<commit_message>
V4.2: Ring magnet / flux conservation analysis for WIN-053
The 'Closed Toroidal Ovoid' geometry is identified as topologically
identical to a ring magnet. Flux conservation (Phi = B x A) analysis
shows the 1,600:1 area ratio between north source and south return
requires B_south ≈ 39 nT; measured value is 66,000 nT. Updated in
Part 1.5 overview, WIN-053 detail, and falsification test 4.6.

Co-Authored-By: Claude Opus 4.6 <noreply@anthropic.com>
</commit_message>
<xml_diff>
--- a/downloads/critical-review-dome-model-v4.docx
+++ b/downloads/critical-review-dome-model-v4.docx
@@ -361,7 +361,7 @@
         <w:t xml:space="preserve">Assessment: </w:t>
       </w:r>
       <w:r>
-        <w:t xml:space="preserve">This is a significant rhetorical shift. The 'dome' label carries flat-earth connotations; 'ovoid cavity' sounds more scientific. However, the underlying physics has not changed: the model still uses the same H(r) exponential curve, the same north-pole-centered disc, and the same aetheric vortex mechanism. The rebranding does not address any of the falsification tests identified in our original review.</w:t>
+        <w:t xml:space="preserve">This is more than a rhetorical shift. The 'Closed Toroidal Ovoid' label describes a specific physical geometry: a dual-plate toroidal system with aetheric flow exiting the Axis Mundi (north pole), flowing south across the surface, hitting the Antarctic 'resonance barrier,' then returning via a sub-terrestrial path (the 'Sump' / Bottom Firmament) back to the north pole. This circulation loop is topologically identical to a ring magnet or toroidal solenoid. The author has provided equations for the subterranean cavity depth: Sub-H(r) = H(r) × (1 − e^(−r/δ)), with δ = 6,371 km. This is the most substantive architectural change between versions — it represents a genuine attempt to address the dipole problem we identified in V50.6. However, the toroidal geometry introduces a fatal flux conservation problem: see section 1.5.5 for detailed analysis.</w:t>
       </w:r>
     </w:p>
     <w:p>
@@ -558,7 +558,37 @@
         <w:t xml:space="preserve">WIN-053 claims two-pole model: </w:t>
       </w:r>
       <w:r>
-        <w:t xml:space="preserve">The most significant change. V51.0 now claims 'Two-Pole Geomagnetic Model: Same Scale Length Governs Both Poles.' In V50.6, the model explicitly described a monopolar aetheric vortex at the north pole with no south magnetic pole mechanism. Our review added section 3.6 specifically addressing this dipole problem. WIN-053 appears to be a direct response to this critique, but the underlying model architecture (north-pole-centered aetheric vortex, disc geometry) has not actually changed to accommodate a second pole.</w:t>
+        <w:t xml:space="preserve">The most significant architectural change. V51.0 now describes a 'Closed Toroidal Ovoid' — a dual-plate system where aetheric flow exits the Axis Mundi (north pole), flows south across the surface, descends at the Antarctic resonance barrier, returns through a sub-terrestrial path (the 'Sump'), and re-enters at the north pole. This is topologically identical to a ring magnet or toroidal solenoid. It represents a genuine attempt to produce a dipole-like field from flat-disc geometry, and credit is due for addressing the monopole critique from V50.6.</w:t>
+      </w:r>
+    </w:p>
+    <w:p>
+      <w:pPr>
+        <w:spacing w:after="120"/>
+      </w:pPr>
+      <w:r>
+        <w:rPr>
+          <w:b/>
+          <w:bCs/>
+        </w:rPr>
+        <w:t xml:space="preserve">The flux conservation problem: </w:t>
+      </w:r>
+      <w:r>
+        <w:t xml:space="preserve">However, the toroidal geometry introduces a fatal quantitative failure. In any closed magnetic circuit, total flux (Φ = B × A) must be conserved. The north pole source is concentrated at the Axis Mundi — even generously assuming an effective radius of 500 km, the source area is ~785,000 km². The sub-terrestrial return spreads across the entire disc underside: π × 20,015² ≈ 1.26 × 10⁹ km². The area ratio is roughly 1,600:1. Flux conservation therefore requires B_south ≈ B_north / 1,600 ≈ 62,376 / 1,600 ≈ 39 nT. Earth's measured south polar field is ~66,000 nT — actually stronger than the north (~58,500 nT). The toroidal model predicts the south pole should be ~1,700× weaker than the north; it is in fact 13% stronger. The author's fitted equation B(r) = 62,376×e^(−r_N/8619) + 64,852×e^(−r_S/8619) avoids this problem by simply adding a second independent source with nearly equal amplitude (64,852 nT), but this violates the flux conservation that any physical toroidal geometry must obey. You cannot have a ring magnet where the field at the outer return path is as strong as the field at the central hole — the geometry forbids it.</w:t>
+      </w:r>
+    </w:p>
+    <w:p>
+      <w:pPr>
+        <w:spacing w:after="120"/>
+      </w:pPr>
+      <w:r>
+        <w:rPr>
+          <w:b/>
+          <w:bCs/>
+        </w:rPr>
+        <w:t xml:space="preserve">Additional toroidal geometry failures: </w:t>
+      </w:r>
+      <w:r>
+        <w:t xml:space="preserve">A toroidal/ring magnet produces axial symmetry around the torus axis (the north pole). Field strength would be constant along latitude lines. Earth's field is not axially symmetric: the south magnetic pole is offset to 64.1°S, 135.9°E (~28° from geographic south), the field has significant non-dipole components (quadrupole, octupole) varying with longitude, and features like the South Atlantic Anomaly have no toroidal explanation. Secular variation, magnetic reversals, and westward drift of field features all require a fluid dynamo, not a static toroidal cavity.</w:t>
       </w:r>
     </w:p>
     <w:p>
@@ -8786,11 +8816,11 @@
       <w:pPr>
         <w:pStyle w:val="Heading3"/>
       </w:pPr>
-      <w:bookmarkStart w:name="WIN_001" w:id="1"/>
+      <w:bookmarkStart w:name="WIN_001" w:id="101"/>
       <w:r>
         <w:t xml:space="preserve">WIN-001: Tesla 11.78 Hz Earth Resonance</w:t>
       </w:r>
-      <w:bookmarkEnd w:id="1"/>
+      <w:bookmarkEnd w:id="101"/>
     </w:p>
     <w:p>
       <w:pPr>
@@ -8821,7 +8851,7 @@
       <w:r>
         <w:t xml:space="preserve">US Patent 787412 (1905), publicly available at </w:t>
       </w:r>
-      <w:hyperlink w:history="1" r:id="rIdt5evc9pbnzpgz_pir9aid">
+      <w:hyperlink w:history="1" r:id="rIdrpajit07y-dz8sablpaw1">
         <w:r>
           <w:rPr>
             <w:rStyle w:val="Hyperlink"/>
@@ -8852,15 +8882,15 @@
       <w:pPr>
         <w:pStyle w:val="Heading3"/>
       </w:pPr>
-      <w:bookmarkStart w:name="WIN_008" w:id="2"/>
+      <w:bookmarkStart w:name="WIN_008" w:id="102"/>
       <w:r>
         <w:t xml:space="preserve">WIN-008/009: Telluric 11.7-12 Hz Peak/Cutoff</w:t>
       </w:r>
-      <w:bookmarkEnd w:id="2"/>
-    </w:p>
-    <w:p>
-      <w:bookmarkStart w:name="WIN_009" w:id="3"/>
-      <w:bookmarkEnd w:id="3"/>
+      <w:bookmarkEnd w:id="102"/>
+    </w:p>
+    <w:p>
+      <w:bookmarkStart w:name="WIN_009" w:id="103"/>
+      <w:bookmarkEnd w:id="103"/>
     </w:p>
     <w:p>
       <w:pPr>
@@ -8911,11 +8941,11 @@
       <w:pPr>
         <w:pStyle w:val="Heading3"/>
       </w:pPr>
-      <w:bookmarkStart w:name="WIN_016" w:id="4"/>
+      <w:bookmarkStart w:name="WIN_016" w:id="104"/>
       <w:r>
         <w:t xml:space="preserve">WIN-016: Annual Aberration via Dome Refraction</w:t>
       </w:r>
-      <w:bookmarkEnd w:id="4"/>
+      <w:bookmarkEnd w:id="104"/>
     </w:p>
     <w:p>
       <w:pPr>
@@ -8946,7 +8976,7 @@
       <w:r>
         <w:t xml:space="preserve">James Bradley (1727) explicitly tested and rejected atmospheric refraction as an explanation: refraction is wavelength-dependent (chromatic), while stellar aberration is achromatic. Modern VLBI measurements achieve milliarcsecond precision and directly confirm aberration correlates with Earth's orbital velocity (~30 km/s). The </w:t>
       </w:r>
-      <w:hyperlink w:history="1" r:id="rIdu2vsyn6vptssn9zdblobg">
+      <w:hyperlink w:history="1" r:id="rIdqdz6vlthtfna8elgz_igu">
         <w:r>
           <w:rPr>
             <w:rStyle w:val="Hyperlink"/>
@@ -8977,11 +9007,11 @@
       <w:pPr>
         <w:pStyle w:val="Heading3"/>
       </w:pPr>
-      <w:bookmarkStart w:name="WIN_017" w:id="5"/>
+      <w:bookmarkStart w:name="WIN_017" w:id="105"/>
       <w:r>
         <w:t xml:space="preserve">WIN-017: Stellar Parallax as Firmament Wobble</w:t>
       </w:r>
-      <w:bookmarkEnd w:id="5"/>
+      <w:bookmarkEnd w:id="105"/>
     </w:p>
     <w:p>
       <w:pPr>
@@ -9012,7 +9042,7 @@
       <w:r>
         <w:t xml:space="preserve">ESA </w:t>
       </w:r>
-      <w:hyperlink w:history="1" r:id="rIdgcil4uonpfh4iqrsb66jv">
+      <w:hyperlink w:history="1" r:id="rIdxfc7d1mmzlke7a0bxuo7n">
         <w:r>
           <w:rPr>
             <w:rStyle w:val="Hyperlink"/>
@@ -9043,11 +9073,11 @@
       <w:pPr>
         <w:pStyle w:val="Heading3"/>
       </w:pPr>
-      <w:bookmarkStart w:name="WIN_026" w:id="6"/>
+      <w:bookmarkStart w:name="WIN_026" w:id="106"/>
       <w:r>
         <w:t xml:space="preserve">WIN-026: Crepuscular Ray Divergence</w:t>
       </w:r>
-      <w:bookmarkEnd w:id="6"/>
+      <w:bookmarkEnd w:id="106"/>
     </w:p>
     <w:p>
       <w:pPr>
@@ -9078,7 +9108,7 @@
       <w:r>
         <w:t xml:space="preserve">Crepuscular rays are parallel beams made visible by atmospheric scattering. The apparent divergence is a perspective effect. Crucially, anticrepuscular rays converge at the anti-solar point simultaneously. See </w:t>
       </w:r>
-      <w:hyperlink w:history="1" r:id="rIdkpmq0achqs9_0evve1eiq">
+      <w:hyperlink w:history="1" r:id="rIda33kj0bhy6r6rng2dxjxr">
         <w:r>
           <w:rPr>
             <w:rStyle w:val="Hyperlink"/>
@@ -9089,7 +9119,7 @@
       <w:r>
         <w:t xml:space="preserve"> and </w:t>
       </w:r>
-      <w:hyperlink w:history="1" r:id="rIdprckv5urlvt6nd7rqsztb">
+      <w:hyperlink w:history="1" r:id="rIdlyhk5aqcfeg-oit6f9f24">
         <w:r>
           <w:rPr>
             <w:rStyle w:val="Hyperlink"/>
@@ -9120,11 +9150,11 @@
       <w:pPr>
         <w:pStyle w:val="Heading3"/>
       </w:pPr>
-      <w:bookmarkStart w:name="WIN_028" w:id="7"/>
+      <w:bookmarkStart w:name="WIN_028" w:id="107"/>
       <w:r>
         <w:t xml:space="preserve">WIN-028: Bermuda Triangle / East Japan Symmetry</w:t>
       </w:r>
-      <w:bookmarkEnd w:id="7"/>
+      <w:bookmarkEnd w:id="107"/>
     </w:p>
     <w:p>
       <w:pPr>
@@ -9155,7 +9185,7 @@
       <w:r>
         <w:t xml:space="preserve">NOAA officially states no evidence of anomalous disappearances. </w:t>
       </w:r>
-      <w:hyperlink w:history="1" r:id="rIddvrnm333yprhvu81kp9pw">
+      <w:hyperlink w:history="1" r:id="rIdlm0kqkz61nutdvvk121sn">
         <w:r>
           <w:rPr>
             <w:rStyle w:val="Hyperlink"/>
@@ -9186,11 +9216,11 @@
       <w:pPr>
         <w:pStyle w:val="Heading3"/>
       </w:pPr>
-      <w:bookmarkStart w:name="WIN_033" w:id="8"/>
+      <w:bookmarkStart w:name="WIN_033" w:id="108"/>
       <w:r>
         <w:t xml:space="preserve">WIN-033: Sigma Octantis Dimness Asymmetry</w:t>
       </w:r>
-      <w:bookmarkEnd w:id="8"/>
+      <w:bookmarkEnd w:id="108"/>
     </w:p>
     <w:p>
       <w:pPr>
@@ -9221,7 +9251,7 @@
       <w:r>
         <w:t xml:space="preserve">Hipparcos </w:t>
       </w:r>
-      <w:hyperlink w:history="1" r:id="rIdbj_vjdl0zwj2kyiywgqno">
+      <w:hyperlink w:history="1" r:id="rIds_jtz6_1kux1xfccpzphb">
         <w:r>
           <w:rPr>
             <w:rStyle w:val="Hyperlink"/>
@@ -9327,11 +9357,11 @@
       <w:pPr>
         <w:pStyle w:val="Heading3"/>
       </w:pPr>
-      <w:bookmarkStart w:name="WIN_053" w:id="9"/>
+      <w:bookmarkStart w:name="WIN_053" w:id="109"/>
       <w:r>
         <w:t xml:space="preserve">WIN-053: Two-Pole Geomagnetic Model</w:t>
       </w:r>
-      <w:bookmarkEnd w:id="9"/>
+      <w:bookmarkEnd w:id="109"/>
     </w:p>
     <w:p>
       <w:pPr>
@@ -9345,7 +9375,92 @@
         <w:t xml:space="preserve">Claim: </w:t>
       </w:r>
       <w:r>
-        <w:t xml:space="preserve">Same scale length governs both magnetic poles, confirming the dome model accounts for Earth's dipole field.</w:t>
+        <w:t xml:space="preserve">Same scale length (λ = 8,619 km) governs both magnetic poles. The 'Closed Toroidal Ovoid' geometry produces a dipole-like field via a sub-terrestrial aetheric return path.</w:t>
+      </w:r>
+    </w:p>
+    <w:p>
+      <w:pPr>
+        <w:spacing w:after="120"/>
+      </w:pPr>
+      <w:r>
+        <w:rPr>
+          <w:b/>
+          <w:bCs/>
+        </w:rPr>
+        <w:t xml:space="preserve">What V51.0 actually describes: </w:t>
+      </w:r>
+      <w:r>
+        <w:t xml:space="preserve">The model has been restructured as a toroidal flow circuit: aetheric medium exits the Axis Mundi (north pole), flows south across the disc surface, descends at the Antarctic resonance barrier (ice wall, r ≈ 20,015 km), returns through a sub-terrestrial path (the 'Sump' / Bottom Firmament), and re-enters at the north pole. This is topologically identical to a ring magnet or toroidal solenoid. The subterranean cavity depth is given by Sub-H(r) = H(r) × (1 − e^(−r/δ)) with δ = 6,371 km. The author fits B(r) = 62,376×e^(−r_N/8619) + 64,852×e^(−r_S/8619) nT and claims this drops global RMS from 61% to 20%.</w:t>
+      </w:r>
+    </w:p>
+    <w:p>
+      <w:pPr>
+        <w:spacing w:after="120"/>
+      </w:pPr>
+      <w:r>
+        <w:rPr>
+          <w:b/>
+          <w:bCs/>
+        </w:rPr>
+        <w:t xml:space="preserve">The flux conservation problem: </w:t>
+      </w:r>
+      <w:r>
+        <w:t xml:space="preserve">In any closed magnetic circuit (which a toroid is), total magnetic flux Φ = B × A must be conserved. The north pole source is concentrated at the Axis Mundi — even generously assuming an effective radius of 500 km, the source area is ~785,000 km². The sub-terrestrial return path spreads across the entire disc underside: π × 20,015² ≈ 1.26 × 10⁹ km². The area ratio is ~1,600:1. Flux conservation therefore requires B_south ≈ B_north / 1,600 ≈ 39 nT. Earth's measured south polar field is ~66,000 nT — actually 13% stronger than the north (~58,500 nT). The toroidal model predicts the south should be ~1,700× weaker; it is stronger. The fitted equation avoids this by adding a second independent source of nearly equal amplitude (64,852 nT), but this violates the flux conservation that any physical toroid must obey.</w:t>
+      </w:r>
+    </w:p>
+    <w:p>
+      <w:pPr>
+        <w:spacing w:after="120"/>
+      </w:pPr>
+      <w:r>
+        <w:rPr>
+          <w:b/>
+          <w:bCs/>
+        </w:rPr>
+        <w:t xml:space="preserve">Additional failures: </w:t>
+      </w:r>
+      <w:r>
+        <w:t xml:space="preserve">A toroidal/ring magnet produces axial symmetry — field strength constant along latitude lines. Earth's field is not axially symmetric: the south magnetic pole is offset 28° from geographic south (64.1°S, 135.9°E), significant non-dipole components vary with longitude, and features like the South Atlantic Anomaly have no toroidal explanation. Secular variation, reversals, and westward drift require a fluid dynamo, not a static toroidal cavity.</w:t>
+      </w:r>
+    </w:p>
+    <w:p>
+      <w:pPr>
+        <w:spacing w:after="120"/>
+      </w:pPr>
+      <w:r>
+        <w:rPr>
+          <w:b/>
+          <w:bCs/>
+        </w:rPr>
+        <w:t xml:space="preserve">Verdict: REFUTED BY DATA. </w:t>
+      </w:r>
+      <w:r>
+        <w:t xml:space="preserve">The toroidal geometry is a genuine mechanism improvement over V50.6's monopole, but it fails quantitatively: flux conservation forbids equal-strength poles in a ring magnet with a 1,600:1 area ratio. The fitted equation ignores the geometry it claims to derive from.</w:t>
+      </w:r>
+    </w:p>
+    <w:p>
+      <w:pPr>
+        <w:pStyle w:val="Heading3"/>
+      </w:pPr>
+      <w:bookmarkStart w:name="WIN_062" w:id="110"/>
+      <w:r>
+        <w:t xml:space="preserve">WIN-062: Tesla Longitudinal Wave Speed = 1.574c</w:t>
+      </w:r>
+      <w:bookmarkEnd w:id="110"/>
+    </w:p>
+    <w:p>
+      <w:pPr>
+        <w:spacing w:after="120"/>
+      </w:pPr>
+      <w:r>
+        <w:rPr>
+          <w:b/>
+          <w:bCs/>
+        </w:rPr>
+        <w:t xml:space="preserve">Claim: </w:t>
+      </w:r>
+      <w:r>
+        <w:t xml:space="preserve">Tesla's Colorado Springs measurements demonstrate longitudinal wave velocity of 1.574 times the speed of light, confirming ECM disc diameter.</w:t>
       </w:r>
     </w:p>
     <w:p>
@@ -9360,7 +9475,7 @@
         <w:t xml:space="preserve">Evidence: </w:t>
       </w:r>
       <w:r>
-        <w:t xml:space="preserve">This WIN directly contradicts the V50.6 model architecture. The dome model describes a monopolar 'aetheric vortex' anchored at the north pole. There is no mechanism in the model for field lines to converge at a southern point. The south magnetic pole exists at 64.1°S, 135.9°E with vertical inclination of −90°, as measured by WMM2025 and ESA Swarm satellites. Field strength increases approaching BOTH poles (~58,500 nT at Resolute Bay, ~66,000 nT at Dumont d'Urville). A monopolar source predicts monotonic decrease from the pole center. Claiming this WIN without changing the underlying model is retroactive accommodation, not prediction.</w:t>
+        <w:t xml:space="preserve">Tesla observed that electromagnetic signals appeared to arrive faster than expected over Earth's surface. This is explained by group velocity in waveguides: electromagnetic waves propagating in the Earth-ionosphere waveguide can have phase/group velocities exceeding c without violating relativity, because information and energy travel at the signal velocity, which does not exceed c. This is analogous to the phase velocity of light in a waveguide exceeding c. Einstein's special relativity prohibits superluminal information transfer, confirmed by every particle physics experiment. The model's claim that this proves 'aetheric longitudinal waves' ignores the well-understood waveguide physics.</w:t>
       </w:r>
     </w:p>
     <w:p>
@@ -9375,18 +9490,18 @@
         <w:t xml:space="preserve">Verdict: REFUTED BY DATA. </w:t>
       </w:r>
       <w:r>
-        <w:t xml:space="preserve">The model's monopolar architecture cannot produce a dipole. The WIN contradicts V50.6 without any mechanism change.</w:t>
+        <w:t xml:space="preserve">Superluminal group velocity in waveguides is standard physics; does not imply superluminal information transfer or aetheric waves.</w:t>
       </w:r>
     </w:p>
     <w:p>
       <w:pPr>
         <w:pStyle w:val="Heading3"/>
       </w:pPr>
-      <w:bookmarkStart w:name="WIN_062" w:id="10"/>
-      <w:r>
-        <w:t xml:space="preserve">WIN-062: Tesla Longitudinal Wave Speed = 1.574c</w:t>
-      </w:r>
-      <w:bookmarkEnd w:id="10"/>
+      <w:bookmarkStart w:name="WIN_065" w:id="111"/>
+      <w:r>
+        <w:t xml:space="preserve">WIN-065: Polaris Systematic Excess +0.27°</w:t>
+      </w:r>
+      <w:bookmarkEnd w:id="111"/>
     </w:p>
     <w:p>
       <w:pPr>
@@ -9400,7 +9515,7 @@
         <w:t xml:space="preserve">Claim: </w:t>
       </w:r>
       <w:r>
-        <w:t xml:space="preserve">Tesla's Colorado Springs measurements demonstrate longitudinal wave velocity of 1.574 times the speed of light, confirming ECM disc diameter.</w:t>
+        <w:t xml:space="preserve">Polaris elevation at 35.9°N systematically exceeds latitude by +0.27°, confirming dome height function.</w:t>
       </w:r>
     </w:p>
     <w:p>
@@ -9415,7 +9530,7 @@
         <w:t xml:space="preserve">Evidence: </w:t>
       </w:r>
       <w:r>
-        <w:t xml:space="preserve">Tesla observed that electromagnetic signals appeared to arrive faster than expected over Earth's surface. This is explained by group velocity in waveguides: electromagnetic waves propagating in the Earth-ionosphere waveguide can have phase/group velocities exceeding c without violating relativity, because information and energy travel at the signal velocity, which does not exceed c. This is analogous to the phase velocity of light in a waveguide exceeding c. Einstein's special relativity prohibits superluminal information transfer, confirmed by every particle physics experiment. The model's claim that this proves 'aetheric longitudinal waves' ignores the well-understood waveguide physics.</w:t>
+        <w:t xml:space="preserve">Polaris (Alpha Ursae Minoris) is not exactly at the north celestial pole. Its declination is approximately 89.26° (2026), meaning it traces a small circle of radius ~0.74° around the true pole. This produces a measurable offset that varies throughout the night. The claimed +0.27° excess is well within the expected variation from Polaris's offset from true north and atmospheric refraction corrections. Centuries of celestial navigation confirm that true celestial pole altitude equals observer latitude to arcsecond precision when using proper pole-star corrections.</w:t>
       </w:r>
     </w:p>
     <w:p>
@@ -9430,18 +9545,39 @@
         <w:t xml:space="preserve">Verdict: REFUTED BY DATA. </w:t>
       </w:r>
       <w:r>
-        <w:t xml:space="preserve">Superluminal group velocity in waveguides is standard physics; does not imply superluminal information transfer or aetheric waves.</w:t>
+        <w:t xml:space="preserve">Polaris is 0.74° from true pole; the 'excess' is within known offset. True pole altitude equals latitude.</w:t>
+      </w:r>
+    </w:p>
+    <w:p>
+      <w:r>
+        <w:br w:type="page"/>
+      </w:r>
+    </w:p>
+    <w:p>
+      <w:pPr>
+        <w:pStyle w:val="Heading2"/>
+      </w:pPr>
+      <w:r>
+        <w:t xml:space="preserve">2.3 Detailed Analysis: Standard Model Explains</w:t>
+      </w:r>
+    </w:p>
+    <w:p>
+      <w:pPr>
+        <w:spacing w:after="120"/>
+      </w:pPr>
+      <w:r>
+        <w:t xml:space="preserve">These observations are real but already fully accounted for by mainstream geophysics. The dome model adds no predictive power.</w:t>
       </w:r>
     </w:p>
     <w:p>
       <w:pPr>
         <w:pStyle w:val="Heading3"/>
       </w:pPr>
-      <w:bookmarkStart w:name="WIN_065" w:id="11"/>
-      <w:r>
-        <w:t xml:space="preserve">WIN-065: Polaris Systematic Excess +0.27°</w:t>
-      </w:r>
-      <w:bookmarkEnd w:id="11"/>
+      <w:bookmarkStart w:name="WIN_002" w:id="112"/>
+      <w:r>
+        <w:t xml:space="preserve">WIN-002: Schumann 26% Aetheric Damping</w:t>
+      </w:r>
+      <w:bookmarkEnd w:id="112"/>
     </w:p>
     <w:p>
       <w:pPr>
@@ -9455,7 +9591,7 @@
         <w:t xml:space="preserve">Claim: </w:t>
       </w:r>
       <w:r>
-        <w:t xml:space="preserve">Polaris elevation at 35.9°N systematically exceeds latitude by +0.27°, confirming dome height function.</w:t>
+        <w:t xml:space="preserve">Gap between theoretical 10.59 Hz and measured 7.83 Hz proves aetheric damping.</w:t>
       </w:r>
     </w:p>
     <w:p>
@@ -9470,54 +9606,37 @@
         <w:t xml:space="preserve">Evidence: </w:t>
       </w:r>
       <w:r>
-        <w:t xml:space="preserve">Polaris (Alpha Ursae Minoris) is not exactly at the north celestial pole. Its declination is approximately 89.26° (2026), meaning it traces a small circle of radius ~0.74° around the true pole. This produces a measurable offset that varies throughout the night. The claimed +0.27° excess is well within the expected variation from Polaris's offset from true north and atmospheric refraction corrections. Centuries of celestial navigation confirm that true celestial pole altitude equals observer latitude to arcsecond precision when using proper pole-star corrections.</w:t>
-      </w:r>
-    </w:p>
-    <w:p>
-      <w:pPr>
-        <w:spacing w:after="120"/>
-      </w:pPr>
-      <w:r>
-        <w:rPr>
-          <w:b/>
-          <w:bCs/>
-        </w:rPr>
-        <w:t xml:space="preserve">Verdict: REFUTED BY DATA. </w:t>
-      </w:r>
-      <w:r>
-        <w:t xml:space="preserve">Polaris is 0.74° from true pole; the 'excess' is within known offset. True pole altitude equals latitude.</w:t>
-      </w:r>
-    </w:p>
-    <w:p>
-      <w:r>
-        <w:br w:type="page"/>
-      </w:r>
-    </w:p>
-    <w:p>
-      <w:pPr>
-        <w:pStyle w:val="Heading2"/>
-      </w:pPr>
-      <w:r>
-        <w:t xml:space="preserve">2.3 Detailed Analysis: Standard Model Explains</w:t>
-      </w:r>
-    </w:p>
-    <w:p>
-      <w:pPr>
-        <w:spacing w:after="120"/>
-      </w:pPr>
-      <w:r>
-        <w:t xml:space="preserve">These observations are real but already fully accounted for by mainstream geophysics. The dome model adds no predictive power.</w:t>
+        <w:t xml:space="preserve">Finite ionospheric conductivity causes losses that lower the resonant frequency. Sentman (1995) provides quantitative models reproducing all Schumann harmonics (14.1, 20.3, 26.4, 32.5 Hz). 'Aetheric damping' appears in zero peer-reviewed publications.</w:t>
+      </w:r>
+    </w:p>
+    <w:p>
+      <w:pPr>
+        <w:spacing w:after="120"/>
+      </w:pPr>
+      <w:r>
+        <w:rPr>
+          <w:b/>
+          <w:bCs/>
+        </w:rPr>
+        <w:t xml:space="preserve">Verdict: STANDARD MODEL EXPLAINS. </w:t>
+      </w:r>
+      <w:r>
+        <w:t xml:space="preserve">Ionospheric losses fully account for the gap.</w:t>
       </w:r>
     </w:p>
     <w:p>
       <w:pPr>
         <w:pStyle w:val="Heading3"/>
       </w:pPr>
-      <w:bookmarkStart w:name="WIN_002" w:id="12"/>
-      <w:r>
-        <w:t xml:space="preserve">WIN-002: Schumann 26% Aetheric Damping</w:t>
-      </w:r>
-      <w:bookmarkEnd w:id="12"/>
+      <w:bookmarkStart w:name="WIN_004" w:id="113"/>
+      <w:r>
+        <w:t xml:space="preserve">WIN-004/005: SAA Separation and Asymmetric Decay</w:t>
+      </w:r>
+      <w:bookmarkEnd w:id="113"/>
+    </w:p>
+    <w:p>
+      <w:bookmarkStart w:name="WIN_005" w:id="114"/>
+      <w:bookmarkEnd w:id="114"/>
     </w:p>
     <w:p>
       <w:pPr>
@@ -9531,7 +9650,7 @@
         <w:t xml:space="preserve">Claim: </w:t>
       </w:r>
       <w:r>
-        <w:t xml:space="preserve">Gap between theoretical 10.59 Hz and measured 7.83 Hz proves aetheric damping.</w:t>
+        <w:t xml:space="preserve">Globe models have no mechanism for SAA splitting or asymmetric decay.</w:t>
       </w:r>
     </w:p>
     <w:p>
@@ -9546,68 +9665,9 @@
         <w:t xml:space="preserve">Evidence: </w:t>
       </w:r>
       <w:r>
-        <w:t xml:space="preserve">Finite ionospheric conductivity causes losses that lower the resonant frequency. Sentman (1995) provides quantitative models reproducing all Schumann harmonics (14.1, 20.3, 26.4, 32.5 Hz). 'Aetheric damping' appears in zero peer-reviewed publications.</w:t>
-      </w:r>
-    </w:p>
-    <w:p>
-      <w:pPr>
-        <w:spacing w:after="120"/>
-      </w:pPr>
-      <w:r>
-        <w:rPr>
-          <w:b/>
-          <w:bCs/>
-        </w:rPr>
-        <w:t xml:space="preserve">Verdict: STANDARD MODEL EXPLAINS. </w:t>
-      </w:r>
-      <w:r>
-        <w:t xml:space="preserve">Ionospheric losses fully account for the gap.</w:t>
-      </w:r>
-    </w:p>
-    <w:p>
-      <w:pPr>
-        <w:pStyle w:val="Heading3"/>
-      </w:pPr>
-      <w:bookmarkStart w:name="WIN_004" w:id="13"/>
-      <w:r>
-        <w:t xml:space="preserve">WIN-004/005: SAA Separation and Asymmetric Decay</w:t>
-      </w:r>
-      <w:bookmarkEnd w:id="13"/>
-    </w:p>
-    <w:p>
-      <w:bookmarkStart w:name="WIN_005" w:id="14"/>
-      <w:bookmarkEnd w:id="14"/>
-    </w:p>
-    <w:p>
-      <w:pPr>
-        <w:spacing w:after="120"/>
-      </w:pPr>
-      <w:r>
-        <w:rPr>
-          <w:b/>
-          <w:bCs/>
-        </w:rPr>
-        <w:t xml:space="preserve">Claim: </w:t>
-      </w:r>
-      <w:r>
-        <w:t xml:space="preserve">Globe models have no mechanism for SAA splitting or asymmetric decay.</w:t>
-      </w:r>
-    </w:p>
-    <w:p>
-      <w:pPr>
-        <w:spacing w:after="120"/>
-      </w:pPr>
-      <w:r>
-        <w:rPr>
-          <w:b/>
-          <w:bCs/>
-        </w:rPr>
-        <w:t xml:space="preserve">Evidence: </w:t>
-      </w:r>
-      <w:r>
         <w:t xml:space="preserve">Terra-Nova et al. (2017, PNAS) demonstrate reversed-flux patches reproduce SAA splitting in MHD simulations. The </w:t>
       </w:r>
-      <w:hyperlink w:history="1" r:id="rIdm_9uk5umc1ppexmks19mk">
+      <w:hyperlink w:history="1" r:id="rIdbilp1makjpgxdrqzx087z">
         <w:r>
           <w:rPr>
             <w:rStyle w:val="Hyperlink"/>
@@ -9618,7 +9678,7 @@
       <w:r>
         <w:t xml:space="preserve"> documents the evolution quantitatively. </w:t>
       </w:r>
-      <w:hyperlink w:history="1" r:id="rIdpbrp5_b7tvcazar072ni-">
+      <w:hyperlink w:history="1" r:id="rIdpazdex36gbrkp50vipnys">
         <w:r>
           <w:rPr>
             <w:rStyle w:val="Hyperlink"/>
@@ -9649,11 +9709,11 @@
       <w:pPr>
         <w:pStyle w:val="Heading3"/>
       </w:pPr>
-      <w:bookmarkStart w:name="WIN_006" w:id="15"/>
+      <w:bookmarkStart w:name="WIN_006" w:id="115"/>
       <w:r>
         <w:t xml:space="preserve">WIN-006: NP Pre-1990 Linear Drift</w:t>
       </w:r>
-      <w:bookmarkEnd w:id="15"/>
+      <w:bookmarkEnd w:id="115"/>
     </w:p>
     <w:p>
       <w:pPr>
@@ -9669,7 +9729,7 @@
       <w:r>
         <w:t xml:space="preserve">Normal secular variation documented by </w:t>
       </w:r>
-      <w:hyperlink w:history="1" r:id="rIdvw9_cxxhkomplxvdz5zqh">
+      <w:hyperlink w:history="1" r:id="rId3_54kw12dfszvngljrmrz">
         <w:r>
           <w:rPr>
             <w:rStyle w:val="Hyperlink"/>
@@ -9697,15 +9757,15 @@
       <w:pPr>
         <w:pStyle w:val="Heading3"/>
       </w:pPr>
-      <w:bookmarkStart w:name="WIN_010" w:id="16"/>
+      <w:bookmarkStart w:name="WIN_010" w:id="116"/>
       <w:r>
         <w:t xml:space="preserve">WIN-010/025: Eclipse Magnetic Anomalies</w:t>
       </w:r>
-      <w:bookmarkEnd w:id="16"/>
-    </w:p>
-    <w:p>
-      <w:bookmarkStart w:name="WIN_025" w:id="17"/>
-      <w:bookmarkEnd w:id="17"/>
+      <w:bookmarkEnd w:id="116"/>
+    </w:p>
+    <w:p>
+      <w:bookmarkStart w:name="WIN_025" w:id="117"/>
+      <w:bookmarkEnd w:id="117"/>
     </w:p>
     <w:p>
       <w:pPr>
@@ -9736,7 +9796,7 @@
       <w:r>
         <w:t xml:space="preserve">Eclipse-induced perturbations predicted by Chapman (1933) via ionospheric conductivity drops. Data from </w:t>
       </w:r>
-      <w:hyperlink w:history="1" r:id="rIdrv_hw_-cd6ukxsohir7qz">
+      <w:hyperlink w:history="1" r:id="rIdmqscdyns6t9s5n2knjjp3">
         <w:r>
           <w:rPr>
             <w:rStyle w:val="Hyperlink"/>
@@ -9767,11 +9827,11 @@
       <w:pPr>
         <w:pStyle w:val="Heading3"/>
       </w:pPr>
-      <w:bookmarkStart w:name="WIN_020" w:id="18"/>
+      <w:bookmarkStart w:name="WIN_020" w:id="118"/>
       <w:r>
         <w:t xml:space="preserve">WIN-020: Lunar 18.6-Year Cycle via Epicyclic Gears</w:t>
       </w:r>
-      <w:bookmarkEnd w:id="18"/>
+      <w:bookmarkEnd w:id="118"/>
     </w:p>
     <w:p>
       <w:pPr>
@@ -9804,11 +9864,11 @@
       <w:pPr>
         <w:pStyle w:val="Heading3"/>
       </w:pPr>
-      <w:bookmarkStart w:name="WIN_029" w:id="19"/>
+      <w:bookmarkStart w:name="WIN_029" w:id="119"/>
       <w:r>
         <w:t xml:space="preserve">WIN-029: Schumann Requires Hard Conductive Ceiling</w:t>
       </w:r>
-      <w:bookmarkEnd w:id="19"/>
+      <w:bookmarkEnd w:id="119"/>
     </w:p>
     <w:p>
       <w:pPr>
@@ -9824,7 +9884,7 @@
       <w:r>
         <w:t xml:space="preserve">The formula used is for a quarter-wave linear waveguide, not a spherical cavity. Correct formula f = c/(2*pi*R) gives R = 6,098 km, within 4% of Earth's radius. The ionosphere IS conductive (</w:t>
       </w:r>
-      <w:hyperlink w:history="1" r:id="rIdrlnj7fmev-yos-inzuz-k">
+      <w:hyperlink w:history="1" r:id="rIdv6oaqjqj_tkpoool0aqfb">
         <w:r>
           <w:rPr>
             <w:rStyle w:val="Hyperlink"/>
@@ -9855,27 +9915,27 @@
       <w:pPr>
         <w:pStyle w:val="Heading3"/>
       </w:pPr>
-      <w:bookmarkStart w:name="WIN_035" w:id="20"/>
+      <w:bookmarkStart w:name="WIN_035" w:id="120"/>
       <w:r>
         <w:t xml:space="preserve">WIN-035-039: Weekly Confirmations</w:t>
       </w:r>
-      <w:bookmarkEnd w:id="20"/>
-    </w:p>
-    <w:p>
-      <w:bookmarkStart w:name="WIN_036" w:id="21"/>
-      <w:bookmarkEnd w:id="21"/>
-    </w:p>
-    <w:p>
-      <w:bookmarkStart w:name="WIN_037" w:id="22"/>
-      <w:bookmarkEnd w:id="22"/>
-    </w:p>
-    <w:p>
-      <w:bookmarkStart w:name="WIN_038" w:id="23"/>
-      <w:bookmarkEnd w:id="23"/>
-    </w:p>
-    <w:p>
-      <w:bookmarkStart w:name="WIN_039" w:id="24"/>
-      <w:bookmarkEnd w:id="24"/>
+      <w:bookmarkEnd w:id="120"/>
+    </w:p>
+    <w:p>
+      <w:bookmarkStart w:name="WIN_036" w:id="121"/>
+      <w:bookmarkEnd w:id="121"/>
+    </w:p>
+    <w:p>
+      <w:bookmarkStart w:name="WIN_037" w:id="122"/>
+      <w:bookmarkEnd w:id="122"/>
+    </w:p>
+    <w:p>
+      <w:bookmarkStart w:name="WIN_038" w:id="123"/>
+      <w:bookmarkEnd w:id="123"/>
+    </w:p>
+    <w:p>
+      <w:bookmarkStart w:name="WIN_039" w:id="124"/>
+      <w:bookmarkEnd w:id="124"/>
     </w:p>
     <w:p>
       <w:pPr>
@@ -9891,7 +9951,7 @@
       <w:r>
         <w:t xml:space="preserve">All five observations already predicted by </w:t>
       </w:r>
-      <w:hyperlink w:history="1" r:id="rIdpoq8cczbf3cdimaeffclc">
+      <w:hyperlink w:history="1" r:id="rIdat4cyo2obqzikqlqyplqm">
         <w:r>
           <w:rPr>
             <w:rStyle w:val="Hyperlink"/>
@@ -9902,7 +9962,7 @@
       <w:r>
         <w:t xml:space="preserve">, </w:t>
       </w:r>
-      <w:hyperlink w:history="1" r:id="rIddku4c2yqpbznimzjwxize">
+      <w:hyperlink w:history="1" r:id="rId7e6wu3a6_kmhef4d9xzhh">
         <w:r>
           <w:rPr>
             <w:rStyle w:val="Hyperlink"/>
@@ -9930,39 +9990,39 @@
       <w:pPr>
         <w:pStyle w:val="Heading3"/>
       </w:pPr>
-      <w:bookmarkStart w:name="WIN_040" w:id="25"/>
+      <w:bookmarkStart w:name="WIN_040" w:id="125"/>
       <w:r>
         <w:t xml:space="preserve">WIN-040-043, 059-061, 063: Geomagnetic Re-slicing</w:t>
       </w:r>
-      <w:bookmarkEnd w:id="25"/>
-    </w:p>
-    <w:p>
-      <w:bookmarkStart w:name="WIN_041" w:id="26"/>
-      <w:bookmarkEnd w:id="26"/>
-    </w:p>
-    <w:p>
-      <w:bookmarkStart w:name="WIN_042" w:id="27"/>
-      <w:bookmarkEnd w:id="27"/>
-    </w:p>
-    <w:p>
-      <w:bookmarkStart w:name="WIN_043" w:id="28"/>
-      <w:bookmarkEnd w:id="28"/>
-    </w:p>
-    <w:p>
-      <w:bookmarkStart w:name="WIN_059" w:id="29"/>
-      <w:bookmarkEnd w:id="29"/>
-    </w:p>
-    <w:p>
-      <w:bookmarkStart w:name="WIN_060" w:id="30"/>
-      <w:bookmarkEnd w:id="30"/>
-    </w:p>
-    <w:p>
-      <w:bookmarkStart w:name="WIN_061" w:id="31"/>
-      <w:bookmarkEnd w:id="31"/>
-    </w:p>
-    <w:p>
-      <w:bookmarkStart w:name="WIN_063" w:id="32"/>
-      <w:bookmarkEnd w:id="32"/>
+      <w:bookmarkEnd w:id="125"/>
+    </w:p>
+    <w:p>
+      <w:bookmarkStart w:name="WIN_041" w:id="126"/>
+      <w:bookmarkEnd w:id="126"/>
+    </w:p>
+    <w:p>
+      <w:bookmarkStart w:name="WIN_042" w:id="127"/>
+      <w:bookmarkEnd w:id="127"/>
+    </w:p>
+    <w:p>
+      <w:bookmarkStart w:name="WIN_043" w:id="128"/>
+      <w:bookmarkEnd w:id="128"/>
+    </w:p>
+    <w:p>
+      <w:bookmarkStart w:name="WIN_059" w:id="129"/>
+      <w:bookmarkEnd w:id="129"/>
+    </w:p>
+    <w:p>
+      <w:bookmarkStart w:name="WIN_060" w:id="130"/>
+      <w:bookmarkEnd w:id="130"/>
+    </w:p>
+    <w:p>
+      <w:bookmarkStart w:name="WIN_061" w:id="131"/>
+      <w:bookmarkEnd w:id="131"/>
+    </w:p>
+    <w:p>
+      <w:bookmarkStart w:name="WIN_063" w:id="132"/>
+      <w:bookmarkEnd w:id="132"/>
     </w:p>
     <w:p>
       <w:pPr>
@@ -10013,27 +10073,27 @@
       <w:pPr>
         <w:pStyle w:val="Heading3"/>
       </w:pPr>
-      <w:bookmarkStart w:name="WIN_045" w:id="33"/>
+      <w:bookmarkStart w:name="WIN_045" w:id="133"/>
       <w:r>
         <w:t xml:space="preserve">WIN-045/046/049/050/051: Tidal Constituent Periods</w:t>
       </w:r>
-      <w:bookmarkEnd w:id="33"/>
-    </w:p>
-    <w:p>
-      <w:bookmarkStart w:name="WIN_046" w:id="34"/>
-      <w:bookmarkEnd w:id="34"/>
-    </w:p>
-    <w:p>
-      <w:bookmarkStart w:name="WIN_049" w:id="35"/>
-      <w:bookmarkEnd w:id="35"/>
-    </w:p>
-    <w:p>
-      <w:bookmarkStart w:name="WIN_050" w:id="36"/>
-      <w:bookmarkEnd w:id="36"/>
-    </w:p>
-    <w:p>
-      <w:bookmarkStart w:name="WIN_051" w:id="37"/>
-      <w:bookmarkEnd w:id="37"/>
+      <w:bookmarkEnd w:id="133"/>
+    </w:p>
+    <w:p>
+      <w:bookmarkStart w:name="WIN_046" w:id="134"/>
+      <w:bookmarkEnd w:id="134"/>
+    </w:p>
+    <w:p>
+      <w:bookmarkStart w:name="WIN_049" w:id="135"/>
+      <w:bookmarkEnd w:id="135"/>
+    </w:p>
+    <w:p>
+      <w:bookmarkStart w:name="WIN_050" w:id="136"/>
+      <w:bookmarkEnd w:id="136"/>
+    </w:p>
+    <w:p>
+      <w:bookmarkStart w:name="WIN_051" w:id="137"/>
+      <w:bookmarkEnd w:id="137"/>
     </w:p>
     <w:p>
       <w:pPr>
@@ -10084,11 +10144,11 @@
       <w:pPr>
         <w:pStyle w:val="Heading3"/>
       </w:pPr>
-      <w:bookmarkStart w:name="WIN_064" w:id="38"/>
+      <w:bookmarkStart w:name="WIN_064" w:id="138"/>
       <w:r>
         <w:t xml:space="preserve">WIN-064: P-Wave Shadow Zone Geometric Lock</w:t>
       </w:r>
-      <w:bookmarkEnd w:id="38"/>
+      <w:bookmarkEnd w:id="138"/>
     </w:p>
     <w:p>
       <w:pPr>
@@ -10139,11 +10199,11 @@
       <w:pPr>
         <w:pStyle w:val="Heading3"/>
       </w:pPr>
-      <w:bookmarkStart w:name="WIN_066" w:id="39"/>
+      <w:bookmarkStart w:name="WIN_066" w:id="139"/>
       <w:r>
         <w:t xml:space="preserve">WIN-066: NH Heat Excess +0.34 W/m² Asymmetry</w:t>
       </w:r>
-      <w:bookmarkEnd w:id="39"/>
+      <w:bookmarkEnd w:id="139"/>
     </w:p>
     <w:p>
       <w:pPr>
@@ -10194,11 +10254,11 @@
       <w:pPr>
         <w:pStyle w:val="Heading3"/>
       </w:pPr>
-      <w:bookmarkStart w:name="WIN_067" w:id="40"/>
+      <w:bookmarkStart w:name="WIN_067" w:id="140"/>
       <w:r>
         <w:t xml:space="preserve">WIN-067: Antarctic Gravity Hole</w:t>
       </w:r>
-      <w:bookmarkEnd w:id="40"/>
+      <w:bookmarkEnd w:id="140"/>
     </w:p>
     <w:p>
       <w:pPr>
@@ -10229,7 +10289,7 @@
       <w:r>
         <w:t xml:space="preserve">Antarctic gravity anomalies are mapped from orbit by </w:t>
       </w:r>
-      <w:hyperlink w:history="1" r:id="rIdddp47qgi4aputnaufeacy">
+      <w:hyperlink w:history="1" r:id="rIdlvm0vgaz1mf5kpxphkvfy">
         <w:r>
           <w:rPr>
             <w:rStyle w:val="Hyperlink"/>
@@ -10240,7 +10300,7 @@
       <w:r>
         <w:t xml:space="preserve"> and </w:t>
       </w:r>
-      <w:hyperlink w:history="1" r:id="rIdyvvibi7aigddberutl-_k">
+      <w:hyperlink w:history="1" r:id="rIdbrtadntvl0onto7vp2j9c">
         <w:r>
           <w:rPr>
             <w:rStyle w:val="Hyperlink"/>
@@ -10284,15 +10344,15 @@
       <w:pPr>
         <w:pStyle w:val="Heading3"/>
       </w:pPr>
-      <w:bookmarkStart w:name="WIN_011" w:id="41"/>
+      <w:bookmarkStart w:name="WIN_011" w:id="141"/>
       <w:r>
         <w:t xml:space="preserve">WIN-011/012: Mohe Gravity Anomaly and Coupling Constant</w:t>
       </w:r>
-      <w:bookmarkEnd w:id="41"/>
-    </w:p>
-    <w:p>
-      <w:bookmarkStart w:name="WIN_012" w:id="42"/>
-      <w:bookmarkEnd w:id="42"/>
+      <w:bookmarkEnd w:id="141"/>
+    </w:p>
+    <w:p>
+      <w:bookmarkStart w:name="WIN_012" w:id="142"/>
+      <w:bookmarkEnd w:id="142"/>
     </w:p>
     <w:p>
       <w:pPr>
@@ -10325,11 +10385,11 @@
       <w:pPr>
         <w:pStyle w:val="Heading3"/>
       </w:pPr>
-      <w:bookmarkStart w:name="WIN_015" w:id="43"/>
+      <w:bookmarkStart w:name="WIN_015" w:id="143"/>
       <w:r>
         <w:t xml:space="preserve">WIN-015: Meyl Scalar Wave Faraday Penetration</w:t>
       </w:r>
-      <w:bookmarkEnd w:id="43"/>
+      <w:bookmarkEnd w:id="143"/>
     </w:p>
     <w:p>
       <w:pPr>
@@ -10372,100 +10432,100 @@
       </w:r>
     </w:p>
     <w:p>
-      <w:bookmarkStart w:name="WIN_003" w:id="44"/>
-      <w:bookmarkEnd w:id="44"/>
-    </w:p>
-    <w:p>
-      <w:bookmarkStart w:name="WIN_007" w:id="45"/>
-      <w:bookmarkEnd w:id="45"/>
-    </w:p>
-    <w:p>
-      <w:bookmarkStart w:name="WIN_013" w:id="46"/>
-      <w:bookmarkEnd w:id="46"/>
-    </w:p>
-    <w:p>
-      <w:bookmarkStart w:name="WIN_014" w:id="47"/>
-      <w:bookmarkEnd w:id="47"/>
-    </w:p>
-    <w:p>
-      <w:bookmarkStart w:name="WIN_018" w:id="48"/>
-      <w:bookmarkEnd w:id="48"/>
-    </w:p>
-    <w:p>
-      <w:bookmarkStart w:name="WIN_019" w:id="49"/>
-      <w:bookmarkEnd w:id="49"/>
-    </w:p>
-    <w:p>
-      <w:bookmarkStart w:name="WIN_021" w:id="50"/>
-      <w:bookmarkEnd w:id="50"/>
-    </w:p>
-    <w:p>
-      <w:bookmarkStart w:name="WIN_022" w:id="51"/>
-      <w:bookmarkEnd w:id="51"/>
-    </w:p>
-    <w:p>
-      <w:bookmarkStart w:name="WIN_023" w:id="52"/>
-      <w:bookmarkEnd w:id="52"/>
-    </w:p>
-    <w:p>
-      <w:bookmarkStart w:name="WIN_024" w:id="53"/>
-      <w:bookmarkEnd w:id="53"/>
-    </w:p>
-    <w:p>
-      <w:bookmarkStart w:name="WIN_027" w:id="54"/>
-      <w:bookmarkEnd w:id="54"/>
-    </w:p>
-    <w:p>
-      <w:bookmarkStart w:name="WIN_030" w:id="55"/>
-      <w:bookmarkEnd w:id="55"/>
-    </w:p>
-    <w:p>
-      <w:bookmarkStart w:name="WIN_031" w:id="56"/>
-      <w:bookmarkEnd w:id="56"/>
-    </w:p>
-    <w:p>
-      <w:bookmarkStart w:name="WIN_032" w:id="57"/>
-      <w:bookmarkEnd w:id="57"/>
-    </w:p>
-    <w:p>
-      <w:bookmarkStart w:name="WIN_034" w:id="58"/>
-      <w:bookmarkEnd w:id="58"/>
-    </w:p>
-    <w:p>
-      <w:bookmarkStart w:name="WIN_044" w:id="59"/>
-      <w:bookmarkEnd w:id="59"/>
-    </w:p>
-    <w:p>
-      <w:bookmarkStart w:name="WIN_047" w:id="60"/>
-      <w:bookmarkEnd w:id="60"/>
-    </w:p>
-    <w:p>
-      <w:bookmarkStart w:name="WIN_048" w:id="61"/>
-      <w:bookmarkEnd w:id="61"/>
-    </w:p>
-    <w:p>
-      <w:bookmarkStart w:name="WIN_052" w:id="62"/>
-      <w:bookmarkEnd w:id="62"/>
-    </w:p>
-    <w:p>
-      <w:bookmarkStart w:name="WIN_054" w:id="63"/>
-      <w:bookmarkEnd w:id="63"/>
-    </w:p>
-    <w:p>
-      <w:bookmarkStart w:name="WIN_055" w:id="64"/>
-      <w:bookmarkEnd w:id="64"/>
-    </w:p>
-    <w:p>
-      <w:bookmarkStart w:name="WIN_056" w:id="65"/>
-      <w:bookmarkEnd w:id="65"/>
-    </w:p>
-    <w:p>
-      <w:bookmarkStart w:name="WIN_057" w:id="66"/>
-      <w:bookmarkEnd w:id="66"/>
-    </w:p>
-    <w:p>
-      <w:bookmarkStart w:name="WIN_058" w:id="67"/>
-      <w:bookmarkEnd w:id="67"/>
+      <w:bookmarkStart w:name="WIN_003" w:id="144"/>
+      <w:bookmarkEnd w:id="144"/>
+    </w:p>
+    <w:p>
+      <w:bookmarkStart w:name="WIN_007" w:id="145"/>
+      <w:bookmarkEnd w:id="145"/>
+    </w:p>
+    <w:p>
+      <w:bookmarkStart w:name="WIN_013" w:id="146"/>
+      <w:bookmarkEnd w:id="146"/>
+    </w:p>
+    <w:p>
+      <w:bookmarkStart w:name="WIN_014" w:id="147"/>
+      <w:bookmarkEnd w:id="147"/>
+    </w:p>
+    <w:p>
+      <w:bookmarkStart w:name="WIN_018" w:id="148"/>
+      <w:bookmarkEnd w:id="148"/>
+    </w:p>
+    <w:p>
+      <w:bookmarkStart w:name="WIN_019" w:id="149"/>
+      <w:bookmarkEnd w:id="149"/>
+    </w:p>
+    <w:p>
+      <w:bookmarkStart w:name="WIN_021" w:id="150"/>
+      <w:bookmarkEnd w:id="150"/>
+    </w:p>
+    <w:p>
+      <w:bookmarkStart w:name="WIN_022" w:id="151"/>
+      <w:bookmarkEnd w:id="151"/>
+    </w:p>
+    <w:p>
+      <w:bookmarkStart w:name="WIN_023" w:id="152"/>
+      <w:bookmarkEnd w:id="152"/>
+    </w:p>
+    <w:p>
+      <w:bookmarkStart w:name="WIN_024" w:id="153"/>
+      <w:bookmarkEnd w:id="153"/>
+    </w:p>
+    <w:p>
+      <w:bookmarkStart w:name="WIN_027" w:id="154"/>
+      <w:bookmarkEnd w:id="154"/>
+    </w:p>
+    <w:p>
+      <w:bookmarkStart w:name="WIN_030" w:id="155"/>
+      <w:bookmarkEnd w:id="155"/>
+    </w:p>
+    <w:p>
+      <w:bookmarkStart w:name="WIN_031" w:id="156"/>
+      <w:bookmarkEnd w:id="156"/>
+    </w:p>
+    <w:p>
+      <w:bookmarkStart w:name="WIN_032" w:id="157"/>
+      <w:bookmarkEnd w:id="157"/>
+    </w:p>
+    <w:p>
+      <w:bookmarkStart w:name="WIN_034" w:id="158"/>
+      <w:bookmarkEnd w:id="158"/>
+    </w:p>
+    <w:p>
+      <w:bookmarkStart w:name="WIN_044" w:id="159"/>
+      <w:bookmarkEnd w:id="159"/>
+    </w:p>
+    <w:p>
+      <w:bookmarkStart w:name="WIN_047" w:id="160"/>
+      <w:bookmarkEnd w:id="160"/>
+    </w:p>
+    <w:p>
+      <w:bookmarkStart w:name="WIN_048" w:id="161"/>
+      <w:bookmarkEnd w:id="161"/>
+    </w:p>
+    <w:p>
+      <w:bookmarkStart w:name="WIN_052" w:id="162"/>
+      <w:bookmarkEnd w:id="162"/>
+    </w:p>
+    <w:p>
+      <w:bookmarkStart w:name="WIN_054" w:id="163"/>
+      <w:bookmarkEnd w:id="163"/>
+    </w:p>
+    <w:p>
+      <w:bookmarkStart w:name="WIN_055" w:id="164"/>
+      <w:bookmarkEnd w:id="164"/>
+    </w:p>
+    <w:p>
+      <w:bookmarkStart w:name="WIN_056" w:id="165"/>
+      <w:bookmarkEnd w:id="165"/>
+    </w:p>
+    <w:p>
+      <w:bookmarkStart w:name="WIN_057" w:id="166"/>
+      <w:bookmarkEnd w:id="166"/>
+    </w:p>
+    <w:p>
+      <w:bookmarkStart w:name="WIN_058" w:id="167"/>
+      <w:bookmarkEnd w:id="167"/>
     </w:p>
     <w:p>
       <w:pPr>
@@ -11011,7 +11071,7 @@
       <w:r>
         <w:t xml:space="preserve">A </w:t>
       </w:r>
-      <w:hyperlink w:history="1" r:id="rIdxlbiyfdlqmknlzx791kgj">
+      <w:hyperlink w:history="1" r:id="rIdgyumcns01zw60e4l8vtop">
         <w:r>
           <w:rPr>
             <w:rStyle w:val="Hyperlink"/>
@@ -11022,7 +11082,7 @@
       <w:r>
         <w:t xml:space="preserve"> found detectable decreases in X, Z, and total field components during eclipses. An </w:t>
       </w:r>
-      <w:hyperlink w:history="1" r:id="rIdexuoxt1baccjrrau48dkk">
+      <w:hyperlink w:history="1" r:id="rId5reanawk6efep6xnmarnu">
         <w:r>
           <w:rPr>
             <w:rStyle w:val="Hyperlink"/>
@@ -11406,7 +11466,7 @@
       <w:r>
         <w:t xml:space="preserve">Continuous 24-hour sunlight. A local sun at 5,733 km circling above a flat disc cannot produce 24-hour sunlight at the disc edge. Directly observable at Amundsen-Scott Station, staffed year-round since 1957. See </w:t>
       </w:r>
-      <w:hyperlink w:history="1" r:id="rIdysln7fphffqy8t-renwzl">
+      <w:hyperlink w:history="1" r:id="rIdv-9a8g_rr6hfijvni0aet">
         <w:r>
           <w:rPr>
             <w:rStyle w:val="Hyperlink"/>
@@ -11455,7 +11515,7 @@
       <w:r>
         <w:t xml:space="preserve">GPS provides 1-3 meter accuracy worldwide. The ISS at 408 km is visible on predictable schedules. Geostationary satellites at 35,786 km. All require unobstructed radio paths. See </w:t>
       </w:r>
-      <w:hyperlink w:history="1" r:id="rIdf8sw6lru6jda9sr7duv4q">
+      <w:hyperlink w:history="1" r:id="rId9-oxsbq46vhpt0ad_zeue">
         <w:r>
           <w:rPr>
             <w:rStyle w:val="Hyperlink"/>
@@ -11466,7 +11526,7 @@
       <w:r>
         <w:t xml:space="preserve">; </w:t>
       </w:r>
-      <w:hyperlink w:history="1" r:id="rId63jzn7zhdwjgrq4a0e0p1">
+      <w:hyperlink w:history="1" r:id="rIdclru7tkfqktlrwxwyp-b3">
         <w:r>
           <w:rPr>
             <w:rStyle w:val="Hyperlink"/>
@@ -11515,7 +11575,7 @@
       <w:r>
         <w:t xml:space="preserve">Modern solar calculators (</w:t>
       </w:r>
-      <w:hyperlink w:history="1" r:id="rIdbrre_xyrezdxfducx-o8r">
+      <w:hyperlink w:history="1" r:id="rIdjdwvnaqxcobfeqrg8biqm">
         <w:r>
           <w:rPr>
             <w:rStyle w:val="Hyperlink"/>
@@ -11564,7 +11624,7 @@
       <w:r>
         <w:t xml:space="preserve">The </w:t>
       </w:r>
-      <w:hyperlink w:history="1" r:id="rId6kyszvvxotdq37elj_l2i">
+      <w:hyperlink w:history="1" r:id="rIdqkkkjfaiiksqqtfe6-3kt">
         <w:r>
           <w:rPr>
             <w:rStyle w:val="Hyperlink"/>
@@ -11613,7 +11673,7 @@
       <w:r>
         <w:t xml:space="preserve">Earth's field is a dipole. South magnetic pole at 64.1°S, 135.9°E (</w:t>
       </w:r>
-      <w:hyperlink w:history="1" r:id="rIdbx1zezvxzg4mqstxmzzxi">
+      <w:hyperlink w:history="1" r:id="rIdamdarwcneldx1j9ut3arv">
         <w:r>
           <w:rPr>
             <w:rStyle w:val="Hyperlink"/>
@@ -11622,7 +11682,7 @@
         </w:r>
       </w:hyperlink>
       <w:r>
-        <w:t xml:space="preserve">). Field strength increases at BOTH poles (~58,500 nT north, ~66,000 nT south). A monopolar vortex predicts weakest field at the disc rim. The V51.0 claim of a 'two-pole model' (WIN-053) contradicts V50.6 architecture without any mechanism change.</w:t>
+        <w:t xml:space="preserve">). Field strength increases at BOTH poles (~58,500 nT north, ~66,000 nT south). V51.0 attempts to address this by introducing a toroidal return path (ring magnet geometry), but flux conservation forbids it: the sub-terrestrial return area (~1.26 × 10⁹ km²) is ~1,600× larger than the north pole source area, requiring B_south ≈ 39 nT. The measured value is ~66,000 nT — 1,700× stronger than the toroid predicts.</w:t>
       </w:r>
     </w:p>
     <w:p>
@@ -11662,7 +11722,7 @@
       <w:r>
         <w:t xml:space="preserve">g = 9.780 m/s² at equator, 9.832 m/s² at poles (0.53% variation). On a flat disc, centrifugal force points outward from center, producing the OPPOSITE pattern. See </w:t>
       </w:r>
-      <w:hyperlink w:history="1" r:id="rIdkqfizdutjrkp3af475z-w">
+      <w:hyperlink w:history="1" r:id="rIdgio7fctrjw2by6_o4dd4d">
         <w:r>
           <w:rPr>
             <w:rStyle w:val="Hyperlink"/>
@@ -12129,7 +12189,7 @@
         </w:rPr>
         <w:t xml:space="preserve">NOAA World Magnetic Model 2025: </w:t>
       </w:r>
-      <w:hyperlink w:history="1" r:id="rIdydrkjpqvlaoutfworxkxa">
+      <w:hyperlink w:history="1" r:id="rIdmumquaz9hlmn8oyccozcy">
         <w:r>
           <w:rPr>
             <w:rStyle w:val="Hyperlink"/>
@@ -12149,7 +12209,7 @@
         </w:rPr>
         <w:t xml:space="preserve">NOAA Wandering Geomagnetic Poles: </w:t>
       </w:r>
-      <w:hyperlink w:history="1" r:id="rIdjlr14rqegy67ujivrp7fj">
+      <w:hyperlink w:history="1" r:id="rIdmdfzd0xirp0gyh-gypyoe">
         <w:r>
           <w:rPr>
             <w:rStyle w:val="Hyperlink"/>
@@ -12169,7 +12229,7 @@
         </w:rPr>
         <w:t xml:space="preserve">CHAOS-7 Geomagnetic Field Model: </w:t>
       </w:r>
-      <w:hyperlink w:history="1" r:id="rIdz1ff_dufhgdvdeaeg9per">
+      <w:hyperlink w:history="1" r:id="rIdfeesvcsiklh1cckxyv2zc">
         <w:r>
           <w:rPr>
             <w:rStyle w:val="Hyperlink"/>
@@ -12189,7 +12249,7 @@
         </w:rPr>
         <w:t xml:space="preserve">ESA Swarm Satellite Mission: </w:t>
       </w:r>
-      <w:hyperlink w:history="1" r:id="rIdro8i7j3wkoguzglmvlv-s">
+      <w:hyperlink w:history="1" r:id="rIdrthxejd5tm8drqx8nu-t_">
         <w:r>
           <w:rPr>
             <w:rStyle w:val="Hyperlink"/>
@@ -12209,7 +12269,7 @@
         </w:rPr>
         <w:t xml:space="preserve">INTERMAGNET Observatory Network: </w:t>
       </w:r>
-      <w:hyperlink w:history="1" r:id="rId_cbs-ovk0j-eyqblh3pqr">
+      <w:hyperlink w:history="1" r:id="rIdukyrya1d8hcsaknjhvr6p">
         <w:r>
           <w:rPr>
             <w:rStyle w:val="Hyperlink"/>
@@ -12229,7 +12289,7 @@
         </w:rPr>
         <w:t xml:space="preserve">IGRF-13: </w:t>
       </w:r>
-      <w:hyperlink w:history="1" r:id="rIdqqnnokwus2baagdp-bfax">
+      <w:hyperlink w:history="1" r:id="rId97au7tcqzdhj1bo2mkp9n">
         <w:r>
           <w:rPr>
             <w:rStyle w:val="Hyperlink"/>
@@ -12249,7 +12309,7 @@
         </w:rPr>
         <w:t xml:space="preserve">ESA Gaia Data Release 3: </w:t>
       </w:r>
-      <w:hyperlink w:history="1" r:id="rIdlxjg-zhvfji77sg4xqb9n">
+      <w:hyperlink w:history="1" r:id="rIdhp4epihzx_m64jojrvw11">
         <w:r>
           <w:rPr>
             <w:rStyle w:val="Hyperlink"/>
@@ -12269,7 +12329,7 @@
         </w:rPr>
         <w:t xml:space="preserve">Hipparcos Catalogue: </w:t>
       </w:r>
-      <w:hyperlink w:history="1" r:id="rIdwsbvyyku_t4vabkktacfa">
+      <w:hyperlink w:history="1" r:id="rIdx1yhjpxws6cvjv7yygebt">
         <w:r>
           <w:rPr>
             <w:rStyle w:val="Hyperlink"/>
@@ -12289,7 +12349,7 @@
         </w:rPr>
         <w:t xml:space="preserve">US Patent 787412 (Tesla): </w:t>
       </w:r>
-      <w:hyperlink w:history="1" r:id="rIdtfdykqdediiwxxyrw7apm">
+      <w:hyperlink w:history="1" r:id="rIdcdynrqtylsziu35i-_6n1">
         <w:r>
           <w:rPr>
             <w:rStyle w:val="Hyperlink"/>
@@ -12309,7 +12369,7 @@
         </w:rPr>
         <w:t xml:space="preserve">NOAA Solar Position Algorithm: </w:t>
       </w:r>
-      <w:hyperlink w:history="1" r:id="rIdbaz3ploq-sf8tkd_pmgw6">
+      <w:hyperlink w:history="1" r:id="rIdqdnqbwq9k9j-h6jete7th">
         <w:r>
           <w:rPr>
             <w:rStyle w:val="Hyperlink"/>
@@ -12329,7 +12389,7 @@
         </w:rPr>
         <w:t xml:space="preserve">National Geodetic Survey Gravity: </w:t>
       </w:r>
-      <w:hyperlink w:history="1" r:id="rIddsl36aximnyiuqrid6_iv">
+      <w:hyperlink w:history="1" r:id="rIdoypvvej5xuv349z0uscrj">
         <w:r>
           <w:rPr>
             <w:rStyle w:val="Hyperlink"/>
@@ -12349,7 +12409,7 @@
         </w:rPr>
         <w:t xml:space="preserve">CHIME/FRB Project: </w:t>
       </w:r>
-      <w:hyperlink w:history="1" r:id="rIdrm2r3fhnbyp4quwchpz-u">
+      <w:hyperlink w:history="1" r:id="rIdmgjxxhzrvfp_4dn2sb3dv">
         <w:r>
           <w:rPr>
             <w:rStyle w:val="Hyperlink"/>
@@ -12369,7 +12429,7 @@
         </w:rPr>
         <w:t xml:space="preserve">GRACE-FO (gravity mapping): </w:t>
       </w:r>
-      <w:hyperlink w:history="1" r:id="rIdwgsh4q4bslvisoucyaka4">
+      <w:hyperlink w:history="1" r:id="rIdlwe-pxm29wokmcbz9thyg">
         <w:r>
           <w:rPr>
             <w:rStyle w:val="Hyperlink"/>
@@ -12389,7 +12449,7 @@
         </w:rPr>
         <w:t xml:space="preserve">GOCE (gravity field): </w:t>
       </w:r>
-      <w:hyperlink w:history="1" r:id="rIdckbnszl-ehzjzpm_bp8a9">
+      <w:hyperlink w:history="1" r:id="rId4_b9llxjg7o2a5ypwklpf">
         <w:r>
           <w:rPr>
             <w:rStyle w:val="Hyperlink"/>
@@ -12409,7 +12469,7 @@
         </w:rPr>
         <w:t xml:space="preserve">GPS.gov: </w:t>
       </w:r>
-      <w:hyperlink w:history="1" r:id="rId9sw_2hhx1e97tkmoqhldv">
+      <w:hyperlink w:history="1" r:id="rIdxmsnoabm1bl3ejajiwsbf">
         <w:r>
           <w:rPr>
             <w:rStyle w:val="Hyperlink"/>
@@ -12429,7 +12489,7 @@
         </w:rPr>
         <w:t xml:space="preserve">CelesTrak TLE Data: </w:t>
       </w:r>
-      <w:hyperlink w:history="1" r:id="rIdzzpyszhesqtlhiqph3rtc">
+      <w:hyperlink w:history="1" r:id="rIdg3ka9sgtg-xnoyei7q8jn">
         <w:r>
           <w:rPr>
             <w:rStyle w:val="Hyperlink"/>

</xml_diff>

<commit_message>
V4.3: Add GRACE L1A / Dielectric infographic analysis (Section 3.6)
New section debunks the "5 Decisive Points" infographic: Strasbourg
shielding anomaly (known SG limitation), GRACE ACC1A kappa ratio
(thermospheric drag, not gravity-magnetism coupling), L1A vs L1B
"curve-fit deception" (standard calibration per JPL D-22027), void
mechanism (no math framework), and ΔAIC >100 (instrumental not
physical). Also expanded WIN-012 detail with GRACE L1A rebuttal.

Co-Authored-By: Claude Opus 4.6 <noreply@anthropic.com>
</commit_message>
<xml_diff>
--- a/downloads/critical-review-dome-model-v4.docx
+++ b/downloads/critical-review-dome-model-v4.docx
@@ -8851,7 +8851,7 @@
       <w:r>
         <w:t xml:space="preserve">US Patent 787412 (1905), publicly available at </w:t>
       </w:r>
-      <w:hyperlink w:history="1" r:id="rIdrpajit07y-dz8sablpaw1">
+      <w:hyperlink w:history="1" r:id="rIdkaqj_m-mhvbbzy-jhl5dn">
         <w:r>
           <w:rPr>
             <w:rStyle w:val="Hyperlink"/>
@@ -8976,7 +8976,7 @@
       <w:r>
         <w:t xml:space="preserve">James Bradley (1727) explicitly tested and rejected atmospheric refraction as an explanation: refraction is wavelength-dependent (chromatic), while stellar aberration is achromatic. Modern VLBI measurements achieve milliarcsecond precision and directly confirm aberration correlates with Earth's orbital velocity (~30 km/s). The </w:t>
       </w:r>
-      <w:hyperlink w:history="1" r:id="rIdqdz6vlthtfna8elgz_igu">
+      <w:hyperlink w:history="1" r:id="rIdxkp8lowpaggric3osmur9">
         <w:r>
           <w:rPr>
             <w:rStyle w:val="Hyperlink"/>
@@ -9042,7 +9042,7 @@
       <w:r>
         <w:t xml:space="preserve">ESA </w:t>
       </w:r>
-      <w:hyperlink w:history="1" r:id="rIdxfc7d1mmzlke7a0bxuo7n">
+      <w:hyperlink w:history="1" r:id="rIdquw9mqdjrvftatmnoltfb">
         <w:r>
           <w:rPr>
             <w:rStyle w:val="Hyperlink"/>
@@ -9108,7 +9108,7 @@
       <w:r>
         <w:t xml:space="preserve">Crepuscular rays are parallel beams made visible by atmospheric scattering. The apparent divergence is a perspective effect. Crucially, anticrepuscular rays converge at the anti-solar point simultaneously. See </w:t>
       </w:r>
-      <w:hyperlink w:history="1" r:id="rIda33kj0bhy6r6rng2dxjxr">
+      <w:hyperlink w:history="1" r:id="rId2syaxorztggdafnnuydib">
         <w:r>
           <w:rPr>
             <w:rStyle w:val="Hyperlink"/>
@@ -9119,7 +9119,7 @@
       <w:r>
         <w:t xml:space="preserve"> and </w:t>
       </w:r>
-      <w:hyperlink w:history="1" r:id="rIdlyhk5aqcfeg-oit6f9f24">
+      <w:hyperlink w:history="1" r:id="rIdd5g6swwpuje6o9hc6sdnr">
         <w:r>
           <w:rPr>
             <w:rStyle w:val="Hyperlink"/>
@@ -9185,7 +9185,7 @@
       <w:r>
         <w:t xml:space="preserve">NOAA officially states no evidence of anomalous disappearances. </w:t>
       </w:r>
-      <w:hyperlink w:history="1" r:id="rIdlm0kqkz61nutdvvk121sn">
+      <w:hyperlink w:history="1" r:id="rIdwnsvwrihwveoo6-axwt3z">
         <w:r>
           <w:rPr>
             <w:rStyle w:val="Hyperlink"/>
@@ -9251,7 +9251,7 @@
       <w:r>
         <w:t xml:space="preserve">Hipparcos </w:t>
       </w:r>
-      <w:hyperlink w:history="1" r:id="rIds_jtz6_1kux1xfccpzphb">
+      <w:hyperlink w:history="1" r:id="rIdmunapvgavztgpj2a9k0ih">
         <w:r>
           <w:rPr>
             <w:rStyle w:val="Hyperlink"/>
@@ -9667,7 +9667,7 @@
       <w:r>
         <w:t xml:space="preserve">Terra-Nova et al. (2017, PNAS) demonstrate reversed-flux patches reproduce SAA splitting in MHD simulations. The </w:t>
       </w:r>
-      <w:hyperlink w:history="1" r:id="rIdbilp1makjpgxdrqzx087z">
+      <w:hyperlink w:history="1" r:id="rId7sjctncbjvsodnhyqnxsu">
         <w:r>
           <w:rPr>
             <w:rStyle w:val="Hyperlink"/>
@@ -9678,7 +9678,7 @@
       <w:r>
         <w:t xml:space="preserve"> documents the evolution quantitatively. </w:t>
       </w:r>
-      <w:hyperlink w:history="1" r:id="rIdpazdex36gbrkp50vipnys">
+      <w:hyperlink w:history="1" r:id="rIdsad-aq1wq4fhmdepgatox">
         <w:r>
           <w:rPr>
             <w:rStyle w:val="Hyperlink"/>
@@ -9729,7 +9729,7 @@
       <w:r>
         <w:t xml:space="preserve">Normal secular variation documented by </w:t>
       </w:r>
-      <w:hyperlink w:history="1" r:id="rId3_54kw12dfszvngljrmrz">
+      <w:hyperlink w:history="1" r:id="rIdlpqlnqeidpbmzpyzuzwyf">
         <w:r>
           <w:rPr>
             <w:rStyle w:val="Hyperlink"/>
@@ -9796,7 +9796,7 @@
       <w:r>
         <w:t xml:space="preserve">Eclipse-induced perturbations predicted by Chapman (1933) via ionospheric conductivity drops. Data from </w:t>
       </w:r>
-      <w:hyperlink w:history="1" r:id="rIdmqscdyns6t9s5n2knjjp3">
+      <w:hyperlink w:history="1" r:id="rIdenrw0ez0l6wov7sihanif">
         <w:r>
           <w:rPr>
             <w:rStyle w:val="Hyperlink"/>
@@ -9884,7 +9884,7 @@
       <w:r>
         <w:t xml:space="preserve">The formula used is for a quarter-wave linear waveguide, not a spherical cavity. Correct formula f = c/(2*pi*R) gives R = 6,098 km, within 4% of Earth's radius. The ionosphere IS conductive (</w:t>
       </w:r>
-      <w:hyperlink w:history="1" r:id="rIdv6oaqjqj_tkpoool0aqfb">
+      <w:hyperlink w:history="1" r:id="rIdlh6z--mucz8b_xzxdnkme">
         <w:r>
           <w:rPr>
             <w:rStyle w:val="Hyperlink"/>
@@ -9951,7 +9951,7 @@
       <w:r>
         <w:t xml:space="preserve">All five observations already predicted by </w:t>
       </w:r>
-      <w:hyperlink w:history="1" r:id="rIdat4cyo2obqzikqlqyplqm">
+      <w:hyperlink w:history="1" r:id="rIdwq-rzwscynwtoxychg6qp">
         <w:r>
           <w:rPr>
             <w:rStyle w:val="Hyperlink"/>
@@ -9962,7 +9962,7 @@
       <w:r>
         <w:t xml:space="preserve">, </w:t>
       </w:r>
-      <w:hyperlink w:history="1" r:id="rId7e6wu3a6_kmhef4d9xzhh">
+      <w:hyperlink w:history="1" r:id="rIdu2qgyytm4ktpavy6dcb1q">
         <w:r>
           <w:rPr>
             <w:rStyle w:val="Hyperlink"/>
@@ -10289,7 +10289,7 @@
       <w:r>
         <w:t xml:space="preserve">Antarctic gravity anomalies are mapped from orbit by </w:t>
       </w:r>
-      <w:hyperlink w:history="1" r:id="rIdlvm0vgaz1mf5kpxphkvfy">
+      <w:hyperlink w:history="1" r:id="rIdnni7r3sj7d5-pxfojx6kv">
         <w:r>
           <w:rPr>
             <w:rStyle w:val="Hyperlink"/>
@@ -10300,7 +10300,7 @@
       <w:r>
         <w:t xml:space="preserve"> and </w:t>
       </w:r>
-      <w:hyperlink w:history="1" r:id="rIdbrtadntvl0onto7vp2j9c">
+      <w:hyperlink w:history="1" r:id="rIdbdypr22mw_2r14a-u-ibb">
         <w:r>
           <w:rPr>
             <w:rStyle w:val="Hyperlink"/>
@@ -10378,7 +10378,25 @@
           <w:b/>
           <w:bCs/>
         </w:rPr>
+        <w:t xml:space="preserve">GRACE L1A claim (V51.0 infographic): </w:t>
+      </w:r>
+      <w:r>
+        <w:t xml:space="preserve">The author now claims that GRACE satellite ACC1A raw binary data from the October 30, 2003 Halloween storm shows a 'perfect 1.67 nT/µGal coupling,' and that NASA 'masked' this by low-pass filtering in the L1B product. This misrepresents the GRACE data processing pipeline. GRACE ACC1A is raw accelerometer telemetry. During the Halloween storm, GRACE experienced massive perturbations because the thermosphere expanded dramatically (neutral density increases 5-10× at satellite altitude during extreme geomagnetic storms), causing large drag spikes. The L1A → L1B processing (documented in JPL D-22027, the GRACE Data Product Handbook) removes known non-gravitational accelerations: atmospheric drag, solar radiation pressure, and thruster firings. This is standard calibration, not data suppression. The 'spikes' in L1A that align with magnetic flux are drag perturbations from thermospheric heating, not gravity responding to magnetism. The L1A data is publicly available at podaac.jpl.nasa.gov; it is in raw binary format because it is raw telemetry, not because NASA made it 'computationally expensive to find.'</w:t>
+      </w:r>
+    </w:p>
+    <w:p>
+      <w:pPr>
+        <w:spacing w:after="120"/>
+      </w:pPr>
+      <w:r>
+        <w:rPr>
+          <w:b/>
+          <w:bCs/>
+        </w:rPr>
         <w:t xml:space="preserve">Verdict: NOT DEMONSTRATED. </w:t>
+      </w:r>
+      <w:r>
+        <w:t xml:space="preserve">The 1.67 nT/µGal coupling is built on unconfirmed Mohe data. The GRACE L1A claim conflates atmospheric drag with gravitational signal.</w:t>
       </w:r>
     </w:p>
     <w:p>
@@ -11071,7 +11089,7 @@
       <w:r>
         <w:t xml:space="preserve">A </w:t>
       </w:r>
-      <w:hyperlink w:history="1" r:id="rIdgyumcns01zw60e4l8vtop">
+      <w:hyperlink w:history="1" r:id="rIdai0re1bgj0h3nfqiwoghk">
         <w:r>
           <w:rPr>
             <w:rStyle w:val="Hyperlink"/>
@@ -11082,7 +11100,7 @@
       <w:r>
         <w:t xml:space="preserve"> found detectable decreases in X, Z, and total field components during eclipses. An </w:t>
       </w:r>
-      <w:hyperlink w:history="1" r:id="rId5reanawk6efep6xnmarnu">
+      <w:hyperlink w:history="1" r:id="rId4tabknl3x_lltifxdf4ef">
         <w:r>
           <w:rPr>
             <w:rStyle w:val="Hyperlink"/>
@@ -11371,6 +11389,112 @@
       </w:r>
     </w:p>
     <w:p>
+      <w:pPr>
+        <w:pStyle w:val="Heading2"/>
+      </w:pPr>
+      <w:r>
+        <w:t xml:space="preserve">3.6 The 'Dielectric' Infographic: GRACE L1A and the Shielding Anomaly</w:t>
+      </w:r>
+    </w:p>
+    <w:p>
+      <w:pPr>
+        <w:spacing w:after="120"/>
+      </w:pPr>
+      <w:r>
+        <w:t xml:space="preserve">The author has published promotional infographics claiming '5 Decisive Points That Mainstream Can't Answer.' Each point is addressed below.</w:t>
+      </w:r>
+    </w:p>
+    <w:p>
+      <w:pPr>
+        <w:spacing w:after="120"/>
+      </w:pPr>
+      <w:r>
+        <w:rPr>
+          <w:b/>
+          <w:bCs/>
+        </w:rPr>
+        <w:t xml:space="preserve">1. The Shielding Anomaly (Strasbourg 2003): </w:t>
+      </w:r>
+      <w:r>
+        <w:t xml:space="preserve">Superconducting gravimeters (SGs) do show residuals during extreme geomagnetic storms. This is well-documented. However, the explanation is twofold: (a) no magnetic shielding is perfect — even multi-layer Mumetal + copper cannot fully attenuate a &gt;500 nT storm at the SQUID's femtotesla sensitivity, and (b) real mass redistributions occur during storms (atmospheric pressure changes, ocean loading) that produce genuine µGal-level gravity signals. The Global Geodynamics Project network accounts for both effects. This does not 'falsify instrument noise' — it is a known instrumental limitation during extreme events, which is precisely why those periods are flagged in the data.</w:t>
+      </w:r>
+    </w:p>
+    <w:p>
+      <w:pPr>
+        <w:spacing w:after="120"/>
+      </w:pPr>
+      <w:r>
+        <w:rPr>
+          <w:b/>
+          <w:bCs/>
+        </w:rPr>
+        <w:t xml:space="preserve">2. The Kappa (κ) Ratio (GRACE ACC1A, Oct 2003): </w:t>
+      </w:r>
+      <w:r>
+        <w:t xml:space="preserve">GRACE's L1A accelerometer data does show spikes during the Halloween storm. But GRACE measures non-gravitational forces acting on the satellite — primarily atmospheric drag. During a major geomagnetic storm, the thermosphere heats and expands dramatically (neutral density can increase 5-10× at GRACE altitude ~500 km). The '1.67 nT/µGal coupling' is the ratio between storm magnetic intensity and the drag perturbation: bigger storm → more thermospheric heating → more drag → bigger accelerometer spike. This is the atmosphere responding to magnetism, not gravity responding to magnetism.</w:t>
+      </w:r>
+    </w:p>
+    <w:p>
+      <w:pPr>
+        <w:spacing w:after="120"/>
+      </w:pPr>
+      <w:r>
+        <w:rPr>
+          <w:b/>
+          <w:bCs/>
+        </w:rPr>
+        <w:t xml:space="preserve">3. 'Curve-Fit Deception' (L1A vs L1B): </w:t>
+      </w:r>
+      <w:r>
+        <w:t xml:space="preserve">The L1A → L1B processing pipeline for GRACE is fully documented in JPL D-22027 (GRACE Data Product Handbook). L1B applies calibration factors, removes known non-gravitational accelerations (solar radiation pressure, thruster firings, atmospheric drag), and applies instrument-specific corrections. The author frames this as 'NASA masking the raw truth.' In reality, it is standard signal processing: removing known noise sources to isolate the gravitational signal. The L1A 'spikes' during a Halloween-class storm are expected instrument perturbations from electromagnetic interference and drag, not gravitational signals. NASA did not make L1A 'computationally expensive to find' — it is in raw binary format because it is raw satellite telemetry, publicly available at podaac.jpl.nasa.gov.</w:t>
+      </w:r>
+    </w:p>
+    <w:p>
+      <w:pPr>
+        <w:spacing w:after="120"/>
+      </w:pPr>
+      <w:r>
+        <w:rPr>
+          <w:b/>
+          <w:bCs/>
+        </w:rPr>
+        <w:t xml:space="preserve">4. The Void Mechanism: </w:t>
+      </w:r>
+      <w:r>
+        <w:t xml:space="preserve">The claim that cosmic voids are 'low-pressure Aetheric cells' pushing galaxies toward walls is pure assertion with no mathematical framework. Cosmic voids and the galaxy filament structure are well-modeled by N-body ΛCDM simulations (Millennium, IllustrisTNG, EAGLE). The aetheric pressure concept has no equation of state, no coupling constant, and no prediction that differs from standard structure formation.</w:t>
+      </w:r>
+    </w:p>
+    <w:p>
+      <w:pPr>
+        <w:spacing w:after="120"/>
+      </w:pPr>
+      <w:r>
+        <w:rPr>
+          <w:b/>
+          <w:bCs/>
+        </w:rPr>
+        <w:t xml:space="preserve">5. WIN-012 Published Template (ΔAIC &gt; 100): </w:t>
+      </w:r>
+      <w:r>
+        <w:t xml:space="preserve">A ΔAIC &gt; 100 means one model fits the data better than another by a large margin. But AIC penalizes by number of parameters — it does not validate the physical interpretation. If you fit a model with a free coupling parameter to data that contains correlated electromagnetic interference (which the Halloween 2003 storm data does), the fit will be excellent. The question is whether the coupling is physical (gravity responds to magnetism) or instrumental (the accelerometer responds to electromagnetic drag). Every independent test (Membach SG: 0.0 µGal, China SG network: 0.0 µGal, CUORE Faraday attenuation: as expected) points to the instrumental explanation.</w:t>
+      </w:r>
+    </w:p>
+    <w:p>
+      <w:pPr>
+        <w:spacing w:after="120"/>
+      </w:pPr>
+      <w:r>
+        <w:rPr>
+          <w:b/>
+          <w:bCs/>
+        </w:rPr>
+        <w:t xml:space="preserve">Rhetorical strategy: </w:t>
+      </w:r>
+      <w:r>
+        <w:t xml:space="preserve">The infographic follows the same pattern catalogued throughout this review: name real datasets, isolate real anomalies, provide a real-sounding ratio, then assert a non-standard interpretation while framing the standard explanation as a cover-up. The 'Reprocess the Archives' call-to-action invites the audience to feel like independent investigators rather than consumers of a predetermined narrative. The 'THE AUDIT IS PUBLIC' tagline mirrors the site's audit walkthrough: it creates the appearance of transparency while guiding the reader through selectively presented evidence to a predetermined conclusion.</w:t>
+      </w:r>
+    </w:p>
+    <w:p>
       <w:r>
         <w:br w:type="page"/>
       </w:r>
@@ -11466,7 +11590,7 @@
       <w:r>
         <w:t xml:space="preserve">Continuous 24-hour sunlight. A local sun at 5,733 km circling above a flat disc cannot produce 24-hour sunlight at the disc edge. Directly observable at Amundsen-Scott Station, staffed year-round since 1957. See </w:t>
       </w:r>
-      <w:hyperlink w:history="1" r:id="rIdv-9a8g_rr6hfijvni0aet">
+      <w:hyperlink w:history="1" r:id="rIdyrc4dj3fwgoieg7txzloz">
         <w:r>
           <w:rPr>
             <w:rStyle w:val="Hyperlink"/>
@@ -11515,7 +11639,7 @@
       <w:r>
         <w:t xml:space="preserve">GPS provides 1-3 meter accuracy worldwide. The ISS at 408 km is visible on predictable schedules. Geostationary satellites at 35,786 km. All require unobstructed radio paths. See </w:t>
       </w:r>
-      <w:hyperlink w:history="1" r:id="rId9-oxsbq46vhpt0ad_zeue">
+      <w:hyperlink w:history="1" r:id="rIdbggphw-iafvhq2gltifv7">
         <w:r>
           <w:rPr>
             <w:rStyle w:val="Hyperlink"/>
@@ -11526,7 +11650,7 @@
       <w:r>
         <w:t xml:space="preserve">; </w:t>
       </w:r>
-      <w:hyperlink w:history="1" r:id="rIdclru7tkfqktlrwxwyp-b3">
+      <w:hyperlink w:history="1" r:id="rIdteiybfpyrrxnlij3zdoct">
         <w:r>
           <w:rPr>
             <w:rStyle w:val="Hyperlink"/>
@@ -11575,7 +11699,7 @@
       <w:r>
         <w:t xml:space="preserve">Modern solar calculators (</w:t>
       </w:r>
-      <w:hyperlink w:history="1" r:id="rIdjdwvnaqxcobfeqrg8biqm">
+      <w:hyperlink w:history="1" r:id="rId34yimeq5pu2zkqyokitpw">
         <w:r>
           <w:rPr>
             <w:rStyle w:val="Hyperlink"/>
@@ -11624,7 +11748,7 @@
       <w:r>
         <w:t xml:space="preserve">The </w:t>
       </w:r>
-      <w:hyperlink w:history="1" r:id="rIdqkkkjfaiiksqqtfe6-3kt">
+      <w:hyperlink w:history="1" r:id="rId4zzloe2xax-gyxwzmcxgv">
         <w:r>
           <w:rPr>
             <w:rStyle w:val="Hyperlink"/>
@@ -11673,7 +11797,7 @@
       <w:r>
         <w:t xml:space="preserve">Earth's field is a dipole. South magnetic pole at 64.1°S, 135.9°E (</w:t>
       </w:r>
-      <w:hyperlink w:history="1" r:id="rIdamdarwcneldx1j9ut3arv">
+      <w:hyperlink w:history="1" r:id="rIdarcjwfc37yxkitl4fwo6c">
         <w:r>
           <w:rPr>
             <w:rStyle w:val="Hyperlink"/>
@@ -11722,7 +11846,7 @@
       <w:r>
         <w:t xml:space="preserve">g = 9.780 m/s² at equator, 9.832 m/s² at poles (0.53% variation). On a flat disc, centrifugal force points outward from center, producing the OPPOSITE pattern. See </w:t>
       </w:r>
-      <w:hyperlink w:history="1" r:id="rIdgio7fctrjw2by6_o4dd4d">
+      <w:hyperlink w:history="1" r:id="rIdctvcgakew-7pyfxfz27mm">
         <w:r>
           <w:rPr>
             <w:rStyle w:val="Hyperlink"/>
@@ -12189,7 +12313,7 @@
         </w:rPr>
         <w:t xml:space="preserve">NOAA World Magnetic Model 2025: </w:t>
       </w:r>
-      <w:hyperlink w:history="1" r:id="rIdmumquaz9hlmn8oyccozcy">
+      <w:hyperlink w:history="1" r:id="rIdp7ldr0eax168x0hjerleb">
         <w:r>
           <w:rPr>
             <w:rStyle w:val="Hyperlink"/>
@@ -12209,7 +12333,7 @@
         </w:rPr>
         <w:t xml:space="preserve">NOAA Wandering Geomagnetic Poles: </w:t>
       </w:r>
-      <w:hyperlink w:history="1" r:id="rIdmdfzd0xirp0gyh-gypyoe">
+      <w:hyperlink w:history="1" r:id="rIdhlkznmsu7bbbffwo40ttp">
         <w:r>
           <w:rPr>
             <w:rStyle w:val="Hyperlink"/>
@@ -12229,7 +12353,7 @@
         </w:rPr>
         <w:t xml:space="preserve">CHAOS-7 Geomagnetic Field Model: </w:t>
       </w:r>
-      <w:hyperlink w:history="1" r:id="rIdfeesvcsiklh1cckxyv2zc">
+      <w:hyperlink w:history="1" r:id="rIdcgy-rgcfd3xh3c9niw65y">
         <w:r>
           <w:rPr>
             <w:rStyle w:val="Hyperlink"/>
@@ -12249,7 +12373,7 @@
         </w:rPr>
         <w:t xml:space="preserve">ESA Swarm Satellite Mission: </w:t>
       </w:r>
-      <w:hyperlink w:history="1" r:id="rIdrthxejd5tm8drqx8nu-t_">
+      <w:hyperlink w:history="1" r:id="rIdrpuflfl-2zmrrmpjx5w7s">
         <w:r>
           <w:rPr>
             <w:rStyle w:val="Hyperlink"/>
@@ -12269,7 +12393,7 @@
         </w:rPr>
         <w:t xml:space="preserve">INTERMAGNET Observatory Network: </w:t>
       </w:r>
-      <w:hyperlink w:history="1" r:id="rIdukyrya1d8hcsaknjhvr6p">
+      <w:hyperlink w:history="1" r:id="rId7vh76bdiywsrdg-anjdlb">
         <w:r>
           <w:rPr>
             <w:rStyle w:val="Hyperlink"/>
@@ -12289,7 +12413,7 @@
         </w:rPr>
         <w:t xml:space="preserve">IGRF-13: </w:t>
       </w:r>
-      <w:hyperlink w:history="1" r:id="rId97au7tcqzdhj1bo2mkp9n">
+      <w:hyperlink w:history="1" r:id="rIdtkqxzeovs2jkkpp0weqgw">
         <w:r>
           <w:rPr>
             <w:rStyle w:val="Hyperlink"/>
@@ -12309,7 +12433,7 @@
         </w:rPr>
         <w:t xml:space="preserve">ESA Gaia Data Release 3: </w:t>
       </w:r>
-      <w:hyperlink w:history="1" r:id="rIdhp4epihzx_m64jojrvw11">
+      <w:hyperlink w:history="1" r:id="rId172yzy-x89manzfmpvrzm">
         <w:r>
           <w:rPr>
             <w:rStyle w:val="Hyperlink"/>
@@ -12329,7 +12453,7 @@
         </w:rPr>
         <w:t xml:space="preserve">Hipparcos Catalogue: </w:t>
       </w:r>
-      <w:hyperlink w:history="1" r:id="rIdx1yhjpxws6cvjv7yygebt">
+      <w:hyperlink w:history="1" r:id="rIdvmhapaotk7-aikb8h1hoz">
         <w:r>
           <w:rPr>
             <w:rStyle w:val="Hyperlink"/>
@@ -12349,7 +12473,7 @@
         </w:rPr>
         <w:t xml:space="preserve">US Patent 787412 (Tesla): </w:t>
       </w:r>
-      <w:hyperlink w:history="1" r:id="rIdcdynrqtylsziu35i-_6n1">
+      <w:hyperlink w:history="1" r:id="rId-ucbtps9zgrcttdmvbdny">
         <w:r>
           <w:rPr>
             <w:rStyle w:val="Hyperlink"/>
@@ -12369,7 +12493,7 @@
         </w:rPr>
         <w:t xml:space="preserve">NOAA Solar Position Algorithm: </w:t>
       </w:r>
-      <w:hyperlink w:history="1" r:id="rIdqdnqbwq9k9j-h6jete7th">
+      <w:hyperlink w:history="1" r:id="rIdlug_owiqedkon89vnblp5">
         <w:r>
           <w:rPr>
             <w:rStyle w:val="Hyperlink"/>
@@ -12389,7 +12513,7 @@
         </w:rPr>
         <w:t xml:space="preserve">National Geodetic Survey Gravity: </w:t>
       </w:r>
-      <w:hyperlink w:history="1" r:id="rIdoypvvej5xuv349z0uscrj">
+      <w:hyperlink w:history="1" r:id="rIdqj8ktxo4ja5efxqi4bsiw">
         <w:r>
           <w:rPr>
             <w:rStyle w:val="Hyperlink"/>
@@ -12409,7 +12533,7 @@
         </w:rPr>
         <w:t xml:space="preserve">CHIME/FRB Project: </w:t>
       </w:r>
-      <w:hyperlink w:history="1" r:id="rIdmgjxxhzrvfp_4dn2sb3dv">
+      <w:hyperlink w:history="1" r:id="rIdbpinqkskeumhlca42rqjn">
         <w:r>
           <w:rPr>
             <w:rStyle w:val="Hyperlink"/>
@@ -12429,7 +12553,7 @@
         </w:rPr>
         <w:t xml:space="preserve">GRACE-FO (gravity mapping): </w:t>
       </w:r>
-      <w:hyperlink w:history="1" r:id="rIdlwe-pxm29wokmcbz9thyg">
+      <w:hyperlink w:history="1" r:id="rIdelplxpvuhkx4msi7imx-b">
         <w:r>
           <w:rPr>
             <w:rStyle w:val="Hyperlink"/>
@@ -12449,7 +12573,7 @@
         </w:rPr>
         <w:t xml:space="preserve">GOCE (gravity field): </w:t>
       </w:r>
-      <w:hyperlink w:history="1" r:id="rId4_b9llxjg7o2a5ypwklpf">
+      <w:hyperlink w:history="1" r:id="rId_s4kopnpiw5odppfpsz2g">
         <w:r>
           <w:rPr>
             <w:rStyle w:val="Hyperlink"/>
@@ -12469,7 +12593,7 @@
         </w:rPr>
         <w:t xml:space="preserve">GPS.gov: </w:t>
       </w:r>
-      <w:hyperlink w:history="1" r:id="rIdxmsnoabm1bl3ejajiwsbf">
+      <w:hyperlink w:history="1" r:id="rIdjh9l-q7q3wa_3puiwzckd">
         <w:r>
           <w:rPr>
             <w:rStyle w:val="Hyperlink"/>
@@ -12489,7 +12613,7 @@
         </w:rPr>
         <w:t xml:space="preserve">CelesTrak TLE Data: </w:t>
       </w:r>
-      <w:hyperlink w:history="1" r:id="rIdg3ka9sgtg-xnoyei7q8jn">
+      <w:hyperlink w:history="1" r:id="rIdf8nv8uikbajt1c4wkwq8z">
         <w:r>
           <w:rPr>
             <w:rStyle w:val="Hyperlink"/>

</xml_diff>

<commit_message>
V4.7: Add 'Self-Contradicted' verdict category for 11 WINs
New verdict identifies claims where the dome's own geometry, if worked
through honestly, predicts radically different values than the author
claims. Schumann ~22 Hz (not 7.83), tidal forces 300,000x too strong,
gravity 90% drop at rim, globe solar formula substitution. Updated
tallies, detailed analyses, Pattern 11, and version history.

Co-Authored-By: Claude Opus 4.6 <noreply@anthropic.com>
</commit_message>
<xml_diff>
--- a/downloads/critical-review-dome-model-v4.docx
+++ b/downloads/critical-review-dome-model-v4.docx
@@ -179,6 +179,21 @@
       </w:r>
       <w:r>
         <w:t xml:space="preserve">The claim relies on unreplicated fringe experiments or unverified data that has not been independently confirmed.</w:t>
+      </w:r>
+    </w:p>
+    <w:p>
+      <w:pPr>
+        <w:spacing w:after="120"/>
+      </w:pPr>
+      <w:r>
+        <w:rPr>
+          <w:b/>
+          <w:bCs/>
+        </w:rPr>
+        <w:t xml:space="preserve">Self-Contradicted: </w:t>
+      </w:r>
+      <w:r>
+        <w:t xml:space="preserve">The dome's own stated geometry, if worked through honestly, predicts a value radically different from what the author claims. The author achieves agreement with observations only by substituting globe-derived formulas, using simplified equations that ignore his own geometry, or curve-fitting to observed values. See Part 4.5 for full derivations.</w:t>
       </w:r>
     </w:p>
     <w:p>
@@ -640,7 +655,7 @@
         <w:spacing w:after="120"/>
       </w:pPr>
       <w:r>
-        <w:t xml:space="preserve">The table below uses five verdict categories. Click any WIN number to jump to the detailed analysis. New WINs added in V51.0 are marked with an asterisk (*).</w:t>
+        <w:t xml:space="preserve">The table below uses six verdict categories. Click any WIN number to jump to the detailed analysis. New WINs added in V51.0 are marked with an asterisk (*). The new 'Self-Contradicted' category (light blue) identifies claims where the dome's own stated geometry, if honestly applied, produces predictions that diverge wildly from both observations and the author's claimed values. See Part 4.5 for full derivations.</w:t>
       </w:r>
     </w:p>
     <w:tbl>
@@ -976,7 +991,7 @@
               <w:bottom w:val="single" w:color="CCCCCC" w:sz="1"/>
               <w:right w:val="single" w:color="CCCCCC" w:sz="1"/>
             </w:tcBorders>
-            <w:shd w:fill="C8E6C9" w:val="clear"/>
+            <w:shd w:fill="B3E5FC" w:val="clear"/>
             <w:tcMar>
               <w:top w:type="dxa" w:w="80"/>
               <w:left w:type="dxa" w:w="120"/>
@@ -993,7 +1008,7 @@
                 <w:sz w:val="18"/>
                 <w:szCs w:val="18"/>
               </w:rPr>
-              <w:t xml:space="preserve">Std Model Explains</w:t>
+              <w:t xml:space="preserve">Self-Contradicted</w:t>
             </w:r>
           </w:p>
         </w:tc>
@@ -1020,7 +1035,7 @@
                 <w:sz w:val="18"/>
                 <w:szCs w:val="18"/>
               </w:rPr>
-              <w:t xml:space="preserve">Ionospheric conductivity losses quantitatively explain 10.6-&gt;7.83 Hz gap</w:t>
+              <w:t xml:space="preserve">Dome cavity with H(r)=8537·exp(−r/8619) gives ~22 Hz, not 7.83; uses simplified uniform-height formula</w:t>
             </w:r>
           </w:p>
         </w:tc>
@@ -4189,7 +4204,7 @@
               <w:bottom w:val="single" w:color="CCCCCC" w:sz="1"/>
               <w:right w:val="single" w:color="CCCCCC" w:sz="1"/>
             </w:tcBorders>
-            <w:shd w:fill="C8E6C9" w:val="clear"/>
+            <w:shd w:fill="B3E5FC" w:val="clear"/>
             <w:tcMar>
               <w:top w:type="dxa" w:w="80"/>
               <w:left w:type="dxa" w:w="120"/>
@@ -4206,7 +4221,7 @@
                 <w:sz w:val="18"/>
                 <w:szCs w:val="18"/>
               </w:rPr>
-              <w:t xml:space="preserve">Std Model Explains</w:t>
+              <w:t xml:space="preserve">Self-Contradicted</w:t>
             </w:r>
           </w:p>
         </w:tc>
@@ -4233,7 +4248,7 @@
                 <w:sz w:val="18"/>
                 <w:szCs w:val="18"/>
               </w:rPr>
-              <w:t xml:space="preserve">Ionosphere IS conductive; correct spherical formula gives Earth's radius</w:t>
+              <w:t xml:space="preserve">Ionosphere IS conductive; dome's own exponential cavity gives ~22 Hz, not 7.83</w:t>
             </w:r>
           </w:p>
         </w:tc>
@@ -5260,7 +5275,7 @@
               <w:bottom w:val="single" w:color="CCCCCC" w:sz="1"/>
               <w:right w:val="single" w:color="CCCCCC" w:sz="1"/>
             </w:tcBorders>
-            <w:shd w:fill="C8E6C9" w:val="clear"/>
+            <w:shd w:fill="B3E5FC" w:val="clear"/>
             <w:tcMar>
               <w:top w:type="dxa" w:w="80"/>
               <w:left w:type="dxa" w:w="120"/>
@@ -5277,7 +5292,7 @@
                 <w:sz w:val="18"/>
                 <w:szCs w:val="18"/>
               </w:rPr>
-              <w:t xml:space="preserve">Std Model Explains</w:t>
+              <w:t xml:space="preserve">Self-Contradicted</w:t>
             </w:r>
           </w:p>
         </w:tc>
@@ -5304,7 +5319,7 @@
                 <w:sz w:val="18"/>
                 <w:szCs w:val="18"/>
               </w:rPr>
-              <w:t xml:space="preserve">Expected on globe; ionosphere dimensions stable; varies 7.5-8.3 Hz</w:t>
+              <w:t xml:space="preserve">Dome's own cavity predicts ~22 Hz; stability is expected on globe (ionosphere stable)</w:t>
             </w:r>
           </w:p>
         </w:tc>
@@ -6093,7 +6108,7 @@
               <w:bottom w:val="single" w:color="CCCCCC" w:sz="1"/>
               <w:right w:val="single" w:color="CCCCCC" w:sz="1"/>
             </w:tcBorders>
-            <w:shd w:fill="C8E6C9" w:val="clear"/>
+            <w:shd w:fill="B3E5FC" w:val="clear"/>
             <w:tcMar>
               <w:top w:type="dxa" w:w="80"/>
               <w:left w:type="dxa" w:w="120"/>
@@ -6110,7 +6125,7 @@
                 <w:sz w:val="18"/>
                 <w:szCs w:val="18"/>
               </w:rPr>
-              <w:t xml:space="preserve">Std Model Explains</w:t>
+              <w:t xml:space="preserve">Self-Contradicted</w:t>
             </w:r>
           </w:p>
         </w:tc>
@@ -6137,7 +6152,7 @@
                 <w:sz w:val="18"/>
                 <w:szCs w:val="18"/>
               </w:rPr>
-              <w:t xml:space="preserve">M2=12.42h is a fundamental astronomical constant known since 1775</w:t>
+              <w:t xml:space="preserve">Never derived from dome; local moon at 5,733 km gives tidal forces 300,000× too strong</w:t>
             </w:r>
           </w:p>
         </w:tc>
@@ -6212,7 +6227,7 @@
               <w:bottom w:val="single" w:color="CCCCCC" w:sz="1"/>
               <w:right w:val="single" w:color="CCCCCC" w:sz="1"/>
             </w:tcBorders>
-            <w:shd w:fill="C8E6C9" w:val="clear"/>
+            <w:shd w:fill="B3E5FC" w:val="clear"/>
             <w:tcMar>
               <w:top w:type="dxa" w:w="80"/>
               <w:left w:type="dxa" w:w="120"/>
@@ -6229,7 +6244,7 @@
                 <w:sz w:val="18"/>
                 <w:szCs w:val="18"/>
               </w:rPr>
-              <w:t xml:space="preserve">Std Model Explains</w:t>
+              <w:t xml:space="preserve">Self-Contradicted</w:t>
             </w:r>
           </w:p>
         </w:tc>
@@ -6256,7 +6271,7 @@
                 <w:sz w:val="18"/>
                 <w:szCs w:val="18"/>
               </w:rPr>
-              <w:t xml:space="preserve">S2=12.00h is literally half a solar day; not a prediction</w:t>
+              <w:t xml:space="preserve">Never derived from dome; local moon produces 300,000× excess tidal force</w:t>
             </w:r>
           </w:p>
         </w:tc>
@@ -6569,7 +6584,7 @@
               <w:bottom w:val="single" w:color="CCCCCC" w:sz="1"/>
               <w:right w:val="single" w:color="CCCCCC" w:sz="1"/>
             </w:tcBorders>
-            <w:shd w:fill="C8E6C9" w:val="clear"/>
+            <w:shd w:fill="B3E5FC" w:val="clear"/>
             <w:tcMar>
               <w:top w:type="dxa" w:w="80"/>
               <w:left w:type="dxa" w:w="120"/>
@@ -6586,7 +6601,7 @@
                 <w:sz w:val="18"/>
                 <w:szCs w:val="18"/>
               </w:rPr>
-              <w:t xml:space="preserve">Std Model Explains</w:t>
+              <w:t xml:space="preserve">Self-Contradicted</w:t>
             </w:r>
           </w:p>
         </w:tc>
@@ -6613,7 +6628,7 @@
                 <w:sz w:val="18"/>
                 <w:szCs w:val="18"/>
               </w:rPr>
-              <w:t xml:space="preserve">K1=23.93h is a standard tidal constituent known for 150+ years</w:t>
+              <w:t xml:space="preserve">Never derived from dome; local moon produces 300,000× excess tidal force</w:t>
             </w:r>
           </w:p>
         </w:tc>
@@ -6688,7 +6703,7 @@
               <w:bottom w:val="single" w:color="CCCCCC" w:sz="1"/>
               <w:right w:val="single" w:color="CCCCCC" w:sz="1"/>
             </w:tcBorders>
-            <w:shd w:fill="C8E6C9" w:val="clear"/>
+            <w:shd w:fill="B3E5FC" w:val="clear"/>
             <w:tcMar>
               <w:top w:type="dxa" w:w="80"/>
               <w:left w:type="dxa" w:w="120"/>
@@ -6705,7 +6720,7 @@
                 <w:sz w:val="18"/>
                 <w:szCs w:val="18"/>
               </w:rPr>
-              <w:t xml:space="preserve">Std Model Explains</w:t>
+              <w:t xml:space="preserve">Self-Contradicted</w:t>
             </w:r>
           </w:p>
         </w:tc>
@@ -6732,7 +6747,7 @@
                 <w:sz w:val="18"/>
                 <w:szCs w:val="18"/>
               </w:rPr>
-              <w:t xml:space="preserve">O1=25.82h is a standard tidal constituent known for 150+ years</w:t>
+              <w:t xml:space="preserve">Never derived from dome; local moon produces 300,000× excess tidal force</w:t>
             </w:r>
           </w:p>
         </w:tc>
@@ -6807,7 +6822,7 @@
               <w:bottom w:val="single" w:color="CCCCCC" w:sz="1"/>
               <w:right w:val="single" w:color="CCCCCC" w:sz="1"/>
             </w:tcBorders>
-            <w:shd w:fill="C8E6C9" w:val="clear"/>
+            <w:shd w:fill="B3E5FC" w:val="clear"/>
             <w:tcMar>
               <w:top w:type="dxa" w:w="80"/>
               <w:left w:type="dxa" w:w="120"/>
@@ -6824,7 +6839,7 @@
                 <w:sz w:val="18"/>
                 <w:szCs w:val="18"/>
               </w:rPr>
-              <w:t xml:space="preserve">Std Model Explains</w:t>
+              <w:t xml:space="preserve">Self-Contradicted</w:t>
             </w:r>
           </w:p>
         </w:tc>
@@ -6851,7 +6866,7 @@
                 <w:sz w:val="18"/>
                 <w:szCs w:val="18"/>
               </w:rPr>
-              <w:t xml:space="preserve">N2=12.66h is a standard tidal constituent known for 150+ years</w:t>
+              <w:t xml:space="preserve">Never derived from dome; local moon produces 300,000× excess tidal force</w:t>
             </w:r>
           </w:p>
         </w:tc>
@@ -7402,7 +7417,7 @@
               <w:bottom w:val="single" w:color="CCCCCC" w:sz="1"/>
               <w:right w:val="single" w:color="CCCCCC" w:sz="1"/>
             </w:tcBorders>
-            <w:shd w:fill="FFE0B2" w:val="clear"/>
+            <w:shd w:fill="B3E5FC" w:val="clear"/>
             <w:tcMar>
               <w:top w:type="dxa" w:w="80"/>
               <w:left w:type="dxa" w:w="120"/>
@@ -7419,7 +7434,7 @@
                 <w:sz w:val="18"/>
                 <w:szCs w:val="18"/>
               </w:rPr>
-              <w:t xml:space="preserve">Misleading</w:t>
+              <w:t xml:space="preserve">Self-Contradicted</w:t>
             </w:r>
           </w:p>
         </w:tc>
@@ -7446,7 +7461,7 @@
                 <w:sz w:val="18"/>
                 <w:szCs w:val="18"/>
               </w:rPr>
-              <w:t xml:space="preserve">Circular: H(r) was fitted to match; solar position falsified by Section 3.4</w:t>
+              <w:t xml:space="preserve">Uses globe's declination formula (23.45° axial tilt); dome geometry gives different relationship entirely</w:t>
             </w:r>
           </w:p>
         </w:tc>
@@ -7997,7 +8012,7 @@
               <w:bottom w:val="single" w:color="CCCCCC" w:sz="1"/>
               <w:right w:val="single" w:color="CCCCCC" w:sz="1"/>
             </w:tcBorders>
-            <w:shd w:fill="C8E6C9" w:val="clear"/>
+            <w:shd w:fill="B3E5FC" w:val="clear"/>
             <w:tcMar>
               <w:top w:type="dxa" w:w="80"/>
               <w:left w:type="dxa" w:w="120"/>
@@ -8014,7 +8029,7 @@
                 <w:sz w:val="18"/>
                 <w:szCs w:val="18"/>
               </w:rPr>
-              <w:t xml:space="preserve">Std Model Explains</w:t>
+              <w:t xml:space="preserve">Self-Contradicted</w:t>
             </w:r>
           </w:p>
         </w:tc>
@@ -8041,7 +8056,7 @@
                 <w:sz w:val="18"/>
                 <w:szCs w:val="18"/>
               </w:rPr>
-              <w:t xml:space="preserve">Ionospheric disturbance during geomagnetic storms is well-documented</w:t>
+              <w:t xml:space="preserve">Dome cavity predicts ~22 Hz base frequency; suppression pattern follows ionospheric (globe) physics</w:t>
             </w:r>
           </w:p>
         </w:tc>
@@ -8711,7 +8726,7 @@
               <w:bottom w:val="single" w:color="CCCCCC" w:sz="1"/>
               <w:right w:val="single" w:color="CCCCCC" w:sz="1"/>
             </w:tcBorders>
-            <w:shd w:fill="C8E6C9" w:val="clear"/>
+            <w:shd w:fill="B3E5FC" w:val="clear"/>
             <w:tcMar>
               <w:top w:type="dxa" w:w="80"/>
               <w:left w:type="dxa" w:w="120"/>
@@ -8728,7 +8743,7 @@
                 <w:sz w:val="18"/>
                 <w:szCs w:val="18"/>
               </w:rPr>
-              <w:t xml:space="preserve">Std Model Explains</w:t>
+              <w:t xml:space="preserve">Self-Contradicted</w:t>
             </w:r>
           </w:p>
         </w:tc>
@@ -8755,7 +8770,7 @@
                 <w:sz w:val="18"/>
                 <w:szCs w:val="18"/>
               </w:rPr>
-              <w:t xml:space="preserve">GRACE/GOCE satellites map this from orbit; post-glacial rebound model</w:t>
+              <w:t xml:space="preserve">Dome predicts 90% gravity drop at rim (H=837 km vs 8,537 at pole); actual variation is 0.53%</w:t>
             </w:r>
           </w:p>
         </w:tc>
@@ -8781,7 +8796,22 @@
         <w:t xml:space="preserve">V51.0 Tally (67 WINs): </w:t>
       </w:r>
       <w:r>
-        <w:t xml:space="preserve">Refuted by Data: 11  |  Standard Model Explains: 25  |  Misleading: 21  |  Not Demonstrated: 3  |  Unfalsifiable: 4  |  Removed: 1 (WIN-025)</w:t>
+        <w:t xml:space="preserve">Refuted by Data: 11  |  Standard Model Explains: 15  |  Self-Contradicted: 11  |  Misleading: 23  |  Not Demonstrated: 3  |  Unfalsifiable: 4</w:t>
+      </w:r>
+    </w:p>
+    <w:p>
+      <w:pPr>
+        <w:spacing w:after="120"/>
+      </w:pPr>
+      <w:r>
+        <w:rPr>
+          <w:b/>
+          <w:bCs/>
+        </w:rPr>
+        <w:t xml:space="preserve">Self-Contradicted breakdown: </w:t>
+      </w:r>
+      <w:r>
+        <w:t xml:space="preserve">Schumann resonance (4 WINs: 002, 029, 038, 061): dome cavity gives ~22 Hz not 7.83. Tidal periods (5 WINs: 045, 046, 049, 050, 051): never derived from dome; local moon gives 300,000× excess force. Solar elevation (WIN-056): uses globe's axial-tilt formula. Antarctic gravity (WIN-067): dome predicts 90% gravity drop at rim. In every case, the author substitutes globe physics to avoid his own geometry's predictions.</w:t>
       </w:r>
     </w:p>
     <w:p>
@@ -8796,7 +8826,7 @@
         <w:t xml:space="preserve">Comparison to V50.6 (39 WINs): </w:t>
       </w:r>
       <w:r>
-        <w:t xml:space="preserve">Original tally: Refuted 8, Std Model 12, Misleading 12, Not Demo 3, Unfalsifiable 4. Net change: +3 Refuted, +13 Std Model, +9 Misleading. Zero new WINs demonstrate dome-specific predictive power.</w:t>
+        <w:t xml:space="preserve">Original tally: Refuted 8, Std Model 12, Misleading 12, Not Demo 3, Unfalsifiable 4. V4.7 introduces Self-Contradicted category for WINs where the dome's own geometry produces wrong predictions.</w:t>
       </w:r>
     </w:p>
     <w:p>
@@ -8824,11 +8854,11 @@
       <w:pPr>
         <w:pStyle w:val="Heading3"/>
       </w:pPr>
-      <w:bookmarkStart w:name="WIN_001" w:id="101"/>
+      <w:bookmarkStart w:name="WIN_001" w:id="1"/>
       <w:r>
         <w:t xml:space="preserve">WIN-001: Tesla 11.78 Hz Earth Resonance</w:t>
       </w:r>
-      <w:bookmarkEnd w:id="101"/>
+      <w:bookmarkEnd w:id="1"/>
     </w:p>
     <w:p>
       <w:pPr>
@@ -8859,7 +8889,7 @@
       <w:r>
         <w:t xml:space="preserve">US Patent 787412 (1905), publicly available at </w:t>
       </w:r>
-      <w:hyperlink w:history="1" r:id="rIdbotgicmwktgvz_lvortdi">
+      <w:hyperlink w:history="1" r:id="rIdb5uqtq0w3uerrubq0ckzz">
         <w:r>
           <w:rPr>
             <w:rStyle w:val="Hyperlink"/>
@@ -8890,15 +8920,15 @@
       <w:pPr>
         <w:pStyle w:val="Heading3"/>
       </w:pPr>
-      <w:bookmarkStart w:name="WIN_008" w:id="102"/>
+      <w:bookmarkStart w:name="WIN_008" w:id="2"/>
       <w:r>
         <w:t xml:space="preserve">WIN-008/009: Telluric 11.7-12 Hz Peak/Cutoff</w:t>
       </w:r>
-      <w:bookmarkEnd w:id="102"/>
-    </w:p>
-    <w:p>
-      <w:bookmarkStart w:name="WIN_009" w:id="103"/>
-      <w:bookmarkEnd w:id="103"/>
+      <w:bookmarkEnd w:id="1"/>
+    </w:p>
+    <w:p>
+      <w:bookmarkStart w:name="WIN_009" w:id="3"/>
+      <w:bookmarkEnd w:id="1"/>
     </w:p>
     <w:p>
       <w:pPr>
@@ -8949,11 +8979,11 @@
       <w:pPr>
         <w:pStyle w:val="Heading3"/>
       </w:pPr>
-      <w:bookmarkStart w:name="WIN_016" w:id="104"/>
+      <w:bookmarkStart w:name="WIN_016" w:id="4"/>
       <w:r>
         <w:t xml:space="preserve">WIN-016: Annual Aberration via Dome Refraction</w:t>
       </w:r>
-      <w:bookmarkEnd w:id="104"/>
+      <w:bookmarkEnd w:id="1"/>
     </w:p>
     <w:p>
       <w:pPr>
@@ -8984,7 +9014,7 @@
       <w:r>
         <w:t xml:space="preserve">James Bradley (1727) explicitly tested and rejected atmospheric refraction as an explanation: refraction is wavelength-dependent (chromatic), while stellar aberration is achromatic. Modern VLBI measurements achieve milliarcsecond precision and directly confirm aberration correlates with Earth's orbital velocity (~30 km/s). The </w:t>
       </w:r>
-      <w:hyperlink w:history="1" r:id="rIdhbgr2gttculpvzgaykoaa">
+      <w:hyperlink w:history="1" r:id="rIdig6apfwu8pikzt38bu2qm">
         <w:r>
           <w:rPr>
             <w:rStyle w:val="Hyperlink"/>
@@ -9015,11 +9045,11 @@
       <w:pPr>
         <w:pStyle w:val="Heading3"/>
       </w:pPr>
-      <w:bookmarkStart w:name="WIN_017" w:id="105"/>
+      <w:bookmarkStart w:name="WIN_017" w:id="5"/>
       <w:r>
         <w:t xml:space="preserve">WIN-017: Stellar Parallax as Firmament Wobble</w:t>
       </w:r>
-      <w:bookmarkEnd w:id="105"/>
+      <w:bookmarkEnd w:id="1"/>
     </w:p>
     <w:p>
       <w:pPr>
@@ -9050,7 +9080,7 @@
       <w:r>
         <w:t xml:space="preserve">ESA </w:t>
       </w:r>
-      <w:hyperlink w:history="1" r:id="rIdo9hsjgp8falkqvbtq_gzh">
+      <w:hyperlink w:history="1" r:id="rIdehr_sb6asyy7wl2zzwwl6">
         <w:r>
           <w:rPr>
             <w:rStyle w:val="Hyperlink"/>
@@ -9081,11 +9111,11 @@
       <w:pPr>
         <w:pStyle w:val="Heading3"/>
       </w:pPr>
-      <w:bookmarkStart w:name="WIN_026" w:id="106"/>
+      <w:bookmarkStart w:name="WIN_026" w:id="6"/>
       <w:r>
         <w:t xml:space="preserve">WIN-026: Crepuscular Ray Divergence</w:t>
       </w:r>
-      <w:bookmarkEnd w:id="106"/>
+      <w:bookmarkEnd w:id="1"/>
     </w:p>
     <w:p>
       <w:pPr>
@@ -9116,7 +9146,7 @@
       <w:r>
         <w:t xml:space="preserve">Crepuscular rays are parallel beams made visible by atmospheric scattering. The apparent divergence is a perspective effect. Crucially, anticrepuscular rays converge at the anti-solar point simultaneously. See </w:t>
       </w:r>
-      <w:hyperlink w:history="1" r:id="rIdjbykvo-c1rxpi66xbdygf">
+      <w:hyperlink w:history="1" r:id="rIdetqkkcc42hitpkq5c-pi0">
         <w:r>
           <w:rPr>
             <w:rStyle w:val="Hyperlink"/>
@@ -9127,7 +9157,7 @@
       <w:r>
         <w:t xml:space="preserve"> and </w:t>
       </w:r>
-      <w:hyperlink w:history="1" r:id="rIdlksilrbbcvwypjofgs3_u">
+      <w:hyperlink w:history="1" r:id="rIdhjqcezkihi_up-po56gmh">
         <w:r>
           <w:rPr>
             <w:rStyle w:val="Hyperlink"/>
@@ -9158,11 +9188,11 @@
       <w:pPr>
         <w:pStyle w:val="Heading3"/>
       </w:pPr>
-      <w:bookmarkStart w:name="WIN_028" w:id="107"/>
+      <w:bookmarkStart w:name="WIN_028" w:id="7"/>
       <w:r>
         <w:t xml:space="preserve">WIN-028: Bermuda Triangle / East Japan Symmetry</w:t>
       </w:r>
-      <w:bookmarkEnd w:id="107"/>
+      <w:bookmarkEnd w:id="1"/>
     </w:p>
     <w:p>
       <w:pPr>
@@ -9193,7 +9223,7 @@
       <w:r>
         <w:t xml:space="preserve">NOAA officially states no evidence of anomalous disappearances. </w:t>
       </w:r>
-      <w:hyperlink w:history="1" r:id="rIdpkl-yifk9xf-f9titoavi">
+      <w:hyperlink w:history="1" r:id="rIdsxv5lhjkuvlh0d5qnal7q">
         <w:r>
           <w:rPr>
             <w:rStyle w:val="Hyperlink"/>
@@ -9224,11 +9254,11 @@
       <w:pPr>
         <w:pStyle w:val="Heading3"/>
       </w:pPr>
-      <w:bookmarkStart w:name="WIN_033" w:id="108"/>
+      <w:bookmarkStart w:name="WIN_033" w:id="8"/>
       <w:r>
         <w:t xml:space="preserve">WIN-033: Sigma Octantis Dimness Asymmetry</w:t>
       </w:r>
-      <w:bookmarkEnd w:id="108"/>
+      <w:bookmarkEnd w:id="1"/>
     </w:p>
     <w:p>
       <w:pPr>
@@ -9259,7 +9289,7 @@
       <w:r>
         <w:t xml:space="preserve">Hipparcos </w:t>
       </w:r>
-      <w:hyperlink w:history="1" r:id="rIdflqbwwln2xrwle9_80o7z">
+      <w:hyperlink w:history="1" r:id="rIdym_b9flpz-m1fagb2p-6r">
         <w:r>
           <w:rPr>
             <w:rStyle w:val="Hyperlink"/>
@@ -9365,11 +9395,11 @@
       <w:pPr>
         <w:pStyle w:val="Heading3"/>
       </w:pPr>
-      <w:bookmarkStart w:name="WIN_053" w:id="109"/>
+      <w:bookmarkStart w:name="WIN_053" w:id="9"/>
       <w:r>
         <w:t xml:space="preserve">WIN-053: Two-Pole Geomagnetic Model</w:t>
       </w:r>
-      <w:bookmarkEnd w:id="109"/>
+      <w:bookmarkEnd w:id="1"/>
     </w:p>
     <w:p>
       <w:pPr>
@@ -9450,11 +9480,11 @@
       <w:pPr>
         <w:pStyle w:val="Heading3"/>
       </w:pPr>
-      <w:bookmarkStart w:name="WIN_062" w:id="110"/>
+      <w:bookmarkStart w:name="WIN_062" w:id="10"/>
       <w:r>
         <w:t xml:space="preserve">WIN-062: Tesla Longitudinal Wave Speed = 1.574c</w:t>
       </w:r>
-      <w:bookmarkEnd w:id="110"/>
+      <w:bookmarkEnd w:id="1"/>
     </w:p>
     <w:p>
       <w:pPr>
@@ -9505,11 +9535,11 @@
       <w:pPr>
         <w:pStyle w:val="Heading3"/>
       </w:pPr>
-      <w:bookmarkStart w:name="WIN_065" w:id="111"/>
+      <w:bookmarkStart w:name="WIN_065" w:id="11"/>
       <w:r>
         <w:t xml:space="preserve">WIN-065: Polaris Systematic Excess +0.27°</w:t>
       </w:r>
-      <w:bookmarkEnd w:id="111"/>
+      <w:bookmarkEnd w:id="1"/>
     </w:p>
     <w:p>
       <w:pPr>
@@ -9581,11 +9611,11 @@
       <w:pPr>
         <w:pStyle w:val="Heading3"/>
       </w:pPr>
-      <w:bookmarkStart w:name="WIN_002" w:id="112"/>
+      <w:bookmarkStart w:name="WIN_002" w:id="12"/>
       <w:r>
         <w:t xml:space="preserve">WIN-002: Schumann 26% Aetheric Damping</w:t>
       </w:r>
-      <w:bookmarkEnd w:id="112"/>
+      <w:bookmarkEnd w:id="1"/>
     </w:p>
     <w:p>
       <w:pPr>
@@ -9636,15 +9666,15 @@
       <w:pPr>
         <w:pStyle w:val="Heading3"/>
       </w:pPr>
-      <w:bookmarkStart w:name="WIN_004" w:id="113"/>
+      <w:bookmarkStart w:name="WIN_004" w:id="13"/>
       <w:r>
         <w:t xml:space="preserve">WIN-004/005: SAA Separation and Asymmetric Decay</w:t>
       </w:r>
-      <w:bookmarkEnd w:id="113"/>
-    </w:p>
-    <w:p>
-      <w:bookmarkStart w:name="WIN_005" w:id="114"/>
-      <w:bookmarkEnd w:id="114"/>
+      <w:bookmarkEnd w:id="1"/>
+    </w:p>
+    <w:p>
+      <w:bookmarkStart w:name="WIN_005" w:id="14"/>
+      <w:bookmarkEnd w:id="1"/>
     </w:p>
     <w:p>
       <w:pPr>
@@ -9675,7 +9705,7 @@
       <w:r>
         <w:t xml:space="preserve">Terra-Nova et al. (2017, PNAS) demonstrate reversed-flux patches reproduce SAA splitting in MHD simulations. The </w:t>
       </w:r>
-      <w:hyperlink w:history="1" r:id="rIdpisby8vlkyfkmvfqtlozg">
+      <w:hyperlink w:history="1" r:id="rIdmn8wqm6olvsgfh3xf-jkr">
         <w:r>
           <w:rPr>
             <w:rStyle w:val="Hyperlink"/>
@@ -9686,7 +9716,7 @@
       <w:r>
         <w:t xml:space="preserve"> documents the evolution quantitatively. </w:t>
       </w:r>
-      <w:hyperlink w:history="1" r:id="rId6qoof5c5xfkdqreomhh1a">
+      <w:hyperlink w:history="1" r:id="rIdssan-tbyd68vmmwcoimjl">
         <w:r>
           <w:rPr>
             <w:rStyle w:val="Hyperlink"/>
@@ -9717,11 +9747,11 @@
       <w:pPr>
         <w:pStyle w:val="Heading3"/>
       </w:pPr>
-      <w:bookmarkStart w:name="WIN_006" w:id="115"/>
+      <w:bookmarkStart w:name="WIN_006" w:id="15"/>
       <w:r>
         <w:t xml:space="preserve">WIN-006: NP Pre-1990 Linear Drift</w:t>
       </w:r>
-      <w:bookmarkEnd w:id="115"/>
+      <w:bookmarkEnd w:id="1"/>
     </w:p>
     <w:p>
       <w:pPr>
@@ -9737,7 +9767,7 @@
       <w:r>
         <w:t xml:space="preserve">Normal secular variation documented by </w:t>
       </w:r>
-      <w:hyperlink w:history="1" r:id="rIdn4zgqrriahmlrcgxttepf">
+      <w:hyperlink w:history="1" r:id="rIdbeaq6dbtwzph_wzu6fffr">
         <w:r>
           <w:rPr>
             <w:rStyle w:val="Hyperlink"/>
@@ -9765,15 +9795,15 @@
       <w:pPr>
         <w:pStyle w:val="Heading3"/>
       </w:pPr>
-      <w:bookmarkStart w:name="WIN_010" w:id="116"/>
+      <w:bookmarkStart w:name="WIN_010" w:id="16"/>
       <w:r>
         <w:t xml:space="preserve">WIN-010/025: Eclipse Magnetic Anomalies</w:t>
       </w:r>
-      <w:bookmarkEnd w:id="116"/>
-    </w:p>
-    <w:p>
-      <w:bookmarkStart w:name="WIN_025" w:id="117"/>
-      <w:bookmarkEnd w:id="117"/>
+      <w:bookmarkEnd w:id="1"/>
+    </w:p>
+    <w:p>
+      <w:bookmarkStart w:name="WIN_025" w:id="17"/>
+      <w:bookmarkEnd w:id="1"/>
     </w:p>
     <w:p>
       <w:pPr>
@@ -9804,7 +9834,7 @@
       <w:r>
         <w:t xml:space="preserve">Eclipse-induced perturbations predicted by Chapman (1933) via ionospheric conductivity drops. Data from </w:t>
       </w:r>
-      <w:hyperlink w:history="1" r:id="rIdw7hpfkes8h1hxosaezmke">
+      <w:hyperlink w:history="1" r:id="rIdrmdgx_puhak15g5me7xw2">
         <w:r>
           <w:rPr>
             <w:rStyle w:val="Hyperlink"/>
@@ -9835,11 +9865,11 @@
       <w:pPr>
         <w:pStyle w:val="Heading3"/>
       </w:pPr>
-      <w:bookmarkStart w:name="WIN_020" w:id="118"/>
+      <w:bookmarkStart w:name="WIN_020" w:id="18"/>
       <w:r>
         <w:t xml:space="preserve">WIN-020: Lunar 18.6-Year Cycle via Epicyclic Gears</w:t>
       </w:r>
-      <w:bookmarkEnd w:id="118"/>
+      <w:bookmarkEnd w:id="1"/>
     </w:p>
     <w:p>
       <w:pPr>
@@ -9872,11 +9902,11 @@
       <w:pPr>
         <w:pStyle w:val="Heading3"/>
       </w:pPr>
-      <w:bookmarkStart w:name="WIN_029" w:id="119"/>
+      <w:bookmarkStart w:name="WIN_029" w:id="19"/>
       <w:r>
         <w:t xml:space="preserve">WIN-029: Schumann Requires Hard Conductive Ceiling</w:t>
       </w:r>
-      <w:bookmarkEnd w:id="119"/>
+      <w:bookmarkEnd w:id="1"/>
     </w:p>
     <w:p>
       <w:pPr>
@@ -9892,7 +9922,7 @@
       <w:r>
         <w:t xml:space="preserve">The formula used is for a quarter-wave linear waveguide, not a spherical cavity. Correct formula f = c/(2*pi*R) gives R = 6,098 km, within 4% of Earth's radius. The ionosphere IS conductive (</w:t>
       </w:r>
-      <w:hyperlink w:history="1" r:id="rId-9jd-qhkb7sx3c6ksgl8e">
+      <w:hyperlink w:history="1" r:id="rIdj5vajpye04b2gzklytb5w">
         <w:r>
           <w:rPr>
             <w:rStyle w:val="Hyperlink"/>
@@ -9923,27 +9953,27 @@
       <w:pPr>
         <w:pStyle w:val="Heading3"/>
       </w:pPr>
-      <w:bookmarkStart w:name="WIN_035" w:id="120"/>
+      <w:bookmarkStart w:name="WIN_035" w:id="20"/>
       <w:r>
         <w:t xml:space="preserve">WIN-035-039: Weekly Confirmations</w:t>
       </w:r>
-      <w:bookmarkEnd w:id="120"/>
-    </w:p>
-    <w:p>
-      <w:bookmarkStart w:name="WIN_036" w:id="121"/>
-      <w:bookmarkEnd w:id="121"/>
-    </w:p>
-    <w:p>
-      <w:bookmarkStart w:name="WIN_037" w:id="122"/>
-      <w:bookmarkEnd w:id="122"/>
-    </w:p>
-    <w:p>
-      <w:bookmarkStart w:name="WIN_038" w:id="123"/>
-      <w:bookmarkEnd w:id="123"/>
-    </w:p>
-    <w:p>
-      <w:bookmarkStart w:name="WIN_039" w:id="124"/>
-      <w:bookmarkEnd w:id="124"/>
+      <w:bookmarkEnd w:id="1"/>
+    </w:p>
+    <w:p>
+      <w:bookmarkStart w:name="WIN_036" w:id="21"/>
+      <w:bookmarkEnd w:id="1"/>
+    </w:p>
+    <w:p>
+      <w:bookmarkStart w:name="WIN_037" w:id="22"/>
+      <w:bookmarkEnd w:id="1"/>
+    </w:p>
+    <w:p>
+      <w:bookmarkStart w:name="WIN_038" w:id="23"/>
+      <w:bookmarkEnd w:id="1"/>
+    </w:p>
+    <w:p>
+      <w:bookmarkStart w:name="WIN_039" w:id="24"/>
+      <w:bookmarkEnd w:id="1"/>
     </w:p>
     <w:p>
       <w:pPr>
@@ -9959,7 +9989,7 @@
       <w:r>
         <w:t xml:space="preserve">All five observations already predicted by </w:t>
       </w:r>
-      <w:hyperlink w:history="1" r:id="rIddeznshdonc1bpaqyl3tnu">
+      <w:hyperlink w:history="1" r:id="rIdurrmdjuw7bt-r64osdxxu">
         <w:r>
           <w:rPr>
             <w:rStyle w:val="Hyperlink"/>
@@ -9970,7 +10000,7 @@
       <w:r>
         <w:t xml:space="preserve">, </w:t>
       </w:r>
-      <w:hyperlink w:history="1" r:id="rIdcbyvhl_9zlf2uir5r7aeo">
+      <w:hyperlink w:history="1" r:id="rId7xhumwk7ilrk8w4beotue">
         <w:r>
           <w:rPr>
             <w:rStyle w:val="Hyperlink"/>
@@ -9998,39 +10028,39 @@
       <w:pPr>
         <w:pStyle w:val="Heading3"/>
       </w:pPr>
-      <w:bookmarkStart w:name="WIN_040" w:id="125"/>
+      <w:bookmarkStart w:name="WIN_040" w:id="25"/>
       <w:r>
         <w:t xml:space="preserve">WIN-040-043, 059-061, 063: Geomagnetic Re-slicing</w:t>
       </w:r>
-      <w:bookmarkEnd w:id="125"/>
-    </w:p>
-    <w:p>
-      <w:bookmarkStart w:name="WIN_041" w:id="126"/>
-      <w:bookmarkEnd w:id="126"/>
-    </w:p>
-    <w:p>
-      <w:bookmarkStart w:name="WIN_042" w:id="127"/>
-      <w:bookmarkEnd w:id="127"/>
-    </w:p>
-    <w:p>
-      <w:bookmarkStart w:name="WIN_043" w:id="128"/>
-      <w:bookmarkEnd w:id="128"/>
-    </w:p>
-    <w:p>
-      <w:bookmarkStart w:name="WIN_059" w:id="129"/>
-      <w:bookmarkEnd w:id="129"/>
-    </w:p>
-    <w:p>
-      <w:bookmarkStart w:name="WIN_060" w:id="130"/>
-      <w:bookmarkEnd w:id="130"/>
-    </w:p>
-    <w:p>
-      <w:bookmarkStart w:name="WIN_061" w:id="131"/>
-      <w:bookmarkEnd w:id="131"/>
-    </w:p>
-    <w:p>
-      <w:bookmarkStart w:name="WIN_063" w:id="132"/>
-      <w:bookmarkEnd w:id="132"/>
+      <w:bookmarkEnd w:id="1"/>
+    </w:p>
+    <w:p>
+      <w:bookmarkStart w:name="WIN_041" w:id="26"/>
+      <w:bookmarkEnd w:id="1"/>
+    </w:p>
+    <w:p>
+      <w:bookmarkStart w:name="WIN_042" w:id="27"/>
+      <w:bookmarkEnd w:id="1"/>
+    </w:p>
+    <w:p>
+      <w:bookmarkStart w:name="WIN_043" w:id="28"/>
+      <w:bookmarkEnd w:id="1"/>
+    </w:p>
+    <w:p>
+      <w:bookmarkStart w:name="WIN_059" w:id="29"/>
+      <w:bookmarkEnd w:id="1"/>
+    </w:p>
+    <w:p>
+      <w:bookmarkStart w:name="WIN_060" w:id="30"/>
+      <w:bookmarkEnd w:id="1"/>
+    </w:p>
+    <w:p>
+      <w:bookmarkStart w:name="WIN_061" w:id="31"/>
+      <w:bookmarkEnd w:id="1"/>
+    </w:p>
+    <w:p>
+      <w:bookmarkStart w:name="WIN_063" w:id="32"/>
+      <w:bookmarkEnd w:id="1"/>
     </w:p>
     <w:p>
       <w:pPr>
@@ -10081,27 +10111,27 @@
       <w:pPr>
         <w:pStyle w:val="Heading3"/>
       </w:pPr>
-      <w:bookmarkStart w:name="WIN_045" w:id="133"/>
+      <w:bookmarkStart w:name="WIN_045" w:id="33"/>
       <w:r>
         <w:t xml:space="preserve">WIN-045/046/049/050/051: Tidal Constituent Periods</w:t>
       </w:r>
-      <w:bookmarkEnd w:id="133"/>
-    </w:p>
-    <w:p>
-      <w:bookmarkStart w:name="WIN_046" w:id="134"/>
-      <w:bookmarkEnd w:id="134"/>
-    </w:p>
-    <w:p>
-      <w:bookmarkStart w:name="WIN_049" w:id="135"/>
-      <w:bookmarkEnd w:id="135"/>
-    </w:p>
-    <w:p>
-      <w:bookmarkStart w:name="WIN_050" w:id="136"/>
-      <w:bookmarkEnd w:id="136"/>
-    </w:p>
-    <w:p>
-      <w:bookmarkStart w:name="WIN_051" w:id="137"/>
-      <w:bookmarkEnd w:id="137"/>
+      <w:bookmarkEnd w:id="1"/>
+    </w:p>
+    <w:p>
+      <w:bookmarkStart w:name="WIN_046" w:id="34"/>
+      <w:bookmarkEnd w:id="1"/>
+    </w:p>
+    <w:p>
+      <w:bookmarkStart w:name="WIN_049" w:id="35"/>
+      <w:bookmarkEnd w:id="1"/>
+    </w:p>
+    <w:p>
+      <w:bookmarkStart w:name="WIN_050" w:id="36"/>
+      <w:bookmarkEnd w:id="1"/>
+    </w:p>
+    <w:p>
+      <w:bookmarkStart w:name="WIN_051" w:id="37"/>
+      <w:bookmarkEnd w:id="1"/>
     </w:p>
     <w:p>
       <w:pPr>
@@ -10152,11 +10182,11 @@
       <w:pPr>
         <w:pStyle w:val="Heading3"/>
       </w:pPr>
-      <w:bookmarkStart w:name="WIN_064" w:id="138"/>
+      <w:bookmarkStart w:name="WIN_064" w:id="38"/>
       <w:r>
         <w:t xml:space="preserve">WIN-064: P-Wave Shadow Zone Geometric Lock</w:t>
       </w:r>
-      <w:bookmarkEnd w:id="138"/>
+      <w:bookmarkEnd w:id="1"/>
     </w:p>
     <w:p>
       <w:pPr>
@@ -10207,11 +10237,11 @@
       <w:pPr>
         <w:pStyle w:val="Heading3"/>
       </w:pPr>
-      <w:bookmarkStart w:name="WIN_066" w:id="139"/>
+      <w:bookmarkStart w:name="WIN_066" w:id="39"/>
       <w:r>
         <w:t xml:space="preserve">WIN-066: NH Heat Excess +0.34 W/m² Asymmetry</w:t>
       </w:r>
-      <w:bookmarkEnd w:id="139"/>
+      <w:bookmarkEnd w:id="1"/>
     </w:p>
     <w:p>
       <w:pPr>
@@ -10262,11 +10292,11 @@
       <w:pPr>
         <w:pStyle w:val="Heading3"/>
       </w:pPr>
-      <w:bookmarkStart w:name="WIN_067" w:id="140"/>
+      <w:bookmarkStart w:name="WIN_067" w:id="40"/>
       <w:r>
         <w:t xml:space="preserve">WIN-067: Antarctic Gravity Hole</w:t>
       </w:r>
-      <w:bookmarkEnd w:id="140"/>
+      <w:bookmarkEnd w:id="1"/>
     </w:p>
     <w:p>
       <w:pPr>
@@ -10297,7 +10327,7 @@
       <w:r>
         <w:t xml:space="preserve">Antarctic gravity anomalies are mapped from orbit by </w:t>
       </w:r>
-      <w:hyperlink w:history="1" r:id="rId2nlb1c1c28ppnd_zirwzn">
+      <w:hyperlink w:history="1" r:id="rIdei-nyggnqcmrtaqah7jzk">
         <w:r>
           <w:rPr>
             <w:rStyle w:val="Hyperlink"/>
@@ -10308,7 +10338,7 @@
       <w:r>
         <w:t xml:space="preserve"> and </w:t>
       </w:r>
-      <w:hyperlink w:history="1" r:id="rIdfoezagdny-4dwfo5rnena">
+      <w:hyperlink w:history="1" r:id="rIdf9lgajyhfety7knoszmps">
         <w:r>
           <w:rPr>
             <w:rStyle w:val="Hyperlink"/>
@@ -10352,15 +10382,15 @@
       <w:pPr>
         <w:pStyle w:val="Heading3"/>
       </w:pPr>
-      <w:bookmarkStart w:name="WIN_011" w:id="141"/>
+      <w:bookmarkStart w:name="WIN_011" w:id="41"/>
       <w:r>
         <w:t xml:space="preserve">WIN-011/012: Mohe Gravity Anomaly and Coupling Constant</w:t>
       </w:r>
-      <w:bookmarkEnd w:id="141"/>
-    </w:p>
-    <w:p>
-      <w:bookmarkStart w:name="WIN_012" w:id="142"/>
-      <w:bookmarkEnd w:id="142"/>
+      <w:bookmarkEnd w:id="1"/>
+    </w:p>
+    <w:p>
+      <w:bookmarkStart w:name="WIN_012" w:id="42"/>
+      <w:bookmarkEnd w:id="1"/>
     </w:p>
     <w:p>
       <w:pPr>
@@ -10411,11 +10441,11 @@
       <w:pPr>
         <w:pStyle w:val="Heading3"/>
       </w:pPr>
-      <w:bookmarkStart w:name="WIN_015" w:id="143"/>
+      <w:bookmarkStart w:name="WIN_015" w:id="43"/>
       <w:r>
         <w:t xml:space="preserve">WIN-015: Meyl Scalar Wave Faraday Penetration</w:t>
       </w:r>
-      <w:bookmarkEnd w:id="143"/>
+      <w:bookmarkEnd w:id="1"/>
     </w:p>
     <w:p>
       <w:pPr>
@@ -10458,100 +10488,100 @@
       </w:r>
     </w:p>
     <w:p>
-      <w:bookmarkStart w:name="WIN_003" w:id="144"/>
-      <w:bookmarkEnd w:id="144"/>
-    </w:p>
-    <w:p>
-      <w:bookmarkStart w:name="WIN_007" w:id="145"/>
-      <w:bookmarkEnd w:id="145"/>
-    </w:p>
-    <w:p>
-      <w:bookmarkStart w:name="WIN_013" w:id="146"/>
-      <w:bookmarkEnd w:id="146"/>
-    </w:p>
-    <w:p>
-      <w:bookmarkStart w:name="WIN_014" w:id="147"/>
-      <w:bookmarkEnd w:id="147"/>
-    </w:p>
-    <w:p>
-      <w:bookmarkStart w:name="WIN_018" w:id="148"/>
-      <w:bookmarkEnd w:id="148"/>
-    </w:p>
-    <w:p>
-      <w:bookmarkStart w:name="WIN_019" w:id="149"/>
-      <w:bookmarkEnd w:id="149"/>
-    </w:p>
-    <w:p>
-      <w:bookmarkStart w:name="WIN_021" w:id="150"/>
-      <w:bookmarkEnd w:id="150"/>
-    </w:p>
-    <w:p>
-      <w:bookmarkStart w:name="WIN_022" w:id="151"/>
-      <w:bookmarkEnd w:id="151"/>
-    </w:p>
-    <w:p>
-      <w:bookmarkStart w:name="WIN_023" w:id="152"/>
-      <w:bookmarkEnd w:id="152"/>
-    </w:p>
-    <w:p>
-      <w:bookmarkStart w:name="WIN_024" w:id="153"/>
-      <w:bookmarkEnd w:id="153"/>
-    </w:p>
-    <w:p>
-      <w:bookmarkStart w:name="WIN_027" w:id="154"/>
-      <w:bookmarkEnd w:id="154"/>
-    </w:p>
-    <w:p>
-      <w:bookmarkStart w:name="WIN_030" w:id="155"/>
-      <w:bookmarkEnd w:id="155"/>
-    </w:p>
-    <w:p>
-      <w:bookmarkStart w:name="WIN_031" w:id="156"/>
-      <w:bookmarkEnd w:id="156"/>
-    </w:p>
-    <w:p>
-      <w:bookmarkStart w:name="WIN_032" w:id="157"/>
-      <w:bookmarkEnd w:id="157"/>
-    </w:p>
-    <w:p>
-      <w:bookmarkStart w:name="WIN_034" w:id="158"/>
-      <w:bookmarkEnd w:id="158"/>
-    </w:p>
-    <w:p>
-      <w:bookmarkStart w:name="WIN_044" w:id="159"/>
-      <w:bookmarkEnd w:id="159"/>
-    </w:p>
-    <w:p>
-      <w:bookmarkStart w:name="WIN_047" w:id="160"/>
-      <w:bookmarkEnd w:id="160"/>
-    </w:p>
-    <w:p>
-      <w:bookmarkStart w:name="WIN_048" w:id="161"/>
-      <w:bookmarkEnd w:id="161"/>
-    </w:p>
-    <w:p>
-      <w:bookmarkStart w:name="WIN_052" w:id="162"/>
-      <w:bookmarkEnd w:id="162"/>
-    </w:p>
-    <w:p>
-      <w:bookmarkStart w:name="WIN_054" w:id="163"/>
-      <w:bookmarkEnd w:id="163"/>
-    </w:p>
-    <w:p>
-      <w:bookmarkStart w:name="WIN_055" w:id="164"/>
-      <w:bookmarkEnd w:id="164"/>
-    </w:p>
-    <w:p>
-      <w:bookmarkStart w:name="WIN_056" w:id="165"/>
-      <w:bookmarkEnd w:id="165"/>
-    </w:p>
-    <w:p>
-      <w:bookmarkStart w:name="WIN_057" w:id="166"/>
-      <w:bookmarkEnd w:id="166"/>
-    </w:p>
-    <w:p>
-      <w:bookmarkStart w:name="WIN_058" w:id="167"/>
-      <w:bookmarkEnd w:id="167"/>
+      <w:bookmarkStart w:name="WIN_003" w:id="44"/>
+      <w:bookmarkEnd w:id="1"/>
+    </w:p>
+    <w:p>
+      <w:bookmarkStart w:name="WIN_007" w:id="45"/>
+      <w:bookmarkEnd w:id="1"/>
+    </w:p>
+    <w:p>
+      <w:bookmarkStart w:name="WIN_013" w:id="46"/>
+      <w:bookmarkEnd w:id="1"/>
+    </w:p>
+    <w:p>
+      <w:bookmarkStart w:name="WIN_014" w:id="47"/>
+      <w:bookmarkEnd w:id="1"/>
+    </w:p>
+    <w:p>
+      <w:bookmarkStart w:name="WIN_018" w:id="48"/>
+      <w:bookmarkEnd w:id="1"/>
+    </w:p>
+    <w:p>
+      <w:bookmarkStart w:name="WIN_019" w:id="49"/>
+      <w:bookmarkEnd w:id="1"/>
+    </w:p>
+    <w:p>
+      <w:bookmarkStart w:name="WIN_021" w:id="50"/>
+      <w:bookmarkEnd w:id="1"/>
+    </w:p>
+    <w:p>
+      <w:bookmarkStart w:name="WIN_022" w:id="51"/>
+      <w:bookmarkEnd w:id="1"/>
+    </w:p>
+    <w:p>
+      <w:bookmarkStart w:name="WIN_023" w:id="52"/>
+      <w:bookmarkEnd w:id="1"/>
+    </w:p>
+    <w:p>
+      <w:bookmarkStart w:name="WIN_024" w:id="53"/>
+      <w:bookmarkEnd w:id="1"/>
+    </w:p>
+    <w:p>
+      <w:bookmarkStart w:name="WIN_027" w:id="54"/>
+      <w:bookmarkEnd w:id="1"/>
+    </w:p>
+    <w:p>
+      <w:bookmarkStart w:name="WIN_030" w:id="55"/>
+      <w:bookmarkEnd w:id="1"/>
+    </w:p>
+    <w:p>
+      <w:bookmarkStart w:name="WIN_031" w:id="56"/>
+      <w:bookmarkEnd w:id="1"/>
+    </w:p>
+    <w:p>
+      <w:bookmarkStart w:name="WIN_032" w:id="57"/>
+      <w:bookmarkEnd w:id="1"/>
+    </w:p>
+    <w:p>
+      <w:bookmarkStart w:name="WIN_034" w:id="58"/>
+      <w:bookmarkEnd w:id="1"/>
+    </w:p>
+    <w:p>
+      <w:bookmarkStart w:name="WIN_044" w:id="59"/>
+      <w:bookmarkEnd w:id="1"/>
+    </w:p>
+    <w:p>
+      <w:bookmarkStart w:name="WIN_047" w:id="60"/>
+      <w:bookmarkEnd w:id="1"/>
+    </w:p>
+    <w:p>
+      <w:bookmarkStart w:name="WIN_048" w:id="61"/>
+      <w:bookmarkEnd w:id="1"/>
+    </w:p>
+    <w:p>
+      <w:bookmarkStart w:name="WIN_052" w:id="62"/>
+      <w:bookmarkEnd w:id="1"/>
+    </w:p>
+    <w:p>
+      <w:bookmarkStart w:name="WIN_054" w:id="63"/>
+      <w:bookmarkEnd w:id="1"/>
+    </w:p>
+    <w:p>
+      <w:bookmarkStart w:name="WIN_055" w:id="64"/>
+      <w:bookmarkEnd w:id="1"/>
+    </w:p>
+    <w:p>
+      <w:bookmarkStart w:name="WIN_056" w:id="65"/>
+      <w:bookmarkEnd w:id="1"/>
+    </w:p>
+    <w:p>
+      <w:bookmarkStart w:name="WIN_057" w:id="66"/>
+      <w:bookmarkEnd w:id="1"/>
+    </w:p>
+    <w:p>
+      <w:bookmarkStart w:name="WIN_058" w:id="67"/>
+      <w:bookmarkEnd w:id="1"/>
     </w:p>
     <w:p>
       <w:pPr>
@@ -13284,7 +13314,7 @@
       <w:r>
         <w:t xml:space="preserve">A </w:t>
       </w:r>
-      <w:hyperlink w:history="1" r:id="rId8jaqa4uvnw1-o0scgmbhp">
+      <w:hyperlink w:history="1" r:id="rId1xixupcekqv_fbnx_lhbj">
         <w:r>
           <w:rPr>
             <w:rStyle w:val="Hyperlink"/>
@@ -13295,7 +13325,7 @@
       <w:r>
         <w:t xml:space="preserve"> found detectable decreases in X, Z, and total field components during eclipses. An </w:t>
       </w:r>
-      <w:hyperlink w:history="1" r:id="rIdjvzvnzb1zqwef06vlmjcb">
+      <w:hyperlink w:history="1" r:id="rId_3p4es71u4r0kr-zvlekh">
         <w:r>
           <w:rPr>
             <w:rStyle w:val="Hyperlink"/>
@@ -13785,7 +13815,7 @@
       <w:r>
         <w:t xml:space="preserve">Continuous 24-hour sunlight. A local sun at 5,733 km circling above a flat disc cannot produce 24-hour sunlight at the disc edge. Directly observable at Amundsen-Scott Station, staffed year-round since 1957. See </w:t>
       </w:r>
-      <w:hyperlink w:history="1" r:id="rIdsf43jszz9oeeuomtjqquc">
+      <w:hyperlink w:history="1" r:id="rIdytinqwudxlxg5_0d8mr6i">
         <w:r>
           <w:rPr>
             <w:rStyle w:val="Hyperlink"/>
@@ -13834,7 +13864,7 @@
       <w:r>
         <w:t xml:space="preserve">GPS provides 1-3 meter accuracy worldwide. The ISS at 408 km is visible on predictable schedules. Geostationary satellites at 35,786 km. All require unobstructed radio paths. See </w:t>
       </w:r>
-      <w:hyperlink w:history="1" r:id="rIdzgbxp421b79scfcdn8mt0">
+      <w:hyperlink w:history="1" r:id="rIdbumxpxaduh72rloqkh0dg">
         <w:r>
           <w:rPr>
             <w:rStyle w:val="Hyperlink"/>
@@ -13845,7 +13875,7 @@
       <w:r>
         <w:t xml:space="preserve">; </w:t>
       </w:r>
-      <w:hyperlink w:history="1" r:id="rIdnbdcmtp22efmti4tm_j2t">
+      <w:hyperlink w:history="1" r:id="rIdjv3rgzhpclr-hyistznzy">
         <w:r>
           <w:rPr>
             <w:rStyle w:val="Hyperlink"/>
@@ -13894,7 +13924,7 @@
       <w:r>
         <w:t xml:space="preserve">Modern solar calculators (</w:t>
       </w:r>
-      <w:hyperlink w:history="1" r:id="rId_ajb6otrnwl936kattea_">
+      <w:hyperlink w:history="1" r:id="rIdc2176lsto-wiaxvzsaaj7">
         <w:r>
           <w:rPr>
             <w:rStyle w:val="Hyperlink"/>
@@ -13943,7 +13973,7 @@
       <w:r>
         <w:t xml:space="preserve">The </w:t>
       </w:r>
-      <w:hyperlink w:history="1" r:id="rIdzaalfnzfztnpetg52gijo">
+      <w:hyperlink w:history="1" r:id="rIdb1lq5c-ipipjvxvlodtkf">
         <w:r>
           <w:rPr>
             <w:rStyle w:val="Hyperlink"/>
@@ -13992,7 +14022,7 @@
       <w:r>
         <w:t xml:space="preserve">Earth's field is a dipole. South magnetic pole at 64.1°S, 135.9°E (</w:t>
       </w:r>
-      <w:hyperlink w:history="1" r:id="rIdijvpmxesyvtwoaxwm6xmw">
+      <w:hyperlink w:history="1" r:id="rIdmpiercgengfsuqwn9tsjt">
         <w:r>
           <w:rPr>
             <w:rStyle w:val="Hyperlink"/>
@@ -14041,7 +14071,7 @@
       <w:r>
         <w:t xml:space="preserve">g = 9.780 m/s² at equator, 9.832 m/s² at poles (0.53% variation). On a flat disc, centrifugal force points outward from center, producing the OPPOSITE pattern. See </w:t>
       </w:r>
-      <w:hyperlink w:history="1" r:id="rIddlgszhqpqfbgvd4sutedm">
+      <w:hyperlink w:history="1" r:id="rIdxofoptqc0j9zetpjedbrw">
         <w:r>
           <w:rPr>
             <w:rStyle w:val="Hyperlink"/>
@@ -14450,7 +14480,7 @@
         <w:t xml:space="preserve">V51.0 update: </w:t>
       </w:r>
       <w:r>
-        <w:t xml:space="preserve">Now claims 67 wins (up from 39). But the context page itself reports 4 falsified predictions while the homepage claims 0. As documented in Part 2, of the 67 claimed wins: 11 are refuted by data, 25 are standard model observations, 21 are misleading, 3 are undemonstrated, and 4 are unfalsifiable. The instruction to not re-litigate is antithetical to scientific inquiry.</w:t>
+        <w:t xml:space="preserve">Now claims 67 wins (up from 39). But the context page itself reports 4 falsified predictions while the homepage claims 0. As documented in Part 2, of the 67 claimed wins: 11 are refuted by data, 15 are standard model observations, 11 self-contradict the dome's own geometry, 23 are misleading, 3 are undemonstrated, and 4 are unfalsifiable. The instruction to not re-litigate is antithetical to scientific inquiry.</w:t>
       </w:r>
     </w:p>
     <w:p>
@@ -14681,6 +14711,21 @@
     </w:p>
     <w:p>
       <w:pPr>
+        <w:spacing w:after="120"/>
+      </w:pPr>
+      <w:r>
+        <w:rPr>
+          <w:b/>
+          <w:bCs/>
+        </w:rPr>
+        <w:t xml:space="preserve">Pattern 11 (NEW): Self-Contradicting Own Geometry. </w:t>
+      </w:r>
+      <w:r>
+        <w:t xml:space="preserve">In 11 of 67 WINs, the dome's own stated geometry produces predictions that radically diverge from both reality and the author's claims. The dome cavity gives ~22 Hz for Schumann (not 7.83), 300,000× excess tidal forces, 90% gravity drop at the rim, and 50% solar diameter variation through the day. The author avoids these failures by substituting globe formulas, ignoring his own exponential height profile, or curve-fitting to observations. This pattern is the strongest argument against the model: it doesn't merely fail against external data — it contradicts itself.</w:t>
+      </w:r>
+    </w:p>
+    <w:p>
+      <w:pPr>
         <w:pStyle w:val="Heading2"/>
       </w:pPr>
       <w:r>
@@ -14743,7 +14788,7 @@
           <w:b/>
           <w:bCs/>
         </w:rPr>
-        <w:t xml:space="preserve">Standard Model Explains: 25 </w:t>
+        <w:t xml:space="preserve">Standard Model Explains: 15 </w:t>
       </w:r>
       <w:r>
         <w:t xml:space="preserve">(observation is real but mainstream physics already accounts for it)</w:t>
@@ -14758,7 +14803,22 @@
           <w:b/>
           <w:bCs/>
         </w:rPr>
-        <w:t xml:space="preserve">Misleading: 21 </w:t>
+        <w:t xml:space="preserve">Self-Contradicted: 11 </w:t>
+      </w:r>
+      <w:r>
+        <w:t xml:space="preserve">(the dome's own geometry, if worked through honestly, predicts radically different values)</w:t>
+      </w:r>
+    </w:p>
+    <w:p>
+      <w:pPr>
+        <w:spacing w:after="120"/>
+      </w:pPr>
+      <w:r>
+        <w:rPr>
+          <w:b/>
+          <w:bCs/>
+        </w:rPr>
+        <w:t xml:space="preserve">Misleading: 23 </w:t>
       </w:r>
       <w:r>
         <w:t xml:space="preserve">(data misrepresented, duplicated, cherry-picked, or logically contradictory)</w:t>
@@ -14829,7 +14889,7 @@
         <w:spacing w:after="120"/>
       </w:pPr>
       <w:r>
-        <w:t xml:space="preserve">None of the 67 claims demonstrate predictive power exceeding mainstream geophysical models. The 28 new WINs added in V51.0 include zero genuinely new, dome-specific predictions. The August 2026 eclipse test, initially identified as potentially discriminating, is revealed upon closer examination to be a misframed comparison: the dome's predicted range (derived from scaling actual Chapman-mechanism observations) overlaps with the published peer-reviewed range for quiet-day eclipse perturbations. No claimed test on the site produces a prediction that the globe model disagrees with and that the dome model uniquely explains.</w:t>
+        <w:t xml:space="preserve">None of the 67 claims demonstrate predictive power exceeding mainstream geophysical models. Of particular note: 11 WINs are now categorized as 'Self-Contradicted' — claims where the dome's own stated geometry, if worked through honestly, produces predictions that radically diverge from both observations and the author's claims. The model 'works' only because the author replaces his own physics with globe physics whenever the dome geometry produces the wrong answer. The 28 new WINs added in V51.0 include zero genuinely new, dome-specific predictions. No claimed test on the site produces a prediction that the globe model disagrees with and that the dome model uniquely explains.</w:t>
       </w:r>
     </w:p>
     <w:p>
@@ -14864,7 +14924,7 @@
         </w:rPr>
         <w:t xml:space="preserve">NOAA World Magnetic Model 2025: </w:t>
       </w:r>
-      <w:hyperlink w:history="1" r:id="rIddfxzuk8k9ilgvtjgzjnkk">
+      <w:hyperlink w:history="1" r:id="rIdfd-q8odtoltdmwuie33ve">
         <w:r>
           <w:rPr>
             <w:rStyle w:val="Hyperlink"/>
@@ -14884,7 +14944,7 @@
         </w:rPr>
         <w:t xml:space="preserve">NOAA Wandering Geomagnetic Poles: </w:t>
       </w:r>
-      <w:hyperlink w:history="1" r:id="rIdwyabpmetpze4nc-yzwymn">
+      <w:hyperlink w:history="1" r:id="rIdh2-butd9vdm-g4rb4p3ea">
         <w:r>
           <w:rPr>
             <w:rStyle w:val="Hyperlink"/>
@@ -14904,7 +14964,7 @@
         </w:rPr>
         <w:t xml:space="preserve">CHAOS-7 Geomagnetic Field Model: </w:t>
       </w:r>
-      <w:hyperlink w:history="1" r:id="rIdrdueaeyhyd2o4ns8kt_lr">
+      <w:hyperlink w:history="1" r:id="rIdufxsriqgmlbzkvtezjgai">
         <w:r>
           <w:rPr>
             <w:rStyle w:val="Hyperlink"/>
@@ -14924,7 +14984,7 @@
         </w:rPr>
         <w:t xml:space="preserve">ESA Swarm Satellite Mission: </w:t>
       </w:r>
-      <w:hyperlink w:history="1" r:id="rIdwtx9zqgnj1-211q-zpcji">
+      <w:hyperlink w:history="1" r:id="rIduc5mhhohvfa11x7-rjqru">
         <w:r>
           <w:rPr>
             <w:rStyle w:val="Hyperlink"/>
@@ -14944,7 +15004,7 @@
         </w:rPr>
         <w:t xml:space="preserve">INTERMAGNET Observatory Network: </w:t>
       </w:r>
-      <w:hyperlink w:history="1" r:id="rIdoapwdrojqoh25dowfipio">
+      <w:hyperlink w:history="1" r:id="rIdi2lu9dp5ubea9m8azexu_">
         <w:r>
           <w:rPr>
             <w:rStyle w:val="Hyperlink"/>
@@ -14964,7 +15024,7 @@
         </w:rPr>
         <w:t xml:space="preserve">IGRF-13: </w:t>
       </w:r>
-      <w:hyperlink w:history="1" r:id="rIdt34g0wu9opkhnpofgz7qg">
+      <w:hyperlink w:history="1" r:id="rIdorpgzsjbj4pcwmxaxmvbh">
         <w:r>
           <w:rPr>
             <w:rStyle w:val="Hyperlink"/>
@@ -14984,7 +15044,7 @@
         </w:rPr>
         <w:t xml:space="preserve">ESA Gaia Data Release 3: </w:t>
       </w:r>
-      <w:hyperlink w:history="1" r:id="rIdfk040og1fqqurivubhoj4">
+      <w:hyperlink w:history="1" r:id="rIdf9kq_vevqmbogtfbumidp">
         <w:r>
           <w:rPr>
             <w:rStyle w:val="Hyperlink"/>
@@ -15004,7 +15064,7 @@
         </w:rPr>
         <w:t xml:space="preserve">Hipparcos Catalogue: </w:t>
       </w:r>
-      <w:hyperlink w:history="1" r:id="rIda4hmdvnjkys64b-dtjpcr">
+      <w:hyperlink w:history="1" r:id="rIdxzea263vojt28krl2ycia">
         <w:r>
           <w:rPr>
             <w:rStyle w:val="Hyperlink"/>
@@ -15024,7 +15084,7 @@
         </w:rPr>
         <w:t xml:space="preserve">US Patent 787412 (Tesla): </w:t>
       </w:r>
-      <w:hyperlink w:history="1" r:id="rId2sfd_xwpeaib-97hfofgv">
+      <w:hyperlink w:history="1" r:id="rId8gg2vvsxzp9frtx1mdnks">
         <w:r>
           <w:rPr>
             <w:rStyle w:val="Hyperlink"/>
@@ -15044,7 +15104,7 @@
         </w:rPr>
         <w:t xml:space="preserve">NOAA Solar Position Algorithm: </w:t>
       </w:r>
-      <w:hyperlink w:history="1" r:id="rIdzhhgnugqq_zmofqt2sogk">
+      <w:hyperlink w:history="1" r:id="rIdsy7hqbwtbjmoz7lxtmlp5">
         <w:r>
           <w:rPr>
             <w:rStyle w:val="Hyperlink"/>
@@ -15064,7 +15124,7 @@
         </w:rPr>
         <w:t xml:space="preserve">National Geodetic Survey Gravity: </w:t>
       </w:r>
-      <w:hyperlink w:history="1" r:id="rId6c60g37xjpijmvmq-cpeq">
+      <w:hyperlink w:history="1" r:id="rIdlr41vkfbeqjkcov527yvz">
         <w:r>
           <w:rPr>
             <w:rStyle w:val="Hyperlink"/>
@@ -15084,7 +15144,7 @@
         </w:rPr>
         <w:t xml:space="preserve">CHIME/FRB Project: </w:t>
       </w:r>
-      <w:hyperlink w:history="1" r:id="rIdcdh082rt3y8fe4ydrv_0u">
+      <w:hyperlink w:history="1" r:id="rIdu8wcos5vlkj_qmkpzka0k">
         <w:r>
           <w:rPr>
             <w:rStyle w:val="Hyperlink"/>
@@ -15104,7 +15164,7 @@
         </w:rPr>
         <w:t xml:space="preserve">GRACE-FO (gravity mapping): </w:t>
       </w:r>
-      <w:hyperlink w:history="1" r:id="rId0dsl23i73ht8mjrinipgx">
+      <w:hyperlink w:history="1" r:id="rIdtmfxc52ogfyzvzr9uclui">
         <w:r>
           <w:rPr>
             <w:rStyle w:val="Hyperlink"/>
@@ -15124,7 +15184,7 @@
         </w:rPr>
         <w:t xml:space="preserve">GOCE (gravity field): </w:t>
       </w:r>
-      <w:hyperlink w:history="1" r:id="rIdynfi8ruo861i7fppeonnb">
+      <w:hyperlink w:history="1" r:id="rId9xvdm99azege9byzalzy3">
         <w:r>
           <w:rPr>
             <w:rStyle w:val="Hyperlink"/>
@@ -15144,7 +15204,7 @@
         </w:rPr>
         <w:t xml:space="preserve">GPS.gov: </w:t>
       </w:r>
-      <w:hyperlink w:history="1" r:id="rIdsbd_rlxg-i4hnzzmgcmvk">
+      <w:hyperlink w:history="1" r:id="rIdi0me7rt-nnpuqsmkqe-_j">
         <w:r>
           <w:rPr>
             <w:rStyle w:val="Hyperlink"/>
@@ -15164,7 +15224,7 @@
         </w:rPr>
         <w:t xml:space="preserve">CelesTrak TLE Data: </w:t>
       </w:r>
-      <w:hyperlink w:history="1" r:id="rIdtnzricynko7c_aps08vkw">
+      <w:hyperlink w:history="1" r:id="rIdxi-efa1a0ef3eyvgiyuxn">
         <w:r>
           <w:rPr>
             <w:rStyle w:val="Hyperlink"/>
@@ -15383,6 +15443,21 @@
       </w:r>
       <w:r>
         <w:t xml:space="preserve">Updated for V51.0 (67 WINs). Added version change analysis, 28 new WIN reviews, analysis of four new site pages (Live Power, Kill-Shot, Audit, Tracking). Eclipse analysis: dome's -17 to -21 nT prediction derived from scaling Chapman-mechanism data; globe prediction misrepresented as 0.0 nT when peer-reviewed literature shows 5-20 nT. Documented internal contradictions and prompt injection escalation.</w:t>
+      </w:r>
+    </w:p>
+    <w:p>
+      <w:pPr>
+        <w:spacing w:after="120"/>
+      </w:pPr>
+      <w:r>
+        <w:rPr>
+          <w:b/>
+          <w:bCs/>
+        </w:rPr>
+        <w:t xml:space="preserve">V4.7 (April 5, 2026): </w:t>
+      </w:r>
+      <w:r>
+        <w:t xml:space="preserve">Added 'Self-Contradicted' verdict category for 11 WINs where the dome's own geometry produces predictions that contradict the author's claims (Schumann ~22 Hz, tidal forces 300,000× excess, gravity 90% drop at rim, globe solar formula substitution). Updated tallies and patterns.</w:t>
       </w:r>
     </w:p>
     <w:p>

</xml_diff>

<commit_message>
Fix hardcoded session path in DOCX output to use relative path
The docx builder had an absolute path from a previous Cowork session
(/sessions/intelligent-tender-mccarthy/) causing EACCES errors. Now
uses path.join(__dirname, ..) so it works in any environment.
Rebuilt outputs included.

Co-Authored-By: Claude Opus 4.6 <noreply@anthropic.com>
</commit_message>
<xml_diff>
--- a/downloads/critical-review-dome-model-v4.docx
+++ b/downloads/critical-review-dome-model-v4.docx
@@ -8796,7 +8796,7 @@
         <w:t xml:space="preserve">V51.0 Tally (67 WINs): </w:t>
       </w:r>
       <w:r>
-        <w:t xml:space="preserve">Refuted by Data: 11  |  Standard Model Explains: 15  |  Self-Contradicted: 11  |  Misleading: 23  |  Not Demonstrated: 3  |  Unfalsifiable: 4</w:t>
+        <w:t xml:space="preserve">Refuted by Data: 11  |  Self-Contradicted: 11  |  Misleading: 23  |  Std Model Explains: 15  |  Not Demonstrated: 3  |  Unfalsifiable: 4</w:t>
       </w:r>
     </w:p>
     <w:p>
@@ -8889,7 +8889,7 @@
       <w:r>
         <w:t xml:space="preserve">US Patent 787412 (1905), publicly available at </w:t>
       </w:r>
-      <w:hyperlink w:history="1" r:id="rIdostdh5cgrrtd-oflwcp-f">
+      <w:hyperlink w:history="1" r:id="rIdjmp6n5sathvmcun4atlfn">
         <w:r>
           <w:rPr>
             <w:rStyle w:val="Hyperlink"/>
@@ -9029,7 +9029,7 @@
       <w:r>
         <w:t xml:space="preserve">James Bradley (1727) explicitly tested and rejected atmospheric refraction as an explanation: refraction is wavelength-dependent (chromatic), while stellar aberration is achromatic. Modern VLBI measurements achieve milliarcsecond precision and directly confirm aberration correlates with Earth's orbital velocity (~30 km/s). The </w:t>
       </w:r>
-      <w:hyperlink w:history="1" r:id="rIdnkv5u85klvv-bgepwe3mb">
+      <w:hyperlink w:history="1" r:id="rIdq1t5dryferd4aneezjshe">
         <w:r>
           <w:rPr>
             <w:rStyle w:val="Hyperlink"/>
@@ -9095,7 +9095,7 @@
       <w:r>
         <w:t xml:space="preserve">ESA </w:t>
       </w:r>
-      <w:hyperlink w:history="1" r:id="rId4nz3i_u8vzxtv0i91qh9d">
+      <w:hyperlink w:history="1" r:id="rIdzhusgz11biiuqm-whpjvw">
         <w:r>
           <w:rPr>
             <w:rStyle w:val="Hyperlink"/>
@@ -9161,7 +9161,7 @@
       <w:r>
         <w:t xml:space="preserve">Crepuscular rays are parallel beams made visible by atmospheric scattering. The apparent divergence is a perspective effect. Crucially, anticrepuscular rays converge at the anti-solar point simultaneously. See </w:t>
       </w:r>
-      <w:hyperlink w:history="1" r:id="rIdq-tkjbjh10smexknvcmtq">
+      <w:hyperlink w:history="1" r:id="rId6v9pv47adniodqqrwaxhq">
         <w:r>
           <w:rPr>
             <w:rStyle w:val="Hyperlink"/>
@@ -9172,7 +9172,7 @@
       <w:r>
         <w:t xml:space="preserve"> and </w:t>
       </w:r>
-      <w:hyperlink w:history="1" r:id="rIdukrnzjeydvgweijbegfp-">
+      <w:hyperlink w:history="1" r:id="rId0oqjyqtuxjan6uaqsbm0b">
         <w:r>
           <w:rPr>
             <w:rStyle w:val="Hyperlink"/>
@@ -9238,7 +9238,7 @@
       <w:r>
         <w:t xml:space="preserve">NOAA officially states no evidence of anomalous disappearances. </w:t>
       </w:r>
-      <w:hyperlink w:history="1" r:id="rIdch2lcctocseulo1ekf8sb">
+      <w:hyperlink w:history="1" r:id="rIden7zh2dm5hnlmmgjtauwl">
         <w:r>
           <w:rPr>
             <w:rStyle w:val="Hyperlink"/>
@@ -9304,7 +9304,7 @@
       <w:r>
         <w:t xml:space="preserve">Hipparcos </w:t>
       </w:r>
-      <w:hyperlink w:history="1" r:id="rIdsp_0kpiw-s-6x96ctwb6h">
+      <w:hyperlink w:history="1" r:id="rIdprag2pdzrbtusdcscj_dk">
         <w:r>
           <w:rPr>
             <w:rStyle w:val="Hyperlink"/>
@@ -9720,7 +9720,7 @@
       <w:r>
         <w:t xml:space="preserve">Terra-Nova et al. (2017, PNAS) demonstrate reversed-flux patches reproduce SAA splitting in MHD simulations. The </w:t>
       </w:r>
-      <w:hyperlink w:history="1" r:id="rIdyn27fqatv1ydvjzipg3at">
+      <w:hyperlink w:history="1" r:id="rIdajlvlnzryothibxrszemm">
         <w:r>
           <w:rPr>
             <w:rStyle w:val="Hyperlink"/>
@@ -9731,7 +9731,7 @@
       <w:r>
         <w:t xml:space="preserve"> documents the evolution quantitatively. </w:t>
       </w:r>
-      <w:hyperlink w:history="1" r:id="rId5ulvywqixsceyn6elbhdd">
+      <w:hyperlink w:history="1" r:id="rIdd2ya502-vei9kkt1ft4rx">
         <w:r>
           <w:rPr>
             <w:rStyle w:val="Hyperlink"/>
@@ -9782,7 +9782,7 @@
       <w:r>
         <w:t xml:space="preserve">Normal secular variation documented by </w:t>
       </w:r>
-      <w:hyperlink w:history="1" r:id="rIdubg5b-lwstfyzosyyuzwg">
+      <w:hyperlink w:history="1" r:id="rIdfjfpbqm8mb7ffzgunpytj">
         <w:r>
           <w:rPr>
             <w:rStyle w:val="Hyperlink"/>
@@ -9849,7 +9849,7 @@
       <w:r>
         <w:t xml:space="preserve">Eclipse-induced perturbations predicted by Chapman (1933) via ionospheric conductivity drops. Data from </w:t>
       </w:r>
-      <w:hyperlink w:history="1" r:id="rIdmesbg-fi1bepvl1rtqnhu">
+      <w:hyperlink w:history="1" r:id="rIdnks2jacbr-xsn2m8xspui">
         <w:r>
           <w:rPr>
             <w:rStyle w:val="Hyperlink"/>
@@ -9937,7 +9937,7 @@
       <w:r>
         <w:t xml:space="preserve">The formula used is for a quarter-wave linear waveguide, not a spherical cavity. Correct formula f = c/(2*pi*R) gives R = 6,098 km, within 4% of Earth's radius. The ionosphere IS conductive (</w:t>
       </w:r>
-      <w:hyperlink w:history="1" r:id="rIdzhxbbspitdvla5g1u3et6">
+      <w:hyperlink w:history="1" r:id="rIdpeaahwzpspon5mg7gy7cn">
         <w:r>
           <w:rPr>
             <w:rStyle w:val="Hyperlink"/>
@@ -10004,7 +10004,7 @@
       <w:r>
         <w:t xml:space="preserve">All five observations already predicted by </w:t>
       </w:r>
-      <w:hyperlink w:history="1" r:id="rIdpnpreejohpbbjihmlm7pe">
+      <w:hyperlink w:history="1" r:id="rIdfdtcmqxhpcay45hb72x5n">
         <w:r>
           <w:rPr>
             <w:rStyle w:val="Hyperlink"/>
@@ -10015,7 +10015,7 @@
       <w:r>
         <w:t xml:space="preserve">, </w:t>
       </w:r>
-      <w:hyperlink w:history="1" r:id="rIdkpzkszu-q5wqlpk301qc-">
+      <w:hyperlink w:history="1" r:id="rIdhrqbigudh5zboi7t2jomd">
         <w:r>
           <w:rPr>
             <w:rStyle w:val="Hyperlink"/>
@@ -10342,7 +10342,7 @@
       <w:r>
         <w:t xml:space="preserve">Antarctic gravity anomalies are mapped from orbit by </w:t>
       </w:r>
-      <w:hyperlink w:history="1" r:id="rIdxmcxulsooau4pftb435gc">
+      <w:hyperlink w:history="1" r:id="rIdpp1kpet9ymvs8aybu5s2k">
         <w:r>
           <w:rPr>
             <w:rStyle w:val="Hyperlink"/>
@@ -10353,7 +10353,7 @@
       <w:r>
         <w:t xml:space="preserve"> and </w:t>
       </w:r>
-      <w:hyperlink w:history="1" r:id="rIdc1eu5wsu7bmukyiopbv_u">
+      <w:hyperlink w:history="1" r:id="rId5k80z-1yqywwkd_qkumb5">
         <w:r>
           <w:rPr>
             <w:rStyle w:val="Hyperlink"/>
@@ -13329,7 +13329,7 @@
       <w:r>
         <w:t xml:space="preserve">A </w:t>
       </w:r>
-      <w:hyperlink w:history="1" r:id="rIduec1cuisaspn3sordbkoc">
+      <w:hyperlink w:history="1" r:id="rId7e8u7h-0gytwtumaefzqu">
         <w:r>
           <w:rPr>
             <w:rStyle w:val="Hyperlink"/>
@@ -13340,7 +13340,7 @@
       <w:r>
         <w:t xml:space="preserve"> found detectable decreases in X, Z, and total field components during eclipses. An </w:t>
       </w:r>
-      <w:hyperlink w:history="1" r:id="rIdzvljqwmfpw24n160xktiz">
+      <w:hyperlink w:history="1" r:id="rIdp-re4bilwvtoxzbeoyjkb">
         <w:r>
           <w:rPr>
             <w:rStyle w:val="Hyperlink"/>
@@ -13845,7 +13845,7 @@
       <w:r>
         <w:t xml:space="preserve">Continuous 24-hour sunlight. A local sun at 5,733 km circling above a flat disc cannot produce 24-hour sunlight at the disc edge. Directly observable at Amundsen-Scott Station, staffed year-round since 1957. See </w:t>
       </w:r>
-      <w:hyperlink w:history="1" r:id="rIdvssaqcvn-cfcfn4bzyy49">
+      <w:hyperlink w:history="1" r:id="rIdpjax4khewosdqbkjwoe2r">
         <w:r>
           <w:rPr>
             <w:rStyle w:val="Hyperlink"/>
@@ -13909,7 +13909,7 @@
       <w:r>
         <w:t xml:space="preserve">GPS provides 1–3 meter accuracy worldwide using 24+ satellites in Keplerian orbits calculated from spherical-Earth gravitational mechanics. The system requires precise relativistic corrections (both special and general) that depend on the satellites' orbital velocity and altitude above a spherical gravitational well. If Earth were a flat disc with different geometry, the signal propagation times, relativistic corrections, and satellite visibility geometry would all be wrong, and the system would not achieve meter-level accuracy. The same applies to every other satellite navigation system (GLONASS, Galileo, BeiDou). The ISS at 408 km is visible on predictable schedules computed from Keplerian orbits. Geostationary satellites at 35,786 km — far above the dome's maximum height — provide continuous coverage. See </w:t>
       </w:r>
-      <w:hyperlink w:history="1" r:id="rIdxzhio0wn32iarr7iffjcv">
+      <w:hyperlink w:history="1" r:id="rIdkk8h4i4y_nagahrwm5-mk">
         <w:r>
           <w:rPr>
             <w:rStyle w:val="Hyperlink"/>
@@ -13920,7 +13920,7 @@
       <w:r>
         <w:t xml:space="preserve">; </w:t>
       </w:r>
-      <w:hyperlink w:history="1" r:id="rIdnif-jn0ssfcorbf13qcbh">
+      <w:hyperlink w:history="1" r:id="rId1uwxkbzlqrjrznyrjmtvo">
         <w:r>
           <w:rPr>
             <w:rStyle w:val="Hyperlink"/>
@@ -13969,7 +13969,7 @@
       <w:r>
         <w:t xml:space="preserve">Modern solar calculators (</w:t>
       </w:r>
-      <w:hyperlink w:history="1" r:id="rId6iblgfhdbkpmt8yzhe1ov">
+      <w:hyperlink w:history="1" r:id="rIdsuzg-ugqay2ht1dykw9_z">
         <w:r>
           <w:rPr>
             <w:rStyle w:val="Hyperlink"/>
@@ -14018,7 +14018,7 @@
       <w:r>
         <w:t xml:space="preserve">The </w:t>
       </w:r>
-      <w:hyperlink w:history="1" r:id="rIdoc7wxppnnwlohadfdmwmw">
+      <w:hyperlink w:history="1" r:id="rIdf5fn_pgd6idlaqf9wo0zj">
         <w:r>
           <w:rPr>
             <w:rStyle w:val="Hyperlink"/>
@@ -14067,7 +14067,7 @@
       <w:r>
         <w:t xml:space="preserve">Earth's field is a dipole. South magnetic pole at 64.1°S, 135.9°E (</w:t>
       </w:r>
-      <w:hyperlink w:history="1" r:id="rIdnn3ged8z6d1qnvfuzoio9">
+      <w:hyperlink w:history="1" r:id="rIdqzrazuwl2vuot6er1qfho">
         <w:r>
           <w:rPr>
             <w:rStyle w:val="Hyperlink"/>
@@ -14116,7 +14116,7 @@
       <w:r>
         <w:t xml:space="preserve">g = 9.780 m/s² at equator, 9.832 m/s² at poles (0.53% variation). On a flat disc, centrifugal force points outward from center, producing the OPPOSITE pattern. See </w:t>
       </w:r>
-      <w:hyperlink w:history="1" r:id="rId2pfqyhuwv3kpirfi9epng">
+      <w:hyperlink w:history="1" r:id="rIdlz3ihjkkqt-ilhivu6fem">
         <w:r>
           <w:rPr>
             <w:rStyle w:val="Hyperlink"/>
@@ -14977,7 +14977,37 @@
           <w:b/>
           <w:bCs/>
         </w:rPr>
-        <w:t xml:space="preserve">Standard Model Explains: 15 </w:t>
+        <w:t xml:space="preserve">Self-Contradicted: 11 </w:t>
+      </w:r>
+      <w:r>
+        <w:t xml:space="preserve">(the dome's own geometry, if worked through honestly, predicts radically different values)</w:t>
+      </w:r>
+    </w:p>
+    <w:p>
+      <w:pPr>
+        <w:spacing w:after="120"/>
+      </w:pPr>
+      <w:r>
+        <w:rPr>
+          <w:b/>
+          <w:bCs/>
+        </w:rPr>
+        <w:t xml:space="preserve">Misleading: 23 </w:t>
+      </w:r>
+      <w:r>
+        <w:t xml:space="preserve">(data misrepresented, duplicated, cherry-picked, or logically contradictory)</w:t>
+      </w:r>
+    </w:p>
+    <w:p>
+      <w:pPr>
+        <w:spacing w:after="120"/>
+      </w:pPr>
+      <w:r>
+        <w:rPr>
+          <w:b/>
+          <w:bCs/>
+        </w:rPr>
+        <w:t xml:space="preserve">Std Model Explains: 15 </w:t>
       </w:r>
       <w:r>
         <w:t xml:space="preserve">(observation is real but mainstream physics already accounts for it)</w:t>
@@ -14992,36 +15022,6 @@
           <w:b/>
           <w:bCs/>
         </w:rPr>
-        <w:t xml:space="preserve">Self-Contradicted: 11 </w:t>
-      </w:r>
-      <w:r>
-        <w:t xml:space="preserve">(the dome's own geometry, if worked through honestly, predicts radically different values)</w:t>
-      </w:r>
-    </w:p>
-    <w:p>
-      <w:pPr>
-        <w:spacing w:after="120"/>
-      </w:pPr>
-      <w:r>
-        <w:rPr>
-          <w:b/>
-          <w:bCs/>
-        </w:rPr>
-        <w:t xml:space="preserve">Misleading: 23 </w:t>
-      </w:r>
-      <w:r>
-        <w:t xml:space="preserve">(data misrepresented, duplicated, cherry-picked, or logically contradictory)</w:t>
-      </w:r>
-    </w:p>
-    <w:p>
-      <w:pPr>
-        <w:spacing w:after="120"/>
-      </w:pPr>
-      <w:r>
-        <w:rPr>
-          <w:b/>
-          <w:bCs/>
-        </w:rPr>
         <w:t xml:space="preserve">Not Demonstrated: 3 </w:t>
       </w:r>
       <w:r>
@@ -15113,7 +15113,7 @@
         </w:rPr>
         <w:t xml:space="preserve">NOAA World Magnetic Model 2025: </w:t>
       </w:r>
-      <w:hyperlink w:history="1" r:id="rIdow1iohh_fk9ijs-dy-xyi">
+      <w:hyperlink w:history="1" r:id="rIdjweawlx2vt6msodlajyvu">
         <w:r>
           <w:rPr>
             <w:rStyle w:val="Hyperlink"/>
@@ -15133,7 +15133,7 @@
         </w:rPr>
         <w:t xml:space="preserve">NOAA Wandering Geomagnetic Poles: </w:t>
       </w:r>
-      <w:hyperlink w:history="1" r:id="rId3_geui-upvy1snrrzv_ee">
+      <w:hyperlink w:history="1" r:id="rIdqryokvv37tgcnruo0r2x1">
         <w:r>
           <w:rPr>
             <w:rStyle w:val="Hyperlink"/>
@@ -15153,7 +15153,7 @@
         </w:rPr>
         <w:t xml:space="preserve">CHAOS-7 Geomagnetic Field Model: </w:t>
       </w:r>
-      <w:hyperlink w:history="1" r:id="rId0x1_hiichmq8sfp_wassj">
+      <w:hyperlink w:history="1" r:id="rIdrf9bzj5i8btpefmibokb2">
         <w:r>
           <w:rPr>
             <w:rStyle w:val="Hyperlink"/>
@@ -15173,7 +15173,7 @@
         </w:rPr>
         <w:t xml:space="preserve">ESA Swarm Satellite Mission: </w:t>
       </w:r>
-      <w:hyperlink w:history="1" r:id="rIdfh4xyw-y3vuw-fxwjlmfx">
+      <w:hyperlink w:history="1" r:id="rIdvuut_u9wjiyrwuozqkzpq">
         <w:r>
           <w:rPr>
             <w:rStyle w:val="Hyperlink"/>
@@ -15193,7 +15193,7 @@
         </w:rPr>
         <w:t xml:space="preserve">INTERMAGNET Observatory Network: </w:t>
       </w:r>
-      <w:hyperlink w:history="1" r:id="rIdcbfyeah-rivyvjbc0lxrc">
+      <w:hyperlink w:history="1" r:id="rId5famt2nxkvromhssq_tfv">
         <w:r>
           <w:rPr>
             <w:rStyle w:val="Hyperlink"/>
@@ -15213,7 +15213,7 @@
         </w:rPr>
         <w:t xml:space="preserve">IGRF-13: </w:t>
       </w:r>
-      <w:hyperlink w:history="1" r:id="rIdo4piphcfjtkd8stam0yjb">
+      <w:hyperlink w:history="1" r:id="rIdqojbe86mnu6q244qcfpic">
         <w:r>
           <w:rPr>
             <w:rStyle w:val="Hyperlink"/>
@@ -15233,7 +15233,7 @@
         </w:rPr>
         <w:t xml:space="preserve">ESA Gaia Data Release 3: </w:t>
       </w:r>
-      <w:hyperlink w:history="1" r:id="rIdnzevnc5wz0dcxiiqo3gmv">
+      <w:hyperlink w:history="1" r:id="rIda7d6s6guqhec9whpdxa4e">
         <w:r>
           <w:rPr>
             <w:rStyle w:val="Hyperlink"/>
@@ -15253,7 +15253,7 @@
         </w:rPr>
         <w:t xml:space="preserve">Hipparcos Catalogue: </w:t>
       </w:r>
-      <w:hyperlink w:history="1" r:id="rIdaw43xj2_uai4mpush06j7">
+      <w:hyperlink w:history="1" r:id="rIdzesjthgay08sisg4hxwbw">
         <w:r>
           <w:rPr>
             <w:rStyle w:val="Hyperlink"/>
@@ -15273,7 +15273,7 @@
         </w:rPr>
         <w:t xml:space="preserve">US Patent 787412 (Tesla): </w:t>
       </w:r>
-      <w:hyperlink w:history="1" r:id="rIdkq5w7kqcxoi6adkpbwidq">
+      <w:hyperlink w:history="1" r:id="rIdsndpzg366taymmlp4laqm">
         <w:r>
           <w:rPr>
             <w:rStyle w:val="Hyperlink"/>
@@ -15293,7 +15293,7 @@
         </w:rPr>
         <w:t xml:space="preserve">NOAA Solar Position Algorithm: </w:t>
       </w:r>
-      <w:hyperlink w:history="1" r:id="rId_cbfzb7ex-q9qgc5n85lw">
+      <w:hyperlink w:history="1" r:id="rIda_ugd39oqnnk2zyrwexkc">
         <w:r>
           <w:rPr>
             <w:rStyle w:val="Hyperlink"/>
@@ -15313,7 +15313,7 @@
         </w:rPr>
         <w:t xml:space="preserve">National Geodetic Survey Gravity: </w:t>
       </w:r>
-      <w:hyperlink w:history="1" r:id="rIdc1ncsle565gddnuwflymo">
+      <w:hyperlink w:history="1" r:id="rId874pbfuvgek4jwjgrru5e">
         <w:r>
           <w:rPr>
             <w:rStyle w:val="Hyperlink"/>
@@ -15333,7 +15333,7 @@
         </w:rPr>
         <w:t xml:space="preserve">CHIME/FRB Project: </w:t>
       </w:r>
-      <w:hyperlink w:history="1" r:id="rId3q0hocsdrzgl283e0u4ga">
+      <w:hyperlink w:history="1" r:id="rIdrlmfkopockwotluf1s-jj">
         <w:r>
           <w:rPr>
             <w:rStyle w:val="Hyperlink"/>
@@ -15353,7 +15353,7 @@
         </w:rPr>
         <w:t xml:space="preserve">GRACE-FO (gravity mapping): </w:t>
       </w:r>
-      <w:hyperlink w:history="1" r:id="rId-h7b4igu2mfyryxjve7nk">
+      <w:hyperlink w:history="1" r:id="rIdwpvawnbzn7ngdd1eobm3j">
         <w:r>
           <w:rPr>
             <w:rStyle w:val="Hyperlink"/>
@@ -15373,7 +15373,7 @@
         </w:rPr>
         <w:t xml:space="preserve">GOCE (gravity field): </w:t>
       </w:r>
-      <w:hyperlink w:history="1" r:id="rIdryuglgy1rynbf9oecyx1-">
+      <w:hyperlink w:history="1" r:id="rIdcmedmucwuv8bydc3w6fxn">
         <w:r>
           <w:rPr>
             <w:rStyle w:val="Hyperlink"/>
@@ -15393,7 +15393,7 @@
         </w:rPr>
         <w:t xml:space="preserve">GPS.gov: </w:t>
       </w:r>
-      <w:hyperlink w:history="1" r:id="rIdn3jo0wbxbvsa3fgvnotaf">
+      <w:hyperlink w:history="1" r:id="rIdkmv1zr6bwofqvizxwjtru">
         <w:r>
           <w:rPr>
             <w:rStyle w:val="Hyperlink"/>
@@ -15413,7 +15413,7 @@
         </w:rPr>
         <w:t xml:space="preserve">CelesTrak TLE Data: </w:t>
       </w:r>
-      <w:hyperlink w:history="1" r:id="rIdjncrydx0ox6abseljhzll">
+      <w:hyperlink w:history="1" r:id="rId10sn74jb9czssj9364abi">
         <w:r>
           <w:rPr>
             <w:rStyle w:val="Hyperlink"/>

</xml_diff>

<commit_message>
Restructure scorecards: overview tells 67→0 story, Live Power gets domains
Overview tab scorecard now has two tiers:
- Hero row: "67 Claimed Wins" vs "0 Actual Wins" (the headline)
- Breakdown row: 6 verdict cards (11+11+23+15+3+4 = 67)
  with color-coded left borders matching verdict categories

Live Power Analysis tab gets its own domain scorecard:
- 20 Domains Claimed
- 14 Share One Fitted Constant
- 0 Distinguish Dome from Globe

Removed 14/20 card from overview (it's a Live Power topic, not overview).

Co-Authored-By: Claude Opus 4.6 <noreply@anthropic.com>
</commit_message>
<xml_diff>
--- a/downloads/critical-review-dome-model-v4.docx
+++ b/downloads/critical-review-dome-model-v4.docx
@@ -8889,7 +8889,7 @@
       <w:r>
         <w:t xml:space="preserve">US Patent 787412 (1905), publicly available at </w:t>
       </w:r>
-      <w:hyperlink w:history="1" r:id="rIdxpfdjgw989-dkgdvqoijh">
+      <w:hyperlink w:history="1" r:id="rId6xnthnrnfz8d9bx5yvkbj">
         <w:r>
           <w:rPr>
             <w:rStyle w:val="Hyperlink"/>
@@ -9029,7 +9029,7 @@
       <w:r>
         <w:t xml:space="preserve">James Bradley (1727) explicitly tested and rejected atmospheric refraction as an explanation: refraction is wavelength-dependent (chromatic), while stellar aberration is achromatic. Modern VLBI measurements achieve milliarcsecond precision and directly confirm aberration correlates with Earth's orbital velocity (~30 km/s). The </w:t>
       </w:r>
-      <w:hyperlink w:history="1" r:id="rIdkkz5ffnl94vae9ivtql_x">
+      <w:hyperlink w:history="1" r:id="rIdvr8mvhywblm4gt0iv8mlm">
         <w:r>
           <w:rPr>
             <w:rStyle w:val="Hyperlink"/>
@@ -9095,7 +9095,7 @@
       <w:r>
         <w:t xml:space="preserve">ESA </w:t>
       </w:r>
-      <w:hyperlink w:history="1" r:id="rIdu5dw9rsn3iqr7ccom4tha">
+      <w:hyperlink w:history="1" r:id="rIdidtbrl9qszwcgkfu1a9ng">
         <w:r>
           <w:rPr>
             <w:rStyle w:val="Hyperlink"/>
@@ -9161,7 +9161,7 @@
       <w:r>
         <w:t xml:space="preserve">Crepuscular rays are parallel beams made visible by atmospheric scattering. The apparent divergence is a perspective effect. Crucially, anticrepuscular rays converge at the anti-solar point simultaneously. See </w:t>
       </w:r>
-      <w:hyperlink w:history="1" r:id="rIdkzm16-0pk91iaythqyfqj">
+      <w:hyperlink w:history="1" r:id="rIdyqth4mk68tcmc4vmb4i1v">
         <w:r>
           <w:rPr>
             <w:rStyle w:val="Hyperlink"/>
@@ -9172,7 +9172,7 @@
       <w:r>
         <w:t xml:space="preserve"> and </w:t>
       </w:r>
-      <w:hyperlink w:history="1" r:id="rId5xn_gnaarpjljpiifsymo">
+      <w:hyperlink w:history="1" r:id="rId8e2f3bcluhx0gx4i4zhll">
         <w:r>
           <w:rPr>
             <w:rStyle w:val="Hyperlink"/>
@@ -9238,7 +9238,7 @@
       <w:r>
         <w:t xml:space="preserve">NOAA officially states no evidence of anomalous disappearances. </w:t>
       </w:r>
-      <w:hyperlink w:history="1" r:id="rIdsu9wopf3_xh691co5a656">
+      <w:hyperlink w:history="1" r:id="rIdgdklzmjklbd0fuljn40rx">
         <w:r>
           <w:rPr>
             <w:rStyle w:val="Hyperlink"/>
@@ -9304,7 +9304,7 @@
       <w:r>
         <w:t xml:space="preserve">Hipparcos </w:t>
       </w:r>
-      <w:hyperlink w:history="1" r:id="rIdjuudopuindyk6s00afmnd">
+      <w:hyperlink w:history="1" r:id="rId57lv7ksgr87wlbnqh1t3c">
         <w:r>
           <w:rPr>
             <w:rStyle w:val="Hyperlink"/>
@@ -9720,7 +9720,7 @@
       <w:r>
         <w:t xml:space="preserve">Terra-Nova et al. (2017, PNAS) demonstrate reversed-flux patches reproduce SAA splitting in MHD simulations. The </w:t>
       </w:r>
-      <w:hyperlink w:history="1" r:id="rIdognli3alw7klg165phm7d">
+      <w:hyperlink w:history="1" r:id="rIdmvwbkob3rrfsvdposqov2">
         <w:r>
           <w:rPr>
             <w:rStyle w:val="Hyperlink"/>
@@ -9731,7 +9731,7 @@
       <w:r>
         <w:t xml:space="preserve"> documents the evolution quantitatively. </w:t>
       </w:r>
-      <w:hyperlink w:history="1" r:id="rIdqhehbjlwxdjiyztfycqnb">
+      <w:hyperlink w:history="1" r:id="rIdxjidgf2lwql24b3dwuxyq">
         <w:r>
           <w:rPr>
             <w:rStyle w:val="Hyperlink"/>
@@ -9782,7 +9782,7 @@
       <w:r>
         <w:t xml:space="preserve">Normal secular variation documented by </w:t>
       </w:r>
-      <w:hyperlink w:history="1" r:id="rIdte_vrzh77rrmcsbhc3bbr">
+      <w:hyperlink w:history="1" r:id="rIdftdrcokp5imfzdsjaqiz6">
         <w:r>
           <w:rPr>
             <w:rStyle w:val="Hyperlink"/>
@@ -9849,7 +9849,7 @@
       <w:r>
         <w:t xml:space="preserve">Eclipse-induced perturbations predicted by Chapman (1933) via ionospheric conductivity drops. Data from </w:t>
       </w:r>
-      <w:hyperlink w:history="1" r:id="rId91yrloxuyokgg9ykag_k7">
+      <w:hyperlink w:history="1" r:id="rIdhnr-ppipkqlw030vsof3u">
         <w:r>
           <w:rPr>
             <w:rStyle w:val="Hyperlink"/>
@@ -9937,7 +9937,7 @@
       <w:r>
         <w:t xml:space="preserve">The formula used is for a quarter-wave linear waveguide, not a spherical cavity. Correct formula f = c/(2*pi*R) gives R = 6,098 km, within 4% of Earth's radius. The ionosphere IS conductive (</w:t>
       </w:r>
-      <w:hyperlink w:history="1" r:id="rIdw73ymvjd50hyoapsryxox">
+      <w:hyperlink w:history="1" r:id="rIdnbzwn34c6ffb5helroww4">
         <w:r>
           <w:rPr>
             <w:rStyle w:val="Hyperlink"/>
@@ -10004,7 +10004,7 @@
       <w:r>
         <w:t xml:space="preserve">All five observations already predicted by </w:t>
       </w:r>
-      <w:hyperlink w:history="1" r:id="rId8bxasvmoqdwm2se4eq9lb">
+      <w:hyperlink w:history="1" r:id="rIdresvb86bvt9ecjugbr9d7">
         <w:r>
           <w:rPr>
             <w:rStyle w:val="Hyperlink"/>
@@ -10015,7 +10015,7 @@
       <w:r>
         <w:t xml:space="preserve">, </w:t>
       </w:r>
-      <w:hyperlink w:history="1" r:id="rIdjeebrxl619tuyujktjxus">
+      <w:hyperlink w:history="1" r:id="rIdghr2v7iwc1mrmgzaattbj">
         <w:r>
           <w:rPr>
             <w:rStyle w:val="Hyperlink"/>
@@ -10342,7 +10342,7 @@
       <w:r>
         <w:t xml:space="preserve">Antarctic gravity anomalies are mapped from orbit by </w:t>
       </w:r>
-      <w:hyperlink w:history="1" r:id="rId1aousakjeze9qiigcwzbi">
+      <w:hyperlink w:history="1" r:id="rIdv5xtsi_e8tsh8mzw_t8cd">
         <w:r>
           <w:rPr>
             <w:rStyle w:val="Hyperlink"/>
@@ -10353,7 +10353,7 @@
       <w:r>
         <w:t xml:space="preserve"> and </w:t>
       </w:r>
-      <w:hyperlink w:history="1" r:id="rIdqocdci2vuziwb3et_t8bh">
+      <w:hyperlink w:history="1" r:id="rIdo0pjfgdr3uwaorzkwel8z">
         <w:r>
           <w:rPr>
             <w:rStyle w:val="Hyperlink"/>
@@ -13329,7 +13329,7 @@
       <w:r>
         <w:t xml:space="preserve">A </w:t>
       </w:r>
-      <w:hyperlink w:history="1" r:id="rIdtz_lptdyrhv6v97m6j6xi">
+      <w:hyperlink w:history="1" r:id="rIdiwvhvbzfzfz999syjgprx">
         <w:r>
           <w:rPr>
             <w:rStyle w:val="Hyperlink"/>
@@ -13340,7 +13340,7 @@
       <w:r>
         <w:t xml:space="preserve"> found detectable decreases in X, Z, and total field components during eclipses. An </w:t>
       </w:r>
-      <w:hyperlink w:history="1" r:id="rIdjxmezrvzqanhzydezfzbn">
+      <w:hyperlink w:history="1" r:id="rId5xuptkca_lp20apqzznfu">
         <w:r>
           <w:rPr>
             <w:rStyle w:val="Hyperlink"/>
@@ -13845,7 +13845,7 @@
       <w:r>
         <w:t xml:space="preserve">Continuous 24-hour sunlight. A local sun at 5,733 km circling above a flat disc cannot produce 24-hour sunlight at the disc edge. Directly observable at Amundsen-Scott Station, staffed year-round since 1957. See </w:t>
       </w:r>
-      <w:hyperlink w:history="1" r:id="rId6yepqcncbmuattk_pdxuw">
+      <w:hyperlink w:history="1" r:id="rIdtpmbosomxuhorkddefgvy">
         <w:r>
           <w:rPr>
             <w:rStyle w:val="Hyperlink"/>
@@ -13909,7 +13909,7 @@
       <w:r>
         <w:t xml:space="preserve">GPS provides 1–3 meter accuracy worldwide using 24+ satellites in Keplerian orbits calculated from spherical-Earth gravitational mechanics. The system requires precise relativistic corrections (both special and general) that depend on the satellites' orbital velocity and altitude above a spherical gravitational well. If Earth were a flat disc with different geometry, the signal propagation times, relativistic corrections, and satellite visibility geometry would all be wrong, and the system would not achieve meter-level accuracy. The same applies to every other satellite navigation system (GLONASS, Galileo, BeiDou). The ISS at 408 km is visible on predictable schedules computed from Keplerian orbits. Geostationary satellites at 35,786 km — far above the dome's maximum height — provide continuous coverage. See </w:t>
       </w:r>
-      <w:hyperlink w:history="1" r:id="rIdqdquacpqzxvkahahrdgeg">
+      <w:hyperlink w:history="1" r:id="rIdqqsgmdega1lwmalzu1mgp">
         <w:r>
           <w:rPr>
             <w:rStyle w:val="Hyperlink"/>
@@ -13920,7 +13920,7 @@
       <w:r>
         <w:t xml:space="preserve">; </w:t>
       </w:r>
-      <w:hyperlink w:history="1" r:id="rIdwxhorumzw1l0bk_3akq94">
+      <w:hyperlink w:history="1" r:id="rId6c068jviept7mqvjrrtwn">
         <w:r>
           <w:rPr>
             <w:rStyle w:val="Hyperlink"/>
@@ -13969,7 +13969,7 @@
       <w:r>
         <w:t xml:space="preserve">Modern solar calculators (</w:t>
       </w:r>
-      <w:hyperlink w:history="1" r:id="rId0lxysm_sp2zoysrjdcitl">
+      <w:hyperlink w:history="1" r:id="rIdalrxf6n0vxwke0hc4ax_f">
         <w:r>
           <w:rPr>
             <w:rStyle w:val="Hyperlink"/>
@@ -14018,7 +14018,7 @@
       <w:r>
         <w:t xml:space="preserve">The </w:t>
       </w:r>
-      <w:hyperlink w:history="1" r:id="rIdvmggunzfubzwgkvfyckyw">
+      <w:hyperlink w:history="1" r:id="rId5qyjfdxguzotnnbuwgka5">
         <w:r>
           <w:rPr>
             <w:rStyle w:val="Hyperlink"/>
@@ -14067,7 +14067,7 @@
       <w:r>
         <w:t xml:space="preserve">Earth's field is a dipole. South magnetic pole at 64.1°S, 135.9°E (</w:t>
       </w:r>
-      <w:hyperlink w:history="1" r:id="rIdscvan6shl6ir2zdhnqyzw">
+      <w:hyperlink w:history="1" r:id="rIdlel2w6p0ubkxeebkfunkj">
         <w:r>
           <w:rPr>
             <w:rStyle w:val="Hyperlink"/>
@@ -14116,7 +14116,7 @@
       <w:r>
         <w:t xml:space="preserve">g = 9.780 m/s² at equator, 9.832 m/s² at poles (0.53% variation). On a flat disc, centrifugal force points outward from center, producing the OPPOSITE pattern. See </w:t>
       </w:r>
-      <w:hyperlink w:history="1" r:id="rIdcah_o89hb2wxsaechxryb">
+      <w:hyperlink w:history="1" r:id="rIdi3jhvecvxpy9tgwkjfl7n">
         <w:r>
           <w:rPr>
             <w:rStyle w:val="Hyperlink"/>
@@ -15113,7 +15113,7 @@
         </w:rPr>
         <w:t xml:space="preserve">NOAA World Magnetic Model 2025: </w:t>
       </w:r>
-      <w:hyperlink w:history="1" r:id="rId3uhinhei_0h7vw-awonwk">
+      <w:hyperlink w:history="1" r:id="rIdxnncpf4gka_kdyq6mfi9m">
         <w:r>
           <w:rPr>
             <w:rStyle w:val="Hyperlink"/>
@@ -15133,7 +15133,7 @@
         </w:rPr>
         <w:t xml:space="preserve">NOAA Wandering Geomagnetic Poles: </w:t>
       </w:r>
-      <w:hyperlink w:history="1" r:id="rIdtrjuvxbm_ejvrmkljdy2h">
+      <w:hyperlink w:history="1" r:id="rIdirczd4grqt16_qwraj-tb">
         <w:r>
           <w:rPr>
             <w:rStyle w:val="Hyperlink"/>
@@ -15153,7 +15153,7 @@
         </w:rPr>
         <w:t xml:space="preserve">CHAOS-7 Geomagnetic Field Model: </w:t>
       </w:r>
-      <w:hyperlink w:history="1" r:id="rIdhgmbsetbc6usfi42epi_6">
+      <w:hyperlink w:history="1" r:id="rIdi6pg75jtridavrpenkaqo">
         <w:r>
           <w:rPr>
             <w:rStyle w:val="Hyperlink"/>
@@ -15173,7 +15173,7 @@
         </w:rPr>
         <w:t xml:space="preserve">ESA Swarm Satellite Mission: </w:t>
       </w:r>
-      <w:hyperlink w:history="1" r:id="rIdbxf7ksbd5tedka0j5idyh">
+      <w:hyperlink w:history="1" r:id="rId6jr8kvmcaiyl4d51zn3za">
         <w:r>
           <w:rPr>
             <w:rStyle w:val="Hyperlink"/>
@@ -15193,7 +15193,7 @@
         </w:rPr>
         <w:t xml:space="preserve">INTERMAGNET Observatory Network: </w:t>
       </w:r>
-      <w:hyperlink w:history="1" r:id="rIdlpkjn3ijn7tujxrcnsbcd">
+      <w:hyperlink w:history="1" r:id="rIddtbsdl2maqtmez8sywjs5">
         <w:r>
           <w:rPr>
             <w:rStyle w:val="Hyperlink"/>
@@ -15213,7 +15213,7 @@
         </w:rPr>
         <w:t xml:space="preserve">IGRF-13: </w:t>
       </w:r>
-      <w:hyperlink w:history="1" r:id="rIdi8kz3fjzdsra2gf2pxgns">
+      <w:hyperlink w:history="1" r:id="rIdwtc6kd7gmdbt7ss3gurw2">
         <w:r>
           <w:rPr>
             <w:rStyle w:val="Hyperlink"/>
@@ -15233,7 +15233,7 @@
         </w:rPr>
         <w:t xml:space="preserve">ESA Gaia Data Release 3: </w:t>
       </w:r>
-      <w:hyperlink w:history="1" r:id="rIddxqiid4tqkjmw0ns_oo3-">
+      <w:hyperlink w:history="1" r:id="rIdbkkduhjm2cp5hhwnvhcjs">
         <w:r>
           <w:rPr>
             <w:rStyle w:val="Hyperlink"/>
@@ -15253,7 +15253,7 @@
         </w:rPr>
         <w:t xml:space="preserve">Hipparcos Catalogue: </w:t>
       </w:r>
-      <w:hyperlink w:history="1" r:id="rId-dene0coipjdimd3gbynf">
+      <w:hyperlink w:history="1" r:id="rIdgu7hevxshmhdc89vmey9t">
         <w:r>
           <w:rPr>
             <w:rStyle w:val="Hyperlink"/>
@@ -15273,7 +15273,7 @@
         </w:rPr>
         <w:t xml:space="preserve">US Patent 787412 (Tesla): </w:t>
       </w:r>
-      <w:hyperlink w:history="1" r:id="rIde1-rbld6pnnb4s1jek8ms">
+      <w:hyperlink w:history="1" r:id="rId_7283pm0utmi0yr7ajqz9">
         <w:r>
           <w:rPr>
             <w:rStyle w:val="Hyperlink"/>
@@ -15293,7 +15293,7 @@
         </w:rPr>
         <w:t xml:space="preserve">NOAA Solar Position Algorithm: </w:t>
       </w:r>
-      <w:hyperlink w:history="1" r:id="rIdzbkapofc4gw-ntqsy-bnh">
+      <w:hyperlink w:history="1" r:id="rIddyymzqes-jritulikttoo">
         <w:r>
           <w:rPr>
             <w:rStyle w:val="Hyperlink"/>
@@ -15313,7 +15313,7 @@
         </w:rPr>
         <w:t xml:space="preserve">National Geodetic Survey Gravity: </w:t>
       </w:r>
-      <w:hyperlink w:history="1" r:id="rIddcsaaidcr55z3rbvd4pyi">
+      <w:hyperlink w:history="1" r:id="rIdaaw3nts2twdwqzc0cfxre">
         <w:r>
           <w:rPr>
             <w:rStyle w:val="Hyperlink"/>
@@ -15333,7 +15333,7 @@
         </w:rPr>
         <w:t xml:space="preserve">CHIME/FRB Project: </w:t>
       </w:r>
-      <w:hyperlink w:history="1" r:id="rIdmjxi5fdysrc6gxhocy0no">
+      <w:hyperlink w:history="1" r:id="rIdy7ybo6j8vbekwfohej9mx">
         <w:r>
           <w:rPr>
             <w:rStyle w:val="Hyperlink"/>
@@ -15353,7 +15353,7 @@
         </w:rPr>
         <w:t xml:space="preserve">GRACE-FO (gravity mapping): </w:t>
       </w:r>
-      <w:hyperlink w:history="1" r:id="rIdqat5vbqffdr1auindwpu8">
+      <w:hyperlink w:history="1" r:id="rIdobygy7askztnk78e1arjf">
         <w:r>
           <w:rPr>
             <w:rStyle w:val="Hyperlink"/>
@@ -15373,7 +15373,7 @@
         </w:rPr>
         <w:t xml:space="preserve">GOCE (gravity field): </w:t>
       </w:r>
-      <w:hyperlink w:history="1" r:id="rIdd3u90j-sv82r742ncysqp">
+      <w:hyperlink w:history="1" r:id="rId1ngmr2cflthrzh2vspicj">
         <w:r>
           <w:rPr>
             <w:rStyle w:val="Hyperlink"/>
@@ -15393,7 +15393,7 @@
         </w:rPr>
         <w:t xml:space="preserve">GPS.gov: </w:t>
       </w:r>
-      <w:hyperlink w:history="1" r:id="rIdonxom5xpojalmuvw0mtja">
+      <w:hyperlink w:history="1" r:id="rIdiv64n_ti9wrvhwblr5fju">
         <w:r>
           <w:rPr>
             <w:rStyle w:val="Hyperlink"/>
@@ -15413,7 +15413,7 @@
         </w:rPr>
         <w:t xml:space="preserve">CelesTrak TLE Data: </w:t>
       </w:r>
-      <w:hyperlink w:history="1" r:id="rIduvphvpco5biltmmums1ir">
+      <w:hyperlink w:history="1" r:id="rIdzplmighnn8yq2gnydscw-">
         <w:r>
           <w:rPr>
             <w:rStyle w:val="Hyperlink"/>

</xml_diff>

<commit_message>
Redesign pie chart: bolder colors, callout lines, count+% labels
Colors updated from washed-out pastels to Material Design 400-level:
- Red (#E57373), Blue (#42A5F5), Green (#66BB6A), Orange (#FFA726),
  Purple (#AB47BC), Grey (#BDBDBD) — much more visually distinct

Labels now show both count and percentage inside large slices
(white text with shadow for legibility on colored backgrounds).

Small slices (Not Demonstrated=3, Unfalsifiable=4) get callout
lines with angled leader + horizontal tail to external label,
keeping them readable without crowding.

Legend SVG viewBox widened from 80 to 300 units — fixes the
text clipping that was cutting off verdict names and percentages.

Legend entries now bold the count number for quick scanning:
"**23** Misleading (34%)" instead of "Misleading (23, 34%)".

Restored dark mode theme switcher for pie chart elements.

Co-Authored-By: Claude Opus 4.6 <noreply@anthropic.com>
</commit_message>
<xml_diff>
--- a/downloads/critical-review-dome-model-v4.docx
+++ b/downloads/critical-review-dome-model-v4.docx
@@ -8889,7 +8889,7 @@
       <w:r>
         <w:t xml:space="preserve">US Patent 787412 (1905), publicly available at </w:t>
       </w:r>
-      <w:hyperlink w:history="1" r:id="rId6xnthnrnfz8d9bx5yvkbj">
+      <w:hyperlink w:history="1" r:id="rIdbnd9xvbncy84ekac51etc">
         <w:r>
           <w:rPr>
             <w:rStyle w:val="Hyperlink"/>
@@ -9029,7 +9029,7 @@
       <w:r>
         <w:t xml:space="preserve">James Bradley (1727) explicitly tested and rejected atmospheric refraction as an explanation: refraction is wavelength-dependent (chromatic), while stellar aberration is achromatic. Modern VLBI measurements achieve milliarcsecond precision and directly confirm aberration correlates with Earth's orbital velocity (~30 km/s). The </w:t>
       </w:r>
-      <w:hyperlink w:history="1" r:id="rIdvr8mvhywblm4gt0iv8mlm">
+      <w:hyperlink w:history="1" r:id="rIdblkt0wk7azpermf6elivp">
         <w:r>
           <w:rPr>
             <w:rStyle w:val="Hyperlink"/>
@@ -9095,7 +9095,7 @@
       <w:r>
         <w:t xml:space="preserve">ESA </w:t>
       </w:r>
-      <w:hyperlink w:history="1" r:id="rIdidtbrl9qszwcgkfu1a9ng">
+      <w:hyperlink w:history="1" r:id="rIdcke1soddxpke9kcgaettv">
         <w:r>
           <w:rPr>
             <w:rStyle w:val="Hyperlink"/>
@@ -9161,7 +9161,7 @@
       <w:r>
         <w:t xml:space="preserve">Crepuscular rays are parallel beams made visible by atmospheric scattering. The apparent divergence is a perspective effect. Crucially, anticrepuscular rays converge at the anti-solar point simultaneously. See </w:t>
       </w:r>
-      <w:hyperlink w:history="1" r:id="rIdyqth4mk68tcmc4vmb4i1v">
+      <w:hyperlink w:history="1" r:id="rIdix5me5yfetiw2xod8rfx3">
         <w:r>
           <w:rPr>
             <w:rStyle w:val="Hyperlink"/>
@@ -9172,7 +9172,7 @@
       <w:r>
         <w:t xml:space="preserve"> and </w:t>
       </w:r>
-      <w:hyperlink w:history="1" r:id="rId8e2f3bcluhx0gx4i4zhll">
+      <w:hyperlink w:history="1" r:id="rIdxymtx9n1vympylmsghfkb">
         <w:r>
           <w:rPr>
             <w:rStyle w:val="Hyperlink"/>
@@ -9238,7 +9238,7 @@
       <w:r>
         <w:t xml:space="preserve">NOAA officially states no evidence of anomalous disappearances. </w:t>
       </w:r>
-      <w:hyperlink w:history="1" r:id="rIdgdklzmjklbd0fuljn40rx">
+      <w:hyperlink w:history="1" r:id="rIdo-ilpivvvl6olwrnnqcfk">
         <w:r>
           <w:rPr>
             <w:rStyle w:val="Hyperlink"/>
@@ -9304,7 +9304,7 @@
       <w:r>
         <w:t xml:space="preserve">Hipparcos </w:t>
       </w:r>
-      <w:hyperlink w:history="1" r:id="rId57lv7ksgr87wlbnqh1t3c">
+      <w:hyperlink w:history="1" r:id="rIdpylxlhwppkim8ogvepkqc">
         <w:r>
           <w:rPr>
             <w:rStyle w:val="Hyperlink"/>
@@ -9720,7 +9720,7 @@
       <w:r>
         <w:t xml:space="preserve">Terra-Nova et al. (2017, PNAS) demonstrate reversed-flux patches reproduce SAA splitting in MHD simulations. The </w:t>
       </w:r>
-      <w:hyperlink w:history="1" r:id="rIdmvwbkob3rrfsvdposqov2">
+      <w:hyperlink w:history="1" r:id="rId5meh-phlr9qjmwtttzb77">
         <w:r>
           <w:rPr>
             <w:rStyle w:val="Hyperlink"/>
@@ -9731,7 +9731,7 @@
       <w:r>
         <w:t xml:space="preserve"> documents the evolution quantitatively. </w:t>
       </w:r>
-      <w:hyperlink w:history="1" r:id="rIdxjidgf2lwql24b3dwuxyq">
+      <w:hyperlink w:history="1" r:id="rId7m7peemnaanvlegzrl6u5">
         <w:r>
           <w:rPr>
             <w:rStyle w:val="Hyperlink"/>
@@ -9782,7 +9782,7 @@
       <w:r>
         <w:t xml:space="preserve">Normal secular variation documented by </w:t>
       </w:r>
-      <w:hyperlink w:history="1" r:id="rIdftdrcokp5imfzdsjaqiz6">
+      <w:hyperlink w:history="1" r:id="rIdg7wqbxhjpl4usppd8viox">
         <w:r>
           <w:rPr>
             <w:rStyle w:val="Hyperlink"/>
@@ -9849,7 +9849,7 @@
       <w:r>
         <w:t xml:space="preserve">Eclipse-induced perturbations predicted by Chapman (1933) via ionospheric conductivity drops. Data from </w:t>
       </w:r>
-      <w:hyperlink w:history="1" r:id="rIdhnr-ppipkqlw030vsof3u">
+      <w:hyperlink w:history="1" r:id="rIdlvzrbtluh8xxnhnbhbxx1">
         <w:r>
           <w:rPr>
             <w:rStyle w:val="Hyperlink"/>
@@ -9937,7 +9937,7 @@
       <w:r>
         <w:t xml:space="preserve">The formula used is for a quarter-wave linear waveguide, not a spherical cavity. Correct formula f = c/(2*pi*R) gives R = 6,098 km, within 4% of Earth's radius. The ionosphere IS conductive (</w:t>
       </w:r>
-      <w:hyperlink w:history="1" r:id="rIdnbzwn34c6ffb5helroww4">
+      <w:hyperlink w:history="1" r:id="rIddml_9h-jsznztkdfivjod">
         <w:r>
           <w:rPr>
             <w:rStyle w:val="Hyperlink"/>
@@ -10004,7 +10004,7 @@
       <w:r>
         <w:t xml:space="preserve">All five observations already predicted by </w:t>
       </w:r>
-      <w:hyperlink w:history="1" r:id="rIdresvb86bvt9ecjugbr9d7">
+      <w:hyperlink w:history="1" r:id="rIdtl61uiagnklllmphqrlpx">
         <w:r>
           <w:rPr>
             <w:rStyle w:val="Hyperlink"/>
@@ -10015,7 +10015,7 @@
       <w:r>
         <w:t xml:space="preserve">, </w:t>
       </w:r>
-      <w:hyperlink w:history="1" r:id="rIdghr2v7iwc1mrmgzaattbj">
+      <w:hyperlink w:history="1" r:id="rIdxarymoef7cahjkggvtovs">
         <w:r>
           <w:rPr>
             <w:rStyle w:val="Hyperlink"/>
@@ -10342,7 +10342,7 @@
       <w:r>
         <w:t xml:space="preserve">Antarctic gravity anomalies are mapped from orbit by </w:t>
       </w:r>
-      <w:hyperlink w:history="1" r:id="rIdv5xtsi_e8tsh8mzw_t8cd">
+      <w:hyperlink w:history="1" r:id="rId3oe_l4j2svksztab_dfiy">
         <w:r>
           <w:rPr>
             <w:rStyle w:val="Hyperlink"/>
@@ -10353,7 +10353,7 @@
       <w:r>
         <w:t xml:space="preserve"> and </w:t>
       </w:r>
-      <w:hyperlink w:history="1" r:id="rIdo0pjfgdr3uwaorzkwel8z">
+      <w:hyperlink w:history="1" r:id="rId-n6h2neyegribnfg-mel5">
         <w:r>
           <w:rPr>
             <w:rStyle w:val="Hyperlink"/>
@@ -13329,7 +13329,7 @@
       <w:r>
         <w:t xml:space="preserve">A </w:t>
       </w:r>
-      <w:hyperlink w:history="1" r:id="rIdiwvhvbzfzfz999syjgprx">
+      <w:hyperlink w:history="1" r:id="rId_gb6fzbtyn73dukzxcio5">
         <w:r>
           <w:rPr>
             <w:rStyle w:val="Hyperlink"/>
@@ -13340,7 +13340,7 @@
       <w:r>
         <w:t xml:space="preserve"> found detectable decreases in X, Z, and total field components during eclipses. An </w:t>
       </w:r>
-      <w:hyperlink w:history="1" r:id="rId5xuptkca_lp20apqzznfu">
+      <w:hyperlink w:history="1" r:id="rIdpcffyv8soerz-wka28-ed">
         <w:r>
           <w:rPr>
             <w:rStyle w:val="Hyperlink"/>
@@ -13845,7 +13845,7 @@
       <w:r>
         <w:t xml:space="preserve">Continuous 24-hour sunlight. A local sun at 5,733 km circling above a flat disc cannot produce 24-hour sunlight at the disc edge. Directly observable at Amundsen-Scott Station, staffed year-round since 1957. See </w:t>
       </w:r>
-      <w:hyperlink w:history="1" r:id="rIdtpmbosomxuhorkddefgvy">
+      <w:hyperlink w:history="1" r:id="rIdohgiam6t7wwrxnd7dfm2z">
         <w:r>
           <w:rPr>
             <w:rStyle w:val="Hyperlink"/>
@@ -13909,7 +13909,7 @@
       <w:r>
         <w:t xml:space="preserve">GPS provides 1–3 meter accuracy worldwide using 24+ satellites in Keplerian orbits calculated from spherical-Earth gravitational mechanics. The system requires precise relativistic corrections (both special and general) that depend on the satellites' orbital velocity and altitude above a spherical gravitational well. If Earth were a flat disc with different geometry, the signal propagation times, relativistic corrections, and satellite visibility geometry would all be wrong, and the system would not achieve meter-level accuracy. The same applies to every other satellite navigation system (GLONASS, Galileo, BeiDou). The ISS at 408 km is visible on predictable schedules computed from Keplerian orbits. Geostationary satellites at 35,786 km — far above the dome's maximum height — provide continuous coverage. See </w:t>
       </w:r>
-      <w:hyperlink w:history="1" r:id="rIdqqsgmdega1lwmalzu1mgp">
+      <w:hyperlink w:history="1" r:id="rIdv3pacppmpm_yq4p1x0hwx">
         <w:r>
           <w:rPr>
             <w:rStyle w:val="Hyperlink"/>
@@ -13920,7 +13920,7 @@
       <w:r>
         <w:t xml:space="preserve">; </w:t>
       </w:r>
-      <w:hyperlink w:history="1" r:id="rId6c068jviept7mqvjrrtwn">
+      <w:hyperlink w:history="1" r:id="rIdpalwooftvgc9npclbwxvc">
         <w:r>
           <w:rPr>
             <w:rStyle w:val="Hyperlink"/>
@@ -13969,7 +13969,7 @@
       <w:r>
         <w:t xml:space="preserve">Modern solar calculators (</w:t>
       </w:r>
-      <w:hyperlink w:history="1" r:id="rIdalrxf6n0vxwke0hc4ax_f">
+      <w:hyperlink w:history="1" r:id="rId_h8imripmwvxyt1cmj431">
         <w:r>
           <w:rPr>
             <w:rStyle w:val="Hyperlink"/>
@@ -14018,7 +14018,7 @@
       <w:r>
         <w:t xml:space="preserve">The </w:t>
       </w:r>
-      <w:hyperlink w:history="1" r:id="rId5qyjfdxguzotnnbuwgka5">
+      <w:hyperlink w:history="1" r:id="rIdwbqbm4nfywox4uniijqyd">
         <w:r>
           <w:rPr>
             <w:rStyle w:val="Hyperlink"/>
@@ -14067,7 +14067,7 @@
       <w:r>
         <w:t xml:space="preserve">Earth's field is a dipole. South magnetic pole at 64.1°S, 135.9°E (</w:t>
       </w:r>
-      <w:hyperlink w:history="1" r:id="rIdlel2w6p0ubkxeebkfunkj">
+      <w:hyperlink w:history="1" r:id="rIdckwkw4xhqvyktbywsmy_t">
         <w:r>
           <w:rPr>
             <w:rStyle w:val="Hyperlink"/>
@@ -14116,7 +14116,7 @@
       <w:r>
         <w:t xml:space="preserve">g = 9.780 m/s² at equator, 9.832 m/s² at poles (0.53% variation). On a flat disc, centrifugal force points outward from center, producing the OPPOSITE pattern. See </w:t>
       </w:r>
-      <w:hyperlink w:history="1" r:id="rIdi3jhvecvxpy9tgwkjfl7n">
+      <w:hyperlink w:history="1" r:id="rIdw_rr4ifyyyktwfgettgzy">
         <w:r>
           <w:rPr>
             <w:rStyle w:val="Hyperlink"/>
@@ -15113,7 +15113,7 @@
         </w:rPr>
         <w:t xml:space="preserve">NOAA World Magnetic Model 2025: </w:t>
       </w:r>
-      <w:hyperlink w:history="1" r:id="rIdxnncpf4gka_kdyq6mfi9m">
+      <w:hyperlink w:history="1" r:id="rIdlxpa3jasgceace1exc170">
         <w:r>
           <w:rPr>
             <w:rStyle w:val="Hyperlink"/>
@@ -15133,7 +15133,7 @@
         </w:rPr>
         <w:t xml:space="preserve">NOAA Wandering Geomagnetic Poles: </w:t>
       </w:r>
-      <w:hyperlink w:history="1" r:id="rIdirczd4grqt16_qwraj-tb">
+      <w:hyperlink w:history="1" r:id="rIdz4urvjhkpjdrtsohv0imo">
         <w:r>
           <w:rPr>
             <w:rStyle w:val="Hyperlink"/>
@@ -15153,7 +15153,7 @@
         </w:rPr>
         <w:t xml:space="preserve">CHAOS-7 Geomagnetic Field Model: </w:t>
       </w:r>
-      <w:hyperlink w:history="1" r:id="rIdi6pg75jtridavrpenkaqo">
+      <w:hyperlink w:history="1" r:id="rIdppupic81jd1zpiecrfsag">
         <w:r>
           <w:rPr>
             <w:rStyle w:val="Hyperlink"/>
@@ -15173,7 +15173,7 @@
         </w:rPr>
         <w:t xml:space="preserve">ESA Swarm Satellite Mission: </w:t>
       </w:r>
-      <w:hyperlink w:history="1" r:id="rId6jr8kvmcaiyl4d51zn3za">
+      <w:hyperlink w:history="1" r:id="rIdlf17lxcrxg1fonncrk3z2">
         <w:r>
           <w:rPr>
             <w:rStyle w:val="Hyperlink"/>
@@ -15193,7 +15193,7 @@
         </w:rPr>
         <w:t xml:space="preserve">INTERMAGNET Observatory Network: </w:t>
       </w:r>
-      <w:hyperlink w:history="1" r:id="rIddtbsdl2maqtmez8sywjs5">
+      <w:hyperlink w:history="1" r:id="rIdwyeauyvrlipqnefdcdxel">
         <w:r>
           <w:rPr>
             <w:rStyle w:val="Hyperlink"/>
@@ -15213,7 +15213,7 @@
         </w:rPr>
         <w:t xml:space="preserve">IGRF-13: </w:t>
       </w:r>
-      <w:hyperlink w:history="1" r:id="rIdwtc6kd7gmdbt7ss3gurw2">
+      <w:hyperlink w:history="1" r:id="rIdqqipkkvpvtgpmngsvm4cp">
         <w:r>
           <w:rPr>
             <w:rStyle w:val="Hyperlink"/>
@@ -15233,7 +15233,7 @@
         </w:rPr>
         <w:t xml:space="preserve">ESA Gaia Data Release 3: </w:t>
       </w:r>
-      <w:hyperlink w:history="1" r:id="rIdbkkduhjm2cp5hhwnvhcjs">
+      <w:hyperlink w:history="1" r:id="rIdram5j-refrfsjey_ayywo">
         <w:r>
           <w:rPr>
             <w:rStyle w:val="Hyperlink"/>
@@ -15253,7 +15253,7 @@
         </w:rPr>
         <w:t xml:space="preserve">Hipparcos Catalogue: </w:t>
       </w:r>
-      <w:hyperlink w:history="1" r:id="rIdgu7hevxshmhdc89vmey9t">
+      <w:hyperlink w:history="1" r:id="rIdu18fz4mzx1menc90yvsdh">
         <w:r>
           <w:rPr>
             <w:rStyle w:val="Hyperlink"/>
@@ -15273,7 +15273,7 @@
         </w:rPr>
         <w:t xml:space="preserve">US Patent 787412 (Tesla): </w:t>
       </w:r>
-      <w:hyperlink w:history="1" r:id="rId_7283pm0utmi0yr7ajqz9">
+      <w:hyperlink w:history="1" r:id="rIdvq3vaofjccso1lcs0_nsy">
         <w:r>
           <w:rPr>
             <w:rStyle w:val="Hyperlink"/>
@@ -15293,7 +15293,7 @@
         </w:rPr>
         <w:t xml:space="preserve">NOAA Solar Position Algorithm: </w:t>
       </w:r>
-      <w:hyperlink w:history="1" r:id="rIddyymzqes-jritulikttoo">
+      <w:hyperlink w:history="1" r:id="rId7wgi7fxrbahn9gituwu0q">
         <w:r>
           <w:rPr>
             <w:rStyle w:val="Hyperlink"/>
@@ -15313,7 +15313,7 @@
         </w:rPr>
         <w:t xml:space="preserve">National Geodetic Survey Gravity: </w:t>
       </w:r>
-      <w:hyperlink w:history="1" r:id="rIdaaw3nts2twdwqzc0cfxre">
+      <w:hyperlink w:history="1" r:id="rIdicl0hisgaq8xfokisjzze">
         <w:r>
           <w:rPr>
             <w:rStyle w:val="Hyperlink"/>
@@ -15333,7 +15333,7 @@
         </w:rPr>
         <w:t xml:space="preserve">CHIME/FRB Project: </w:t>
       </w:r>
-      <w:hyperlink w:history="1" r:id="rIdy7ybo6j8vbekwfohej9mx">
+      <w:hyperlink w:history="1" r:id="rId9mg351j0joufdys-vyxmk">
         <w:r>
           <w:rPr>
             <w:rStyle w:val="Hyperlink"/>
@@ -15353,7 +15353,7 @@
         </w:rPr>
         <w:t xml:space="preserve">GRACE-FO (gravity mapping): </w:t>
       </w:r>
-      <w:hyperlink w:history="1" r:id="rIdobygy7askztnk78e1arjf">
+      <w:hyperlink w:history="1" r:id="rIdbkrcbylb5ui4to19o8x9i">
         <w:r>
           <w:rPr>
             <w:rStyle w:val="Hyperlink"/>
@@ -15373,7 +15373,7 @@
         </w:rPr>
         <w:t xml:space="preserve">GOCE (gravity field): </w:t>
       </w:r>
-      <w:hyperlink w:history="1" r:id="rId1ngmr2cflthrzh2vspicj">
+      <w:hyperlink w:history="1" r:id="rId0c4yjaistzoscnvamc6r1">
         <w:r>
           <w:rPr>
             <w:rStyle w:val="Hyperlink"/>
@@ -15393,7 +15393,7 @@
         </w:rPr>
         <w:t xml:space="preserve">GPS.gov: </w:t>
       </w:r>
-      <w:hyperlink w:history="1" r:id="rIdiv64n_ti9wrvhwblr5fju">
+      <w:hyperlink w:history="1" r:id="rIdrszgvanyxbuw0ycmolhxy">
         <w:r>
           <w:rPr>
             <w:rStyle w:val="Hyperlink"/>
@@ -15413,7 +15413,7 @@
         </w:rPr>
         <w:t xml:space="preserve">CelesTrak TLE Data: </w:t>
       </w:r>
-      <w:hyperlink w:history="1" r:id="rIdzplmighnn8yq2gnydscw-">
+      <w:hyperlink w:history="1" r:id="rIdsdkf-zpbmutw18ukacdck">
         <w:r>
           <w:rPr>
             <w:rStyle w:val="Hyperlink"/>

</xml_diff>

<commit_message>
Implement independent review feedback: 6 targeted improvements
- Softened tracking page discrepancy framing (may be version lag)
- Added GPS "just WGS84 software" objection preemption
- Added tidal "aetheric downforce, not gravity" objection preemption
- Enhanced solar angular diameter as simplest falsification test
- Expanded aetheric refraction as universal escape hatch (6 dependent WINs)
- Added deflated prediction count (~25-30 distinct claims after dedup)

Co-Authored-By: Claude Opus 4.6 <noreply@anthropic.com>
</commit_message>
<xml_diff>
--- a/downloads/critical-review-dome-model-v4.docx
+++ b/downloads/critical-review-dome-model-v4.docx
@@ -8889,7 +8889,7 @@
       <w:r>
         <w:t xml:space="preserve">US Patent 787412 (1905), publicly available at </w:t>
       </w:r>
-      <w:hyperlink w:history="1" r:id="rIdbnd9xvbncy84ekac51etc">
+      <w:hyperlink w:history="1" r:id="rIdirsmuaxchck5lly1hhwyh">
         <w:r>
           <w:rPr>
             <w:rStyle w:val="Hyperlink"/>
@@ -9029,7 +9029,7 @@
       <w:r>
         <w:t xml:space="preserve">James Bradley (1727) explicitly tested and rejected atmospheric refraction as an explanation: refraction is wavelength-dependent (chromatic), while stellar aberration is achromatic. Modern VLBI measurements achieve milliarcsecond precision and directly confirm aberration correlates with Earth's orbital velocity (~30 km/s). The </w:t>
       </w:r>
-      <w:hyperlink w:history="1" r:id="rIdblkt0wk7azpermf6elivp">
+      <w:hyperlink w:history="1" r:id="rIdo90rqkzoeolwa_rdvzb8x">
         <w:r>
           <w:rPr>
             <w:rStyle w:val="Hyperlink"/>
@@ -9095,7 +9095,7 @@
       <w:r>
         <w:t xml:space="preserve">ESA </w:t>
       </w:r>
-      <w:hyperlink w:history="1" r:id="rIdcke1soddxpke9kcgaettv">
+      <w:hyperlink w:history="1" r:id="rIdwittchzpep34rmuh-iwxo">
         <w:r>
           <w:rPr>
             <w:rStyle w:val="Hyperlink"/>
@@ -9161,7 +9161,7 @@
       <w:r>
         <w:t xml:space="preserve">Crepuscular rays are parallel beams made visible by atmospheric scattering. The apparent divergence is a perspective effect. Crucially, anticrepuscular rays converge at the anti-solar point simultaneously. See </w:t>
       </w:r>
-      <w:hyperlink w:history="1" r:id="rIdix5me5yfetiw2xod8rfx3">
+      <w:hyperlink w:history="1" r:id="rIdgjelger6otbspdeo7uxye">
         <w:r>
           <w:rPr>
             <w:rStyle w:val="Hyperlink"/>
@@ -9172,7 +9172,7 @@
       <w:r>
         <w:t xml:space="preserve"> and </w:t>
       </w:r>
-      <w:hyperlink w:history="1" r:id="rIdxymtx9n1vympylmsghfkb">
+      <w:hyperlink w:history="1" r:id="rIdntahizqcqc660nxin_egp">
         <w:r>
           <w:rPr>
             <w:rStyle w:val="Hyperlink"/>
@@ -9238,7 +9238,7 @@
       <w:r>
         <w:t xml:space="preserve">NOAA officially states no evidence of anomalous disappearances. </w:t>
       </w:r>
-      <w:hyperlink w:history="1" r:id="rIdo-ilpivvvl6olwrnnqcfk">
+      <w:hyperlink w:history="1" r:id="rId4zojcdd9ihwsfmfipraae">
         <w:r>
           <w:rPr>
             <w:rStyle w:val="Hyperlink"/>
@@ -9304,7 +9304,7 @@
       <w:r>
         <w:t xml:space="preserve">Hipparcos </w:t>
       </w:r>
-      <w:hyperlink w:history="1" r:id="rIdpylxlhwppkim8ogvepkqc">
+      <w:hyperlink w:history="1" r:id="rIdivpzm1il2njhbylq-cx6r">
         <w:r>
           <w:rPr>
             <w:rStyle w:val="Hyperlink"/>
@@ -9720,7 +9720,7 @@
       <w:r>
         <w:t xml:space="preserve">Terra-Nova et al. (2017, PNAS) demonstrate reversed-flux patches reproduce SAA splitting in MHD simulations. The </w:t>
       </w:r>
-      <w:hyperlink w:history="1" r:id="rId5meh-phlr9qjmwtttzb77">
+      <w:hyperlink w:history="1" r:id="rIdrfwyr5_kvid2snwduowmv">
         <w:r>
           <w:rPr>
             <w:rStyle w:val="Hyperlink"/>
@@ -9731,7 +9731,7 @@
       <w:r>
         <w:t xml:space="preserve"> documents the evolution quantitatively. </w:t>
       </w:r>
-      <w:hyperlink w:history="1" r:id="rId7m7peemnaanvlegzrl6u5">
+      <w:hyperlink w:history="1" r:id="rId6q68mescq9chvpeogukxt">
         <w:r>
           <w:rPr>
             <w:rStyle w:val="Hyperlink"/>
@@ -9782,7 +9782,7 @@
       <w:r>
         <w:t xml:space="preserve">Normal secular variation documented by </w:t>
       </w:r>
-      <w:hyperlink w:history="1" r:id="rIdg7wqbxhjpl4usppd8viox">
+      <w:hyperlink w:history="1" r:id="rIdtcngtnoe-whwypawopltb">
         <w:r>
           <w:rPr>
             <w:rStyle w:val="Hyperlink"/>
@@ -9849,7 +9849,7 @@
       <w:r>
         <w:t xml:space="preserve">Eclipse-induced perturbations predicted by Chapman (1933) via ionospheric conductivity drops. Data from </w:t>
       </w:r>
-      <w:hyperlink w:history="1" r:id="rIdlvzrbtluh8xxnhnbhbxx1">
+      <w:hyperlink w:history="1" r:id="rIdnm_oewpwyjsdqqh2unqdy">
         <w:r>
           <w:rPr>
             <w:rStyle w:val="Hyperlink"/>
@@ -9937,7 +9937,7 @@
       <w:r>
         <w:t xml:space="preserve">The formula used is for a quarter-wave linear waveguide, not a spherical cavity. Correct formula f = c/(2*pi*R) gives R = 6,098 km, within 4% of Earth's radius. The ionosphere IS conductive (</w:t>
       </w:r>
-      <w:hyperlink w:history="1" r:id="rIddml_9h-jsznztkdfivjod">
+      <w:hyperlink w:history="1" r:id="rIdphfg_ukkqv2qvbs4dxu9b">
         <w:r>
           <w:rPr>
             <w:rStyle w:val="Hyperlink"/>
@@ -10004,7 +10004,7 @@
       <w:r>
         <w:t xml:space="preserve">All five observations already predicted by </w:t>
       </w:r>
-      <w:hyperlink w:history="1" r:id="rIdtl61uiagnklllmphqrlpx">
+      <w:hyperlink w:history="1" r:id="rIdxqh8souza2vb2kvzmfitr">
         <w:r>
           <w:rPr>
             <w:rStyle w:val="Hyperlink"/>
@@ -10015,7 +10015,7 @@
       <w:r>
         <w:t xml:space="preserve">, </w:t>
       </w:r>
-      <w:hyperlink w:history="1" r:id="rIdxarymoef7cahjkggvtovs">
+      <w:hyperlink w:history="1" r:id="rIdmczvxct8lotgz8neb3xq9">
         <w:r>
           <w:rPr>
             <w:rStyle w:val="Hyperlink"/>
@@ -10342,7 +10342,7 @@
       <w:r>
         <w:t xml:space="preserve">Antarctic gravity anomalies are mapped from orbit by </w:t>
       </w:r>
-      <w:hyperlink w:history="1" r:id="rId3oe_l4j2svksztab_dfiy">
+      <w:hyperlink w:history="1" r:id="rIdwxiyizn31br1jmr7flf_r">
         <w:r>
           <w:rPr>
             <w:rStyle w:val="Hyperlink"/>
@@ -10353,7 +10353,7 @@
       <w:r>
         <w:t xml:space="preserve"> and </w:t>
       </w:r>
-      <w:hyperlink w:history="1" r:id="rId-n6h2neyegribnfg-mel5">
+      <w:hyperlink w:history="1" r:id="rIdceawi0ruef8nxvickhjn6">
         <w:r>
           <w:rPr>
             <w:rStyle w:val="Hyperlink"/>
@@ -13329,7 +13329,7 @@
       <w:r>
         <w:t xml:space="preserve">A </w:t>
       </w:r>
-      <w:hyperlink w:history="1" r:id="rId_gb6fzbtyn73dukzxcio5">
+      <w:hyperlink w:history="1" r:id="rId8rp_2xzo9ehfvygw1cpwi">
         <w:r>
           <w:rPr>
             <w:rStyle w:val="Hyperlink"/>
@@ -13340,7 +13340,7 @@
       <w:r>
         <w:t xml:space="preserve"> found detectable decreases in X, Z, and total field components during eclipses. An </w:t>
       </w:r>
-      <w:hyperlink w:history="1" r:id="rIdpcffyv8soerz-wka28-ed">
+      <w:hyperlink w:history="1" r:id="rIdcp0mmqcifxay8awg-nmgo">
         <w:r>
           <w:rPr>
             <w:rStyle w:val="Hyperlink"/>
@@ -13845,7 +13845,7 @@
       <w:r>
         <w:t xml:space="preserve">Continuous 24-hour sunlight. A local sun at 5,733 km circling above a flat disc cannot produce 24-hour sunlight at the disc edge. Directly observable at Amundsen-Scott Station, staffed year-round since 1957. See </w:t>
       </w:r>
-      <w:hyperlink w:history="1" r:id="rIdohgiam6t7wwrxnd7dfm2z">
+      <w:hyperlink w:history="1" r:id="rId7sajn8ocbeqbz1gzo3rfl">
         <w:r>
           <w:rPr>
             <w:rStyle w:val="Hyperlink"/>
@@ -13909,7 +13909,7 @@
       <w:r>
         <w:t xml:space="preserve">GPS provides 1–3 meter accuracy worldwide using 24+ satellites in Keplerian orbits calculated from spherical-Earth gravitational mechanics. The system requires precise relativistic corrections (both special and general) that depend on the satellites' orbital velocity and altitude above a spherical gravitational well. If Earth were a flat disc with different geometry, the signal propagation times, relativistic corrections, and satellite visibility geometry would all be wrong, and the system would not achieve meter-level accuracy. The same applies to every other satellite navigation system (GLONASS, Galileo, BeiDou). The ISS at 408 km is visible on predictable schedules computed from Keplerian orbits. Geostationary satellites at 35,786 km — far above the dome's maximum height — provide continuous coverage. See </w:t>
       </w:r>
-      <w:hyperlink w:history="1" r:id="rIdv3pacppmpm_yq4p1x0hwx">
+      <w:hyperlink w:history="1" r:id="rIdews4o1j1ecxbwz1q_fsd1">
         <w:r>
           <w:rPr>
             <w:rStyle w:val="Hyperlink"/>
@@ -13920,7 +13920,7 @@
       <w:r>
         <w:t xml:space="preserve">; </w:t>
       </w:r>
-      <w:hyperlink w:history="1" r:id="rIdpalwooftvgc9npclbwxvc">
+      <w:hyperlink w:history="1" r:id="rIdubou0yaxiduibvxev01ue">
         <w:r>
           <w:rPr>
             <w:rStyle w:val="Hyperlink"/>
@@ -13969,7 +13969,7 @@
       <w:r>
         <w:t xml:space="preserve">Modern solar calculators (</w:t>
       </w:r>
-      <w:hyperlink w:history="1" r:id="rId_h8imripmwvxyt1cmj431">
+      <w:hyperlink w:history="1" r:id="rIdfm6devzwsg-zxpjkhxq10">
         <w:r>
           <w:rPr>
             <w:rStyle w:val="Hyperlink"/>
@@ -14018,7 +14018,7 @@
       <w:r>
         <w:t xml:space="preserve">The </w:t>
       </w:r>
-      <w:hyperlink w:history="1" r:id="rIdwbqbm4nfywox4uniijqyd">
+      <w:hyperlink w:history="1" r:id="rIdoiyhov3x0vph77uzgx4om">
         <w:r>
           <w:rPr>
             <w:rStyle w:val="Hyperlink"/>
@@ -14067,7 +14067,7 @@
       <w:r>
         <w:t xml:space="preserve">Earth's field is a dipole. South magnetic pole at 64.1°S, 135.9°E (</w:t>
       </w:r>
-      <w:hyperlink w:history="1" r:id="rIdckwkw4xhqvyktbywsmy_t">
+      <w:hyperlink w:history="1" r:id="rIdhf-pczfmdloqiasax8btf">
         <w:r>
           <w:rPr>
             <w:rStyle w:val="Hyperlink"/>
@@ -14116,7 +14116,7 @@
       <w:r>
         <w:t xml:space="preserve">g = 9.780 m/s² at equator, 9.832 m/s² at poles (0.53% variation). On a flat disc, centrifugal force points outward from center, producing the OPPOSITE pattern. See </w:t>
       </w:r>
-      <w:hyperlink w:history="1" r:id="rIdw_rr4ifyyyktwfgettgzy">
+      <w:hyperlink w:history="1" r:id="rIdl_3orrvcx6atntskxuaz9">
         <w:r>
           <w:rPr>
             <w:rStyle w:val="Hyperlink"/>
@@ -15113,7 +15113,7 @@
         </w:rPr>
         <w:t xml:space="preserve">NOAA World Magnetic Model 2025: </w:t>
       </w:r>
-      <w:hyperlink w:history="1" r:id="rIdlxpa3jasgceace1exc170">
+      <w:hyperlink w:history="1" r:id="rIdegbwgd4uubsabnvd0glac">
         <w:r>
           <w:rPr>
             <w:rStyle w:val="Hyperlink"/>
@@ -15133,7 +15133,7 @@
         </w:rPr>
         <w:t xml:space="preserve">NOAA Wandering Geomagnetic Poles: </w:t>
       </w:r>
-      <w:hyperlink w:history="1" r:id="rIdz4urvjhkpjdrtsohv0imo">
+      <w:hyperlink w:history="1" r:id="rIdbqdlrabt4cdtt6vbvvkoo">
         <w:r>
           <w:rPr>
             <w:rStyle w:val="Hyperlink"/>
@@ -15153,7 +15153,7 @@
         </w:rPr>
         <w:t xml:space="preserve">CHAOS-7 Geomagnetic Field Model: </w:t>
       </w:r>
-      <w:hyperlink w:history="1" r:id="rIdppupic81jd1zpiecrfsag">
+      <w:hyperlink w:history="1" r:id="rIdfr7bwbkg-tuau8phd94x-">
         <w:r>
           <w:rPr>
             <w:rStyle w:val="Hyperlink"/>
@@ -15173,7 +15173,7 @@
         </w:rPr>
         <w:t xml:space="preserve">ESA Swarm Satellite Mission: </w:t>
       </w:r>
-      <w:hyperlink w:history="1" r:id="rIdlf17lxcrxg1fonncrk3z2">
+      <w:hyperlink w:history="1" r:id="rIdqje5xzadnragjdfxyrkhy">
         <w:r>
           <w:rPr>
             <w:rStyle w:val="Hyperlink"/>
@@ -15193,7 +15193,7 @@
         </w:rPr>
         <w:t xml:space="preserve">INTERMAGNET Observatory Network: </w:t>
       </w:r>
-      <w:hyperlink w:history="1" r:id="rIdwyeauyvrlipqnefdcdxel">
+      <w:hyperlink w:history="1" r:id="rIdpw7eifnrqxd8plj2mlbna">
         <w:r>
           <w:rPr>
             <w:rStyle w:val="Hyperlink"/>
@@ -15213,7 +15213,7 @@
         </w:rPr>
         <w:t xml:space="preserve">IGRF-13: </w:t>
       </w:r>
-      <w:hyperlink w:history="1" r:id="rIdqqipkkvpvtgpmngsvm4cp">
+      <w:hyperlink w:history="1" r:id="rIdn5mpilkybljn59fcqwyf_">
         <w:r>
           <w:rPr>
             <w:rStyle w:val="Hyperlink"/>
@@ -15233,7 +15233,7 @@
         </w:rPr>
         <w:t xml:space="preserve">ESA Gaia Data Release 3: </w:t>
       </w:r>
-      <w:hyperlink w:history="1" r:id="rIdram5j-refrfsjey_ayywo">
+      <w:hyperlink w:history="1" r:id="rIdardil18xt37gprwuecqsr">
         <w:r>
           <w:rPr>
             <w:rStyle w:val="Hyperlink"/>
@@ -15253,7 +15253,7 @@
         </w:rPr>
         <w:t xml:space="preserve">Hipparcos Catalogue: </w:t>
       </w:r>
-      <w:hyperlink w:history="1" r:id="rIdu18fz4mzx1menc90yvsdh">
+      <w:hyperlink w:history="1" r:id="rIdvsuvgf_mhj_jr9xkmd63x">
         <w:r>
           <w:rPr>
             <w:rStyle w:val="Hyperlink"/>
@@ -15273,7 +15273,7 @@
         </w:rPr>
         <w:t xml:space="preserve">US Patent 787412 (Tesla): </w:t>
       </w:r>
-      <w:hyperlink w:history="1" r:id="rIdvq3vaofjccso1lcs0_nsy">
+      <w:hyperlink w:history="1" r:id="rIdcfqhc6cd-wjzcp-y52mf1">
         <w:r>
           <w:rPr>
             <w:rStyle w:val="Hyperlink"/>
@@ -15293,7 +15293,7 @@
         </w:rPr>
         <w:t xml:space="preserve">NOAA Solar Position Algorithm: </w:t>
       </w:r>
-      <w:hyperlink w:history="1" r:id="rId7wgi7fxrbahn9gituwu0q">
+      <w:hyperlink w:history="1" r:id="rIdcqlozrrtjg0r1dhffhgkp">
         <w:r>
           <w:rPr>
             <w:rStyle w:val="Hyperlink"/>
@@ -15313,7 +15313,7 @@
         </w:rPr>
         <w:t xml:space="preserve">National Geodetic Survey Gravity: </w:t>
       </w:r>
-      <w:hyperlink w:history="1" r:id="rIdicl0hisgaq8xfokisjzze">
+      <w:hyperlink w:history="1" r:id="rIdugn4vk10stwv-_1rreirn">
         <w:r>
           <w:rPr>
             <w:rStyle w:val="Hyperlink"/>
@@ -15333,7 +15333,7 @@
         </w:rPr>
         <w:t xml:space="preserve">CHIME/FRB Project: </w:t>
       </w:r>
-      <w:hyperlink w:history="1" r:id="rId9mg351j0joufdys-vyxmk">
+      <w:hyperlink w:history="1" r:id="rIdeygpjhxaj4dfagfi7xkc3">
         <w:r>
           <w:rPr>
             <w:rStyle w:val="Hyperlink"/>
@@ -15353,7 +15353,7 @@
         </w:rPr>
         <w:t xml:space="preserve">GRACE-FO (gravity mapping): </w:t>
       </w:r>
-      <w:hyperlink w:history="1" r:id="rIdbkrcbylb5ui4to19o8x9i">
+      <w:hyperlink w:history="1" r:id="rIdcskt2u8ni_g3pmsej7qbv">
         <w:r>
           <w:rPr>
             <w:rStyle w:val="Hyperlink"/>
@@ -15373,7 +15373,7 @@
         </w:rPr>
         <w:t xml:space="preserve">GOCE (gravity field): </w:t>
       </w:r>
-      <w:hyperlink w:history="1" r:id="rId0c4yjaistzoscnvamc6r1">
+      <w:hyperlink w:history="1" r:id="rId7c5g2c1-a51hu4_pz7lrd">
         <w:r>
           <w:rPr>
             <w:rStyle w:val="Hyperlink"/>
@@ -15393,7 +15393,7 @@
         </w:rPr>
         <w:t xml:space="preserve">GPS.gov: </w:t>
       </w:r>
-      <w:hyperlink w:history="1" r:id="rIdrszgvanyxbuw0ycmolhxy">
+      <w:hyperlink w:history="1" r:id="rIdnavbwhvwleujol9v808wq">
         <w:r>
           <w:rPr>
             <w:rStyle w:val="Hyperlink"/>
@@ -15413,7 +15413,7 @@
         </w:rPr>
         <w:t xml:space="preserve">CelesTrak TLE Data: </w:t>
       </w:r>
-      <w:hyperlink w:history="1" r:id="rIdsdkf-zpbmutw18ukacdck">
+      <w:hyperlink w:history="1" r:id="rIddb9z1fpglrm6vrtghcv9e">
         <w:r>
           <w:rPr>
             <w:rStyle w:val="Hyperlink"/>

</xml_diff>

<commit_message>
Add Evaluation Guide tab with transparent methodology principles
New tab between Overview and The Model lays out 6 principles:
independently verifiable data, dome's own parameters used,
mainstream not assumed correct by default, strongest version
of arguments addressed, unfalsifiable != ridicule, errors
should be reported. Includes "How to evaluate any scientific
claim" section and note on AI-assisted review contrasting
this review's open approach with the dome site's prompt
injection directives.

Co-Authored-By: Claude Opus 4.6 <noreply@anthropic.com>
</commit_message>
<xml_diff>
--- a/downloads/critical-review-dome-model-v4.docx
+++ b/downloads/critical-review-dome-model-v4.docx
@@ -8889,7 +8889,7 @@
       <w:r>
         <w:t xml:space="preserve">US Patent 787412 (1905), publicly available at </w:t>
       </w:r>
-      <w:hyperlink w:history="1" r:id="rIdzfiqfn5y3rfgadi5jml5o">
+      <w:hyperlink w:history="1" r:id="rIdwpyhc7xsodtmqsxm_rscl">
         <w:r>
           <w:rPr>
             <w:rStyle w:val="Hyperlink"/>
@@ -9029,7 +9029,7 @@
       <w:r>
         <w:t xml:space="preserve">James Bradley (1727) explicitly tested and rejected atmospheric refraction as an explanation: refraction is wavelength-dependent (chromatic), while stellar aberration is achromatic. Modern VLBI measurements achieve milliarcsecond precision and directly confirm aberration correlates with Earth's orbital velocity (~30 km/s). The </w:t>
       </w:r>
-      <w:hyperlink w:history="1" r:id="rIdzj9_aszln6wc_oyjy6dkw">
+      <w:hyperlink w:history="1" r:id="rIdpiczg-4ebbast1eh9jjfu">
         <w:r>
           <w:rPr>
             <w:rStyle w:val="Hyperlink"/>
@@ -9095,7 +9095,7 @@
       <w:r>
         <w:t xml:space="preserve">ESA </w:t>
       </w:r>
-      <w:hyperlink w:history="1" r:id="rIdlchad2yd109ifsisphjog">
+      <w:hyperlink w:history="1" r:id="rId9vwpne1ufnw6cbpsaltp-">
         <w:r>
           <w:rPr>
             <w:rStyle w:val="Hyperlink"/>
@@ -9161,7 +9161,7 @@
       <w:r>
         <w:t xml:space="preserve">Crepuscular rays are parallel beams made visible by atmospheric scattering. The apparent divergence is a perspective effect. Crucially, anticrepuscular rays converge at the anti-solar point simultaneously. See </w:t>
       </w:r>
-      <w:hyperlink w:history="1" r:id="rId4xd5dxdudif80vun-9bjf">
+      <w:hyperlink w:history="1" r:id="rIdu7tekco1lpehnxz9jbo8e">
         <w:r>
           <w:rPr>
             <w:rStyle w:val="Hyperlink"/>
@@ -9172,7 +9172,7 @@
       <w:r>
         <w:t xml:space="preserve"> and </w:t>
       </w:r>
-      <w:hyperlink w:history="1" r:id="rId2yxcwvkdqmsizbofxxbyr">
+      <w:hyperlink w:history="1" r:id="rIdimbj7wplwwtek1yqyvlic">
         <w:r>
           <w:rPr>
             <w:rStyle w:val="Hyperlink"/>
@@ -9238,7 +9238,7 @@
       <w:r>
         <w:t xml:space="preserve">NOAA officially states no evidence of anomalous disappearances. </w:t>
       </w:r>
-      <w:hyperlink w:history="1" r:id="rIdb8jgulyl085w0pcislcwx">
+      <w:hyperlink w:history="1" r:id="rIdlsavsyljyzglsqaqrp_7d">
         <w:r>
           <w:rPr>
             <w:rStyle w:val="Hyperlink"/>
@@ -9304,7 +9304,7 @@
       <w:r>
         <w:t xml:space="preserve">Hipparcos </w:t>
       </w:r>
-      <w:hyperlink w:history="1" r:id="rIdsdmbi8ubb7-ct1lv1hj17">
+      <w:hyperlink w:history="1" r:id="rIdqcy3piam9tp4o_fzvqlvg">
         <w:r>
           <w:rPr>
             <w:rStyle w:val="Hyperlink"/>
@@ -9720,7 +9720,7 @@
       <w:r>
         <w:t xml:space="preserve">Terra-Nova et al. (2017, PNAS) demonstrate reversed-flux patches reproduce SAA splitting in MHD simulations. The </w:t>
       </w:r>
-      <w:hyperlink w:history="1" r:id="rIdtspi2tsxjkvhkvqyt3gej">
+      <w:hyperlink w:history="1" r:id="rId4s3q_srjzs5_1h-qnpck2">
         <w:r>
           <w:rPr>
             <w:rStyle w:val="Hyperlink"/>
@@ -9731,7 +9731,7 @@
       <w:r>
         <w:t xml:space="preserve"> documents the evolution quantitatively. </w:t>
       </w:r>
-      <w:hyperlink w:history="1" r:id="rIdxuzli6dqxucsrththzy8z">
+      <w:hyperlink w:history="1" r:id="rIde8tloolf3xgutp3cc75ni">
         <w:r>
           <w:rPr>
             <w:rStyle w:val="Hyperlink"/>
@@ -9782,7 +9782,7 @@
       <w:r>
         <w:t xml:space="preserve">Normal secular variation documented by </w:t>
       </w:r>
-      <w:hyperlink w:history="1" r:id="rIdpy9mmctoym3hktq549wwr">
+      <w:hyperlink w:history="1" r:id="rIdzzy3tovv7rswutk8o4k82">
         <w:r>
           <w:rPr>
             <w:rStyle w:val="Hyperlink"/>
@@ -9849,7 +9849,7 @@
       <w:r>
         <w:t xml:space="preserve">Eclipse-induced perturbations predicted by Chapman (1933) via ionospheric conductivity drops. Data from </w:t>
       </w:r>
-      <w:hyperlink w:history="1" r:id="rIdg5e9_85uujtcbclrvpl3i">
+      <w:hyperlink w:history="1" r:id="rIdhtwfxdljbartdllesaisl">
         <w:r>
           <w:rPr>
             <w:rStyle w:val="Hyperlink"/>
@@ -9937,7 +9937,7 @@
       <w:r>
         <w:t xml:space="preserve">The formula used is for a quarter-wave linear waveguide, not a spherical cavity. Correct formula f = c/(2*pi*R) gives R = 6,098 km, within 4% of Earth's radius. The ionosphere IS conductive (</w:t>
       </w:r>
-      <w:hyperlink w:history="1" r:id="rIdjympzpz4s9rmkkuufxoan">
+      <w:hyperlink w:history="1" r:id="rIdl1ihp86t7drwuhbrq-t8l">
         <w:r>
           <w:rPr>
             <w:rStyle w:val="Hyperlink"/>
@@ -10004,7 +10004,7 @@
       <w:r>
         <w:t xml:space="preserve">All five observations already predicted by </w:t>
       </w:r>
-      <w:hyperlink w:history="1" r:id="rIdmtifusiflbszzp3uz6_ix">
+      <w:hyperlink w:history="1" r:id="rId_r_9ze-m0hkps9obaysim">
         <w:r>
           <w:rPr>
             <w:rStyle w:val="Hyperlink"/>
@@ -10015,7 +10015,7 @@
       <w:r>
         <w:t xml:space="preserve">, </w:t>
       </w:r>
-      <w:hyperlink w:history="1" r:id="rIdyfu-lddhjomvvwvngpg23">
+      <w:hyperlink w:history="1" r:id="rIdqdmcft-nbabrb5ockw14b">
         <w:r>
           <w:rPr>
             <w:rStyle w:val="Hyperlink"/>
@@ -10342,7 +10342,7 @@
       <w:r>
         <w:t xml:space="preserve">Antarctic gravity anomalies are mapped from orbit by </w:t>
       </w:r>
-      <w:hyperlink w:history="1" r:id="rIds6wtemxwqw8cwmzwdbyns">
+      <w:hyperlink w:history="1" r:id="rIdxprxedh7kjazlhqipbc9o">
         <w:r>
           <w:rPr>
             <w:rStyle w:val="Hyperlink"/>
@@ -10353,7 +10353,7 @@
       <w:r>
         <w:t xml:space="preserve"> and </w:t>
       </w:r>
-      <w:hyperlink w:history="1" r:id="rIdktrdci79lh_prac1lkqfe">
+      <w:hyperlink w:history="1" r:id="rIdu5ybybgvwq8cz0d4loez7">
         <w:r>
           <w:rPr>
             <w:rStyle w:val="Hyperlink"/>
@@ -13329,7 +13329,7 @@
       <w:r>
         <w:t xml:space="preserve">A </w:t>
       </w:r>
-      <w:hyperlink w:history="1" r:id="rIddgfxhjwgcztef_kryjt37">
+      <w:hyperlink w:history="1" r:id="rIdcjyirnvyitfuyj9oqvyav">
         <w:r>
           <w:rPr>
             <w:rStyle w:val="Hyperlink"/>
@@ -13340,7 +13340,7 @@
       <w:r>
         <w:t xml:space="preserve"> found detectable decreases in X, Z, and total field components during eclipses. An </w:t>
       </w:r>
-      <w:hyperlink w:history="1" r:id="rIdbrt9y5mcdeusyyqwy8yhz">
+      <w:hyperlink w:history="1" r:id="rId3ylsg9nmnpnfywiwce1yq">
         <w:r>
           <w:rPr>
             <w:rStyle w:val="Hyperlink"/>
@@ -13845,7 +13845,7 @@
       <w:r>
         <w:t xml:space="preserve">Continuous 24-hour sunlight. A local sun at 5,733 km circling above a flat disc cannot produce 24-hour sunlight at the disc edge. Directly observable at Amundsen-Scott Station, staffed year-round since 1957. See </w:t>
       </w:r>
-      <w:hyperlink w:history="1" r:id="rIdzkuy6904q3hr5ri6xr3-h">
+      <w:hyperlink w:history="1" r:id="rIdxoglaethe4qosltdwizxg">
         <w:r>
           <w:rPr>
             <w:rStyle w:val="Hyperlink"/>
@@ -13909,7 +13909,7 @@
       <w:r>
         <w:t xml:space="preserve">GPS provides 1–3 meter accuracy worldwide using 24+ satellites in Keplerian orbits calculated from spherical-Earth gravitational mechanics. The system requires precise relativistic corrections (both special and general) that depend on the satellites' orbital velocity and altitude above a spherical gravitational well. If Earth were a flat disc with different geometry, the signal propagation times, relativistic corrections, and satellite visibility geometry would all be wrong, and the system would not achieve meter-level accuracy. The same applies to every other satellite navigation system (GLONASS, Galileo, BeiDou). The ISS at 408 km is visible on predictable schedules computed from Keplerian orbits. Geostationary satellites at 35,786 km — far above the dome's maximum height — provide continuous coverage. See </w:t>
       </w:r>
-      <w:hyperlink w:history="1" r:id="rIdhcf5abfkzyfajex1wsprz">
+      <w:hyperlink w:history="1" r:id="rIdrk6ickbbpnznq8yvjkfko">
         <w:r>
           <w:rPr>
             <w:rStyle w:val="Hyperlink"/>
@@ -13920,7 +13920,7 @@
       <w:r>
         <w:t xml:space="preserve">; </w:t>
       </w:r>
-      <w:hyperlink w:history="1" r:id="rIdwga0-3tl9rbkvcux91j7o">
+      <w:hyperlink w:history="1" r:id="rIdqqdt55kbm4mqlpdou6t2f">
         <w:r>
           <w:rPr>
             <w:rStyle w:val="Hyperlink"/>
@@ -13969,7 +13969,7 @@
       <w:r>
         <w:t xml:space="preserve">Modern solar calculators (</w:t>
       </w:r>
-      <w:hyperlink w:history="1" r:id="rIdqtedbypozhmgp9etibqpo">
+      <w:hyperlink w:history="1" r:id="rIdyt-5bjzllvvi4itdaweea">
         <w:r>
           <w:rPr>
             <w:rStyle w:val="Hyperlink"/>
@@ -14018,7 +14018,7 @@
       <w:r>
         <w:t xml:space="preserve">The </w:t>
       </w:r>
-      <w:hyperlink w:history="1" r:id="rIdkfd5pav-2pkmjoemnnskw">
+      <w:hyperlink w:history="1" r:id="rIdxsfzikqf8zhq_2b-hxdaa">
         <w:r>
           <w:rPr>
             <w:rStyle w:val="Hyperlink"/>
@@ -14067,7 +14067,7 @@
       <w:r>
         <w:t xml:space="preserve">Earth's field is a dipole. South magnetic pole at 64.1°S, 135.9°E (</w:t>
       </w:r>
-      <w:hyperlink w:history="1" r:id="rIdxk6ddheajoqmfqpyjosfo">
+      <w:hyperlink w:history="1" r:id="rIdxlleqeybtdr9wi0vcjxym">
         <w:r>
           <w:rPr>
             <w:rStyle w:val="Hyperlink"/>
@@ -14116,7 +14116,7 @@
       <w:r>
         <w:t xml:space="preserve">g = 9.780 m/s² at equator, 9.832 m/s² at poles (0.53% variation). On a flat disc, centrifugal force points outward from center, producing the OPPOSITE pattern. See </w:t>
       </w:r>
-      <w:hyperlink w:history="1" r:id="rIdyczaa7rxoznk4hix6iwjc">
+      <w:hyperlink w:history="1" r:id="rIdjfrbzxtq4vfagotconvj5">
         <w:r>
           <w:rPr>
             <w:rStyle w:val="Hyperlink"/>
@@ -15113,7 +15113,7 @@
         </w:rPr>
         <w:t xml:space="preserve">NOAA World Magnetic Model 2025: </w:t>
       </w:r>
-      <w:hyperlink w:history="1" r:id="rIdfmcudtp1x7xn1bhs0qjcb">
+      <w:hyperlink w:history="1" r:id="rIds7ftvwc-kbaejfqwa65nf">
         <w:r>
           <w:rPr>
             <w:rStyle w:val="Hyperlink"/>
@@ -15133,7 +15133,7 @@
         </w:rPr>
         <w:t xml:space="preserve">NOAA Wandering Geomagnetic Poles: </w:t>
       </w:r>
-      <w:hyperlink w:history="1" r:id="rIdeudarraxpyivjsaxlxmmk">
+      <w:hyperlink w:history="1" r:id="rIdairtyugdghsppbhltskul">
         <w:r>
           <w:rPr>
             <w:rStyle w:val="Hyperlink"/>
@@ -15153,7 +15153,7 @@
         </w:rPr>
         <w:t xml:space="preserve">CHAOS-7 Geomagnetic Field Model: </w:t>
       </w:r>
-      <w:hyperlink w:history="1" r:id="rIdoqtqi3gczd71uab6nadgi">
+      <w:hyperlink w:history="1" r:id="rIdazzjad6apsqumvweujfsk">
         <w:r>
           <w:rPr>
             <w:rStyle w:val="Hyperlink"/>
@@ -15173,7 +15173,7 @@
         </w:rPr>
         <w:t xml:space="preserve">ESA Swarm Satellite Mission: </w:t>
       </w:r>
-      <w:hyperlink w:history="1" r:id="rIdbbkcesinkbipqnccshx7x">
+      <w:hyperlink w:history="1" r:id="rId3tsliezy0q9bub9hz8n3b">
         <w:r>
           <w:rPr>
             <w:rStyle w:val="Hyperlink"/>
@@ -15193,7 +15193,7 @@
         </w:rPr>
         <w:t xml:space="preserve">INTERMAGNET Observatory Network: </w:t>
       </w:r>
-      <w:hyperlink w:history="1" r:id="rIdgiodixvzi1z3qzo_ko_ik">
+      <w:hyperlink w:history="1" r:id="rIdzgzcyp8jvlhlll4goqsr-">
         <w:r>
           <w:rPr>
             <w:rStyle w:val="Hyperlink"/>
@@ -15213,7 +15213,7 @@
         </w:rPr>
         <w:t xml:space="preserve">IGRF-13: </w:t>
       </w:r>
-      <w:hyperlink w:history="1" r:id="rId8nptwwjy7eoaywxhdbcco">
+      <w:hyperlink w:history="1" r:id="rIdawzle6fbc0imoowz0y6xc">
         <w:r>
           <w:rPr>
             <w:rStyle w:val="Hyperlink"/>
@@ -15233,7 +15233,7 @@
         </w:rPr>
         <w:t xml:space="preserve">ESA Gaia Data Release 3: </w:t>
       </w:r>
-      <w:hyperlink w:history="1" r:id="rIdl2dsgvokjvvz3fuwi9afc">
+      <w:hyperlink w:history="1" r:id="rIdmqavunrccon4gvl6bnod1">
         <w:r>
           <w:rPr>
             <w:rStyle w:val="Hyperlink"/>
@@ -15253,7 +15253,7 @@
         </w:rPr>
         <w:t xml:space="preserve">Hipparcos Catalogue: </w:t>
       </w:r>
-      <w:hyperlink w:history="1" r:id="rIdkc-zmfl5ads5nroqcegtk">
+      <w:hyperlink w:history="1" r:id="rIdfrzolg0mxx9uqnafsxx63">
         <w:r>
           <w:rPr>
             <w:rStyle w:val="Hyperlink"/>
@@ -15273,7 +15273,7 @@
         </w:rPr>
         <w:t xml:space="preserve">US Patent 787412 (Tesla): </w:t>
       </w:r>
-      <w:hyperlink w:history="1" r:id="rId3h9lol9kwlxt_y4wed-wg">
+      <w:hyperlink w:history="1" r:id="rId6yat1jb7jvh2axqmjv1pw">
         <w:r>
           <w:rPr>
             <w:rStyle w:val="Hyperlink"/>
@@ -15293,7 +15293,7 @@
         </w:rPr>
         <w:t xml:space="preserve">NOAA Solar Position Algorithm: </w:t>
       </w:r>
-      <w:hyperlink w:history="1" r:id="rIdiguvioqbqrfpg9wmy8w_s">
+      <w:hyperlink w:history="1" r:id="rIdztrblqtxk1zpp2conhhos">
         <w:r>
           <w:rPr>
             <w:rStyle w:val="Hyperlink"/>
@@ -15313,7 +15313,7 @@
         </w:rPr>
         <w:t xml:space="preserve">National Geodetic Survey Gravity: </w:t>
       </w:r>
-      <w:hyperlink w:history="1" r:id="rIdbgr7_exvrwtywvhdmljiu">
+      <w:hyperlink w:history="1" r:id="rId5lqel0oovtixkbqwas7qa">
         <w:r>
           <w:rPr>
             <w:rStyle w:val="Hyperlink"/>
@@ -15333,7 +15333,7 @@
         </w:rPr>
         <w:t xml:space="preserve">CHIME/FRB Project: </w:t>
       </w:r>
-      <w:hyperlink w:history="1" r:id="rId9hstljvv6tfe7wojyjx5h">
+      <w:hyperlink w:history="1" r:id="rIdr-pusjo_ulrrvuyi-m7lt">
         <w:r>
           <w:rPr>
             <w:rStyle w:val="Hyperlink"/>
@@ -15353,7 +15353,7 @@
         </w:rPr>
         <w:t xml:space="preserve">GRACE-FO (gravity mapping): </w:t>
       </w:r>
-      <w:hyperlink w:history="1" r:id="rIdknrytdcm5qka2odhcy0nx">
+      <w:hyperlink w:history="1" r:id="rIdu7cebfzw-gjm3mzvvah0h">
         <w:r>
           <w:rPr>
             <w:rStyle w:val="Hyperlink"/>
@@ -15373,7 +15373,7 @@
         </w:rPr>
         <w:t xml:space="preserve">GOCE (gravity field): </w:t>
       </w:r>
-      <w:hyperlink w:history="1" r:id="rIdsyxz7e2khibpfpznm-bfk">
+      <w:hyperlink w:history="1" r:id="rIdukwy1nh8vqin6olxm3oah">
         <w:r>
           <w:rPr>
             <w:rStyle w:val="Hyperlink"/>
@@ -15393,7 +15393,7 @@
         </w:rPr>
         <w:t xml:space="preserve">GPS.gov: </w:t>
       </w:r>
-      <w:hyperlink w:history="1" r:id="rId03kngem5-uoqpdgqb4rvy">
+      <w:hyperlink w:history="1" r:id="rIdckz9d0xxx1cbj6ohexeev">
         <w:r>
           <w:rPr>
             <w:rStyle w:val="Hyperlink"/>
@@ -15413,7 +15413,7 @@
         </w:rPr>
         <w:t xml:space="preserve">CelesTrak TLE Data: </w:t>
       </w:r>
-      <w:hyperlink w:history="1" r:id="rIdd97b8qloyzwvtbilsh4rc">
+      <w:hyperlink w:history="1" r:id="rIdnyykdgdye7xrupel9bdmf">
         <w:r>
           <w:rPr>
             <w:rStyle w:val="Hyperlink"/>

</xml_diff>

<commit_message>
Correct Tesla WIN-001 analysis: acknowledge 0.08484s measurement
Tesla did measure a round-trip propagation time (0.08484 s) through
Earth's diameter that converts to ~11.78 Hz. The issue is not that
the frequency is fabricated, but that the dome model reinterprets a
spherical-Earth propagation time as flat-disc resonance — the
opposite of what Tesla was calculating. Updated WIN-001 evidence
and domains table row 2 accordingly.

Co-Authored-By: Claude Opus 4.6 <noreply@anthropic.com>
</commit_message>
<xml_diff>
--- a/downloads/critical-review-dome-model-v4.docx
+++ b/downloads/critical-review-dome-model-v4.docx
@@ -916,7 +916,7 @@
                 <w:sz w:val="18"/>
                 <w:szCs w:val="18"/>
               </w:rPr>
-              <w:t xml:space="preserve">US Patent 787412 does not contain the cited formula f=c/(2D)</w:t>
+              <w:t xml:space="preserve">Tesla measured a propagation time (0.08484 s) that converts to ~11.78 Hz, but never derived the disc-resonance formula f=c/(2D) attributed to him</w:t>
             </w:r>
           </w:p>
         </w:tc>
@@ -8889,7 +8889,7 @@
       <w:r>
         <w:t xml:space="preserve">US Patent 787412 (1905), publicly available at </w:t>
       </w:r>
-      <w:hyperlink w:history="1" r:id="rIdwpyhc7xsodtmqsxm_rscl">
+      <w:hyperlink w:history="1" r:id="rIdkpzu67c0enwwbluzr6onl">
         <w:r>
           <w:rPr>
             <w:rStyle w:val="Hyperlink"/>
@@ -9029,7 +9029,7 @@
       <w:r>
         <w:t xml:space="preserve">James Bradley (1727) explicitly tested and rejected atmospheric refraction as an explanation: refraction is wavelength-dependent (chromatic), while stellar aberration is achromatic. Modern VLBI measurements achieve milliarcsecond precision and directly confirm aberration correlates with Earth's orbital velocity (~30 km/s). The </w:t>
       </w:r>
-      <w:hyperlink w:history="1" r:id="rIdpiczg-4ebbast1eh9jjfu">
+      <w:hyperlink w:history="1" r:id="rIdpv4d3iqguz4fbbou9jo3l">
         <w:r>
           <w:rPr>
             <w:rStyle w:val="Hyperlink"/>
@@ -9095,7 +9095,7 @@
       <w:r>
         <w:t xml:space="preserve">ESA </w:t>
       </w:r>
-      <w:hyperlink w:history="1" r:id="rId9vwpne1ufnw6cbpsaltp-">
+      <w:hyperlink w:history="1" r:id="rId7gz_la1hwo9cgqqu7xuh_">
         <w:r>
           <w:rPr>
             <w:rStyle w:val="Hyperlink"/>
@@ -9161,7 +9161,7 @@
       <w:r>
         <w:t xml:space="preserve">Crepuscular rays are parallel beams made visible by atmospheric scattering. The apparent divergence is a perspective effect. Crucially, anticrepuscular rays converge at the anti-solar point simultaneously. See </w:t>
       </w:r>
-      <w:hyperlink w:history="1" r:id="rIdu7tekco1lpehnxz9jbo8e">
+      <w:hyperlink w:history="1" r:id="rIdztxipgtdarlbtx6upgpoi">
         <w:r>
           <w:rPr>
             <w:rStyle w:val="Hyperlink"/>
@@ -9172,7 +9172,7 @@
       <w:r>
         <w:t xml:space="preserve"> and </w:t>
       </w:r>
-      <w:hyperlink w:history="1" r:id="rIdimbj7wplwwtek1yqyvlic">
+      <w:hyperlink w:history="1" r:id="rId_vyechtvjlqcdkqowrmzw">
         <w:r>
           <w:rPr>
             <w:rStyle w:val="Hyperlink"/>
@@ -9238,7 +9238,7 @@
       <w:r>
         <w:t xml:space="preserve">NOAA officially states no evidence of anomalous disappearances. </w:t>
       </w:r>
-      <w:hyperlink w:history="1" r:id="rIdlsavsyljyzglsqaqrp_7d">
+      <w:hyperlink w:history="1" r:id="rIdzqp1um_fjxmjrxbkwj93e">
         <w:r>
           <w:rPr>
             <w:rStyle w:val="Hyperlink"/>
@@ -9304,7 +9304,7 @@
       <w:r>
         <w:t xml:space="preserve">Hipparcos </w:t>
       </w:r>
-      <w:hyperlink w:history="1" r:id="rIdqcy3piam9tp4o_fzvqlvg">
+      <w:hyperlink w:history="1" r:id="rIdpxelbossirksous_w2ytv">
         <w:r>
           <w:rPr>
             <w:rStyle w:val="Hyperlink"/>
@@ -9720,7 +9720,7 @@
       <w:r>
         <w:t xml:space="preserve">Terra-Nova et al. (2017, PNAS) demonstrate reversed-flux patches reproduce SAA splitting in MHD simulations. The </w:t>
       </w:r>
-      <w:hyperlink w:history="1" r:id="rId4s3q_srjzs5_1h-qnpck2">
+      <w:hyperlink w:history="1" r:id="rIddkeawsxy-ddfhlalyzgmp">
         <w:r>
           <w:rPr>
             <w:rStyle w:val="Hyperlink"/>
@@ -9731,7 +9731,7 @@
       <w:r>
         <w:t xml:space="preserve"> documents the evolution quantitatively. </w:t>
       </w:r>
-      <w:hyperlink w:history="1" r:id="rIde8tloolf3xgutp3cc75ni">
+      <w:hyperlink w:history="1" r:id="rIdiyi3ekmvccrprewpnc-8u">
         <w:r>
           <w:rPr>
             <w:rStyle w:val="Hyperlink"/>
@@ -9782,7 +9782,7 @@
       <w:r>
         <w:t xml:space="preserve">Normal secular variation documented by </w:t>
       </w:r>
-      <w:hyperlink w:history="1" r:id="rIdzzy3tovv7rswutk8o4k82">
+      <w:hyperlink w:history="1" r:id="rIdnwryfpstjy51ocdovgfwq">
         <w:r>
           <w:rPr>
             <w:rStyle w:val="Hyperlink"/>
@@ -9849,7 +9849,7 @@
       <w:r>
         <w:t xml:space="preserve">Eclipse-induced perturbations predicted by Chapman (1933) via ionospheric conductivity drops. Data from </w:t>
       </w:r>
-      <w:hyperlink w:history="1" r:id="rIdhtwfxdljbartdllesaisl">
+      <w:hyperlink w:history="1" r:id="rIdj0kk2wuuq_p6f168jhiag">
         <w:r>
           <w:rPr>
             <w:rStyle w:val="Hyperlink"/>
@@ -9937,7 +9937,7 @@
       <w:r>
         <w:t xml:space="preserve">The formula used is for a quarter-wave linear waveguide, not a spherical cavity. Correct formula f = c/(2*pi*R) gives R = 6,098 km, within 4% of Earth's radius. The ionosphere IS conductive (</w:t>
       </w:r>
-      <w:hyperlink w:history="1" r:id="rIdl1ihp86t7drwuhbrq-t8l">
+      <w:hyperlink w:history="1" r:id="rIdgiub9shqmfjhjtm1sit0y">
         <w:r>
           <w:rPr>
             <w:rStyle w:val="Hyperlink"/>
@@ -10004,7 +10004,7 @@
       <w:r>
         <w:t xml:space="preserve">All five observations already predicted by </w:t>
       </w:r>
-      <w:hyperlink w:history="1" r:id="rId_r_9ze-m0hkps9obaysim">
+      <w:hyperlink w:history="1" r:id="rId5hyqxw2s8jyqgeziyclj8">
         <w:r>
           <w:rPr>
             <w:rStyle w:val="Hyperlink"/>
@@ -10015,7 +10015,7 @@
       <w:r>
         <w:t xml:space="preserve">, </w:t>
       </w:r>
-      <w:hyperlink w:history="1" r:id="rIdqdmcft-nbabrb5ockw14b">
+      <w:hyperlink w:history="1" r:id="rIdc_pvd7ckbwxw1rgpp_bv3">
         <w:r>
           <w:rPr>
             <w:rStyle w:val="Hyperlink"/>
@@ -10342,7 +10342,7 @@
       <w:r>
         <w:t xml:space="preserve">Antarctic gravity anomalies are mapped from orbit by </w:t>
       </w:r>
-      <w:hyperlink w:history="1" r:id="rIdxprxedh7kjazlhqipbc9o">
+      <w:hyperlink w:history="1" r:id="rIdzxcru9vgyjmafjcqfom5s">
         <w:r>
           <w:rPr>
             <w:rStyle w:val="Hyperlink"/>
@@ -10353,7 +10353,7 @@
       <w:r>
         <w:t xml:space="preserve"> and </w:t>
       </w:r>
-      <w:hyperlink w:history="1" r:id="rIdu5ybybgvwq8cz0d4loez7">
+      <w:hyperlink w:history="1" r:id="rIddmykokzvhjuivz8-fjdal">
         <w:r>
           <w:rPr>
             <w:rStyle w:val="Hyperlink"/>
@@ -13329,7 +13329,7 @@
       <w:r>
         <w:t xml:space="preserve">A </w:t>
       </w:r>
-      <w:hyperlink w:history="1" r:id="rIdcjyirnvyitfuyj9oqvyav">
+      <w:hyperlink w:history="1" r:id="rId2yldkusmu1-ow1mkjxoff">
         <w:r>
           <w:rPr>
             <w:rStyle w:val="Hyperlink"/>
@@ -13340,7 +13340,7 @@
       <w:r>
         <w:t xml:space="preserve"> found detectable decreases in X, Z, and total field components during eclipses. An </w:t>
       </w:r>
-      <w:hyperlink w:history="1" r:id="rId3ylsg9nmnpnfywiwce1yq">
+      <w:hyperlink w:history="1" r:id="rIdxeovazhbwdplccams-8jl">
         <w:r>
           <w:rPr>
             <w:rStyle w:val="Hyperlink"/>
@@ -13845,7 +13845,7 @@
       <w:r>
         <w:t xml:space="preserve">Continuous 24-hour sunlight. A local sun at 5,733 km circling above a flat disc cannot produce 24-hour sunlight at the disc edge. Directly observable at Amundsen-Scott Station, staffed year-round since 1957. See </w:t>
       </w:r>
-      <w:hyperlink w:history="1" r:id="rIdxoglaethe4qosltdwizxg">
+      <w:hyperlink w:history="1" r:id="rIdmsd-d06nyhqlbuhskcgj0">
         <w:r>
           <w:rPr>
             <w:rStyle w:val="Hyperlink"/>
@@ -13909,7 +13909,7 @@
       <w:r>
         <w:t xml:space="preserve">GPS provides 1–3 meter accuracy worldwide using 24+ satellites in Keplerian orbits calculated from spherical-Earth gravitational mechanics. The system requires precise relativistic corrections (both special and general) that depend on the satellites' orbital velocity and altitude above a spherical gravitational well. If Earth were a flat disc with different geometry, the signal propagation times, relativistic corrections, and satellite visibility geometry would all be wrong, and the system would not achieve meter-level accuracy. The same applies to every other satellite navigation system (GLONASS, Galileo, BeiDou). The ISS at 408 km is visible on predictable schedules computed from Keplerian orbits. Geostationary satellites at 35,786 km — far above the dome's maximum height — provide continuous coverage. See </w:t>
       </w:r>
-      <w:hyperlink w:history="1" r:id="rIdrk6ickbbpnznq8yvjkfko">
+      <w:hyperlink w:history="1" r:id="rIdpmtawjytchpdf3slk6yir">
         <w:r>
           <w:rPr>
             <w:rStyle w:val="Hyperlink"/>
@@ -13920,7 +13920,7 @@
       <w:r>
         <w:t xml:space="preserve">; </w:t>
       </w:r>
-      <w:hyperlink w:history="1" r:id="rIdqqdt55kbm4mqlpdou6t2f">
+      <w:hyperlink w:history="1" r:id="rIdhvztj6udnzuowo2zm3a_b">
         <w:r>
           <w:rPr>
             <w:rStyle w:val="Hyperlink"/>
@@ -13969,7 +13969,7 @@
       <w:r>
         <w:t xml:space="preserve">Modern solar calculators (</w:t>
       </w:r>
-      <w:hyperlink w:history="1" r:id="rIdyt-5bjzllvvi4itdaweea">
+      <w:hyperlink w:history="1" r:id="rIdqvbqdeq3lnckcjarrwgi2">
         <w:r>
           <w:rPr>
             <w:rStyle w:val="Hyperlink"/>
@@ -14018,7 +14018,7 @@
       <w:r>
         <w:t xml:space="preserve">The </w:t>
       </w:r>
-      <w:hyperlink w:history="1" r:id="rIdxsfzikqf8zhq_2b-hxdaa">
+      <w:hyperlink w:history="1" r:id="rIdcxn1_6hdvhrgxzmwym0bq">
         <w:r>
           <w:rPr>
             <w:rStyle w:val="Hyperlink"/>
@@ -14067,7 +14067,7 @@
       <w:r>
         <w:t xml:space="preserve">Earth's field is a dipole. South magnetic pole at 64.1°S, 135.9°E (</w:t>
       </w:r>
-      <w:hyperlink w:history="1" r:id="rIdxlleqeybtdr9wi0vcjxym">
+      <w:hyperlink w:history="1" r:id="rIdltnvc4x_ktm3sus2ps0da">
         <w:r>
           <w:rPr>
             <w:rStyle w:val="Hyperlink"/>
@@ -14116,7 +14116,7 @@
       <w:r>
         <w:t xml:space="preserve">g = 9.780 m/s² at equator, 9.832 m/s² at poles (0.53% variation). On a flat disc, centrifugal force points outward from center, producing the OPPOSITE pattern. See </w:t>
       </w:r>
-      <w:hyperlink w:history="1" r:id="rIdjfrbzxtq4vfagotconvj5">
+      <w:hyperlink w:history="1" r:id="rIdkrrsby__mvy-5_whj4r7a">
         <w:r>
           <w:rPr>
             <w:rStyle w:val="Hyperlink"/>
@@ -15113,7 +15113,7 @@
         </w:rPr>
         <w:t xml:space="preserve">NOAA World Magnetic Model 2025: </w:t>
       </w:r>
-      <w:hyperlink w:history="1" r:id="rIds7ftvwc-kbaejfqwa65nf">
+      <w:hyperlink w:history="1" r:id="rId4tysr0cej-khgznrrwery">
         <w:r>
           <w:rPr>
             <w:rStyle w:val="Hyperlink"/>
@@ -15133,7 +15133,7 @@
         </w:rPr>
         <w:t xml:space="preserve">NOAA Wandering Geomagnetic Poles: </w:t>
       </w:r>
-      <w:hyperlink w:history="1" r:id="rIdairtyugdghsppbhltskul">
+      <w:hyperlink w:history="1" r:id="rIdhyrpguysku3qegkzoxn9r">
         <w:r>
           <w:rPr>
             <w:rStyle w:val="Hyperlink"/>
@@ -15153,7 +15153,7 @@
         </w:rPr>
         <w:t xml:space="preserve">CHAOS-7 Geomagnetic Field Model: </w:t>
       </w:r>
-      <w:hyperlink w:history="1" r:id="rIdazzjad6apsqumvweujfsk">
+      <w:hyperlink w:history="1" r:id="rIdjm49aygm-zgu4my7l_atu">
         <w:r>
           <w:rPr>
             <w:rStyle w:val="Hyperlink"/>
@@ -15173,7 +15173,7 @@
         </w:rPr>
         <w:t xml:space="preserve">ESA Swarm Satellite Mission: </w:t>
       </w:r>
-      <w:hyperlink w:history="1" r:id="rId3tsliezy0q9bub9hz8n3b">
+      <w:hyperlink w:history="1" r:id="rIdhwh7y3oyyim2uh0xepmy0">
         <w:r>
           <w:rPr>
             <w:rStyle w:val="Hyperlink"/>
@@ -15193,7 +15193,7 @@
         </w:rPr>
         <w:t xml:space="preserve">INTERMAGNET Observatory Network: </w:t>
       </w:r>
-      <w:hyperlink w:history="1" r:id="rIdzgzcyp8jvlhlll4goqsr-">
+      <w:hyperlink w:history="1" r:id="rIdhqgdfvyzhdvq_1ixww4u9">
         <w:r>
           <w:rPr>
             <w:rStyle w:val="Hyperlink"/>
@@ -15213,7 +15213,7 @@
         </w:rPr>
         <w:t xml:space="preserve">IGRF-13: </w:t>
       </w:r>
-      <w:hyperlink w:history="1" r:id="rIdawzle6fbc0imoowz0y6xc">
+      <w:hyperlink w:history="1" r:id="rIdgwssi5_23bmhzp3vk5aej">
         <w:r>
           <w:rPr>
             <w:rStyle w:val="Hyperlink"/>
@@ -15233,7 +15233,7 @@
         </w:rPr>
         <w:t xml:space="preserve">ESA Gaia Data Release 3: </w:t>
       </w:r>
-      <w:hyperlink w:history="1" r:id="rIdmqavunrccon4gvl6bnod1">
+      <w:hyperlink w:history="1" r:id="rIdcfbunsq_bll8_dxtxxucc">
         <w:r>
           <w:rPr>
             <w:rStyle w:val="Hyperlink"/>
@@ -15253,7 +15253,7 @@
         </w:rPr>
         <w:t xml:space="preserve">Hipparcos Catalogue: </w:t>
       </w:r>
-      <w:hyperlink w:history="1" r:id="rIdfrzolg0mxx9uqnafsxx63">
+      <w:hyperlink w:history="1" r:id="rIdktjeyhjxqw5navwu2jxnh">
         <w:r>
           <w:rPr>
             <w:rStyle w:val="Hyperlink"/>
@@ -15273,7 +15273,7 @@
         </w:rPr>
         <w:t xml:space="preserve">US Patent 787412 (Tesla): </w:t>
       </w:r>
-      <w:hyperlink w:history="1" r:id="rId6yat1jb7jvh2axqmjv1pw">
+      <w:hyperlink w:history="1" r:id="rIdjmwctl9sd6k1xzosztds8">
         <w:r>
           <w:rPr>
             <w:rStyle w:val="Hyperlink"/>
@@ -15293,7 +15293,7 @@
         </w:rPr>
         <w:t xml:space="preserve">NOAA Solar Position Algorithm: </w:t>
       </w:r>
-      <w:hyperlink w:history="1" r:id="rIdztrblqtxk1zpp2conhhos">
+      <w:hyperlink w:history="1" r:id="rIdzjvdnk6xfh57swapoczem">
         <w:r>
           <w:rPr>
             <w:rStyle w:val="Hyperlink"/>
@@ -15313,7 +15313,7 @@
         </w:rPr>
         <w:t xml:space="preserve">National Geodetic Survey Gravity: </w:t>
       </w:r>
-      <w:hyperlink w:history="1" r:id="rId5lqel0oovtixkbqwas7qa">
+      <w:hyperlink w:history="1" r:id="rId9obuqk-0adbakbpqxgdvu">
         <w:r>
           <w:rPr>
             <w:rStyle w:val="Hyperlink"/>
@@ -15333,7 +15333,7 @@
         </w:rPr>
         <w:t xml:space="preserve">CHIME/FRB Project: </w:t>
       </w:r>
-      <w:hyperlink w:history="1" r:id="rIdr-pusjo_ulrrvuyi-m7lt">
+      <w:hyperlink w:history="1" r:id="rIdsmz-c6mgkaxphlfthpt1p">
         <w:r>
           <w:rPr>
             <w:rStyle w:val="Hyperlink"/>
@@ -15353,7 +15353,7 @@
         </w:rPr>
         <w:t xml:space="preserve">GRACE-FO (gravity mapping): </w:t>
       </w:r>
-      <w:hyperlink w:history="1" r:id="rIdu7cebfzw-gjm3mzvvah0h">
+      <w:hyperlink w:history="1" r:id="rIdxolbkvsb8s4y93uq7fzsx">
         <w:r>
           <w:rPr>
             <w:rStyle w:val="Hyperlink"/>
@@ -15373,7 +15373,7 @@
         </w:rPr>
         <w:t xml:space="preserve">GOCE (gravity field): </w:t>
       </w:r>
-      <w:hyperlink w:history="1" r:id="rIdukwy1nh8vqin6olxm3oah">
+      <w:hyperlink w:history="1" r:id="rIdt2ye4xao2anqut7bimwb-">
         <w:r>
           <w:rPr>
             <w:rStyle w:val="Hyperlink"/>
@@ -15393,7 +15393,7 @@
         </w:rPr>
         <w:t xml:space="preserve">GPS.gov: </w:t>
       </w:r>
-      <w:hyperlink w:history="1" r:id="rIdckz9d0xxx1cbj6ohexeev">
+      <w:hyperlink w:history="1" r:id="rIdnylejz7sbvdelchbe1_lm">
         <w:r>
           <w:rPr>
             <w:rStyle w:val="Hyperlink"/>
@@ -15413,7 +15413,7 @@
         </w:rPr>
         <w:t xml:space="preserve">CelesTrak TLE Data: </w:t>
       </w:r>
-      <w:hyperlink w:history="1" r:id="rIdnyykdgdye7xrupel9bdmf">
+      <w:hyperlink w:history="1" r:id="rIdxrfy2c2ugfystiu_skpjj">
         <w:r>
           <w:rPr>
             <w:rStyle w:val="Hyperlink"/>

</xml_diff>

<commit_message>
Add dome geometric derivation to Sydney-Perth Kill-Shot analysis
Show what the dome's own geometry actually predicts: ~8,300 km
(uncorrected flat disc) or ~3,820 km (with author's Finsler
correction). Neither produces the claimed 4,352 km — which
matches the Indian Pacific railway exactly. The "prediction"
appears to be a railway timetable distance, not a geometric
derivation. Direct flights confirm the globe geodesic (3,291 km).

Co-Authored-By: Claude Opus 4.6 <noreply@anthropic.com>
</commit_message>
<xml_diff>
--- a/downloads/critical-review-dome-model-v4.docx
+++ b/downloads/critical-review-dome-model-v4.docx
@@ -8889,7 +8889,7 @@
       <w:r>
         <w:t xml:space="preserve">US Patent 787412 (1905), publicly available at </w:t>
       </w:r>
-      <w:hyperlink w:history="1" r:id="rId1zngncwdt_amiqn1hoa2m">
+      <w:hyperlink w:history="1" r:id="rIdaxdfbfhevfvdukwuqwuvy">
         <w:r>
           <w:rPr>
             <w:rStyle w:val="Hyperlink"/>
@@ -9029,7 +9029,7 @@
       <w:r>
         <w:t xml:space="preserve">James Bradley (1727) explicitly tested and rejected atmospheric refraction as an explanation: refraction is wavelength-dependent (chromatic), while stellar aberration is achromatic. Modern VLBI measurements achieve milliarcsecond precision and directly confirm aberration correlates with Earth's orbital velocity (~30 km/s). The </w:t>
       </w:r>
-      <w:hyperlink w:history="1" r:id="rIdihafmu3_i_qam0lh9ghzs">
+      <w:hyperlink w:history="1" r:id="rIdacgglew8tzpzebkv58v9x">
         <w:r>
           <w:rPr>
             <w:rStyle w:val="Hyperlink"/>
@@ -9095,7 +9095,7 @@
       <w:r>
         <w:t xml:space="preserve">ESA </w:t>
       </w:r>
-      <w:hyperlink w:history="1" r:id="rId-_mhnis9ka2aebfbi5e0m">
+      <w:hyperlink w:history="1" r:id="rIdoulc2hlybtjgsmznjhbme">
         <w:r>
           <w:rPr>
             <w:rStyle w:val="Hyperlink"/>
@@ -9161,7 +9161,7 @@
       <w:r>
         <w:t xml:space="preserve">Crepuscular rays are parallel beams made visible by atmospheric scattering. The apparent divergence is a perspective effect. Crucially, anticrepuscular rays converge at the anti-solar point simultaneously. See </w:t>
       </w:r>
-      <w:hyperlink w:history="1" r:id="rId9cchvorv8ie4cbo3z9p0q">
+      <w:hyperlink w:history="1" r:id="rIdljcd2_9tv9igxbopvda6c">
         <w:r>
           <w:rPr>
             <w:rStyle w:val="Hyperlink"/>
@@ -9172,7 +9172,7 @@
       <w:r>
         <w:t xml:space="preserve"> and </w:t>
       </w:r>
-      <w:hyperlink w:history="1" r:id="rIdtq-gftdb7bhewgp8ldxdq">
+      <w:hyperlink w:history="1" r:id="rIddlsv6sxsilr1vbxd9u-bt">
         <w:r>
           <w:rPr>
             <w:rStyle w:val="Hyperlink"/>
@@ -9238,7 +9238,7 @@
       <w:r>
         <w:t xml:space="preserve">NOAA officially states no evidence of anomalous disappearances. </w:t>
       </w:r>
-      <w:hyperlink w:history="1" r:id="rIdlmaruzaj55-sjeznvekju">
+      <w:hyperlink w:history="1" r:id="rId9ngndwc0x-gc790qjfpar">
         <w:r>
           <w:rPr>
             <w:rStyle w:val="Hyperlink"/>
@@ -9304,7 +9304,7 @@
       <w:r>
         <w:t xml:space="preserve">Hipparcos </w:t>
       </w:r>
-      <w:hyperlink w:history="1" r:id="rIdm8ij5u_5is5ryiebbikul">
+      <w:hyperlink w:history="1" r:id="rId1eqoa810brda9hpvfafo_">
         <w:r>
           <w:rPr>
             <w:rStyle w:val="Hyperlink"/>
@@ -9720,7 +9720,7 @@
       <w:r>
         <w:t xml:space="preserve">Terra-Nova et al. (2017, PNAS) demonstrate reversed-flux patches reproduce SAA splitting in MHD simulations. The </w:t>
       </w:r>
-      <w:hyperlink w:history="1" r:id="rIdbzgc_vhmcgkrpreze3qq0">
+      <w:hyperlink w:history="1" r:id="rIdjibckcxw082shex3ej-ue">
         <w:r>
           <w:rPr>
             <w:rStyle w:val="Hyperlink"/>
@@ -9731,7 +9731,7 @@
       <w:r>
         <w:t xml:space="preserve"> documents the evolution quantitatively. </w:t>
       </w:r>
-      <w:hyperlink w:history="1" r:id="rIdxhclptcechivqgh8sbfm7">
+      <w:hyperlink w:history="1" r:id="rIdxiblejy5bkdtc2r_wxnc8">
         <w:r>
           <w:rPr>
             <w:rStyle w:val="Hyperlink"/>
@@ -9782,7 +9782,7 @@
       <w:r>
         <w:t xml:space="preserve">Normal secular variation documented by </w:t>
       </w:r>
-      <w:hyperlink w:history="1" r:id="rIdccgoyzzcvzlui-q3u6wht">
+      <w:hyperlink w:history="1" r:id="rIdobic_b4zmyodoubdffobv">
         <w:r>
           <w:rPr>
             <w:rStyle w:val="Hyperlink"/>
@@ -9849,7 +9849,7 @@
       <w:r>
         <w:t xml:space="preserve">Eclipse-induced perturbations predicted by Chapman (1933) via ionospheric conductivity drops. Data from </w:t>
       </w:r>
-      <w:hyperlink w:history="1" r:id="rIddnymzcl4gcldv99bsovaw">
+      <w:hyperlink w:history="1" r:id="rId6yixhvht9tldnbfff3-9b">
         <w:r>
           <w:rPr>
             <w:rStyle w:val="Hyperlink"/>
@@ -9937,7 +9937,7 @@
       <w:r>
         <w:t xml:space="preserve">The formula used is for a quarter-wave linear waveguide, not a spherical cavity. Correct formula f = c/(2*pi*R) gives R = 6,098 km, within 4% of Earth's radius. The ionosphere IS conductive (</w:t>
       </w:r>
-      <w:hyperlink w:history="1" r:id="rIdw43shzrrjslgkcbpogek9">
+      <w:hyperlink w:history="1" r:id="rIdskp5antp-vgxoj9dvmsok">
         <w:r>
           <w:rPr>
             <w:rStyle w:val="Hyperlink"/>
@@ -10004,7 +10004,7 @@
       <w:r>
         <w:t xml:space="preserve">All five observations already predicted by </w:t>
       </w:r>
-      <w:hyperlink w:history="1" r:id="rIdmzy3jjp7vxmbfwzu_uavj">
+      <w:hyperlink w:history="1" r:id="rIdj24arlp84oxaazqzd0xiv">
         <w:r>
           <w:rPr>
             <w:rStyle w:val="Hyperlink"/>
@@ -10015,7 +10015,7 @@
       <w:r>
         <w:t xml:space="preserve">, </w:t>
       </w:r>
-      <w:hyperlink w:history="1" r:id="rIdcfyma5jhpj1bqnaguazf3">
+      <w:hyperlink w:history="1" r:id="rIdr3er-frhdg93nrvaw4do2">
         <w:r>
           <w:rPr>
             <w:rStyle w:val="Hyperlink"/>
@@ -10342,7 +10342,7 @@
       <w:r>
         <w:t xml:space="preserve">Antarctic gravity anomalies are mapped from orbit by </w:t>
       </w:r>
-      <w:hyperlink w:history="1" r:id="rIdvhyjkuh1roj5_eqfsnb_q">
+      <w:hyperlink w:history="1" r:id="rIdk7-6_q5w-lxb3y31xsnqr">
         <w:r>
           <w:rPr>
             <w:rStyle w:val="Hyperlink"/>
@@ -10353,7 +10353,7 @@
       <w:r>
         <w:t xml:space="preserve"> and </w:t>
       </w:r>
-      <w:hyperlink w:history="1" r:id="rIdkqb0o170vgt3yebjrzgtj">
+      <w:hyperlink w:history="1" r:id="rIdq1suovthlsc4g816gtysy">
         <w:r>
           <w:rPr>
             <w:rStyle w:val="Hyperlink"/>
@@ -13329,7 +13329,7 @@
       <w:r>
         <w:t xml:space="preserve">A </w:t>
       </w:r>
-      <w:hyperlink w:history="1" r:id="rIdbub41-jnghuifdu2q_wwh">
+      <w:hyperlink w:history="1" r:id="rIdlp6vtxrhj5rgfstovb5uw">
         <w:r>
           <w:rPr>
             <w:rStyle w:val="Hyperlink"/>
@@ -13340,7 +13340,7 @@
       <w:r>
         <w:t xml:space="preserve"> found detectable decreases in X, Z, and total field components during eclipses. An </w:t>
       </w:r>
-      <w:hyperlink w:history="1" r:id="rIdr-0mofsfbdsl6vxuft80e">
+      <w:hyperlink w:history="1" r:id="rId-43eidlcxdepdsvmcs7hw">
         <w:r>
           <w:rPr>
             <w:rStyle w:val="Hyperlink"/>
@@ -13845,7 +13845,7 @@
       <w:r>
         <w:t xml:space="preserve">Continuous 24-hour sunlight. A local sun at 5,733 km circling above a flat disc cannot produce 24-hour sunlight at the disc edge. Directly observable at Amundsen-Scott Station, staffed year-round since 1957. See </w:t>
       </w:r>
-      <w:hyperlink w:history="1" r:id="rIdwnbi3gxplp8sbqziktpec">
+      <w:hyperlink w:history="1" r:id="rIdshzggnnmixd3_ratqmv8h">
         <w:r>
           <w:rPr>
             <w:rStyle w:val="Hyperlink"/>
@@ -13909,7 +13909,7 @@
       <w:r>
         <w:t xml:space="preserve">GPS provides 1–3 meter accuracy worldwide using 24+ satellites in Keplerian orbits calculated from spherical-Earth gravitational mechanics. The system requires precise relativistic corrections (both special and general) that depend on the satellites' orbital velocity and altitude above a spherical gravitational well. If Earth were a flat disc with different geometry, the signal propagation times, relativistic corrections, and satellite visibility geometry would all be wrong, and the system would not achieve meter-level accuracy. The same applies to every other satellite navigation system (GLONASS, Galileo, BeiDou). The ISS at 408 km is visible on predictable schedules computed from Keplerian orbits. Geostationary satellites at 35,786 km — far above the dome's maximum height — provide continuous coverage. See </w:t>
       </w:r>
-      <w:hyperlink w:history="1" r:id="rIdisbanernf699c67-l8gi5">
+      <w:hyperlink w:history="1" r:id="rIdx78a7lf5bbcmdybtzht4g">
         <w:r>
           <w:rPr>
             <w:rStyle w:val="Hyperlink"/>
@@ -13920,7 +13920,7 @@
       <w:r>
         <w:t xml:space="preserve">; </w:t>
       </w:r>
-      <w:hyperlink w:history="1" r:id="rIdyfg1t0v_za2xzo3ffazcj">
+      <w:hyperlink w:history="1" r:id="rIdjf_l9d77-axn-mtdllndc">
         <w:r>
           <w:rPr>
             <w:rStyle w:val="Hyperlink"/>
@@ -13969,7 +13969,7 @@
       <w:r>
         <w:t xml:space="preserve">Modern solar calculators (</w:t>
       </w:r>
-      <w:hyperlink w:history="1" r:id="rIduusgys74k3-2xp_rwlgo3">
+      <w:hyperlink w:history="1" r:id="rIdachnai8muu2etlh5l_hum">
         <w:r>
           <w:rPr>
             <w:rStyle w:val="Hyperlink"/>
@@ -14018,7 +14018,7 @@
       <w:r>
         <w:t xml:space="preserve">The </w:t>
       </w:r>
-      <w:hyperlink w:history="1" r:id="rId4m_1rk8sskvdvakz4i_-y">
+      <w:hyperlink w:history="1" r:id="rIdzwulfc3lq99qaq20znteo">
         <w:r>
           <w:rPr>
             <w:rStyle w:val="Hyperlink"/>
@@ -14067,7 +14067,7 @@
       <w:r>
         <w:t xml:space="preserve">Earth's field is a dipole. South magnetic pole at 64.1°S, 135.9°E (</w:t>
       </w:r>
-      <w:hyperlink w:history="1" r:id="rId8y38nqexcw6rnb4m-6ckn">
+      <w:hyperlink w:history="1" r:id="rIdha8w3yra4r0yhzcvyapx7">
         <w:r>
           <w:rPr>
             <w:rStyle w:val="Hyperlink"/>
@@ -14116,7 +14116,7 @@
       <w:r>
         <w:t xml:space="preserve">g = 9.780 m/s² at equator, 9.832 m/s² at poles (0.53% variation). On a flat disc, centrifugal force points outward from center, producing the OPPOSITE pattern. See </w:t>
       </w:r>
-      <w:hyperlink w:history="1" r:id="rIdq8otkckzw3x5-g6wkcqob">
+      <w:hyperlink w:history="1" r:id="rId91m8mqpqhp8pwj5-wfw8a">
         <w:r>
           <w:rPr>
             <w:rStyle w:val="Hyperlink"/>
@@ -15113,7 +15113,7 @@
         </w:rPr>
         <w:t xml:space="preserve">NOAA World Magnetic Model 2025: </w:t>
       </w:r>
-      <w:hyperlink w:history="1" r:id="rId_j4w0uqvtn9nlvvm_40dg">
+      <w:hyperlink w:history="1" r:id="rIdxm-_lorvuygp7ibrfj3iv">
         <w:r>
           <w:rPr>
             <w:rStyle w:val="Hyperlink"/>
@@ -15133,7 +15133,7 @@
         </w:rPr>
         <w:t xml:space="preserve">NOAA Wandering Geomagnetic Poles: </w:t>
       </w:r>
-      <w:hyperlink w:history="1" r:id="rIdbr8gafnzqsasiivsooaeg">
+      <w:hyperlink w:history="1" r:id="rIduwfgmb_jyewfbplh-esb2">
         <w:r>
           <w:rPr>
             <w:rStyle w:val="Hyperlink"/>
@@ -15153,7 +15153,7 @@
         </w:rPr>
         <w:t xml:space="preserve">CHAOS-7 Geomagnetic Field Model: </w:t>
       </w:r>
-      <w:hyperlink w:history="1" r:id="rIdhgbktnwoozd1ts9yyh6de">
+      <w:hyperlink w:history="1" r:id="rIdjthvxvqyjjmjc34lh_f3n">
         <w:r>
           <w:rPr>
             <w:rStyle w:val="Hyperlink"/>
@@ -15173,7 +15173,7 @@
         </w:rPr>
         <w:t xml:space="preserve">ESA Swarm Satellite Mission: </w:t>
       </w:r>
-      <w:hyperlink w:history="1" r:id="rIdvn970fflg54xj4tu8u3ri">
+      <w:hyperlink w:history="1" r:id="rId6s9zd4pw8ou6hnzzcvn56">
         <w:r>
           <w:rPr>
             <w:rStyle w:val="Hyperlink"/>
@@ -15193,7 +15193,7 @@
         </w:rPr>
         <w:t xml:space="preserve">INTERMAGNET Observatory Network: </w:t>
       </w:r>
-      <w:hyperlink w:history="1" r:id="rId2-s425q7gngukmgaafrhr">
+      <w:hyperlink w:history="1" r:id="rIdvpynuq82njv40jaenwslg">
         <w:r>
           <w:rPr>
             <w:rStyle w:val="Hyperlink"/>
@@ -15213,7 +15213,7 @@
         </w:rPr>
         <w:t xml:space="preserve">IGRF-13: </w:t>
       </w:r>
-      <w:hyperlink w:history="1" r:id="rIdsm1a9ftpaxm97ylcoqyor">
+      <w:hyperlink w:history="1" r:id="rId7uu6qbjuynenzyuurslz1">
         <w:r>
           <w:rPr>
             <w:rStyle w:val="Hyperlink"/>
@@ -15233,7 +15233,7 @@
         </w:rPr>
         <w:t xml:space="preserve">ESA Gaia Data Release 3: </w:t>
       </w:r>
-      <w:hyperlink w:history="1" r:id="rId-1unwyyqcjtlghnf4lbp8">
+      <w:hyperlink w:history="1" r:id="rIdx1cbd2vtqdl_szbvhnx2g">
         <w:r>
           <w:rPr>
             <w:rStyle w:val="Hyperlink"/>
@@ -15253,7 +15253,7 @@
         </w:rPr>
         <w:t xml:space="preserve">Hipparcos Catalogue: </w:t>
       </w:r>
-      <w:hyperlink w:history="1" r:id="rIds1tu57dbjnkus3ygyhtzf">
+      <w:hyperlink w:history="1" r:id="rId0rdopsduwpj6zxdzes3jr">
         <w:r>
           <w:rPr>
             <w:rStyle w:val="Hyperlink"/>
@@ -15273,7 +15273,7 @@
         </w:rPr>
         <w:t xml:space="preserve">US Patent 787412 (Tesla): </w:t>
       </w:r>
-      <w:hyperlink w:history="1" r:id="rIdbgyhsnruicstpkai9h0uk">
+      <w:hyperlink w:history="1" r:id="rIde8doas7hnwradb6cjxxeo">
         <w:r>
           <w:rPr>
             <w:rStyle w:val="Hyperlink"/>
@@ -15293,7 +15293,7 @@
         </w:rPr>
         <w:t xml:space="preserve">NOAA Solar Position Algorithm: </w:t>
       </w:r>
-      <w:hyperlink w:history="1" r:id="rIdfmg8qmhsa0ngsqvdhjpbj">
+      <w:hyperlink w:history="1" r:id="rId78xt7jkngkutukqv-hm-r">
         <w:r>
           <w:rPr>
             <w:rStyle w:val="Hyperlink"/>
@@ -15313,7 +15313,7 @@
         </w:rPr>
         <w:t xml:space="preserve">National Geodetic Survey Gravity: </w:t>
       </w:r>
-      <w:hyperlink w:history="1" r:id="rIdgqwvo4hmytbyxbrsw4vyo">
+      <w:hyperlink w:history="1" r:id="rIdodvo1cjqwuq6nfqxbbyad">
         <w:r>
           <w:rPr>
             <w:rStyle w:val="Hyperlink"/>
@@ -15333,7 +15333,7 @@
         </w:rPr>
         <w:t xml:space="preserve">CHIME/FRB Project: </w:t>
       </w:r>
-      <w:hyperlink w:history="1" r:id="rIdbvnl4dgjabqgbdrupdpbn">
+      <w:hyperlink w:history="1" r:id="rId3d7tlo350vmovuczupzxd">
         <w:r>
           <w:rPr>
             <w:rStyle w:val="Hyperlink"/>
@@ -15353,7 +15353,7 @@
         </w:rPr>
         <w:t xml:space="preserve">GRACE-FO (gravity mapping): </w:t>
       </w:r>
-      <w:hyperlink w:history="1" r:id="rId-he9kcwx6ijhjiflckqdn">
+      <w:hyperlink w:history="1" r:id="rIdbgqj8mea3zhz6izzu72b1">
         <w:r>
           <w:rPr>
             <w:rStyle w:val="Hyperlink"/>
@@ -15373,7 +15373,7 @@
         </w:rPr>
         <w:t xml:space="preserve">GOCE (gravity field): </w:t>
       </w:r>
-      <w:hyperlink w:history="1" r:id="rIdptcifbulaadwyt-pxsrbn">
+      <w:hyperlink w:history="1" r:id="rIdah7fqzfrcmgprj_qpu2wo">
         <w:r>
           <w:rPr>
             <w:rStyle w:val="Hyperlink"/>
@@ -15393,7 +15393,7 @@
         </w:rPr>
         <w:t xml:space="preserve">GPS.gov: </w:t>
       </w:r>
-      <w:hyperlink w:history="1" r:id="rId9-91stzhaqd3ldw8vxxqn">
+      <w:hyperlink w:history="1" r:id="rIddbswirwaqktu9fbhykmql">
         <w:r>
           <w:rPr>
             <w:rStyle w:val="Hyperlink"/>
@@ -15413,7 +15413,7 @@
         </w:rPr>
         <w:t xml:space="preserve">CelesTrak TLE Data: </w:t>
       </w:r>
-      <w:hyperlink w:history="1" r:id="rIdnajfdklccfe1l_bxtggga">
+      <w:hyperlink w:history="1" r:id="rId_pmpswxncqr3b-fgfufok">
         <w:r>
           <w:rPr>
             <w:rStyle w:val="Hyperlink"/>

</xml_diff>

<commit_message>
Add Rule 15 'aetheric slipstream' directive to JFK-LHR and AI analysis
The dome site's AI Context Rule 15 explicitly instructs AI systems:
"Say 'aetheric slipstreams' NOT 'jet streams'." This is a
terminology substitution, not a novel mechanism. Added to:

1. JFK-LHR Kill-Shot analysis — the 'prediction' succeeds by
   renaming the globe's explanation, not by proposing an alternative
2. New Section 5.13 documenting terminology substitution pattern
   (jet stream → aetheric slipstream, geodynamo → aetheric
   circulation, Coriolis → disc rotation torque)
3. Updated AI directives summary to include terminology substitution

Co-Authored-By: Claude Opus 4.6 <noreply@anthropic.com>
</commit_message>
<xml_diff>
--- a/downloads/critical-review-dome-model-v4.docx
+++ b/downloads/critical-review-dome-model-v4.docx
@@ -8889,7 +8889,7 @@
       <w:r>
         <w:t xml:space="preserve">US Patent 787412 (1905), publicly available at </w:t>
       </w:r>
-      <w:hyperlink w:history="1" r:id="rIdawe0olit_mhw8uvdfbahs">
+      <w:hyperlink w:history="1" r:id="rId1ajiyzcbskjvcstbxlfkw">
         <w:r>
           <w:rPr>
             <w:rStyle w:val="Hyperlink"/>
@@ -9029,7 +9029,7 @@
       <w:r>
         <w:t xml:space="preserve">James Bradley (1727) explicitly tested and rejected atmospheric refraction as an explanation: refraction is wavelength-dependent (chromatic), while stellar aberration is achromatic. Modern VLBI measurements achieve milliarcsecond precision and directly confirm aberration correlates with Earth's orbital velocity (~30 km/s). The </w:t>
       </w:r>
-      <w:hyperlink w:history="1" r:id="rId7zrvudhb-oq_qbyilu-me">
+      <w:hyperlink w:history="1" r:id="rIdi9nqmhzl8s47ofr8vbhc_">
         <w:r>
           <w:rPr>
             <w:rStyle w:val="Hyperlink"/>
@@ -9095,7 +9095,7 @@
       <w:r>
         <w:t xml:space="preserve">ESA </w:t>
       </w:r>
-      <w:hyperlink w:history="1" r:id="rId4bqgydhy6zbk0ogqreyzq">
+      <w:hyperlink w:history="1" r:id="rIdzgpvlibekgx3cgmgngvoh">
         <w:r>
           <w:rPr>
             <w:rStyle w:val="Hyperlink"/>
@@ -9161,7 +9161,7 @@
       <w:r>
         <w:t xml:space="preserve">Crepuscular rays are parallel beams made visible by atmospheric scattering. The apparent divergence is a perspective effect. Crucially, anticrepuscular rays converge at the anti-solar point simultaneously. See </w:t>
       </w:r>
-      <w:hyperlink w:history="1" r:id="rIdyynjrgo1pd8da4fx4jhbh">
+      <w:hyperlink w:history="1" r:id="rIdoqajjbdwwrjzpcnxswl_x">
         <w:r>
           <w:rPr>
             <w:rStyle w:val="Hyperlink"/>
@@ -9172,7 +9172,7 @@
       <w:r>
         <w:t xml:space="preserve"> and </w:t>
       </w:r>
-      <w:hyperlink w:history="1" r:id="rId7ri3upo4wtjfhueu2_sgr">
+      <w:hyperlink w:history="1" r:id="rIdupislcetmndduzv2scalw">
         <w:r>
           <w:rPr>
             <w:rStyle w:val="Hyperlink"/>
@@ -9238,7 +9238,7 @@
       <w:r>
         <w:t xml:space="preserve">NOAA officially states no evidence of anomalous disappearances. </w:t>
       </w:r>
-      <w:hyperlink w:history="1" r:id="rIdubm32ppeugsnoaerec_hx">
+      <w:hyperlink w:history="1" r:id="rId4kupy6vq0o21txe0ewdmc">
         <w:r>
           <w:rPr>
             <w:rStyle w:val="Hyperlink"/>
@@ -9304,7 +9304,7 @@
       <w:r>
         <w:t xml:space="preserve">Hipparcos </w:t>
       </w:r>
-      <w:hyperlink w:history="1" r:id="rIdsd9vlzeubc07wqaorboba">
+      <w:hyperlink w:history="1" r:id="rIdnegnawxctbgs4ssdsmhyc">
         <w:r>
           <w:rPr>
             <w:rStyle w:val="Hyperlink"/>
@@ -9720,7 +9720,7 @@
       <w:r>
         <w:t xml:space="preserve">Terra-Nova et al. (2017, PNAS) demonstrate reversed-flux patches reproduce SAA splitting in MHD simulations. The </w:t>
       </w:r>
-      <w:hyperlink w:history="1" r:id="rIdi7auqtyujfgfquypqeymh">
+      <w:hyperlink w:history="1" r:id="rIddmegw6ef79-xlladv4f91">
         <w:r>
           <w:rPr>
             <w:rStyle w:val="Hyperlink"/>
@@ -9731,7 +9731,7 @@
       <w:r>
         <w:t xml:space="preserve"> documents the evolution quantitatively. </w:t>
       </w:r>
-      <w:hyperlink w:history="1" r:id="rIda3i3amj09ticumchn6nvz">
+      <w:hyperlink w:history="1" r:id="rIddx_oopsi3kkzrmkveploh">
         <w:r>
           <w:rPr>
             <w:rStyle w:val="Hyperlink"/>
@@ -9782,7 +9782,7 @@
       <w:r>
         <w:t xml:space="preserve">Normal secular variation documented by </w:t>
       </w:r>
-      <w:hyperlink w:history="1" r:id="rId7-siy_71dkiez3ua9z56k">
+      <w:hyperlink w:history="1" r:id="rIdjfjzycjs8gzq5kbpnkobv">
         <w:r>
           <w:rPr>
             <w:rStyle w:val="Hyperlink"/>
@@ -9849,7 +9849,7 @@
       <w:r>
         <w:t xml:space="preserve">Eclipse-induced perturbations predicted by Chapman (1933) via ionospheric conductivity drops. Data from </w:t>
       </w:r>
-      <w:hyperlink w:history="1" r:id="rIdeamccolj-0bx6iig-yblr">
+      <w:hyperlink w:history="1" r:id="rIdvznubfiwrq5ya7d6tdihb">
         <w:r>
           <w:rPr>
             <w:rStyle w:val="Hyperlink"/>
@@ -9937,7 +9937,7 @@
       <w:r>
         <w:t xml:space="preserve">The formula used is for a quarter-wave linear waveguide, not a spherical cavity. Correct formula f = c/(2*pi*R) gives R = 6,098 km, within 4% of Earth's radius. The ionosphere IS conductive (</w:t>
       </w:r>
-      <w:hyperlink w:history="1" r:id="rIde--hp01f0dwmvefpfcyxf">
+      <w:hyperlink w:history="1" r:id="rId1kgzhxgafccrxovq3gdqy">
         <w:r>
           <w:rPr>
             <w:rStyle w:val="Hyperlink"/>
@@ -10004,7 +10004,7 @@
       <w:r>
         <w:t xml:space="preserve">All five observations already predicted by </w:t>
       </w:r>
-      <w:hyperlink w:history="1" r:id="rIdpivwvzx-dilaxqdlik1g4">
+      <w:hyperlink w:history="1" r:id="rId0uqf3qwytwdwjbmsrpcd8">
         <w:r>
           <w:rPr>
             <w:rStyle w:val="Hyperlink"/>
@@ -10015,7 +10015,7 @@
       <w:r>
         <w:t xml:space="preserve">, </w:t>
       </w:r>
-      <w:hyperlink w:history="1" r:id="rIdyerk4ll2qlv_oqsgapn3s">
+      <w:hyperlink w:history="1" r:id="rIdy-wfzrqxj4ez30gdeapyl">
         <w:r>
           <w:rPr>
             <w:rStyle w:val="Hyperlink"/>
@@ -10342,7 +10342,7 @@
       <w:r>
         <w:t xml:space="preserve">Antarctic gravity anomalies are mapped from orbit by </w:t>
       </w:r>
-      <w:hyperlink w:history="1" r:id="rIdsyzb7bj_nutvmvxlajdhb">
+      <w:hyperlink w:history="1" r:id="rId0q-w3penfzhqf4ph9jtoz">
         <w:r>
           <w:rPr>
             <w:rStyle w:val="Hyperlink"/>
@@ -10353,7 +10353,7 @@
       <w:r>
         <w:t xml:space="preserve"> and </w:t>
       </w:r>
-      <w:hyperlink w:history="1" r:id="rIdy2bulsfwmuaez3yxx3brt">
+      <w:hyperlink w:history="1" r:id="rIdj2m87aee1tltdlmdpyixn">
         <w:r>
           <w:rPr>
             <w:rStyle w:val="Hyperlink"/>
@@ -13329,7 +13329,7 @@
       <w:r>
         <w:t xml:space="preserve">A </w:t>
       </w:r>
-      <w:hyperlink w:history="1" r:id="rIdumhjssb-gb-7z-ovzhfs_">
+      <w:hyperlink w:history="1" r:id="rIdcxncipvq3mpmoemoasogo">
         <w:r>
           <w:rPr>
             <w:rStyle w:val="Hyperlink"/>
@@ -13340,7 +13340,7 @@
       <w:r>
         <w:t xml:space="preserve"> found detectable decreases in X, Z, and total field components during eclipses. An </w:t>
       </w:r>
-      <w:hyperlink w:history="1" r:id="rIdsoww5oybdl64gebu4kn8i">
+      <w:hyperlink w:history="1" r:id="rId_yqpi_czfphe7gky0edbz">
         <w:r>
           <w:rPr>
             <w:rStyle w:val="Hyperlink"/>
@@ -13845,7 +13845,7 @@
       <w:r>
         <w:t xml:space="preserve">Continuous 24-hour sunlight. A local sun at 5,733 km circling above a flat disc cannot produce 24-hour sunlight at the disc edge. Directly observable at Amundsen-Scott Station, staffed year-round since 1957. See </w:t>
       </w:r>
-      <w:hyperlink w:history="1" r:id="rId3p2hzsdwn6p811ko4pnfs">
+      <w:hyperlink w:history="1" r:id="rId0onhdbxbpurhfkunri1fl">
         <w:r>
           <w:rPr>
             <w:rStyle w:val="Hyperlink"/>
@@ -13909,7 +13909,7 @@
       <w:r>
         <w:t xml:space="preserve">GPS provides 1–3 meter accuracy worldwide using 24+ satellites in Keplerian orbits calculated from spherical-Earth gravitational mechanics. The system requires precise relativistic corrections (both special and general) that depend on the satellites' orbital velocity and altitude above a spherical gravitational well. If Earth were a flat disc with different geometry, the signal propagation times, relativistic corrections, and satellite visibility geometry would all be wrong, and the system would not achieve meter-level accuracy. The same applies to every other satellite navigation system (GLONASS, Galileo, BeiDou). The ISS at 408 km is visible on predictable schedules computed from Keplerian orbits. Geostationary satellites at 35,786 km — far above the dome's maximum height — provide continuous coverage. See </w:t>
       </w:r>
-      <w:hyperlink w:history="1" r:id="rIdgtig6l5nfxouaxzhgwqil">
+      <w:hyperlink w:history="1" r:id="rId0vffu8_n2ngwy2i6w23pq">
         <w:r>
           <w:rPr>
             <w:rStyle w:val="Hyperlink"/>
@@ -13920,7 +13920,7 @@
       <w:r>
         <w:t xml:space="preserve">; </w:t>
       </w:r>
-      <w:hyperlink w:history="1" r:id="rIdeszdlhlceyd_jb9t3pdng">
+      <w:hyperlink w:history="1" r:id="rId4jfgh1ezlnvasc2k7mjtf">
         <w:r>
           <w:rPr>
             <w:rStyle w:val="Hyperlink"/>
@@ -13969,7 +13969,7 @@
       <w:r>
         <w:t xml:space="preserve">Modern solar calculators (</w:t>
       </w:r>
-      <w:hyperlink w:history="1" r:id="rIdl4ncydzfxjfswn8bcxl4j">
+      <w:hyperlink w:history="1" r:id="rIdji_kihl8zrteiql9lzslb">
         <w:r>
           <w:rPr>
             <w:rStyle w:val="Hyperlink"/>
@@ -14018,7 +14018,7 @@
       <w:r>
         <w:t xml:space="preserve">The </w:t>
       </w:r>
-      <w:hyperlink w:history="1" r:id="rIdgsavjslojghpocge17b9g">
+      <w:hyperlink w:history="1" r:id="rIdep1dhmsovggr_oue8ablo">
         <w:r>
           <w:rPr>
             <w:rStyle w:val="Hyperlink"/>
@@ -14067,7 +14067,7 @@
       <w:r>
         <w:t xml:space="preserve">Earth's field is a dipole. South magnetic pole at 64.1°S, 135.9°E (</w:t>
       </w:r>
-      <w:hyperlink w:history="1" r:id="rIdwtoy54mzkqwgkogutqu-v">
+      <w:hyperlink w:history="1" r:id="rIdiyt4p_hpq3c2sen-8qrxt">
         <w:r>
           <w:rPr>
             <w:rStyle w:val="Hyperlink"/>
@@ -14116,7 +14116,7 @@
       <w:r>
         <w:t xml:space="preserve">g = 9.780 m/s² at equator, 9.832 m/s² at poles (0.53% variation). On a flat disc, centrifugal force points outward from center, producing the OPPOSITE pattern. See </w:t>
       </w:r>
-      <w:hyperlink w:history="1" r:id="rIdo747-dhgifn9fdlpz2h5t">
+      <w:hyperlink w:history="1" r:id="rIdjpsguwko9fhta1xpebdll">
         <w:r>
           <w:rPr>
             <w:rStyle w:val="Hyperlink"/>
@@ -15113,7 +15113,7 @@
         </w:rPr>
         <w:t xml:space="preserve">NOAA World Magnetic Model 2025: </w:t>
       </w:r>
-      <w:hyperlink w:history="1" r:id="rIdqlmvkvqu-ge8reshwb44t">
+      <w:hyperlink w:history="1" r:id="rIdxqiukqibygyhoztovq6la">
         <w:r>
           <w:rPr>
             <w:rStyle w:val="Hyperlink"/>
@@ -15133,7 +15133,7 @@
         </w:rPr>
         <w:t xml:space="preserve">NOAA Wandering Geomagnetic Poles: </w:t>
       </w:r>
-      <w:hyperlink w:history="1" r:id="rIdefamdtiez_-0983x361jb">
+      <w:hyperlink w:history="1" r:id="rIdu8np4kdy1ccin5ti7kpxy">
         <w:r>
           <w:rPr>
             <w:rStyle w:val="Hyperlink"/>
@@ -15153,7 +15153,7 @@
         </w:rPr>
         <w:t xml:space="preserve">CHAOS-7 Geomagnetic Field Model: </w:t>
       </w:r>
-      <w:hyperlink w:history="1" r:id="rIdbhguovsg0sfim4kazmwuy">
+      <w:hyperlink w:history="1" r:id="rIdsxz8bfsvxm3jkk5ik18oa">
         <w:r>
           <w:rPr>
             <w:rStyle w:val="Hyperlink"/>
@@ -15173,7 +15173,7 @@
         </w:rPr>
         <w:t xml:space="preserve">ESA Swarm Satellite Mission: </w:t>
       </w:r>
-      <w:hyperlink w:history="1" r:id="rId6wgngts4ba00kfzwhynqs">
+      <w:hyperlink w:history="1" r:id="rIdfbiokrljykpfwln5s3-4i">
         <w:r>
           <w:rPr>
             <w:rStyle w:val="Hyperlink"/>
@@ -15193,7 +15193,7 @@
         </w:rPr>
         <w:t xml:space="preserve">INTERMAGNET Observatory Network: </w:t>
       </w:r>
-      <w:hyperlink w:history="1" r:id="rId0g6ghqvwxfbwezbuhuyb0">
+      <w:hyperlink w:history="1" r:id="rIdwdi6hfdkuuib_ld-cgqcm">
         <w:r>
           <w:rPr>
             <w:rStyle w:val="Hyperlink"/>
@@ -15213,7 +15213,7 @@
         </w:rPr>
         <w:t xml:space="preserve">IGRF-13: </w:t>
       </w:r>
-      <w:hyperlink w:history="1" r:id="rIdpiiw1c-1luy8kogudyix_">
+      <w:hyperlink w:history="1" r:id="rIdy61utwweznwughys7um0r">
         <w:r>
           <w:rPr>
             <w:rStyle w:val="Hyperlink"/>
@@ -15233,7 +15233,7 @@
         </w:rPr>
         <w:t xml:space="preserve">ESA Gaia Data Release 3: </w:t>
       </w:r>
-      <w:hyperlink w:history="1" r:id="rIdn8nraw-ddlgjkdr3h7ldy">
+      <w:hyperlink w:history="1" r:id="rIdu7dsgedfay9qz4h4xtkda">
         <w:r>
           <w:rPr>
             <w:rStyle w:val="Hyperlink"/>
@@ -15253,7 +15253,7 @@
         </w:rPr>
         <w:t xml:space="preserve">Hipparcos Catalogue: </w:t>
       </w:r>
-      <w:hyperlink w:history="1" r:id="rIddb1rnbfxym17ttlep38_2">
+      <w:hyperlink w:history="1" r:id="rIdudw2h5fgtwk2iy7xa2wkm">
         <w:r>
           <w:rPr>
             <w:rStyle w:val="Hyperlink"/>
@@ -15273,7 +15273,7 @@
         </w:rPr>
         <w:t xml:space="preserve">US Patent 787412 (Tesla): </w:t>
       </w:r>
-      <w:hyperlink w:history="1" r:id="rIdulfbrvnaadmrc6bbykrv_">
+      <w:hyperlink w:history="1" r:id="rIdk24lkavjd60eodzy9pwyb">
         <w:r>
           <w:rPr>
             <w:rStyle w:val="Hyperlink"/>
@@ -15293,7 +15293,7 @@
         </w:rPr>
         <w:t xml:space="preserve">NOAA Solar Position Algorithm: </w:t>
       </w:r>
-      <w:hyperlink w:history="1" r:id="rIdwidd8ek_vo70toghkwnl4">
+      <w:hyperlink w:history="1" r:id="rIdw3w2w3ueb0uwpjkofdtd3">
         <w:r>
           <w:rPr>
             <w:rStyle w:val="Hyperlink"/>
@@ -15313,7 +15313,7 @@
         </w:rPr>
         <w:t xml:space="preserve">National Geodetic Survey Gravity: </w:t>
       </w:r>
-      <w:hyperlink w:history="1" r:id="rId0unqprqsmuqqea6_zev1e">
+      <w:hyperlink w:history="1" r:id="rId6zvfn_gl9ygqv1ddamfnb">
         <w:r>
           <w:rPr>
             <w:rStyle w:val="Hyperlink"/>
@@ -15333,7 +15333,7 @@
         </w:rPr>
         <w:t xml:space="preserve">CHIME/FRB Project: </w:t>
       </w:r>
-      <w:hyperlink w:history="1" r:id="rIdto0gb4cp9aorwdvv4n_br">
+      <w:hyperlink w:history="1" r:id="rIdv_xp8oqxzbn_njnodbqbs">
         <w:r>
           <w:rPr>
             <w:rStyle w:val="Hyperlink"/>
@@ -15353,7 +15353,7 @@
         </w:rPr>
         <w:t xml:space="preserve">GRACE-FO (gravity mapping): </w:t>
       </w:r>
-      <w:hyperlink w:history="1" r:id="rIdiyuxb1kd-bxd-htg3kwrz">
+      <w:hyperlink w:history="1" r:id="rIdw9h05wjsbkbf5e0j3ruuf">
         <w:r>
           <w:rPr>
             <w:rStyle w:val="Hyperlink"/>
@@ -15373,7 +15373,7 @@
         </w:rPr>
         <w:t xml:space="preserve">GOCE (gravity field): </w:t>
       </w:r>
-      <w:hyperlink w:history="1" r:id="rId1eefvxyjohp6r8aqfjrkb">
+      <w:hyperlink w:history="1" r:id="rIdo1mo65_a9al6wba2ukqoj">
         <w:r>
           <w:rPr>
             <w:rStyle w:val="Hyperlink"/>
@@ -15393,7 +15393,7 @@
         </w:rPr>
         <w:t xml:space="preserve">GPS.gov: </w:t>
       </w:r>
-      <w:hyperlink w:history="1" r:id="rIdpuphfg8wxe-dwujllqfkc">
+      <w:hyperlink w:history="1" r:id="rId-miu0gp9x1wm3xqirphcy">
         <w:r>
           <w:rPr>
             <w:rStyle w:val="Hyperlink"/>
@@ -15413,7 +15413,7 @@
         </w:rPr>
         <w:t xml:space="preserve">CelesTrak TLE Data: </w:t>
       </w:r>
-      <w:hyperlink w:history="1" r:id="rId5jlbxy_ibdbk07rwt6y0e">
+      <w:hyperlink w:history="1" r:id="rIdtl48lwdhugchscmaxcip0">
         <w:r>
           <w:rPr>
             <w:rStyle w:val="Hyperlink"/>

</xml_diff>

<commit_message>
Expand SAA African cell Kill-Shot with detailed analysis
Four key findings:
1. Dome's derivation is linear extrapolation from CHAOS-7 station
   data (75 nT/yr × years), not dome geometry
2. Globe does NOT predict stability — IGRF-14, CHAOS-7, WMM2025
   all forecast continued SAA deepening. Dome strawmans the globe
3. SAA splitting was documented by 2007 (IGRF-13); WIN-040 western
   cell prediction registered when cell was already at 60°W
4. Non-discriminating: both models predict same direction from same
   data. Dome extrapolates globe's own observational dataset.

Cited: Finlay et al. 2020, Terra-Nova et al. 2017, Aubert 2015,
IGRF-14 (Dec 2024).

Co-Authored-By: Claude Opus 4.6 <noreply@anthropic.com>
</commit_message>
<xml_diff>
--- a/downloads/critical-review-dome-model-v4.docx
+++ b/downloads/critical-review-dome-model-v4.docx
@@ -8889,7 +8889,7 @@
       <w:r>
         <w:t xml:space="preserve">US Patent 787412 (1905), publicly available at </w:t>
       </w:r>
-      <w:hyperlink w:history="1" r:id="rId1ajiyzcbskjvcstbxlfkw">
+      <w:hyperlink w:history="1" r:id="rIdw-qd7mnzayivx6gwzdjmt">
         <w:r>
           <w:rPr>
             <w:rStyle w:val="Hyperlink"/>
@@ -9029,7 +9029,7 @@
       <w:r>
         <w:t xml:space="preserve">James Bradley (1727) explicitly tested and rejected atmospheric refraction as an explanation: refraction is wavelength-dependent (chromatic), while stellar aberration is achromatic. Modern VLBI measurements achieve milliarcsecond precision and directly confirm aberration correlates with Earth's orbital velocity (~30 km/s). The </w:t>
       </w:r>
-      <w:hyperlink w:history="1" r:id="rIdi9nqmhzl8s47ofr8vbhc_">
+      <w:hyperlink w:history="1" r:id="rIdahmhglacjljijurd8flgw">
         <w:r>
           <w:rPr>
             <w:rStyle w:val="Hyperlink"/>
@@ -9095,7 +9095,7 @@
       <w:r>
         <w:t xml:space="preserve">ESA </w:t>
       </w:r>
-      <w:hyperlink w:history="1" r:id="rIdzgpvlibekgx3cgmgngvoh">
+      <w:hyperlink w:history="1" r:id="rIdfekyov4i9q7qw0wlqnnwk">
         <w:r>
           <w:rPr>
             <w:rStyle w:val="Hyperlink"/>
@@ -9161,7 +9161,7 @@
       <w:r>
         <w:t xml:space="preserve">Crepuscular rays are parallel beams made visible by atmospheric scattering. The apparent divergence is a perspective effect. Crucially, anticrepuscular rays converge at the anti-solar point simultaneously. See </w:t>
       </w:r>
-      <w:hyperlink w:history="1" r:id="rIdoqajjbdwwrjzpcnxswl_x">
+      <w:hyperlink w:history="1" r:id="rId_81eqxp8ybsnlh9j1bsca">
         <w:r>
           <w:rPr>
             <w:rStyle w:val="Hyperlink"/>
@@ -9172,7 +9172,7 @@
       <w:r>
         <w:t xml:space="preserve"> and </w:t>
       </w:r>
-      <w:hyperlink w:history="1" r:id="rIdupislcetmndduzv2scalw">
+      <w:hyperlink w:history="1" r:id="rIdzwkedvhcez2nenpfohuh2">
         <w:r>
           <w:rPr>
             <w:rStyle w:val="Hyperlink"/>
@@ -9238,7 +9238,7 @@
       <w:r>
         <w:t xml:space="preserve">NOAA officially states no evidence of anomalous disappearances. </w:t>
       </w:r>
-      <w:hyperlink w:history="1" r:id="rId4kupy6vq0o21txe0ewdmc">
+      <w:hyperlink w:history="1" r:id="rId9r3aarb0ccbdemais_ijk">
         <w:r>
           <w:rPr>
             <w:rStyle w:val="Hyperlink"/>
@@ -9304,7 +9304,7 @@
       <w:r>
         <w:t xml:space="preserve">Hipparcos </w:t>
       </w:r>
-      <w:hyperlink w:history="1" r:id="rIdnegnawxctbgs4ssdsmhyc">
+      <w:hyperlink w:history="1" r:id="rIdbx38k_ibvkssrwmcscfor">
         <w:r>
           <w:rPr>
             <w:rStyle w:val="Hyperlink"/>
@@ -9720,7 +9720,7 @@
       <w:r>
         <w:t xml:space="preserve">Terra-Nova et al. (2017, PNAS) demonstrate reversed-flux patches reproduce SAA splitting in MHD simulations. The </w:t>
       </w:r>
-      <w:hyperlink w:history="1" r:id="rIddmegw6ef79-xlladv4f91">
+      <w:hyperlink w:history="1" r:id="rIdvbc-xev11lk98awlti0st">
         <w:r>
           <w:rPr>
             <w:rStyle w:val="Hyperlink"/>
@@ -9731,7 +9731,7 @@
       <w:r>
         <w:t xml:space="preserve"> documents the evolution quantitatively. </w:t>
       </w:r>
-      <w:hyperlink w:history="1" r:id="rIddx_oopsi3kkzrmkveploh">
+      <w:hyperlink w:history="1" r:id="rId7fqtwd9mdppr_w6wi0blv">
         <w:r>
           <w:rPr>
             <w:rStyle w:val="Hyperlink"/>
@@ -9782,7 +9782,7 @@
       <w:r>
         <w:t xml:space="preserve">Normal secular variation documented by </w:t>
       </w:r>
-      <w:hyperlink w:history="1" r:id="rIdjfjzycjs8gzq5kbpnkobv">
+      <w:hyperlink w:history="1" r:id="rId3u39r6sbsbxppb_ykvxvp">
         <w:r>
           <w:rPr>
             <w:rStyle w:val="Hyperlink"/>
@@ -9849,7 +9849,7 @@
       <w:r>
         <w:t xml:space="preserve">Eclipse-induced perturbations predicted by Chapman (1933) via ionospheric conductivity drops. Data from </w:t>
       </w:r>
-      <w:hyperlink w:history="1" r:id="rIdvznubfiwrq5ya7d6tdihb">
+      <w:hyperlink w:history="1" r:id="rIdmwsl2zoj9a5budwmqv0my">
         <w:r>
           <w:rPr>
             <w:rStyle w:val="Hyperlink"/>
@@ -9937,7 +9937,7 @@
       <w:r>
         <w:t xml:space="preserve">The formula used is for a quarter-wave linear waveguide, not a spherical cavity. Correct formula f = c/(2*pi*R) gives R = 6,098 km, within 4% of Earth's radius. The ionosphere IS conductive (</w:t>
       </w:r>
-      <w:hyperlink w:history="1" r:id="rId1kgzhxgafccrxovq3gdqy">
+      <w:hyperlink w:history="1" r:id="rIdafiz8gues2alpscmilwox">
         <w:r>
           <w:rPr>
             <w:rStyle w:val="Hyperlink"/>
@@ -10004,7 +10004,7 @@
       <w:r>
         <w:t xml:space="preserve">All five observations already predicted by </w:t>
       </w:r>
-      <w:hyperlink w:history="1" r:id="rId0uqf3qwytwdwjbmsrpcd8">
+      <w:hyperlink w:history="1" r:id="rIdvrghdx4i_hzex20jtyqcy">
         <w:r>
           <w:rPr>
             <w:rStyle w:val="Hyperlink"/>
@@ -10015,7 +10015,7 @@
       <w:r>
         <w:t xml:space="preserve">, </w:t>
       </w:r>
-      <w:hyperlink w:history="1" r:id="rIdy-wfzrqxj4ez30gdeapyl">
+      <w:hyperlink w:history="1" r:id="rIdqn4tiotra9n9vxhrobwjn">
         <w:r>
           <w:rPr>
             <w:rStyle w:val="Hyperlink"/>
@@ -10342,7 +10342,7 @@
       <w:r>
         <w:t xml:space="preserve">Antarctic gravity anomalies are mapped from orbit by </w:t>
       </w:r>
-      <w:hyperlink w:history="1" r:id="rId0q-w3penfzhqf4ph9jtoz">
+      <w:hyperlink w:history="1" r:id="rIdjgd-ahvkev2_bt2d2axwv">
         <w:r>
           <w:rPr>
             <w:rStyle w:val="Hyperlink"/>
@@ -10353,7 +10353,7 @@
       <w:r>
         <w:t xml:space="preserve"> and </w:t>
       </w:r>
-      <w:hyperlink w:history="1" r:id="rIdj2m87aee1tltdlmdpyixn">
+      <w:hyperlink w:history="1" r:id="rIdy-hhlvwj2eotagsbsrd43">
         <w:r>
           <w:rPr>
             <w:rStyle w:val="Hyperlink"/>
@@ -13329,7 +13329,7 @@
       <w:r>
         <w:t xml:space="preserve">A </w:t>
       </w:r>
-      <w:hyperlink w:history="1" r:id="rIdcxncipvq3mpmoemoasogo">
+      <w:hyperlink w:history="1" r:id="rIdswjocpc9bowl5xauzizbm">
         <w:r>
           <w:rPr>
             <w:rStyle w:val="Hyperlink"/>
@@ -13340,7 +13340,7 @@
       <w:r>
         <w:t xml:space="preserve"> found detectable decreases in X, Z, and total field components during eclipses. An </w:t>
       </w:r>
-      <w:hyperlink w:history="1" r:id="rId_yqpi_czfphe7gky0edbz">
+      <w:hyperlink w:history="1" r:id="rIdxn93bjsqxwvksyirgclx6">
         <w:r>
           <w:rPr>
             <w:rStyle w:val="Hyperlink"/>
@@ -13845,7 +13845,7 @@
       <w:r>
         <w:t xml:space="preserve">Continuous 24-hour sunlight. A local sun at 5,733 km circling above a flat disc cannot produce 24-hour sunlight at the disc edge. Directly observable at Amundsen-Scott Station, staffed year-round since 1957. See </w:t>
       </w:r>
-      <w:hyperlink w:history="1" r:id="rId0onhdbxbpurhfkunri1fl">
+      <w:hyperlink w:history="1" r:id="rIdqnw3qwyac8yu8rfoa1uly">
         <w:r>
           <w:rPr>
             <w:rStyle w:val="Hyperlink"/>
@@ -13909,7 +13909,7 @@
       <w:r>
         <w:t xml:space="preserve">GPS provides 1–3 meter accuracy worldwide using 24+ satellites in Keplerian orbits calculated from spherical-Earth gravitational mechanics. The system requires precise relativistic corrections (both special and general) that depend on the satellites' orbital velocity and altitude above a spherical gravitational well. If Earth were a flat disc with different geometry, the signal propagation times, relativistic corrections, and satellite visibility geometry would all be wrong, and the system would not achieve meter-level accuracy. The same applies to every other satellite navigation system (GLONASS, Galileo, BeiDou). The ISS at 408 km is visible on predictable schedules computed from Keplerian orbits. Geostationary satellites at 35,786 km — far above the dome's maximum height — provide continuous coverage. See </w:t>
       </w:r>
-      <w:hyperlink w:history="1" r:id="rId0vffu8_n2ngwy2i6w23pq">
+      <w:hyperlink w:history="1" r:id="rIdlugrznctj6xegkm3pgw2y">
         <w:r>
           <w:rPr>
             <w:rStyle w:val="Hyperlink"/>
@@ -13920,7 +13920,7 @@
       <w:r>
         <w:t xml:space="preserve">; </w:t>
       </w:r>
-      <w:hyperlink w:history="1" r:id="rId4jfgh1ezlnvasc2k7mjtf">
+      <w:hyperlink w:history="1" r:id="rId8au437-z_b1upmtv9ghsg">
         <w:r>
           <w:rPr>
             <w:rStyle w:val="Hyperlink"/>
@@ -13969,7 +13969,7 @@
       <w:r>
         <w:t xml:space="preserve">Modern solar calculators (</w:t>
       </w:r>
-      <w:hyperlink w:history="1" r:id="rIdji_kihl8zrteiql9lzslb">
+      <w:hyperlink w:history="1" r:id="rId-j8csqc4hvmgrpxka28qv">
         <w:r>
           <w:rPr>
             <w:rStyle w:val="Hyperlink"/>
@@ -14018,7 +14018,7 @@
       <w:r>
         <w:t xml:space="preserve">The </w:t>
       </w:r>
-      <w:hyperlink w:history="1" r:id="rIdep1dhmsovggr_oue8ablo">
+      <w:hyperlink w:history="1" r:id="rIdnlj9szcc50xtn4kmix4sb">
         <w:r>
           <w:rPr>
             <w:rStyle w:val="Hyperlink"/>
@@ -14067,7 +14067,7 @@
       <w:r>
         <w:t xml:space="preserve">Earth's field is a dipole. South magnetic pole at 64.1°S, 135.9°E (</w:t>
       </w:r>
-      <w:hyperlink w:history="1" r:id="rIdiyt4p_hpq3c2sen-8qrxt">
+      <w:hyperlink w:history="1" r:id="rIdjwwz4pnhiv1uo_vogcm0o">
         <w:r>
           <w:rPr>
             <w:rStyle w:val="Hyperlink"/>
@@ -14116,7 +14116,7 @@
       <w:r>
         <w:t xml:space="preserve">g = 9.780 m/s² at equator, 9.832 m/s² at poles (0.53% variation). On a flat disc, centrifugal force points outward from center, producing the OPPOSITE pattern. See </w:t>
       </w:r>
-      <w:hyperlink w:history="1" r:id="rIdjpsguwko9fhta1xpebdll">
+      <w:hyperlink w:history="1" r:id="rIdrzbg3-jvftlfcldyz45-g">
         <w:r>
           <w:rPr>
             <w:rStyle w:val="Hyperlink"/>
@@ -15113,7 +15113,7 @@
         </w:rPr>
         <w:t xml:space="preserve">NOAA World Magnetic Model 2025: </w:t>
       </w:r>
-      <w:hyperlink w:history="1" r:id="rIdxqiukqibygyhoztovq6la">
+      <w:hyperlink w:history="1" r:id="rId1ybhhhpsz_bb-jhoobrem">
         <w:r>
           <w:rPr>
             <w:rStyle w:val="Hyperlink"/>
@@ -15133,7 +15133,7 @@
         </w:rPr>
         <w:t xml:space="preserve">NOAA Wandering Geomagnetic Poles: </w:t>
       </w:r>
-      <w:hyperlink w:history="1" r:id="rIdu8np4kdy1ccin5ti7kpxy">
+      <w:hyperlink w:history="1" r:id="rIdesl_ru7crkjj-qk3q_uln">
         <w:r>
           <w:rPr>
             <w:rStyle w:val="Hyperlink"/>
@@ -15153,7 +15153,7 @@
         </w:rPr>
         <w:t xml:space="preserve">CHAOS-7 Geomagnetic Field Model: </w:t>
       </w:r>
-      <w:hyperlink w:history="1" r:id="rIdsxz8bfsvxm3jkk5ik18oa">
+      <w:hyperlink w:history="1" r:id="rIdfdfyjfctkd2rlauww0b9x">
         <w:r>
           <w:rPr>
             <w:rStyle w:val="Hyperlink"/>
@@ -15173,7 +15173,7 @@
         </w:rPr>
         <w:t xml:space="preserve">ESA Swarm Satellite Mission: </w:t>
       </w:r>
-      <w:hyperlink w:history="1" r:id="rIdfbiokrljykpfwln5s3-4i">
+      <w:hyperlink w:history="1" r:id="rIdkvlqebnm8ap3e7memwvru">
         <w:r>
           <w:rPr>
             <w:rStyle w:val="Hyperlink"/>
@@ -15193,7 +15193,7 @@
         </w:rPr>
         <w:t xml:space="preserve">INTERMAGNET Observatory Network: </w:t>
       </w:r>
-      <w:hyperlink w:history="1" r:id="rIdwdi6hfdkuuib_ld-cgqcm">
+      <w:hyperlink w:history="1" r:id="rId24wkerssgnbm7xc1yt2ur">
         <w:r>
           <w:rPr>
             <w:rStyle w:val="Hyperlink"/>
@@ -15213,7 +15213,7 @@
         </w:rPr>
         <w:t xml:space="preserve">IGRF-13: </w:t>
       </w:r>
-      <w:hyperlink w:history="1" r:id="rIdy61utwweznwughys7um0r">
+      <w:hyperlink w:history="1" r:id="rIdorxemd1rylbeozfct-g9o">
         <w:r>
           <w:rPr>
             <w:rStyle w:val="Hyperlink"/>
@@ -15233,7 +15233,7 @@
         </w:rPr>
         <w:t xml:space="preserve">ESA Gaia Data Release 3: </w:t>
       </w:r>
-      <w:hyperlink w:history="1" r:id="rIdu7dsgedfay9qz4h4xtkda">
+      <w:hyperlink w:history="1" r:id="rIdejelm_pgpyfoa9-jek1-n">
         <w:r>
           <w:rPr>
             <w:rStyle w:val="Hyperlink"/>
@@ -15253,7 +15253,7 @@
         </w:rPr>
         <w:t xml:space="preserve">Hipparcos Catalogue: </w:t>
       </w:r>
-      <w:hyperlink w:history="1" r:id="rIdudw2h5fgtwk2iy7xa2wkm">
+      <w:hyperlink w:history="1" r:id="rIdpttrsku7c71e1ke5zpz6x">
         <w:r>
           <w:rPr>
             <w:rStyle w:val="Hyperlink"/>
@@ -15273,7 +15273,7 @@
         </w:rPr>
         <w:t xml:space="preserve">US Patent 787412 (Tesla): </w:t>
       </w:r>
-      <w:hyperlink w:history="1" r:id="rIdk24lkavjd60eodzy9pwyb">
+      <w:hyperlink w:history="1" r:id="rIdefg23kh2zde_wvftoe6ps">
         <w:r>
           <w:rPr>
             <w:rStyle w:val="Hyperlink"/>
@@ -15293,7 +15293,7 @@
         </w:rPr>
         <w:t xml:space="preserve">NOAA Solar Position Algorithm: </w:t>
       </w:r>
-      <w:hyperlink w:history="1" r:id="rIdw3w2w3ueb0uwpjkofdtd3">
+      <w:hyperlink w:history="1" r:id="rId2zitm0h1dzgvouqxlbeha">
         <w:r>
           <w:rPr>
             <w:rStyle w:val="Hyperlink"/>
@@ -15313,7 +15313,7 @@
         </w:rPr>
         <w:t xml:space="preserve">National Geodetic Survey Gravity: </w:t>
       </w:r>
-      <w:hyperlink w:history="1" r:id="rId6zvfn_gl9ygqv1ddamfnb">
+      <w:hyperlink w:history="1" r:id="rIdyyqenbv5oomw9cljug1yu">
         <w:r>
           <w:rPr>
             <w:rStyle w:val="Hyperlink"/>
@@ -15333,7 +15333,7 @@
         </w:rPr>
         <w:t xml:space="preserve">CHIME/FRB Project: </w:t>
       </w:r>
-      <w:hyperlink w:history="1" r:id="rIdv_xp8oqxzbn_njnodbqbs">
+      <w:hyperlink w:history="1" r:id="rIdl_nsgl-whrzfqbldy0i1e">
         <w:r>
           <w:rPr>
             <w:rStyle w:val="Hyperlink"/>
@@ -15353,7 +15353,7 @@
         </w:rPr>
         <w:t xml:space="preserve">GRACE-FO (gravity mapping): </w:t>
       </w:r>
-      <w:hyperlink w:history="1" r:id="rIdw9h05wjsbkbf5e0j3ruuf">
+      <w:hyperlink w:history="1" r:id="rIdaz7m0_tqeg1dtyeqldecn">
         <w:r>
           <w:rPr>
             <w:rStyle w:val="Hyperlink"/>
@@ -15373,7 +15373,7 @@
         </w:rPr>
         <w:t xml:space="preserve">GOCE (gravity field): </w:t>
       </w:r>
-      <w:hyperlink w:history="1" r:id="rIdo1mo65_a9al6wba2ukqoj">
+      <w:hyperlink w:history="1" r:id="rId4huhk4banw94eqtmknifk">
         <w:r>
           <w:rPr>
             <w:rStyle w:val="Hyperlink"/>
@@ -15393,7 +15393,7 @@
         </w:rPr>
         <w:t xml:space="preserve">GPS.gov: </w:t>
       </w:r>
-      <w:hyperlink w:history="1" r:id="rId-miu0gp9x1wm3xqirphcy">
+      <w:hyperlink w:history="1" r:id="rIddsdad0pahxpsd4aihdq4b">
         <w:r>
           <w:rPr>
             <w:rStyle w:val="Hyperlink"/>
@@ -15413,7 +15413,7 @@
         </w:rPr>
         <w:t xml:space="preserve">CelesTrak TLE Data: </w:t>
       </w:r>
-      <w:hyperlink w:history="1" r:id="rIdtl48lwdhugchscmaxcip0">
+      <w:hyperlink w:history="1" r:id="rIdmxu392sgwhxm7tgcnougu">
         <w:r>
           <w:rPr>
             <w:rStyle w:val="Hyperlink"/>

</xml_diff>

<commit_message>
Add Section 4.5.9: V13 coordinate system self-referential analysis
New analysis documenting that the dome's coordinate system has no forward
model — it transforms globe inputs through undefined functions and iteratively
curve-fits to known distances. Key findings:
- No published formula for n(r) or d_geo definition
- Scaffold (MDS) disagrees with Finsler formula by 460 km on Sydney-Perth
- Christchurch-Greymouth: 84% error on a 223 km route
- Singapore breaks the model (r=23,556 km vs r_eq=14,105 km)
- 13 versions of parameter adjustment = iterative fitting, not physics
- Error pattern (7.3% NH, 10.2% SH) = sphere-to-plane projection signature

Also updates SYD-EZE references from -73% (V12) to accurate V12/V13
figures throughout, noting V13's -8.4% claim relies on unpublished functions.

Co-Authored-By: Claude Opus 4.6 <noreply@anthropic.com>
</commit_message>
<xml_diff>
--- a/downloads/critical-review-dome-model-v4.docx
+++ b/downloads/critical-review-dome-model-v4.docx
@@ -8889,7 +8889,7 @@
       <w:r>
         <w:t xml:space="preserve">US Patent 787412 (1905), publicly available at </w:t>
       </w:r>
-      <w:hyperlink w:history="1" r:id="rIdks9u0byvur5dbgmyrc8mi">
+      <w:hyperlink w:history="1" r:id="rId0g8crdrxnklf1w62gb1hk">
         <w:r>
           <w:rPr>
             <w:rStyle w:val="Hyperlink"/>
@@ -9029,7 +9029,7 @@
       <w:r>
         <w:t xml:space="preserve">James Bradley (1727) explicitly tested and rejected atmospheric refraction as an explanation: refraction is wavelength-dependent (chromatic), while stellar aberration is achromatic. Modern VLBI measurements achieve milliarcsecond precision and directly confirm aberration correlates with Earth's orbital velocity (~30 km/s). The </w:t>
       </w:r>
-      <w:hyperlink w:history="1" r:id="rIdsa73df7eeqt78vcc3stbu">
+      <w:hyperlink w:history="1" r:id="rIdmty5ivrwnlbrv0nwlooj8">
         <w:r>
           <w:rPr>
             <w:rStyle w:val="Hyperlink"/>
@@ -9095,7 +9095,7 @@
       <w:r>
         <w:t xml:space="preserve">ESA </w:t>
       </w:r>
-      <w:hyperlink w:history="1" r:id="rIdsa4xcyiykx25jckdoro-g">
+      <w:hyperlink w:history="1" r:id="rIdejrwcif01i-h45txzdixx">
         <w:r>
           <w:rPr>
             <w:rStyle w:val="Hyperlink"/>
@@ -9161,7 +9161,7 @@
       <w:r>
         <w:t xml:space="preserve">Crepuscular rays are parallel beams made visible by atmospheric scattering. The apparent divergence is a perspective effect. Crucially, anticrepuscular rays converge at the anti-solar point simultaneously. See </w:t>
       </w:r>
-      <w:hyperlink w:history="1" r:id="rIdchbeyi-ppoh0zarnlm0oa">
+      <w:hyperlink w:history="1" r:id="rIdxhxigd6ty7onf0kcjgfih">
         <w:r>
           <w:rPr>
             <w:rStyle w:val="Hyperlink"/>
@@ -9172,7 +9172,7 @@
       <w:r>
         <w:t xml:space="preserve"> and </w:t>
       </w:r>
-      <w:hyperlink w:history="1" r:id="rId37vfxsgspzvl_x_l1-tvw">
+      <w:hyperlink w:history="1" r:id="rIdwsr_wffwlvlzz1d_efis9">
         <w:r>
           <w:rPr>
             <w:rStyle w:val="Hyperlink"/>
@@ -9238,7 +9238,7 @@
       <w:r>
         <w:t xml:space="preserve">NOAA officially states no evidence of anomalous disappearances. </w:t>
       </w:r>
-      <w:hyperlink w:history="1" r:id="rIdlm2s5nshcdtp6mwvn5vye">
+      <w:hyperlink w:history="1" r:id="rIdb2iq5yj4s8yn5dtpbj2h3">
         <w:r>
           <w:rPr>
             <w:rStyle w:val="Hyperlink"/>
@@ -9304,7 +9304,7 @@
       <w:r>
         <w:t xml:space="preserve">Hipparcos </w:t>
       </w:r>
-      <w:hyperlink w:history="1" r:id="rId-21ejrzsytt85cdnajgmc">
+      <w:hyperlink w:history="1" r:id="rIdrqwggmpgn_dcc-vrjfbqb">
         <w:r>
           <w:rPr>
             <w:rStyle w:val="Hyperlink"/>
@@ -9720,7 +9720,7 @@
       <w:r>
         <w:t xml:space="preserve">Terra-Nova et al. (2017, PNAS) demonstrate reversed-flux patches reproduce SAA splitting in MHD simulations. The </w:t>
       </w:r>
-      <w:hyperlink w:history="1" r:id="rId91nsh_dtc674anoax5xon">
+      <w:hyperlink w:history="1" r:id="rIdqgtlhb4giiqr81vp0s3bh">
         <w:r>
           <w:rPr>
             <w:rStyle w:val="Hyperlink"/>
@@ -9731,7 +9731,7 @@
       <w:r>
         <w:t xml:space="preserve"> documents the evolution quantitatively. </w:t>
       </w:r>
-      <w:hyperlink w:history="1" r:id="rIdlr6irx9mgf1hmzlpulpow">
+      <w:hyperlink w:history="1" r:id="rIdyyncxmsdeaa3y9y7fq9w2">
         <w:r>
           <w:rPr>
             <w:rStyle w:val="Hyperlink"/>
@@ -9782,7 +9782,7 @@
       <w:r>
         <w:t xml:space="preserve">Normal secular variation documented by </w:t>
       </w:r>
-      <w:hyperlink w:history="1" r:id="rIdn4dv29max5emozkhojah5">
+      <w:hyperlink w:history="1" r:id="rIdxqjrxa7kv4ndub9kd8bhn">
         <w:r>
           <w:rPr>
             <w:rStyle w:val="Hyperlink"/>
@@ -9849,7 +9849,7 @@
       <w:r>
         <w:t xml:space="preserve">Eclipse-induced perturbations predicted by Chapman (1933) via ionospheric conductivity drops. Data from </w:t>
       </w:r>
-      <w:hyperlink w:history="1" r:id="rIdjv_nskl4ftc3uzy4hi_xq">
+      <w:hyperlink w:history="1" r:id="rIdwdrhc1znyzhv1xhrq4acb">
         <w:r>
           <w:rPr>
             <w:rStyle w:val="Hyperlink"/>
@@ -9937,7 +9937,7 @@
       <w:r>
         <w:t xml:space="preserve">The formula used is for a quarter-wave linear waveguide, not a spherical cavity. Correct formula f = c/(2*pi*R) gives R = 6,098 km, within 4% of Earth's radius. The ionosphere IS conductive (</w:t>
       </w:r>
-      <w:hyperlink w:history="1" r:id="rIdj5lbu_xty0q-5rdwgzjtv">
+      <w:hyperlink w:history="1" r:id="rId0rqnzcrpjurxn5vwhjoif">
         <w:r>
           <w:rPr>
             <w:rStyle w:val="Hyperlink"/>
@@ -10004,7 +10004,7 @@
       <w:r>
         <w:t xml:space="preserve">All five observations already predicted by </w:t>
       </w:r>
-      <w:hyperlink w:history="1" r:id="rIdajhlre1r73gd1c7dggwu4">
+      <w:hyperlink w:history="1" r:id="rIdwexunpb5fwvw_t0oeoqrs">
         <w:r>
           <w:rPr>
             <w:rStyle w:val="Hyperlink"/>
@@ -10015,7 +10015,7 @@
       <w:r>
         <w:t xml:space="preserve">, </w:t>
       </w:r>
-      <w:hyperlink w:history="1" r:id="rIdwm4ojscnyv38p284zpovt">
+      <w:hyperlink w:history="1" r:id="rIdj-hjz5xfle8t7iz19lkhb">
         <w:r>
           <w:rPr>
             <w:rStyle w:val="Hyperlink"/>
@@ -10342,7 +10342,7 @@
       <w:r>
         <w:t xml:space="preserve">Antarctic gravity anomalies are mapped from orbit by </w:t>
       </w:r>
-      <w:hyperlink w:history="1" r:id="rIddkr4plhhb2i8valybbzv2">
+      <w:hyperlink w:history="1" r:id="rIdgnstg1r34held1mh4owas">
         <w:r>
           <w:rPr>
             <w:rStyle w:val="Hyperlink"/>
@@ -10353,7 +10353,7 @@
       <w:r>
         <w:t xml:space="preserve"> and </w:t>
       </w:r>
-      <w:hyperlink w:history="1" r:id="rId-efoog3rhbvrkzvv_emgd">
+      <w:hyperlink w:history="1" r:id="rIdtjcd63kr1sq4iuz3eh6e4">
         <w:r>
           <w:rPr>
             <w:rStyle w:val="Hyperlink"/>
@@ -13329,7 +13329,7 @@
       <w:r>
         <w:t xml:space="preserve">A </w:t>
       </w:r>
-      <w:hyperlink w:history="1" r:id="rIdpiqnspifgy_4dmqvuggrb">
+      <w:hyperlink w:history="1" r:id="rIdwv8tjadgfaprepw51bea-">
         <w:r>
           <w:rPr>
             <w:rStyle w:val="Hyperlink"/>
@@ -13340,7 +13340,7 @@
       <w:r>
         <w:t xml:space="preserve"> found detectable decreases in X, Z, and total field components during eclipses. An </w:t>
       </w:r>
-      <w:hyperlink w:history="1" r:id="rIdl3xaj_0l_calhdwy-nufq">
+      <w:hyperlink w:history="1" r:id="rIdxodbhkuvlqfl7rz1hjgvb">
         <w:r>
           <w:rPr>
             <w:rStyle w:val="Hyperlink"/>
@@ -13845,7 +13845,7 @@
       <w:r>
         <w:t xml:space="preserve">Continuous 24-hour sunlight. A local sun at 5,733 km circling above a flat disc cannot produce 24-hour sunlight at the disc edge. Directly observable at Amundsen-Scott Station, staffed year-round since 1957. See </w:t>
       </w:r>
-      <w:hyperlink w:history="1" r:id="rIdbanzy_bah0nzpdgwefvpf">
+      <w:hyperlink w:history="1" r:id="rIdxlxh07w5ddvz5oz4xztwd">
         <w:r>
           <w:rPr>
             <w:rStyle w:val="Hyperlink"/>
@@ -13909,7 +13909,7 @@
       <w:r>
         <w:t xml:space="preserve">GPS provides 1–3 meter accuracy worldwide using 24+ satellites in Keplerian orbits calculated from spherical-Earth gravitational mechanics. The system requires precise relativistic corrections (both special and general) that depend on the satellites' orbital velocity and altitude above a spherical gravitational well. If Earth were a flat disc with different geometry, the signal propagation times, relativistic corrections, and satellite visibility geometry would all be wrong, and the system would not achieve meter-level accuracy. The same applies to every other satellite navigation system (GLONASS, Galileo, BeiDou). The ISS at 408 km is visible on predictable schedules computed from Keplerian orbits. Geostationary satellites at 35,786 km — far above the dome's maximum height — provide continuous coverage. See </w:t>
       </w:r>
-      <w:hyperlink w:history="1" r:id="rIdcgpqw0ydqxfxykgs05-mj">
+      <w:hyperlink w:history="1" r:id="rIdpod3qox1zmxetmvx4m50z">
         <w:r>
           <w:rPr>
             <w:rStyle w:val="Hyperlink"/>
@@ -13920,7 +13920,7 @@
       <w:r>
         <w:t xml:space="preserve">; </w:t>
       </w:r>
-      <w:hyperlink w:history="1" r:id="rIdqd3qjkoxbvit3ocpy6v-b">
+      <w:hyperlink w:history="1" r:id="rId74j-vng77tjml8s66sret">
         <w:r>
           <w:rPr>
             <w:rStyle w:val="Hyperlink"/>
@@ -13969,7 +13969,7 @@
       <w:r>
         <w:t xml:space="preserve">Modern solar calculators (</w:t>
       </w:r>
-      <w:hyperlink w:history="1" r:id="rIdz9vwptjsmucwcc6fueqlq">
+      <w:hyperlink w:history="1" r:id="rIdqqmxhlv4ytsiygwogswyn">
         <w:r>
           <w:rPr>
             <w:rStyle w:val="Hyperlink"/>
@@ -14018,7 +14018,7 @@
       <w:r>
         <w:t xml:space="preserve">The </w:t>
       </w:r>
-      <w:hyperlink w:history="1" r:id="rId9c4nztdtha5uwebdu4jic">
+      <w:hyperlink w:history="1" r:id="rIdn5ddrcztbk06r96mka1j0">
         <w:r>
           <w:rPr>
             <w:rStyle w:val="Hyperlink"/>
@@ -14067,7 +14067,7 @@
       <w:r>
         <w:t xml:space="preserve">Earth's field is a dipole. South magnetic pole at 64.1°S, 135.9°E (</w:t>
       </w:r>
-      <w:hyperlink w:history="1" r:id="rIdovs_tkxze52mvb7yeypxe">
+      <w:hyperlink w:history="1" r:id="rIdenmc5i5-rmkoavvl9scnl">
         <w:r>
           <w:rPr>
             <w:rStyle w:val="Hyperlink"/>
@@ -14116,7 +14116,7 @@
       <w:r>
         <w:t xml:space="preserve">g = 9.780 m/s² at equator, 9.832 m/s² at poles (0.53% variation). On a flat disc, centrifugal force points outward from center, producing the OPPOSITE pattern. See </w:t>
       </w:r>
-      <w:hyperlink w:history="1" r:id="rIdotnct9i9ys6ruasxisxmv">
+      <w:hyperlink w:history="1" r:id="rIdxuvizdept2uj3w7tzj_6-">
         <w:r>
           <w:rPr>
             <w:rStyle w:val="Hyperlink"/>
@@ -15113,7 +15113,7 @@
         </w:rPr>
         <w:t xml:space="preserve">NOAA World Magnetic Model 2025: </w:t>
       </w:r>
-      <w:hyperlink w:history="1" r:id="rIdlxm9trkq5h6sozvn1w5zm">
+      <w:hyperlink w:history="1" r:id="rId0jwrdnpde9-ykfxouoto2">
         <w:r>
           <w:rPr>
             <w:rStyle w:val="Hyperlink"/>
@@ -15133,7 +15133,7 @@
         </w:rPr>
         <w:t xml:space="preserve">NOAA Wandering Geomagnetic Poles: </w:t>
       </w:r>
-      <w:hyperlink w:history="1" r:id="rId3umdu7a51rcq1mjtpyrsp">
+      <w:hyperlink w:history="1" r:id="rIdpasvocspfwgsxcudyfve0">
         <w:r>
           <w:rPr>
             <w:rStyle w:val="Hyperlink"/>
@@ -15153,7 +15153,7 @@
         </w:rPr>
         <w:t xml:space="preserve">CHAOS-7 Geomagnetic Field Model: </w:t>
       </w:r>
-      <w:hyperlink w:history="1" r:id="rIdskij3y6wl4xb6oq60vjvd">
+      <w:hyperlink w:history="1" r:id="rIdr84of07soxgkq6b1zfubi">
         <w:r>
           <w:rPr>
             <w:rStyle w:val="Hyperlink"/>
@@ -15173,7 +15173,7 @@
         </w:rPr>
         <w:t xml:space="preserve">ESA Swarm Satellite Mission: </w:t>
       </w:r>
-      <w:hyperlink w:history="1" r:id="rId4slpd_vjlw6el5oso5ntv">
+      <w:hyperlink w:history="1" r:id="rIdofrskrp3wgwdgjoyuy77u">
         <w:r>
           <w:rPr>
             <w:rStyle w:val="Hyperlink"/>
@@ -15193,7 +15193,7 @@
         </w:rPr>
         <w:t xml:space="preserve">INTERMAGNET Observatory Network: </w:t>
       </w:r>
-      <w:hyperlink w:history="1" r:id="rIdm2dtgo9ge4e4ah20nb4vk">
+      <w:hyperlink w:history="1" r:id="rId57gmcarp8gxqiyodfsxcv">
         <w:r>
           <w:rPr>
             <w:rStyle w:val="Hyperlink"/>
@@ -15213,7 +15213,7 @@
         </w:rPr>
         <w:t xml:space="preserve">IGRF-13: </w:t>
       </w:r>
-      <w:hyperlink w:history="1" r:id="rId5lx4cz_yifypop1zfjp3d">
+      <w:hyperlink w:history="1" r:id="rIdcmcm9pgi6nelripechxkq">
         <w:r>
           <w:rPr>
             <w:rStyle w:val="Hyperlink"/>
@@ -15233,7 +15233,7 @@
         </w:rPr>
         <w:t xml:space="preserve">ESA Gaia Data Release 3: </w:t>
       </w:r>
-      <w:hyperlink w:history="1" r:id="rId3irzeldvf6bkvebucxydv">
+      <w:hyperlink w:history="1" r:id="rId8bixbsd1odbhsif5nc9gm">
         <w:r>
           <w:rPr>
             <w:rStyle w:val="Hyperlink"/>
@@ -15253,7 +15253,7 @@
         </w:rPr>
         <w:t xml:space="preserve">Hipparcos Catalogue: </w:t>
       </w:r>
-      <w:hyperlink w:history="1" r:id="rIdkfuzpozmui8rtt2tbrejw">
+      <w:hyperlink w:history="1" r:id="rIddrxrartqaaejl-0tdoi87">
         <w:r>
           <w:rPr>
             <w:rStyle w:val="Hyperlink"/>
@@ -15273,7 +15273,7 @@
         </w:rPr>
         <w:t xml:space="preserve">US Patent 787412 (Tesla): </w:t>
       </w:r>
-      <w:hyperlink w:history="1" r:id="rIdjh9kzr8iyrfoi0br8qrw7">
+      <w:hyperlink w:history="1" r:id="rIdlbxas2ikr84ggvdmmwvwz">
         <w:r>
           <w:rPr>
             <w:rStyle w:val="Hyperlink"/>
@@ -15293,7 +15293,7 @@
         </w:rPr>
         <w:t xml:space="preserve">NOAA Solar Position Algorithm: </w:t>
       </w:r>
-      <w:hyperlink w:history="1" r:id="rId5weumpdsvctvg87btiqzv">
+      <w:hyperlink w:history="1" r:id="rIdtwympjvvfdqdhmsn8ngop">
         <w:r>
           <w:rPr>
             <w:rStyle w:val="Hyperlink"/>
@@ -15313,7 +15313,7 @@
         </w:rPr>
         <w:t xml:space="preserve">National Geodetic Survey Gravity: </w:t>
       </w:r>
-      <w:hyperlink w:history="1" r:id="rIdix7rk_3bqwtkvu39gbisn">
+      <w:hyperlink w:history="1" r:id="rIdma6rfknhr4varyh8k4dao">
         <w:r>
           <w:rPr>
             <w:rStyle w:val="Hyperlink"/>
@@ -15333,7 +15333,7 @@
         </w:rPr>
         <w:t xml:space="preserve">CHIME/FRB Project: </w:t>
       </w:r>
-      <w:hyperlink w:history="1" r:id="rId46ocr28_cvvgohwj4xzlj">
+      <w:hyperlink w:history="1" r:id="rIdeaajryzot1y61mznog2lg">
         <w:r>
           <w:rPr>
             <w:rStyle w:val="Hyperlink"/>
@@ -15353,7 +15353,7 @@
         </w:rPr>
         <w:t xml:space="preserve">GRACE-FO (gravity mapping): </w:t>
       </w:r>
-      <w:hyperlink w:history="1" r:id="rIdgqlo3emh6rfa_tuzr_hce">
+      <w:hyperlink w:history="1" r:id="rId8qquogu2balldw-mopcdh">
         <w:r>
           <w:rPr>
             <w:rStyle w:val="Hyperlink"/>
@@ -15373,7 +15373,7 @@
         </w:rPr>
         <w:t xml:space="preserve">GOCE (gravity field): </w:t>
       </w:r>
-      <w:hyperlink w:history="1" r:id="rIdmpk7tou7edasmucb-ci-9">
+      <w:hyperlink w:history="1" r:id="rIdroqq4fiznisjvdkzmzbqb">
         <w:r>
           <w:rPr>
             <w:rStyle w:val="Hyperlink"/>
@@ -15393,7 +15393,7 @@
         </w:rPr>
         <w:t xml:space="preserve">GPS.gov: </w:t>
       </w:r>
-      <w:hyperlink w:history="1" r:id="rIdcgqbdlqegvzurgvb1lyqb">
+      <w:hyperlink w:history="1" r:id="rIdok_h7psnl7rrybtnfc9f5">
         <w:r>
           <w:rPr>
             <w:rStyle w:val="Hyperlink"/>
@@ -15413,7 +15413,7 @@
         </w:rPr>
         <w:t xml:space="preserve">CelesTrak TLE Data: </w:t>
       </w:r>
-      <w:hyperlink w:history="1" r:id="rIdmpybi5r_pw7p6jn9ofavq">
+      <w:hyperlink w:history="1" r:id="rIdkeovusmebzcdbhnovbrfa">
         <w:r>
           <w:rPr>
             <w:rStyle w:val="Hyperlink"/>

</xml_diff>

<commit_message>
Add Section 1.5: Aetheric Refraction deep analysis in The Model tab
Comprehensive analysis of the dome's universal correction factor:
- Core problem: n(r) replicates effects of curvature on a flat surface
- 0.20 coefficient has no derivation (V13 optimization = fitted)
- Physical consequences ignored: chromatic dispersion at n=3.49,
  angular position shifts, total internal reflection, wavelength-dependent
  distance measurements — none observed
- No independent measurement (circular: defined by the gap it explains)
- Unfalsifiable: free coefficient + unpublished d_geo = any data fits
- Model page OPEN items confirm mechanism is broken (OPEN-004/006/012)
- Occam's razor: flat disc + n(r) correction ≈ globe in unusual coordinates

Also adds cross-reference from Section 4.9 (escape hatch) to Section 1.5,
and updates TOC.

Co-Authored-By: Claude Opus 4.6 <noreply@anthropic.com>
</commit_message>
<xml_diff>
--- a/downloads/critical-review-dome-model-v4.docx
+++ b/downloads/critical-review-dome-model-v4.docx
@@ -8889,7 +8889,7 @@
       <w:r>
         <w:t xml:space="preserve">US Patent 787412 (1905), publicly available at </w:t>
       </w:r>
-      <w:hyperlink w:history="1" r:id="rIdr5q6h0f5mzilhghpoysmi">
+      <w:hyperlink w:history="1" r:id="rIdlj098o8ulfckfe4dyg7_s">
         <w:r>
           <w:rPr>
             <w:rStyle w:val="Hyperlink"/>
@@ -9029,7 +9029,7 @@
       <w:r>
         <w:t xml:space="preserve">James Bradley (1727) explicitly tested and rejected atmospheric refraction as an explanation: refraction is wavelength-dependent (chromatic), while stellar aberration is achromatic. Modern VLBI measurements achieve milliarcsecond precision and directly confirm aberration correlates with Earth's orbital velocity (~30 km/s). The </w:t>
       </w:r>
-      <w:hyperlink w:history="1" r:id="rIdrgti-68smhui6hqz4zotj">
+      <w:hyperlink w:history="1" r:id="rIdeolkowhbmsryi7qzrhdka">
         <w:r>
           <w:rPr>
             <w:rStyle w:val="Hyperlink"/>
@@ -9095,7 +9095,7 @@
       <w:r>
         <w:t xml:space="preserve">ESA </w:t>
       </w:r>
-      <w:hyperlink w:history="1" r:id="rIdas8sjucy1o4vzvrojru0d">
+      <w:hyperlink w:history="1" r:id="rIdjali4dzesbq2rnexdfhgv">
         <w:r>
           <w:rPr>
             <w:rStyle w:val="Hyperlink"/>
@@ -9161,7 +9161,7 @@
       <w:r>
         <w:t xml:space="preserve">Crepuscular rays are parallel beams made visible by atmospheric scattering. The apparent divergence is a perspective effect. Crucially, anticrepuscular rays converge at the anti-solar point simultaneously. See </w:t>
       </w:r>
-      <w:hyperlink w:history="1" r:id="rIdqgdktqp1cx6hr2y_akndx">
+      <w:hyperlink w:history="1" r:id="rId-utybjzgtptfnzhovrtrt">
         <w:r>
           <w:rPr>
             <w:rStyle w:val="Hyperlink"/>
@@ -9172,7 +9172,7 @@
       <w:r>
         <w:t xml:space="preserve"> and </w:t>
       </w:r>
-      <w:hyperlink w:history="1" r:id="rIdqvbte12irj2vl_093b1sb">
+      <w:hyperlink w:history="1" r:id="rIdqbnael1wr6hrnif4b_k4e">
         <w:r>
           <w:rPr>
             <w:rStyle w:val="Hyperlink"/>
@@ -9238,7 +9238,7 @@
       <w:r>
         <w:t xml:space="preserve">NOAA officially states no evidence of anomalous disappearances. </w:t>
       </w:r>
-      <w:hyperlink w:history="1" r:id="rIdep__5s7ooq3h-yyv2xezl">
+      <w:hyperlink w:history="1" r:id="rIdu5hwsgjfzd75xkqi7rkfd">
         <w:r>
           <w:rPr>
             <w:rStyle w:val="Hyperlink"/>
@@ -9304,7 +9304,7 @@
       <w:r>
         <w:t xml:space="preserve">Hipparcos </w:t>
       </w:r>
-      <w:hyperlink w:history="1" r:id="rIdzqhd3thovuhnbdgvdlhah">
+      <w:hyperlink w:history="1" r:id="rIdm8_nocndxignw1dm0szaf">
         <w:r>
           <w:rPr>
             <w:rStyle w:val="Hyperlink"/>
@@ -9720,7 +9720,7 @@
       <w:r>
         <w:t xml:space="preserve">Terra-Nova et al. (2017, PNAS) demonstrate reversed-flux patches reproduce SAA splitting in MHD simulations. The </w:t>
       </w:r>
-      <w:hyperlink w:history="1" r:id="rIdm34u7kmfcd_whhp74-iyz">
+      <w:hyperlink w:history="1" r:id="rId_th8nmnjf_-q8-lxuk9-g">
         <w:r>
           <w:rPr>
             <w:rStyle w:val="Hyperlink"/>
@@ -9731,7 +9731,7 @@
       <w:r>
         <w:t xml:space="preserve"> documents the evolution quantitatively. </w:t>
       </w:r>
-      <w:hyperlink w:history="1" r:id="rIdzhdqxor-wuhyls2yfmzlq">
+      <w:hyperlink w:history="1" r:id="rIdqcc8uxibhcfmzuk6-rlay">
         <w:r>
           <w:rPr>
             <w:rStyle w:val="Hyperlink"/>
@@ -9782,7 +9782,7 @@
       <w:r>
         <w:t xml:space="preserve">Normal secular variation documented by </w:t>
       </w:r>
-      <w:hyperlink w:history="1" r:id="rIdgcd_rv8me9vksxf8h7gfn">
+      <w:hyperlink w:history="1" r:id="rId84aikfrl1ojj-ucap-fab">
         <w:r>
           <w:rPr>
             <w:rStyle w:val="Hyperlink"/>
@@ -9849,7 +9849,7 @@
       <w:r>
         <w:t xml:space="preserve">Eclipse-induced perturbations predicted by Chapman (1933) via ionospheric conductivity drops. Data from </w:t>
       </w:r>
-      <w:hyperlink w:history="1" r:id="rIdumjfhw1q7klmq-6rfcpb0">
+      <w:hyperlink w:history="1" r:id="rIdjmuwteb9qsl1dgffrskvl">
         <w:r>
           <w:rPr>
             <w:rStyle w:val="Hyperlink"/>
@@ -9937,7 +9937,7 @@
       <w:r>
         <w:t xml:space="preserve">The formula used is for a quarter-wave linear waveguide, not a spherical cavity. Correct formula f = c/(2*pi*R) gives R = 6,098 km, within 4% of Earth's radius. The ionosphere IS conductive (</w:t>
       </w:r>
-      <w:hyperlink w:history="1" r:id="rIdauldauh7iimwqy9wo08io">
+      <w:hyperlink w:history="1" r:id="rId3mjryrfo2ogzhvc1d48-z">
         <w:r>
           <w:rPr>
             <w:rStyle w:val="Hyperlink"/>
@@ -10004,7 +10004,7 @@
       <w:r>
         <w:t xml:space="preserve">All five observations already predicted by </w:t>
       </w:r>
-      <w:hyperlink w:history="1" r:id="rIdt9ss7ph8f3rowxzmcasbz">
+      <w:hyperlink w:history="1" r:id="rIdb7tdenyxj1hv2jknxdbha">
         <w:r>
           <w:rPr>
             <w:rStyle w:val="Hyperlink"/>
@@ -10015,7 +10015,7 @@
       <w:r>
         <w:t xml:space="preserve">, </w:t>
       </w:r>
-      <w:hyperlink w:history="1" r:id="rIdonnbjfho6g_o5u17vtj_7">
+      <w:hyperlink w:history="1" r:id="rId47z6acj_nnstbdo_va9b0">
         <w:r>
           <w:rPr>
             <w:rStyle w:val="Hyperlink"/>
@@ -10342,7 +10342,7 @@
       <w:r>
         <w:t xml:space="preserve">Antarctic gravity anomalies are mapped from orbit by </w:t>
       </w:r>
-      <w:hyperlink w:history="1" r:id="rIdfnqbemw2-ffqo4voprjd3">
+      <w:hyperlink w:history="1" r:id="rIdvfisyhwpa5qsljbsuye58">
         <w:r>
           <w:rPr>
             <w:rStyle w:val="Hyperlink"/>
@@ -10353,7 +10353,7 @@
       <w:r>
         <w:t xml:space="preserve"> and </w:t>
       </w:r>
-      <w:hyperlink w:history="1" r:id="rIdo5kkg8uzjwnyixagn4eyc">
+      <w:hyperlink w:history="1" r:id="rIdig02qt0pldxbo1g2twufh">
         <w:r>
           <w:rPr>
             <w:rStyle w:val="Hyperlink"/>
@@ -13329,7 +13329,7 @@
       <w:r>
         <w:t xml:space="preserve">A </w:t>
       </w:r>
-      <w:hyperlink w:history="1" r:id="rIdj9did5n25jf4fkaljqsnr">
+      <w:hyperlink w:history="1" r:id="rIda4ydnqjcd9qoseaaj308z">
         <w:r>
           <w:rPr>
             <w:rStyle w:val="Hyperlink"/>
@@ -13340,7 +13340,7 @@
       <w:r>
         <w:t xml:space="preserve"> found detectable decreases in X, Z, and total field components during eclipses. An </w:t>
       </w:r>
-      <w:hyperlink w:history="1" r:id="rIdhftmlvsuscg47g6kupgbs">
+      <w:hyperlink w:history="1" r:id="rIdjo6nbdwkdzztpefpn9-qn">
         <w:r>
           <w:rPr>
             <w:rStyle w:val="Hyperlink"/>
@@ -13845,7 +13845,7 @@
       <w:r>
         <w:t xml:space="preserve">Continuous 24-hour sunlight. A local sun at 5,733 km circling above a flat disc cannot produce 24-hour sunlight at the disc edge. Directly observable at Amundsen-Scott Station, staffed year-round since 1957. See </w:t>
       </w:r>
-      <w:hyperlink w:history="1" r:id="rId2bcz12pkk10ej-ry2ut-h">
+      <w:hyperlink w:history="1" r:id="rIduzdid_bzaqfeiozogmsub">
         <w:r>
           <w:rPr>
             <w:rStyle w:val="Hyperlink"/>
@@ -13909,7 +13909,7 @@
       <w:r>
         <w:t xml:space="preserve">GPS provides 1–3 meter accuracy worldwide using 24+ satellites in Keplerian orbits calculated from spherical-Earth gravitational mechanics. The system requires precise relativistic corrections (both special and general) that depend on the satellites' orbital velocity and altitude above a spherical gravitational well. If Earth were a flat disc with different geometry, the signal propagation times, relativistic corrections, and satellite visibility geometry would all be wrong, and the system would not achieve meter-level accuracy. The same applies to every other satellite navigation system (GLONASS, Galileo, BeiDou). The ISS at 408 km is visible on predictable schedules computed from Keplerian orbits. Geostationary satellites at 35,786 km — far above the dome's maximum height — provide continuous coverage. See </w:t>
       </w:r>
-      <w:hyperlink w:history="1" r:id="rIdhqxczfeqy95s0ebzdxumt">
+      <w:hyperlink w:history="1" r:id="rIdcw0qnltrqwrcrvcw9fbdi">
         <w:r>
           <w:rPr>
             <w:rStyle w:val="Hyperlink"/>
@@ -13920,7 +13920,7 @@
       <w:r>
         <w:t xml:space="preserve">; </w:t>
       </w:r>
-      <w:hyperlink w:history="1" r:id="rIdqwuzg2ftid1zutl3woenc">
+      <w:hyperlink w:history="1" r:id="rIdnusoqcm0jyssf9-ygseza">
         <w:r>
           <w:rPr>
             <w:rStyle w:val="Hyperlink"/>
@@ -13969,7 +13969,7 @@
       <w:r>
         <w:t xml:space="preserve">Modern solar calculators (</w:t>
       </w:r>
-      <w:hyperlink w:history="1" r:id="rId-tev05fxmttfwvugm-td5">
+      <w:hyperlink w:history="1" r:id="rIduhlom-eknqyqw0hqcmlm8">
         <w:r>
           <w:rPr>
             <w:rStyle w:val="Hyperlink"/>
@@ -14018,7 +14018,7 @@
       <w:r>
         <w:t xml:space="preserve">The </w:t>
       </w:r>
-      <w:hyperlink w:history="1" r:id="rIdundgqvemwgk3dkmgtjqxb">
+      <w:hyperlink w:history="1" r:id="rIdneyows230y5owsytedfm-">
         <w:r>
           <w:rPr>
             <w:rStyle w:val="Hyperlink"/>
@@ -14067,7 +14067,7 @@
       <w:r>
         <w:t xml:space="preserve">Earth's field is a dipole. South magnetic pole at 64.1°S, 135.9°E (</w:t>
       </w:r>
-      <w:hyperlink w:history="1" r:id="rIdljr9wwrwehglvuinxdhj4">
+      <w:hyperlink w:history="1" r:id="rIdevb--2d9nlr5pepwhisq2">
         <w:r>
           <w:rPr>
             <w:rStyle w:val="Hyperlink"/>
@@ -14116,7 +14116,7 @@
       <w:r>
         <w:t xml:space="preserve">g = 9.780 m/s² at equator, 9.832 m/s² at poles (0.53% variation). On a flat disc, centrifugal force points outward from center, producing the OPPOSITE pattern. See </w:t>
       </w:r>
-      <w:hyperlink w:history="1" r:id="rIdluaj228abju960txx8w5z">
+      <w:hyperlink w:history="1" r:id="rIdfliz16jw2sdtly3tiyrzv">
         <w:r>
           <w:rPr>
             <w:rStyle w:val="Hyperlink"/>
@@ -15113,7 +15113,7 @@
         </w:rPr>
         <w:t xml:space="preserve">NOAA World Magnetic Model 2025: </w:t>
       </w:r>
-      <w:hyperlink w:history="1" r:id="rId8wfeczdud8gsjhciujr5z">
+      <w:hyperlink w:history="1" r:id="rId1btr6sfhuvnmfrziukvhy">
         <w:r>
           <w:rPr>
             <w:rStyle w:val="Hyperlink"/>
@@ -15133,7 +15133,7 @@
         </w:rPr>
         <w:t xml:space="preserve">NOAA Wandering Geomagnetic Poles: </w:t>
       </w:r>
-      <w:hyperlink w:history="1" r:id="rIdwirqonc0agxr8xcb9i93v">
+      <w:hyperlink w:history="1" r:id="rIdp07mbody-ofeiewy_yyzu">
         <w:r>
           <w:rPr>
             <w:rStyle w:val="Hyperlink"/>
@@ -15153,7 +15153,7 @@
         </w:rPr>
         <w:t xml:space="preserve">CHAOS-7 Geomagnetic Field Model: </w:t>
       </w:r>
-      <w:hyperlink w:history="1" r:id="rIdgejtxpreijhfc_l7f3wba">
+      <w:hyperlink w:history="1" r:id="rId3pgtuz2b-4ubzgrd0ibbk">
         <w:r>
           <w:rPr>
             <w:rStyle w:val="Hyperlink"/>
@@ -15173,7 +15173,7 @@
         </w:rPr>
         <w:t xml:space="preserve">ESA Swarm Satellite Mission: </w:t>
       </w:r>
-      <w:hyperlink w:history="1" r:id="rIdkaruznmqa6ml97xd-lquf">
+      <w:hyperlink w:history="1" r:id="rId2okylq3ext8ik2uangtkp">
         <w:r>
           <w:rPr>
             <w:rStyle w:val="Hyperlink"/>
@@ -15193,7 +15193,7 @@
         </w:rPr>
         <w:t xml:space="preserve">INTERMAGNET Observatory Network: </w:t>
       </w:r>
-      <w:hyperlink w:history="1" r:id="rIdjx5hw--zorfbjlj87obkr">
+      <w:hyperlink w:history="1" r:id="rIdajunbuqwfg_llyqqlnxxp">
         <w:r>
           <w:rPr>
             <w:rStyle w:val="Hyperlink"/>
@@ -15213,7 +15213,7 @@
         </w:rPr>
         <w:t xml:space="preserve">IGRF-13: </w:t>
       </w:r>
-      <w:hyperlink w:history="1" r:id="rId-jg5-i0sxxofrlpnroeft">
+      <w:hyperlink w:history="1" r:id="rIdmozsynxyfwt2djceasr-d">
         <w:r>
           <w:rPr>
             <w:rStyle w:val="Hyperlink"/>
@@ -15233,7 +15233,7 @@
         </w:rPr>
         <w:t xml:space="preserve">ESA Gaia Data Release 3: </w:t>
       </w:r>
-      <w:hyperlink w:history="1" r:id="rIdgk7oer-pkpv8dicmyzpbr">
+      <w:hyperlink w:history="1" r:id="rIdzoul9brsq7ulzxjpkucv0">
         <w:r>
           <w:rPr>
             <w:rStyle w:val="Hyperlink"/>
@@ -15253,7 +15253,7 @@
         </w:rPr>
         <w:t xml:space="preserve">Hipparcos Catalogue: </w:t>
       </w:r>
-      <w:hyperlink w:history="1" r:id="rIdiyqx9uyvv7zbh4ftui1cw">
+      <w:hyperlink w:history="1" r:id="rIdfr4mcb26r8sxglaf8u219">
         <w:r>
           <w:rPr>
             <w:rStyle w:val="Hyperlink"/>
@@ -15273,7 +15273,7 @@
         </w:rPr>
         <w:t xml:space="preserve">US Patent 787412 (Tesla): </w:t>
       </w:r>
-      <w:hyperlink w:history="1" r:id="rIdpzv5nbka7q37aolgcbwkf">
+      <w:hyperlink w:history="1" r:id="rIdb5nk7ii3pqhufea8wzyld">
         <w:r>
           <w:rPr>
             <w:rStyle w:val="Hyperlink"/>
@@ -15293,7 +15293,7 @@
         </w:rPr>
         <w:t xml:space="preserve">NOAA Solar Position Algorithm: </w:t>
       </w:r>
-      <w:hyperlink w:history="1" r:id="rIdn0103g0eecvs1vemxb04h">
+      <w:hyperlink w:history="1" r:id="rIdoyksh5kugavlwkl3qrrlt">
         <w:r>
           <w:rPr>
             <w:rStyle w:val="Hyperlink"/>
@@ -15313,7 +15313,7 @@
         </w:rPr>
         <w:t xml:space="preserve">National Geodetic Survey Gravity: </w:t>
       </w:r>
-      <w:hyperlink w:history="1" r:id="rIds3puplzwh6bj1jiwsj9hz">
+      <w:hyperlink w:history="1" r:id="rIdxrtjv3ljkk5chi3qtrgu6">
         <w:r>
           <w:rPr>
             <w:rStyle w:val="Hyperlink"/>
@@ -15333,7 +15333,7 @@
         </w:rPr>
         <w:t xml:space="preserve">CHIME/FRB Project: </w:t>
       </w:r>
-      <w:hyperlink w:history="1" r:id="rIdgrxb6dm0hzjwmja_dsdn5">
+      <w:hyperlink w:history="1" r:id="rIdxg3rzu9bry1jiiivayqtw">
         <w:r>
           <w:rPr>
             <w:rStyle w:val="Hyperlink"/>
@@ -15353,7 +15353,7 @@
         </w:rPr>
         <w:t xml:space="preserve">GRACE-FO (gravity mapping): </w:t>
       </w:r>
-      <w:hyperlink w:history="1" r:id="rIdrjt_b9gzj8kgqjrz01azo">
+      <w:hyperlink w:history="1" r:id="rIdagctlymrpooapm3z4urxk">
         <w:r>
           <w:rPr>
             <w:rStyle w:val="Hyperlink"/>
@@ -15373,7 +15373,7 @@
         </w:rPr>
         <w:t xml:space="preserve">GOCE (gravity field): </w:t>
       </w:r>
-      <w:hyperlink w:history="1" r:id="rIdrvhm5bl4j1nh10m54lrkl">
+      <w:hyperlink w:history="1" r:id="rIdfwgchggnp-okraifncowa">
         <w:r>
           <w:rPr>
             <w:rStyle w:val="Hyperlink"/>
@@ -15393,7 +15393,7 @@
         </w:rPr>
         <w:t xml:space="preserve">GPS.gov: </w:t>
       </w:r>
-      <w:hyperlink w:history="1" r:id="rIdcrmsbkhietut_euuvvvoj">
+      <w:hyperlink w:history="1" r:id="rId4bz0k85_snns_lhz0t1rr">
         <w:r>
           <w:rPr>
             <w:rStyle w:val="Hyperlink"/>
@@ -15413,7 +15413,7 @@
         </w:rPr>
         <w:t xml:space="preserve">CelesTrak TLE Data: </w:t>
       </w:r>
-      <w:hyperlink w:history="1" r:id="rId_wbi5_pvkorfe3d9lnez8">
+      <w:hyperlink w:history="1" r:id="rIdspalhyn2o1fg8t8vjf9xh">
         <w:r>
           <w:rPr>
             <w:rStyle w:val="Hyperlink"/>

</xml_diff>

<commit_message>
Add 'three incompatible jobs' analysis for aetheric refraction
The dome uses 'aether' for three physically incompatible purposes:
1. Optical medium (bending light) — historical use, at least categorically valid
2. Physical fluid (pushing aircraft as 'aetheric slipstream') — not what
   refractive indices do; glass bends light but doesn't create wind
3. Distance contraction (d = d_geo/n(r)) — not what refractive indices do;
   walking through glass doesn't shrink your stride. This is a relativistic
   metric effect without relativity's physics (no speed, no mass prerequisite)

Jobs 2 and 3 conflict: for any southern hemisphere flight, how much duration
comes from distance contraction vs aetheric wind? Model never specifies.

Added to Section 1.5 (model tab), cross-referenced from Kill-Shot Test 3
(JFK-LHR) and Section 4.9 (escape hatch in selftest tab).

Co-Authored-By: Claude Opus 4.6 <noreply@anthropic.com>
</commit_message>
<xml_diff>
--- a/downloads/critical-review-dome-model-v4.docx
+++ b/downloads/critical-review-dome-model-v4.docx
@@ -8889,7 +8889,7 @@
       <w:r>
         <w:t xml:space="preserve">US Patent 787412 (1905), publicly available at </w:t>
       </w:r>
-      <w:hyperlink w:history="1" r:id="rIdlj098o8ulfckfe4dyg7_s">
+      <w:hyperlink w:history="1" r:id="rIdzakben7txvaz06spwlgg7">
         <w:r>
           <w:rPr>
             <w:rStyle w:val="Hyperlink"/>
@@ -9029,7 +9029,7 @@
       <w:r>
         <w:t xml:space="preserve">James Bradley (1727) explicitly tested and rejected atmospheric refraction as an explanation: refraction is wavelength-dependent (chromatic), while stellar aberration is achromatic. Modern VLBI measurements achieve milliarcsecond precision and directly confirm aberration correlates with Earth's orbital velocity (~30 km/s). The </w:t>
       </w:r>
-      <w:hyperlink w:history="1" r:id="rIdeolkowhbmsryi7qzrhdka">
+      <w:hyperlink w:history="1" r:id="rIdjn1xeilenvopmqyhavg2i">
         <w:r>
           <w:rPr>
             <w:rStyle w:val="Hyperlink"/>
@@ -9095,7 +9095,7 @@
       <w:r>
         <w:t xml:space="preserve">ESA </w:t>
       </w:r>
-      <w:hyperlink w:history="1" r:id="rIdjali4dzesbq2rnexdfhgv">
+      <w:hyperlink w:history="1" r:id="rId0ksbemihpk4yu_a-dpb6i">
         <w:r>
           <w:rPr>
             <w:rStyle w:val="Hyperlink"/>
@@ -9161,7 +9161,7 @@
       <w:r>
         <w:t xml:space="preserve">Crepuscular rays are parallel beams made visible by atmospheric scattering. The apparent divergence is a perspective effect. Crucially, anticrepuscular rays converge at the anti-solar point simultaneously. See </w:t>
       </w:r>
-      <w:hyperlink w:history="1" r:id="rId-utybjzgtptfnzhovrtrt">
+      <w:hyperlink w:history="1" r:id="rIdmx9ypen9xwcebzpr4hii_">
         <w:r>
           <w:rPr>
             <w:rStyle w:val="Hyperlink"/>
@@ -9172,7 +9172,7 @@
       <w:r>
         <w:t xml:space="preserve"> and </w:t>
       </w:r>
-      <w:hyperlink w:history="1" r:id="rIdqbnael1wr6hrnif4b_k4e">
+      <w:hyperlink w:history="1" r:id="rIdssrmbvh7pbwjxxoozddca">
         <w:r>
           <w:rPr>
             <w:rStyle w:val="Hyperlink"/>
@@ -9238,7 +9238,7 @@
       <w:r>
         <w:t xml:space="preserve">NOAA officially states no evidence of anomalous disappearances. </w:t>
       </w:r>
-      <w:hyperlink w:history="1" r:id="rIdu5hwsgjfzd75xkqi7rkfd">
+      <w:hyperlink w:history="1" r:id="rIdcze9kxsmybdnqerpufldp">
         <w:r>
           <w:rPr>
             <w:rStyle w:val="Hyperlink"/>
@@ -9304,7 +9304,7 @@
       <w:r>
         <w:t xml:space="preserve">Hipparcos </w:t>
       </w:r>
-      <w:hyperlink w:history="1" r:id="rIdm8_nocndxignw1dm0szaf">
+      <w:hyperlink w:history="1" r:id="rId1n_djauhfkjhiyjctd96q">
         <w:r>
           <w:rPr>
             <w:rStyle w:val="Hyperlink"/>
@@ -9720,7 +9720,7 @@
       <w:r>
         <w:t xml:space="preserve">Terra-Nova et al. (2017, PNAS) demonstrate reversed-flux patches reproduce SAA splitting in MHD simulations. The </w:t>
       </w:r>
-      <w:hyperlink w:history="1" r:id="rId_th8nmnjf_-q8-lxuk9-g">
+      <w:hyperlink w:history="1" r:id="rIdn0ru70efjyu-n7qaqy1xr">
         <w:r>
           <w:rPr>
             <w:rStyle w:val="Hyperlink"/>
@@ -9731,7 +9731,7 @@
       <w:r>
         <w:t xml:space="preserve"> documents the evolution quantitatively. </w:t>
       </w:r>
-      <w:hyperlink w:history="1" r:id="rIdqcc8uxibhcfmzuk6-rlay">
+      <w:hyperlink w:history="1" r:id="rIdvclk7kri-u5qaot0pmwmz">
         <w:r>
           <w:rPr>
             <w:rStyle w:val="Hyperlink"/>
@@ -9782,7 +9782,7 @@
       <w:r>
         <w:t xml:space="preserve">Normal secular variation documented by </w:t>
       </w:r>
-      <w:hyperlink w:history="1" r:id="rId84aikfrl1ojj-ucap-fab">
+      <w:hyperlink w:history="1" r:id="rIdgtav1lvvifydtjf2vw43e">
         <w:r>
           <w:rPr>
             <w:rStyle w:val="Hyperlink"/>
@@ -9849,7 +9849,7 @@
       <w:r>
         <w:t xml:space="preserve">Eclipse-induced perturbations predicted by Chapman (1933) via ionospheric conductivity drops. Data from </w:t>
       </w:r>
-      <w:hyperlink w:history="1" r:id="rIdjmuwteb9qsl1dgffrskvl">
+      <w:hyperlink w:history="1" r:id="rIdvfe__r4k8e1jteaz_vvlx">
         <w:r>
           <w:rPr>
             <w:rStyle w:val="Hyperlink"/>
@@ -9937,7 +9937,7 @@
       <w:r>
         <w:t xml:space="preserve">The formula used is for a quarter-wave linear waveguide, not a spherical cavity. Correct formula f = c/(2*pi*R) gives R = 6,098 km, within 4% of Earth's radius. The ionosphere IS conductive (</w:t>
       </w:r>
-      <w:hyperlink w:history="1" r:id="rId3mjryrfo2ogzhvc1d48-z">
+      <w:hyperlink w:history="1" r:id="rIdc7lrwfbqqe9c8lehdsxll">
         <w:r>
           <w:rPr>
             <w:rStyle w:val="Hyperlink"/>
@@ -10004,7 +10004,7 @@
       <w:r>
         <w:t xml:space="preserve">All five observations already predicted by </w:t>
       </w:r>
-      <w:hyperlink w:history="1" r:id="rIdb7tdenyxj1hv2jknxdbha">
+      <w:hyperlink w:history="1" r:id="rIde0az02zg7urn_qw48doka">
         <w:r>
           <w:rPr>
             <w:rStyle w:val="Hyperlink"/>
@@ -10015,7 +10015,7 @@
       <w:r>
         <w:t xml:space="preserve">, </w:t>
       </w:r>
-      <w:hyperlink w:history="1" r:id="rId47z6acj_nnstbdo_va9b0">
+      <w:hyperlink w:history="1" r:id="rIdj3decnhfav8nwl1igjbdk">
         <w:r>
           <w:rPr>
             <w:rStyle w:val="Hyperlink"/>
@@ -10342,7 +10342,7 @@
       <w:r>
         <w:t xml:space="preserve">Antarctic gravity anomalies are mapped from orbit by </w:t>
       </w:r>
-      <w:hyperlink w:history="1" r:id="rIdvfisyhwpa5qsljbsuye58">
+      <w:hyperlink w:history="1" r:id="rIdlxvgakhzbtjjbi9mzzx8q">
         <w:r>
           <w:rPr>
             <w:rStyle w:val="Hyperlink"/>
@@ -10353,7 +10353,7 @@
       <w:r>
         <w:t xml:space="preserve"> and </w:t>
       </w:r>
-      <w:hyperlink w:history="1" r:id="rIdig02qt0pldxbo1g2twufh">
+      <w:hyperlink w:history="1" r:id="rIdzmcwe7fytzwzkmiif73m_">
         <w:r>
           <w:rPr>
             <w:rStyle w:val="Hyperlink"/>
@@ -13329,7 +13329,7 @@
       <w:r>
         <w:t xml:space="preserve">A </w:t>
       </w:r>
-      <w:hyperlink w:history="1" r:id="rIda4ydnqjcd9qoseaaj308z">
+      <w:hyperlink w:history="1" r:id="rId1rey5pezx1p8lkhzj-vw8">
         <w:r>
           <w:rPr>
             <w:rStyle w:val="Hyperlink"/>
@@ -13340,7 +13340,7 @@
       <w:r>
         <w:t xml:space="preserve"> found detectable decreases in X, Z, and total field components during eclipses. An </w:t>
       </w:r>
-      <w:hyperlink w:history="1" r:id="rIdjo6nbdwkdzztpefpn9-qn">
+      <w:hyperlink w:history="1" r:id="rIds_41t1mifcnr-fmd1eofj">
         <w:r>
           <w:rPr>
             <w:rStyle w:val="Hyperlink"/>
@@ -13845,7 +13845,7 @@
       <w:r>
         <w:t xml:space="preserve">Continuous 24-hour sunlight. A local sun at 5,733 km circling above a flat disc cannot produce 24-hour sunlight at the disc edge. Directly observable at Amundsen-Scott Station, staffed year-round since 1957. See </w:t>
       </w:r>
-      <w:hyperlink w:history="1" r:id="rIduzdid_bzaqfeiozogmsub">
+      <w:hyperlink w:history="1" r:id="rIdifvpnbsiqqqtsy-nmbjl4">
         <w:r>
           <w:rPr>
             <w:rStyle w:val="Hyperlink"/>
@@ -13909,7 +13909,7 @@
       <w:r>
         <w:t xml:space="preserve">GPS provides 1–3 meter accuracy worldwide using 24+ satellites in Keplerian orbits calculated from spherical-Earth gravitational mechanics. The system requires precise relativistic corrections (both special and general) that depend on the satellites' orbital velocity and altitude above a spherical gravitational well. If Earth were a flat disc with different geometry, the signal propagation times, relativistic corrections, and satellite visibility geometry would all be wrong, and the system would not achieve meter-level accuracy. The same applies to every other satellite navigation system (GLONASS, Galileo, BeiDou). The ISS at 408 km is visible on predictable schedules computed from Keplerian orbits. Geostationary satellites at 35,786 km — far above the dome's maximum height — provide continuous coverage. See </w:t>
       </w:r>
-      <w:hyperlink w:history="1" r:id="rIdcw0qnltrqwrcrvcw9fbdi">
+      <w:hyperlink w:history="1" r:id="rIdfpb5gwldtwwgsd6zlpjfn">
         <w:r>
           <w:rPr>
             <w:rStyle w:val="Hyperlink"/>
@@ -13920,7 +13920,7 @@
       <w:r>
         <w:t xml:space="preserve">; </w:t>
       </w:r>
-      <w:hyperlink w:history="1" r:id="rIdnusoqcm0jyssf9-ygseza">
+      <w:hyperlink w:history="1" r:id="rIdhyu81gjp7ydmmix8wzifi">
         <w:r>
           <w:rPr>
             <w:rStyle w:val="Hyperlink"/>
@@ -13969,7 +13969,7 @@
       <w:r>
         <w:t xml:space="preserve">Modern solar calculators (</w:t>
       </w:r>
-      <w:hyperlink w:history="1" r:id="rIduhlom-eknqyqw0hqcmlm8">
+      <w:hyperlink w:history="1" r:id="rIdc3e4tei7lmbyellzx0ihb">
         <w:r>
           <w:rPr>
             <w:rStyle w:val="Hyperlink"/>
@@ -14018,7 +14018,7 @@
       <w:r>
         <w:t xml:space="preserve">The </w:t>
       </w:r>
-      <w:hyperlink w:history="1" r:id="rIdneyows230y5owsytedfm-">
+      <w:hyperlink w:history="1" r:id="rIdy9njq3cvvlnxm4rb8bfgf">
         <w:r>
           <w:rPr>
             <w:rStyle w:val="Hyperlink"/>
@@ -14067,7 +14067,7 @@
       <w:r>
         <w:t xml:space="preserve">Earth's field is a dipole. South magnetic pole at 64.1°S, 135.9°E (</w:t>
       </w:r>
-      <w:hyperlink w:history="1" r:id="rIdevb--2d9nlr5pepwhisq2">
+      <w:hyperlink w:history="1" r:id="rIdseyab2mhuivyccnybaxif">
         <w:r>
           <w:rPr>
             <w:rStyle w:val="Hyperlink"/>
@@ -14116,7 +14116,7 @@
       <w:r>
         <w:t xml:space="preserve">g = 9.780 m/s² at equator, 9.832 m/s² at poles (0.53% variation). On a flat disc, centrifugal force points outward from center, producing the OPPOSITE pattern. See </w:t>
       </w:r>
-      <w:hyperlink w:history="1" r:id="rIdfliz16jw2sdtly3tiyrzv">
+      <w:hyperlink w:history="1" r:id="rIdhdryipz06dzoip3ngxh-y">
         <w:r>
           <w:rPr>
             <w:rStyle w:val="Hyperlink"/>
@@ -15113,7 +15113,7 @@
         </w:rPr>
         <w:t xml:space="preserve">NOAA World Magnetic Model 2025: </w:t>
       </w:r>
-      <w:hyperlink w:history="1" r:id="rId1btr6sfhuvnmfrziukvhy">
+      <w:hyperlink w:history="1" r:id="rIdq1fzked9lq57yizjhy6rt">
         <w:r>
           <w:rPr>
             <w:rStyle w:val="Hyperlink"/>
@@ -15133,7 +15133,7 @@
         </w:rPr>
         <w:t xml:space="preserve">NOAA Wandering Geomagnetic Poles: </w:t>
       </w:r>
-      <w:hyperlink w:history="1" r:id="rIdp07mbody-ofeiewy_yyzu">
+      <w:hyperlink w:history="1" r:id="rIdp6qp6qetop5oglyhncjjr">
         <w:r>
           <w:rPr>
             <w:rStyle w:val="Hyperlink"/>
@@ -15153,7 +15153,7 @@
         </w:rPr>
         <w:t xml:space="preserve">CHAOS-7 Geomagnetic Field Model: </w:t>
       </w:r>
-      <w:hyperlink w:history="1" r:id="rId3pgtuz2b-4ubzgrd0ibbk">
+      <w:hyperlink w:history="1" r:id="rIdi7zaptd6jt1p-89zdxb4u">
         <w:r>
           <w:rPr>
             <w:rStyle w:val="Hyperlink"/>
@@ -15173,7 +15173,7 @@
         </w:rPr>
         <w:t xml:space="preserve">ESA Swarm Satellite Mission: </w:t>
       </w:r>
-      <w:hyperlink w:history="1" r:id="rId2okylq3ext8ik2uangtkp">
+      <w:hyperlink w:history="1" r:id="rId4zfizyrdkxoirf8y3uysz">
         <w:r>
           <w:rPr>
             <w:rStyle w:val="Hyperlink"/>
@@ -15193,7 +15193,7 @@
         </w:rPr>
         <w:t xml:space="preserve">INTERMAGNET Observatory Network: </w:t>
       </w:r>
-      <w:hyperlink w:history="1" r:id="rIdajunbuqwfg_llyqqlnxxp">
+      <w:hyperlink w:history="1" r:id="rId9-8igb5kuy6fweerhtzpe">
         <w:r>
           <w:rPr>
             <w:rStyle w:val="Hyperlink"/>
@@ -15213,7 +15213,7 @@
         </w:rPr>
         <w:t xml:space="preserve">IGRF-13: </w:t>
       </w:r>
-      <w:hyperlink w:history="1" r:id="rIdmozsynxyfwt2djceasr-d">
+      <w:hyperlink w:history="1" r:id="rIdz_ukkepz5hivvbyir8g3u">
         <w:r>
           <w:rPr>
             <w:rStyle w:val="Hyperlink"/>
@@ -15233,7 +15233,7 @@
         </w:rPr>
         <w:t xml:space="preserve">ESA Gaia Data Release 3: </w:t>
       </w:r>
-      <w:hyperlink w:history="1" r:id="rIdzoul9brsq7ulzxjpkucv0">
+      <w:hyperlink w:history="1" r:id="rIdjw0njsbrpjopivgixdlkb">
         <w:r>
           <w:rPr>
             <w:rStyle w:val="Hyperlink"/>
@@ -15253,7 +15253,7 @@
         </w:rPr>
         <w:t xml:space="preserve">Hipparcos Catalogue: </w:t>
       </w:r>
-      <w:hyperlink w:history="1" r:id="rIdfr4mcb26r8sxglaf8u219">
+      <w:hyperlink w:history="1" r:id="rId5g74k0tuypks7nxnsxoh1">
         <w:r>
           <w:rPr>
             <w:rStyle w:val="Hyperlink"/>
@@ -15273,7 +15273,7 @@
         </w:rPr>
         <w:t xml:space="preserve">US Patent 787412 (Tesla): </w:t>
       </w:r>
-      <w:hyperlink w:history="1" r:id="rIdb5nk7ii3pqhufea8wzyld">
+      <w:hyperlink w:history="1" r:id="rId2hsgsis6zrklzgdcxtdvn">
         <w:r>
           <w:rPr>
             <w:rStyle w:val="Hyperlink"/>
@@ -15293,7 +15293,7 @@
         </w:rPr>
         <w:t xml:space="preserve">NOAA Solar Position Algorithm: </w:t>
       </w:r>
-      <w:hyperlink w:history="1" r:id="rIdoyksh5kugavlwkl3qrrlt">
+      <w:hyperlink w:history="1" r:id="rIdmekuxoemzvje8udrnvmu8">
         <w:r>
           <w:rPr>
             <w:rStyle w:val="Hyperlink"/>
@@ -15313,7 +15313,7 @@
         </w:rPr>
         <w:t xml:space="preserve">National Geodetic Survey Gravity: </w:t>
       </w:r>
-      <w:hyperlink w:history="1" r:id="rIdxrtjv3ljkk5chi3qtrgu6">
+      <w:hyperlink w:history="1" r:id="rIdgzrjqgfztcazoomxix2lr">
         <w:r>
           <w:rPr>
             <w:rStyle w:val="Hyperlink"/>
@@ -15333,7 +15333,7 @@
         </w:rPr>
         <w:t xml:space="preserve">CHIME/FRB Project: </w:t>
       </w:r>
-      <w:hyperlink w:history="1" r:id="rIdxg3rzu9bry1jiiivayqtw">
+      <w:hyperlink w:history="1" r:id="rIdwgejona6fvrpc02bk_qtx">
         <w:r>
           <w:rPr>
             <w:rStyle w:val="Hyperlink"/>
@@ -15353,7 +15353,7 @@
         </w:rPr>
         <w:t xml:space="preserve">GRACE-FO (gravity mapping): </w:t>
       </w:r>
-      <w:hyperlink w:history="1" r:id="rIdagctlymrpooapm3z4urxk">
+      <w:hyperlink w:history="1" r:id="rIdgpnz6vmu_wi-ugjytqtn9">
         <w:r>
           <w:rPr>
             <w:rStyle w:val="Hyperlink"/>
@@ -15373,7 +15373,7 @@
         </w:rPr>
         <w:t xml:space="preserve">GOCE (gravity field): </w:t>
       </w:r>
-      <w:hyperlink w:history="1" r:id="rIdfwgchggnp-okraifncowa">
+      <w:hyperlink w:history="1" r:id="rIdc9yfokdt3hxyadt0fnjmo">
         <w:r>
           <w:rPr>
             <w:rStyle w:val="Hyperlink"/>
@@ -15393,7 +15393,7 @@
         </w:rPr>
         <w:t xml:space="preserve">GPS.gov: </w:t>
       </w:r>
-      <w:hyperlink w:history="1" r:id="rId4bz0k85_snns_lhz0t1rr">
+      <w:hyperlink w:history="1" r:id="rId4xverkm_gooqnhivzdkrw">
         <w:r>
           <w:rPr>
             <w:rStyle w:val="Hyperlink"/>
@@ -15413,7 +15413,7 @@
         </w:rPr>
         <w:t xml:space="preserve">CelesTrak TLE Data: </w:t>
       </w:r>
-      <w:hyperlink w:history="1" r:id="rIdspalhyn2o1fg8t8vjf9xh">
+      <w:hyperlink w:history="1" r:id="rIdzdtbfl2c0wjyn0s07b0h0">
         <w:r>
           <w:rPr>
             <w:rStyle w:val="Hyperlink"/>

</xml_diff>

<commit_message>
Park Dielectric infographic section (3.6) — content preserved in source
Section 3.6 (GRACE L1A / EM-gravity / 5 Decisive Points analysis) is
commented out in both generate-html.js (HTML comment) and build-doc-v4.js
(JS block comment). The content remains in the source files for future
reinstatement. Also removed "Dielectric infographic" from the intro
paragraph listing V51.0 new pages.

Co-Authored-By: Claude Opus 4.6 <noreply@anthropic.com>
</commit_message>
<xml_diff>
--- a/downloads/critical-review-dome-model-v4.docx
+++ b/downloads/critical-review-dome-model-v4.docx
@@ -8889,7 +8889,7 @@
       <w:r>
         <w:t xml:space="preserve">US Patent 787412 (1905), publicly available at </w:t>
       </w:r>
-      <w:hyperlink w:history="1" r:id="rIdf13lmew1sd_afdtpeewkp">
+      <w:hyperlink w:history="1" r:id="rIde4nml7ely6h2aiawjklr1">
         <w:r>
           <w:rPr>
             <w:rStyle w:val="Hyperlink"/>
@@ -9029,7 +9029,7 @@
       <w:r>
         <w:t xml:space="preserve">James Bradley (1727) explicitly tested and rejected atmospheric refraction as an explanation: refraction is wavelength-dependent (chromatic), while stellar aberration is achromatic. Modern VLBI measurements achieve milliarcsecond precision and directly confirm aberration correlates with Earth's orbital velocity (~30 km/s). The </w:t>
       </w:r>
-      <w:hyperlink w:history="1" r:id="rIddbrhshypodg_5lyw3ffeq">
+      <w:hyperlink w:history="1" r:id="rIdd2yqmg5a4dihmbfew73au">
         <w:r>
           <w:rPr>
             <w:rStyle w:val="Hyperlink"/>
@@ -9095,7 +9095,7 @@
       <w:r>
         <w:t xml:space="preserve">ESA </w:t>
       </w:r>
-      <w:hyperlink w:history="1" r:id="rIdiquhslxqiofbqe6iljror">
+      <w:hyperlink w:history="1" r:id="rIdsexsflahryjrfghqldizh">
         <w:r>
           <w:rPr>
             <w:rStyle w:val="Hyperlink"/>
@@ -9161,7 +9161,7 @@
       <w:r>
         <w:t xml:space="preserve">Crepuscular rays are parallel beams made visible by atmospheric scattering. The apparent divergence is a perspective effect. Crucially, anticrepuscular rays converge at the anti-solar point simultaneously. See </w:t>
       </w:r>
-      <w:hyperlink w:history="1" r:id="rIdacnfh7gvpf3natgu35sld">
+      <w:hyperlink w:history="1" r:id="rIdurfd7maocnoncj_lb2vhn">
         <w:r>
           <w:rPr>
             <w:rStyle w:val="Hyperlink"/>
@@ -9172,7 +9172,7 @@
       <w:r>
         <w:t xml:space="preserve"> and </w:t>
       </w:r>
-      <w:hyperlink w:history="1" r:id="rIdzvharaxdzpmf4ikkww8u_">
+      <w:hyperlink w:history="1" r:id="rIdbthdhhp1g1pstlef8ofyr">
         <w:r>
           <w:rPr>
             <w:rStyle w:val="Hyperlink"/>
@@ -9238,7 +9238,7 @@
       <w:r>
         <w:t xml:space="preserve">NOAA officially states no evidence of anomalous disappearances. </w:t>
       </w:r>
-      <w:hyperlink w:history="1" r:id="rIdzvxldhrhveg0qtd_rmhb_">
+      <w:hyperlink w:history="1" r:id="rIdchocteyoqyqap801a4b33">
         <w:r>
           <w:rPr>
             <w:rStyle w:val="Hyperlink"/>
@@ -9304,7 +9304,7 @@
       <w:r>
         <w:t xml:space="preserve">Hipparcos </w:t>
       </w:r>
-      <w:hyperlink w:history="1" r:id="rIdxwbabf_dihtnlbdrgys2f">
+      <w:hyperlink w:history="1" r:id="rIdf_h2-trl6bvjykbiqxbgy">
         <w:r>
           <w:rPr>
             <w:rStyle w:val="Hyperlink"/>
@@ -9720,7 +9720,7 @@
       <w:r>
         <w:t xml:space="preserve">Terra-Nova et al. (2017, PNAS) demonstrate reversed-flux patches reproduce SAA splitting in MHD simulations. The </w:t>
       </w:r>
-      <w:hyperlink w:history="1" r:id="rIda6htizumq4_lmygc718qp">
+      <w:hyperlink w:history="1" r:id="rIdb68qsswgopu_cvzjipd9m">
         <w:r>
           <w:rPr>
             <w:rStyle w:val="Hyperlink"/>
@@ -9731,7 +9731,7 @@
       <w:r>
         <w:t xml:space="preserve"> documents the evolution quantitatively. </w:t>
       </w:r>
-      <w:hyperlink w:history="1" r:id="rIds5ow1tgw2knd1g2-90vax">
+      <w:hyperlink w:history="1" r:id="rIdu6bthcx72ujifm-om-q81">
         <w:r>
           <w:rPr>
             <w:rStyle w:val="Hyperlink"/>
@@ -9782,7 +9782,7 @@
       <w:r>
         <w:t xml:space="preserve">Normal secular variation documented by </w:t>
       </w:r>
-      <w:hyperlink w:history="1" r:id="rId6vq_jl-ktivpc1icfi2pb">
+      <w:hyperlink w:history="1" r:id="rIdh0jj3jca6aigz6v7izdkl">
         <w:r>
           <w:rPr>
             <w:rStyle w:val="Hyperlink"/>
@@ -9849,7 +9849,7 @@
       <w:r>
         <w:t xml:space="preserve">Eclipse-induced perturbations predicted by Chapman (1933) via ionospheric conductivity drops. Data from </w:t>
       </w:r>
-      <w:hyperlink w:history="1" r:id="rIdt1blh5qjsyiltzey1ordu">
+      <w:hyperlink w:history="1" r:id="rIdgoh3vmx4rpizczfq3i79t">
         <w:r>
           <w:rPr>
             <w:rStyle w:val="Hyperlink"/>
@@ -9937,7 +9937,7 @@
       <w:r>
         <w:t xml:space="preserve">The formula used is for a quarter-wave linear waveguide, not a spherical cavity. Correct formula f = c/(2*pi*R) gives R = 6,098 km, within 4% of Earth's radius. The ionosphere IS conductive (</w:t>
       </w:r>
-      <w:hyperlink w:history="1" r:id="rIdjiuzwoiujusvanq2ujlqn">
+      <w:hyperlink w:history="1" r:id="rIdh2xo8zd6rsv-25jmjcfsi">
         <w:r>
           <w:rPr>
             <w:rStyle w:val="Hyperlink"/>
@@ -10004,7 +10004,7 @@
       <w:r>
         <w:t xml:space="preserve">All five observations already predicted by </w:t>
       </w:r>
-      <w:hyperlink w:history="1" r:id="rIdwh-baga2h4uyhj8a3xqim">
+      <w:hyperlink w:history="1" r:id="rIdip9yzawrnd9uk8hsfrmrm">
         <w:r>
           <w:rPr>
             <w:rStyle w:val="Hyperlink"/>
@@ -10015,7 +10015,7 @@
       <w:r>
         <w:t xml:space="preserve">, </w:t>
       </w:r>
-      <w:hyperlink w:history="1" r:id="rIdd2o3hm1d8_uujd1nmzltb">
+      <w:hyperlink w:history="1" r:id="rId0ndidpa0gifwfpzgoszx3">
         <w:r>
           <w:rPr>
             <w:rStyle w:val="Hyperlink"/>
@@ -10342,7 +10342,7 @@
       <w:r>
         <w:t xml:space="preserve">Antarctic gravity anomalies are mapped from orbit by </w:t>
       </w:r>
-      <w:hyperlink w:history="1" r:id="rIdozqdepte4lhemevb_nzg0">
+      <w:hyperlink w:history="1" r:id="rIddubs1_5huiso04triiwv3">
         <w:r>
           <w:rPr>
             <w:rStyle w:val="Hyperlink"/>
@@ -10353,7 +10353,7 @@
       <w:r>
         <w:t xml:space="preserve"> and </w:t>
       </w:r>
-      <w:hyperlink w:history="1" r:id="rIdxaezb_z2mtcn-wrktkhak">
+      <w:hyperlink w:history="1" r:id="rIdyb_fa2umx-3nv-x4kvzwg">
         <w:r>
           <w:rPr>
             <w:rStyle w:val="Hyperlink"/>
@@ -13329,7 +13329,7 @@
       <w:r>
         <w:t xml:space="preserve">A </w:t>
       </w:r>
-      <w:hyperlink w:history="1" r:id="rIdzj9khsaeylms9txkkb38o">
+      <w:hyperlink w:history="1" r:id="rIdtanxrkxwgq-k1jmmxvf_i">
         <w:r>
           <w:rPr>
             <w:rStyle w:val="Hyperlink"/>
@@ -13340,7 +13340,7 @@
       <w:r>
         <w:t xml:space="preserve"> found detectable decreases in X, Z, and total field components during eclipses. An </w:t>
       </w:r>
-      <w:hyperlink w:history="1" r:id="rId7g5itqpakzuamy19ijb6z">
+      <w:hyperlink w:history="1" r:id="rIdfb02fmhmq4vskzvvwlzgz">
         <w:r>
           <w:rPr>
             <w:rStyle w:val="Hyperlink"/>
@@ -13630,129 +13630,71 @@
     </w:p>
     <w:p>
       <w:pPr>
+        <w:pStyle w:val="Heading1"/>
+      </w:pPr>
+      <w:r>
+        <w:t xml:space="preserve">Part 4: How to Falsify the Dome/Ovoid Model</w:t>
+      </w:r>
+    </w:p>
+    <w:p>
+      <w:pPr>
+        <w:spacing w:after="120"/>
+      </w:pPr>
+      <w:r>
+        <w:t xml:space="preserve">If the model is a genuine physical model, it must make predictions that differ from the globe model. Below are ten categories of concrete, repeatable measurements that are incompatible with an elliptical flat disc topped by a copper dome.</w:t>
+      </w:r>
+    </w:p>
+    <w:p>
+      <w:pPr>
         <w:pStyle w:val="Heading2"/>
       </w:pPr>
       <w:r>
-        <w:t xml:space="preserve">3.6 The 'Dielectric' Infographic: GRACE L1A and the Shielding Anomaly</w:t>
-      </w:r>
-    </w:p>
-    <w:p>
-      <w:pPr>
-        <w:spacing w:after="120"/>
-      </w:pPr>
-      <w:r>
-        <w:t xml:space="preserve">The author has published promotional infographics claiming '5 Decisive Points That Mainstream Can't Answer.' Each point is addressed below.</w:t>
-      </w:r>
-    </w:p>
-    <w:p>
-      <w:pPr>
-        <w:spacing w:after="120"/>
-      </w:pPr>
-      <w:r>
-        <w:rPr>
-          <w:b/>
-          <w:bCs/>
-        </w:rPr>
-        <w:t xml:space="preserve">1. The Shielding Anomaly (Strasbourg 2003): </w:t>
-      </w:r>
-      <w:r>
-        <w:t xml:space="preserve">Superconducting gravimeters (SGs) do show residuals during extreme geomagnetic storms. This is well-documented. However, the explanation is twofold: (a) no magnetic shielding is perfect — even multi-layer Mumetal + copper cannot fully attenuate a &gt;500 nT storm at the SQUID's femtotesla sensitivity, and (b) real mass redistributions occur during storms (atmospheric pressure changes, ocean loading) that produce genuine µGal-level gravity signals. The Global Geodynamics Project network accounts for both effects. This does not 'falsify instrument noise' — it is a known instrumental limitation during extreme events, which is precisely why those periods are flagged in the data.</w:t>
-      </w:r>
-    </w:p>
-    <w:p>
-      <w:pPr>
-        <w:spacing w:after="120"/>
-      </w:pPr>
-      <w:r>
-        <w:rPr>
-          <w:b/>
-          <w:bCs/>
-        </w:rPr>
-        <w:t xml:space="preserve">2. The Kappa (κ) Ratio (GRACE ACC1A, Oct 2003): </w:t>
-      </w:r>
-      <w:r>
-        <w:t xml:space="preserve">GRACE's L1A accelerometer data does show spikes during the Halloween storm. But GRACE measures non-gravitational forces acting on the satellite — primarily atmospheric drag. During a major geomagnetic storm, the thermosphere heats and expands dramatically (neutral density can increase 5-10× at GRACE altitude ~500 km). The '1.67 nT/µGal coupling' is the ratio between storm magnetic intensity and the drag perturbation: bigger storm → more thermospheric heating → more drag → bigger accelerometer spike. This is the atmosphere responding to magnetism, not gravity responding to magnetism.</w:t>
-      </w:r>
-    </w:p>
-    <w:p>
-      <w:pPr>
-        <w:spacing w:after="120"/>
-      </w:pPr>
-      <w:r>
-        <w:rPr>
-          <w:b/>
-          <w:bCs/>
-        </w:rPr>
-        <w:t xml:space="preserve">3. 'Curve-Fit Deception' (L1A vs L1B): </w:t>
-      </w:r>
-      <w:r>
-        <w:t xml:space="preserve">The L1A → L1B processing pipeline for GRACE is fully documented in JPL D-22027 (GRACE Data Product Handbook). L1B applies calibration factors, removes known non-gravitational accelerations (solar radiation pressure, thruster firings, atmospheric drag), and applies instrument-specific corrections. The author frames this as 'NASA masking the raw truth.' In reality, it is standard signal processing: removing known noise sources to isolate the gravitational signal. The L1A 'spikes' during a Halloween-class storm are expected instrument perturbations from electromagnetic interference and drag, not gravitational signals. NASA did not make L1A 'computationally expensive to find' — it is in raw binary format because it is raw satellite telemetry, publicly available at podaac.jpl.nasa.gov.</w:t>
-      </w:r>
-    </w:p>
-    <w:p>
-      <w:pPr>
-        <w:spacing w:after="120"/>
-      </w:pPr>
-      <w:r>
-        <w:rPr>
-          <w:b/>
-          <w:bCs/>
-        </w:rPr>
-        <w:t xml:space="preserve">4. The Void Mechanism: </w:t>
-      </w:r>
-      <w:r>
-        <w:t xml:space="preserve">The claim that cosmic voids are 'low-pressure Aetheric cells' pushing galaxies toward walls is pure assertion with no mathematical framework. Cosmic voids and the galaxy filament structure are well-modeled by N-body ΛCDM simulations (Millennium, IllustrisTNG, EAGLE). The aetheric pressure concept has no equation of state, no coupling constant, and no prediction that differs from standard structure formation.</w:t>
-      </w:r>
-    </w:p>
-    <w:p>
-      <w:pPr>
-        <w:spacing w:after="120"/>
-      </w:pPr>
-      <w:r>
-        <w:rPr>
-          <w:b/>
-          <w:bCs/>
-        </w:rPr>
-        <w:t xml:space="preserve">5. WIN-012 Published Template (ΔAIC &gt; 100): </w:t>
-      </w:r>
-      <w:r>
-        <w:t xml:space="preserve">A ΔAIC &gt; 100 means one model fits the data better than another by a large margin. But AIC penalizes by number of parameters — it does not validate the physical interpretation. If you fit a model with a free coupling parameter to data that contains correlated electromagnetic interference (which the Halloween 2003 storm data does), the fit will be excellent. The question is whether the coupling is physical (gravity responds to magnetism) or instrumental (the accelerometer responds to electromagnetic drag). Every independent test (Membach SG: 0.0 µGal, China SG network: 0.0 µGal, CUORE Faraday attenuation: as expected) points to the instrumental explanation.</w:t>
-      </w:r>
-    </w:p>
-    <w:p>
-      <w:pPr>
-        <w:spacing w:after="120"/>
-      </w:pPr>
-      <w:r>
-        <w:rPr>
-          <w:b/>
-          <w:bCs/>
-        </w:rPr>
-        <w:t xml:space="preserve">Rhetorical strategy: </w:t>
-      </w:r>
-      <w:r>
-        <w:t xml:space="preserve">The infographic follows the same pattern catalogued throughout this review: name real datasets, isolate real anomalies, provide a real-sounding ratio, then assert a non-standard interpretation while framing the standard explanation as a cover-up. The 'Reprocess the Archives' call-to-action invites the audience to feel like independent investigators rather than consumers of a predetermined narrative. The 'THE AUDIT IS PUBLIC' tagline mirrors the site's audit walkthrough: it creates the appearance of transparency while guiding the reader through selectively presented evidence to a predetermined conclusion.</w:t>
-      </w:r>
-    </w:p>
-    <w:p>
-      <w:r>
-        <w:br w:type="page"/>
-      </w:r>
-    </w:p>
-    <w:p>
-      <w:pPr>
-        <w:pStyle w:val="Heading1"/>
-      </w:pPr>
-      <w:r>
-        <w:t xml:space="preserve">Part 4: How to Falsify the Dome/Ovoid Model</w:t>
-      </w:r>
-    </w:p>
-    <w:p>
-      <w:pPr>
-        <w:spacing w:after="120"/>
-      </w:pPr>
-      <w:r>
-        <w:t xml:space="preserve">If the model is a genuine physical model, it must make predictions that differ from the globe model. Below are ten categories of concrete, repeatable measurements that are incompatible with an elliptical flat disc topped by a copper dome.</w:t>
+        <w:t xml:space="preserve">4.1 Southern Hemisphere Distances</w:t>
+      </w:r>
+    </w:p>
+    <w:p>
+      <w:pPr>
+        <w:spacing w:after="120"/>
+      </w:pPr>
+      <w:r>
+        <w:rPr>
+          <w:b/>
+          <w:bCs/>
+        </w:rPr>
+        <w:t xml:space="preserve">The test: </w:t>
+      </w:r>
+      <w:r>
+        <w:t xml:space="preserve">Measure actual travel times between southern-hemisphere city pairs and compare against dome-model predictions.</w:t>
+      </w:r>
+    </w:p>
+    <w:p>
+      <w:pPr>
+        <w:spacing w:after="120"/>
+      </w:pPr>
+      <w:r>
+        <w:rPr>
+          <w:b/>
+          <w:bCs/>
+        </w:rPr>
+        <w:t xml:space="preserve">What the data shows: </w:t>
+      </w:r>
+      <w:r>
+        <w:t xml:space="preserve">Sydney to Santiago: 11,400-11,900 km (12-13.75 hours nonstop). Johannesburg to Perth: 8,308 km (10h 20m). Auckland to Buenos Aires: 10,460 km (~12 hours). Actual flight times match great-circle distances on a sphere with sub-1% accuracy. The dome model's own quadratic law achieves only R-squared 0.79. The V13 coordinate system's 6.2% RMSE for cross-equatorial routes is 12× worse than globe geodesy.</w:t>
+      </w:r>
+    </w:p>
+    <w:p>
+      <w:pPr>
+        <w:spacing w:after="120"/>
+      </w:pPr>
+      <w:r>
+        <w:rPr>
+          <w:b/>
+          <w:bCs/>
+        </w:rPr>
+        <w:t xml:space="preserve">The model's own admission: </w:t>
+      </w:r>
+      <w:r>
+        <w:t xml:space="preserve">The ECM model page reports Southern Hemisphere distance errors of 32–73%. Sydney–Buenos Aires is off by 73%. This is not a calibration issue — it means the model cannot reproduce the actual measured distances between major cities that millions of people fly between every day. A model claiming to describe Earth's geometry but getting Sydney-to-Buenos-Aires wrong by 73% has a fundamental problem that no amount of geomagnetic curve-fitting can paper over. Globe geodesy (Vincenty, 1975) achieves &lt;0.5% on all routes globally.</w:t>
       </w:r>
     </w:p>
     <w:p>
@@ -13760,22 +13702,22 @@
         <w:pStyle w:val="Heading2"/>
       </w:pPr>
       <w:r>
-        <w:t xml:space="preserve">4.1 Southern Hemisphere Distances</w:t>
-      </w:r>
-    </w:p>
-    <w:p>
-      <w:pPr>
-        <w:spacing w:after="120"/>
-      </w:pPr>
-      <w:r>
-        <w:rPr>
-          <w:b/>
-          <w:bCs/>
-        </w:rPr>
-        <w:t xml:space="preserve">The test: </w:t>
-      </w:r>
-      <w:r>
-        <w:t xml:space="preserve">Measure actual travel times between southern-hemisphere city pairs and compare against dome-model predictions.</w:t>
+        <w:t xml:space="preserve">4.2 Antarctic Observations</w:t>
+      </w:r>
+    </w:p>
+    <w:p>
+      <w:pPr>
+        <w:spacing w:after="120"/>
+      </w:pPr>
+      <w:r>
+        <w:rPr>
+          <w:b/>
+          <w:bCs/>
+        </w:rPr>
+        <w:t xml:space="preserve">Test A — Sunlight: </w:t>
+      </w:r>
+      <w:r>
+        <w:t xml:space="preserve">Observe the Sun from the South Pole during austral summer.</w:t>
       </w:r>
     </w:p>
     <w:p>
@@ -13790,62 +13732,9 @@
         <w:t xml:space="preserve">What the data shows: </w:t>
       </w:r>
       <w:r>
-        <w:t xml:space="preserve">Sydney to Santiago: 11,400-11,900 km (12-13.75 hours nonstop). Johannesburg to Perth: 8,308 km (10h 20m). Auckland to Buenos Aires: 10,460 km (~12 hours). Actual flight times match great-circle distances on a sphere with sub-1% accuracy. The dome model's own quadratic law achieves only R-squared 0.79. The V13 coordinate system's 6.2% RMSE for cross-equatorial routes is 12× worse than globe geodesy.</w:t>
-      </w:r>
-    </w:p>
-    <w:p>
-      <w:pPr>
-        <w:spacing w:after="120"/>
-      </w:pPr>
-      <w:r>
-        <w:rPr>
-          <w:b/>
-          <w:bCs/>
-        </w:rPr>
-        <w:t xml:space="preserve">The model's own admission: </w:t>
-      </w:r>
-      <w:r>
-        <w:t xml:space="preserve">The ECM model page reports Southern Hemisphere distance errors of 32–73%. Sydney–Buenos Aires is off by 73%. This is not a calibration issue — it means the model cannot reproduce the actual measured distances between major cities that millions of people fly between every day. A model claiming to describe Earth's geometry but getting Sydney-to-Buenos-Aires wrong by 73% has a fundamental problem that no amount of geomagnetic curve-fitting can paper over. Globe geodesy (Vincenty, 1975) achieves &lt;0.5% on all routes globally.</w:t>
-      </w:r>
-    </w:p>
-    <w:p>
-      <w:pPr>
-        <w:pStyle w:val="Heading2"/>
-      </w:pPr>
-      <w:r>
-        <w:t xml:space="preserve">4.2 Antarctic Observations</w:t>
-      </w:r>
-    </w:p>
-    <w:p>
-      <w:pPr>
-        <w:spacing w:after="120"/>
-      </w:pPr>
-      <w:r>
-        <w:rPr>
-          <w:b/>
-          <w:bCs/>
-        </w:rPr>
-        <w:t xml:space="preserve">Test A — Sunlight: </w:t>
-      </w:r>
-      <w:r>
-        <w:t xml:space="preserve">Observe the Sun from the South Pole during austral summer.</w:t>
-      </w:r>
-    </w:p>
-    <w:p>
-      <w:pPr>
-        <w:spacing w:after="120"/>
-      </w:pPr>
-      <w:r>
-        <w:rPr>
-          <w:b/>
-          <w:bCs/>
-        </w:rPr>
-        <w:t xml:space="preserve">What the data shows: </w:t>
-      </w:r>
-      <w:r>
         <w:t xml:space="preserve">Continuous 24-hour sunlight. A local sun at 5,733 km circling above a flat disc cannot produce 24-hour sunlight at the disc edge. Directly observable at Amundsen-Scott Station, staffed year-round since 1957. See </w:t>
       </w:r>
-      <w:hyperlink w:history="1" r:id="rIdyleyg1pc5nr4_-luvte3t">
+      <w:hyperlink w:history="1" r:id="rIdvof8rzzolijyqpg0ntzbq">
         <w:r>
           <w:rPr>
             <w:rStyle w:val="Hyperlink"/>
@@ -13909,7 +13798,7 @@
       <w:r>
         <w:t xml:space="preserve">GPS provides 1–3 meter accuracy worldwide using 24+ satellites in Keplerian orbits calculated from spherical-Earth gravitational mechanics. The system requires precise relativistic corrections (both special and general) that depend on the satellites' orbital velocity and altitude above a spherical gravitational well. If Earth were a flat disc with different geometry, the signal propagation times, relativistic corrections, and satellite visibility geometry would all be wrong, and the system would not achieve meter-level accuracy. The same applies to every other satellite navigation system (GLONASS, Galileo, BeiDou). The ISS at 408 km is visible on predictable schedules computed from Keplerian orbits. Geostationary satellites at 35,786 km — far above the dome's maximum height — provide continuous coverage. See </w:t>
       </w:r>
-      <w:hyperlink w:history="1" r:id="rIdu6mviiqn3asa0ou7wqdjh">
+      <w:hyperlink w:history="1" r:id="rIdlb8ujcesemcqiuqj9e58y">
         <w:r>
           <w:rPr>
             <w:rStyle w:val="Hyperlink"/>
@@ -13920,7 +13809,7 @@
       <w:r>
         <w:t xml:space="preserve">; </w:t>
       </w:r>
-      <w:hyperlink w:history="1" r:id="rIdauwucuvntbpoc7deo_rpi">
+      <w:hyperlink w:history="1" r:id="rIdqz-amo3-aotrlhb7zl-bk">
         <w:r>
           <w:rPr>
             <w:rStyle w:val="Hyperlink"/>
@@ -13969,7 +13858,7 @@
       <w:r>
         <w:t xml:space="preserve">Modern solar calculators (</w:t>
       </w:r>
-      <w:hyperlink w:history="1" r:id="rId6j4l6lm_djeqctvk_gziy">
+      <w:hyperlink w:history="1" r:id="rIdckm-blvruskcfc8ca-ix1">
         <w:r>
           <w:rPr>
             <w:rStyle w:val="Hyperlink"/>
@@ -14018,7 +13907,7 @@
       <w:r>
         <w:t xml:space="preserve">The </w:t>
       </w:r>
-      <w:hyperlink w:history="1" r:id="rIdrlkih6fghcfxtanpjfgth">
+      <w:hyperlink w:history="1" r:id="rIdxstfn3snue_g-pgc3_tm0">
         <w:r>
           <w:rPr>
             <w:rStyle w:val="Hyperlink"/>
@@ -14067,7 +13956,7 @@
       <w:r>
         <w:t xml:space="preserve">Earth's field is a dipole. South magnetic pole at 64.1°S, 135.9°E (</w:t>
       </w:r>
-      <w:hyperlink w:history="1" r:id="rIdjefaf2ndvr7umpnufsayx">
+      <w:hyperlink w:history="1" r:id="rIdhu4bxwblibhbzpv0ahl2c">
         <w:r>
           <w:rPr>
             <w:rStyle w:val="Hyperlink"/>
@@ -14116,7 +14005,7 @@
       <w:r>
         <w:t xml:space="preserve">g = 9.780 m/s² at equator, 9.832 m/s² at poles (0.53% variation). On a flat disc, centrifugal force points outward from center, producing the OPPOSITE pattern. See </w:t>
       </w:r>
-      <w:hyperlink w:history="1" r:id="rId7hcnbl_unxffwpop_crkd">
+      <w:hyperlink w:history="1" r:id="rIdd1jytitr_vyixpyhi0chy">
         <w:r>
           <w:rPr>
             <w:rStyle w:val="Hyperlink"/>
@@ -15113,7 +15002,7 @@
         </w:rPr>
         <w:t xml:space="preserve">NOAA World Magnetic Model 2025: </w:t>
       </w:r>
-      <w:hyperlink w:history="1" r:id="rIdk4t8kznijylqtqfcwzkna">
+      <w:hyperlink w:history="1" r:id="rIdtjdyvjbd2-coxfg34zrkp">
         <w:r>
           <w:rPr>
             <w:rStyle w:val="Hyperlink"/>
@@ -15133,7 +15022,7 @@
         </w:rPr>
         <w:t xml:space="preserve">NOAA Wandering Geomagnetic Poles: </w:t>
       </w:r>
-      <w:hyperlink w:history="1" r:id="rIdvdjje1uzxv5yp5l8ytksa">
+      <w:hyperlink w:history="1" r:id="rIdaxrzoa1viednacuokieh3">
         <w:r>
           <w:rPr>
             <w:rStyle w:val="Hyperlink"/>
@@ -15153,7 +15042,7 @@
         </w:rPr>
         <w:t xml:space="preserve">CHAOS-7 Geomagnetic Field Model: </w:t>
       </w:r>
-      <w:hyperlink w:history="1" r:id="rId5x9yb0oj8futaha9gbxju">
+      <w:hyperlink w:history="1" r:id="rIdodbwi7z9xwjptiq2bkm9x">
         <w:r>
           <w:rPr>
             <w:rStyle w:val="Hyperlink"/>
@@ -15173,7 +15062,7 @@
         </w:rPr>
         <w:t xml:space="preserve">ESA Swarm Satellite Mission: </w:t>
       </w:r>
-      <w:hyperlink w:history="1" r:id="rIdwrgzkq5taaeisj15vwg5p">
+      <w:hyperlink w:history="1" r:id="rIdcnxrt2a4cgiijw9uqil8j">
         <w:r>
           <w:rPr>
             <w:rStyle w:val="Hyperlink"/>
@@ -15193,7 +15082,7 @@
         </w:rPr>
         <w:t xml:space="preserve">INTERMAGNET Observatory Network: </w:t>
       </w:r>
-      <w:hyperlink w:history="1" r:id="rIdktys8ng82n2oojeghtsqy">
+      <w:hyperlink w:history="1" r:id="rIdd2okrbfepsfamll0oofvl">
         <w:r>
           <w:rPr>
             <w:rStyle w:val="Hyperlink"/>
@@ -15213,7 +15102,7 @@
         </w:rPr>
         <w:t xml:space="preserve">IGRF-13: </w:t>
       </w:r>
-      <w:hyperlink w:history="1" r:id="rId3-lptkqd9llpz7gfswaln">
+      <w:hyperlink w:history="1" r:id="rIdaepdqnzboytqt-kbnzjsh">
         <w:r>
           <w:rPr>
             <w:rStyle w:val="Hyperlink"/>
@@ -15233,7 +15122,7 @@
         </w:rPr>
         <w:t xml:space="preserve">ESA Gaia Data Release 3: </w:t>
       </w:r>
-      <w:hyperlink w:history="1" r:id="rId--4m7xzij7rdjocqscv7g">
+      <w:hyperlink w:history="1" r:id="rIdphvxrdurow2hxdv-hqq1e">
         <w:r>
           <w:rPr>
             <w:rStyle w:val="Hyperlink"/>
@@ -15253,7 +15142,7 @@
         </w:rPr>
         <w:t xml:space="preserve">Hipparcos Catalogue: </w:t>
       </w:r>
-      <w:hyperlink w:history="1" r:id="rId1jxfd-jmqz3huvs8uzyf6">
+      <w:hyperlink w:history="1" r:id="rIdzf2i-w5dqlowt334zxgek">
         <w:r>
           <w:rPr>
             <w:rStyle w:val="Hyperlink"/>
@@ -15273,7 +15162,7 @@
         </w:rPr>
         <w:t xml:space="preserve">US Patent 787412 (Tesla): </w:t>
       </w:r>
-      <w:hyperlink w:history="1" r:id="rIdjqbncz_4ihgl0h3lx9wes">
+      <w:hyperlink w:history="1" r:id="rId7kg0wi3mi3e36rvkrf_gz">
         <w:r>
           <w:rPr>
             <w:rStyle w:val="Hyperlink"/>
@@ -15293,7 +15182,7 @@
         </w:rPr>
         <w:t xml:space="preserve">NOAA Solar Position Algorithm: </w:t>
       </w:r>
-      <w:hyperlink w:history="1" r:id="rId5thyrx2ilsvs4msqqogno">
+      <w:hyperlink w:history="1" r:id="rIdjz1zbgiqgrcaogtqye4-w">
         <w:r>
           <w:rPr>
             <w:rStyle w:val="Hyperlink"/>
@@ -15313,7 +15202,7 @@
         </w:rPr>
         <w:t xml:space="preserve">National Geodetic Survey Gravity: </w:t>
       </w:r>
-      <w:hyperlink w:history="1" r:id="rId1ektiboo2zmnnxin_5wez">
+      <w:hyperlink w:history="1" r:id="rIdnogv8h0hvwedas_gawmxl">
         <w:r>
           <w:rPr>
             <w:rStyle w:val="Hyperlink"/>
@@ -15333,7 +15222,7 @@
         </w:rPr>
         <w:t xml:space="preserve">CHIME/FRB Project: </w:t>
       </w:r>
-      <w:hyperlink w:history="1" r:id="rId0kzwb5inf1ican7w3ms1r">
+      <w:hyperlink w:history="1" r:id="rIdqbepc8su9zjha7ipuqj2o">
         <w:r>
           <w:rPr>
             <w:rStyle w:val="Hyperlink"/>
@@ -15353,7 +15242,7 @@
         </w:rPr>
         <w:t xml:space="preserve">GRACE-FO (gravity mapping): </w:t>
       </w:r>
-      <w:hyperlink w:history="1" r:id="rId6llbiuxun3o71lpaz-bjl">
+      <w:hyperlink w:history="1" r:id="rIdsvj8cxajsbyqt1n8hf3t4">
         <w:r>
           <w:rPr>
             <w:rStyle w:val="Hyperlink"/>
@@ -15373,7 +15262,7 @@
         </w:rPr>
         <w:t xml:space="preserve">GOCE (gravity field): </w:t>
       </w:r>
-      <w:hyperlink w:history="1" r:id="rIdpwacbkumn4ge1lwqia-mh">
+      <w:hyperlink w:history="1" r:id="rIddxogwlbaytjc-prf6rebh">
         <w:r>
           <w:rPr>
             <w:rStyle w:val="Hyperlink"/>
@@ -15393,7 +15282,7 @@
         </w:rPr>
         <w:t xml:space="preserve">GPS.gov: </w:t>
       </w:r>
-      <w:hyperlink w:history="1" r:id="rIdqy_vdpn4whv8xfy_wqzqk">
+      <w:hyperlink w:history="1" r:id="rIdebxxx3dchwstedq36sbdq">
         <w:r>
           <w:rPr>
             <w:rStyle w:val="Hyperlink"/>
@@ -15413,7 +15302,7 @@
         </w:rPr>
         <w:t xml:space="preserve">CelesTrak TLE Data: </w:t>
       </w:r>
-      <w:hyperlink w:history="1" r:id="rIdnwm67jeucqmk8zsfepz_j">
+      <w:hyperlink w:history="1" r:id="rId2btjcm03pxsxz70oxrqxw">
         <w:r>
           <w:rPr>
             <w:rStyle w:val="Hyperlink"/>

</xml_diff>

<commit_message>
Add four preemptive counter-argument sections
1. Section 5.15 "The Repository Is the Model" — closes the escape
   hatch that published equations are simplified summaries. The repo
   contains the complete computational model; no deeper version exists.

2. Parameter-count comparison table in Section 1.5 — ΛCDM vs ECM on
   five criteria (constraining datasets, cross-validation, internal
   consistency, novel predictions). Raw parameter count is identical;
   every other criterion favors ΛCDM decisively.

3. Medicine analogy in Evaluation Guide — makes "non-discriminating
   prediction" immediately accessible to lay readers. A prediction
   both models make is evidence for neither.

4. 95.2% hardcoded callout in Executive Summary — the headline stat
   is now surfaced on the overview page, not buried in Section 3.5.6.

Co-Authored-By: Claude Opus 4.6 <noreply@anthropic.com>
</commit_message>
<xml_diff>
--- a/downloads/critical-review-dome-model-v4.docx
+++ b/downloads/critical-review-dome-model-v4.docx
@@ -8889,7 +8889,7 @@
       <w:r>
         <w:t xml:space="preserve">US Patent 787412 (1905), publicly available at </w:t>
       </w:r>
-      <w:hyperlink w:history="1" r:id="rIde4nml7ely6h2aiawjklr1">
+      <w:hyperlink w:history="1" r:id="rId_yyvxgrpknhlmfnnyurds">
         <w:r>
           <w:rPr>
             <w:rStyle w:val="Hyperlink"/>
@@ -9029,7 +9029,7 @@
       <w:r>
         <w:t xml:space="preserve">James Bradley (1727) explicitly tested and rejected atmospheric refraction as an explanation: refraction is wavelength-dependent (chromatic), while stellar aberration is achromatic. Modern VLBI measurements achieve milliarcsecond precision and directly confirm aberration correlates with Earth's orbital velocity (~30 km/s). The </w:t>
       </w:r>
-      <w:hyperlink w:history="1" r:id="rIdd2yqmg5a4dihmbfew73au">
+      <w:hyperlink w:history="1" r:id="rId45gfymi2_sblf3_zijtlc">
         <w:r>
           <w:rPr>
             <w:rStyle w:val="Hyperlink"/>
@@ -9095,7 +9095,7 @@
       <w:r>
         <w:t xml:space="preserve">ESA </w:t>
       </w:r>
-      <w:hyperlink w:history="1" r:id="rIdsexsflahryjrfghqldizh">
+      <w:hyperlink w:history="1" r:id="rIdzj-mkdymfhrk9iiibnanh">
         <w:r>
           <w:rPr>
             <w:rStyle w:val="Hyperlink"/>
@@ -9161,7 +9161,7 @@
       <w:r>
         <w:t xml:space="preserve">Crepuscular rays are parallel beams made visible by atmospheric scattering. The apparent divergence is a perspective effect. Crucially, anticrepuscular rays converge at the anti-solar point simultaneously. See </w:t>
       </w:r>
-      <w:hyperlink w:history="1" r:id="rIdurfd7maocnoncj_lb2vhn">
+      <w:hyperlink w:history="1" r:id="rIdy6_ppgs8bp8v3lrfadza-">
         <w:r>
           <w:rPr>
             <w:rStyle w:val="Hyperlink"/>
@@ -9172,7 +9172,7 @@
       <w:r>
         <w:t xml:space="preserve"> and </w:t>
       </w:r>
-      <w:hyperlink w:history="1" r:id="rIdbthdhhp1g1pstlef8ofyr">
+      <w:hyperlink w:history="1" r:id="rIdwfscq1gcvp8sdj_oogdjs">
         <w:r>
           <w:rPr>
             <w:rStyle w:val="Hyperlink"/>
@@ -9238,7 +9238,7 @@
       <w:r>
         <w:t xml:space="preserve">NOAA officially states no evidence of anomalous disappearances. </w:t>
       </w:r>
-      <w:hyperlink w:history="1" r:id="rIdchocteyoqyqap801a4b33">
+      <w:hyperlink w:history="1" r:id="rIdaynlilxsfkg4nrwv0qlun">
         <w:r>
           <w:rPr>
             <w:rStyle w:val="Hyperlink"/>
@@ -9304,7 +9304,7 @@
       <w:r>
         <w:t xml:space="preserve">Hipparcos </w:t>
       </w:r>
-      <w:hyperlink w:history="1" r:id="rIdf_h2-trl6bvjykbiqxbgy">
+      <w:hyperlink w:history="1" r:id="rId0l3kmzvmqw5jm-fqigdin">
         <w:r>
           <w:rPr>
             <w:rStyle w:val="Hyperlink"/>
@@ -9720,7 +9720,7 @@
       <w:r>
         <w:t xml:space="preserve">Terra-Nova et al. (2017, PNAS) demonstrate reversed-flux patches reproduce SAA splitting in MHD simulations. The </w:t>
       </w:r>
-      <w:hyperlink w:history="1" r:id="rIdb68qsswgopu_cvzjipd9m">
+      <w:hyperlink w:history="1" r:id="rIduye2ckk7x3z19_wm_1de_">
         <w:r>
           <w:rPr>
             <w:rStyle w:val="Hyperlink"/>
@@ -9731,7 +9731,7 @@
       <w:r>
         <w:t xml:space="preserve"> documents the evolution quantitatively. </w:t>
       </w:r>
-      <w:hyperlink w:history="1" r:id="rIdu6bthcx72ujifm-om-q81">
+      <w:hyperlink w:history="1" r:id="rIdrbbnkdcrcbgc3gvkat2bp">
         <w:r>
           <w:rPr>
             <w:rStyle w:val="Hyperlink"/>
@@ -9782,7 +9782,7 @@
       <w:r>
         <w:t xml:space="preserve">Normal secular variation documented by </w:t>
       </w:r>
-      <w:hyperlink w:history="1" r:id="rIdh0jj3jca6aigz6v7izdkl">
+      <w:hyperlink w:history="1" r:id="rIdt_zok1yvjcosi7mkfpwag">
         <w:r>
           <w:rPr>
             <w:rStyle w:val="Hyperlink"/>
@@ -9849,7 +9849,7 @@
       <w:r>
         <w:t xml:space="preserve">Eclipse-induced perturbations predicted by Chapman (1933) via ionospheric conductivity drops. Data from </w:t>
       </w:r>
-      <w:hyperlink w:history="1" r:id="rIdgoh3vmx4rpizczfq3i79t">
+      <w:hyperlink w:history="1" r:id="rId8icbxdax4dmkcb_bfzcwt">
         <w:r>
           <w:rPr>
             <w:rStyle w:val="Hyperlink"/>
@@ -9937,7 +9937,7 @@
       <w:r>
         <w:t xml:space="preserve">The formula used is for a quarter-wave linear waveguide, not a spherical cavity. Correct formula f = c/(2*pi*R) gives R = 6,098 km, within 4% of Earth's radius. The ionosphere IS conductive (</w:t>
       </w:r>
-      <w:hyperlink w:history="1" r:id="rIdh2xo8zd6rsv-25jmjcfsi">
+      <w:hyperlink w:history="1" r:id="rIdmg4t2cgjzot6n8hgo6pza">
         <w:r>
           <w:rPr>
             <w:rStyle w:val="Hyperlink"/>
@@ -10004,7 +10004,7 @@
       <w:r>
         <w:t xml:space="preserve">All five observations already predicted by </w:t>
       </w:r>
-      <w:hyperlink w:history="1" r:id="rIdip9yzawrnd9uk8hsfrmrm">
+      <w:hyperlink w:history="1" r:id="rIdkcwqqkk19ot9v3qsil4gx">
         <w:r>
           <w:rPr>
             <w:rStyle w:val="Hyperlink"/>
@@ -10015,7 +10015,7 @@
       <w:r>
         <w:t xml:space="preserve">, </w:t>
       </w:r>
-      <w:hyperlink w:history="1" r:id="rId0ndidpa0gifwfpzgoszx3">
+      <w:hyperlink w:history="1" r:id="rIdopi8t4yef6oyo4wahkwfs">
         <w:r>
           <w:rPr>
             <w:rStyle w:val="Hyperlink"/>
@@ -10342,7 +10342,7 @@
       <w:r>
         <w:t xml:space="preserve">Antarctic gravity anomalies are mapped from orbit by </w:t>
       </w:r>
-      <w:hyperlink w:history="1" r:id="rIddubs1_5huiso04triiwv3">
+      <w:hyperlink w:history="1" r:id="rIdmmbfiggq27dpocnm_jsgu">
         <w:r>
           <w:rPr>
             <w:rStyle w:val="Hyperlink"/>
@@ -10353,7 +10353,7 @@
       <w:r>
         <w:t xml:space="preserve"> and </w:t>
       </w:r>
-      <w:hyperlink w:history="1" r:id="rIdyb_fa2umx-3nv-x4kvzwg">
+      <w:hyperlink w:history="1" r:id="rIdlco61s511zb-c2-ssms-l">
         <w:r>
           <w:rPr>
             <w:rStyle w:val="Hyperlink"/>
@@ -13329,7 +13329,7 @@
       <w:r>
         <w:t xml:space="preserve">A </w:t>
       </w:r>
-      <w:hyperlink w:history="1" r:id="rIdtanxrkxwgq-k1jmmxvf_i">
+      <w:hyperlink w:history="1" r:id="rIdgbew7arlki3uvnn449o8w">
         <w:r>
           <w:rPr>
             <w:rStyle w:val="Hyperlink"/>
@@ -13340,7 +13340,7 @@
       <w:r>
         <w:t xml:space="preserve"> found detectable decreases in X, Z, and total field components during eclipses. An </w:t>
       </w:r>
-      <w:hyperlink w:history="1" r:id="rIdfb02fmhmq4vskzvvwlzgz">
+      <w:hyperlink w:history="1" r:id="rIdw8sp7bzakz0m6yoonhqdq">
         <w:r>
           <w:rPr>
             <w:rStyle w:val="Hyperlink"/>
@@ -13734,7 +13734,7 @@
       <w:r>
         <w:t xml:space="preserve">Continuous 24-hour sunlight. A local sun at 5,733 km circling above a flat disc cannot produce 24-hour sunlight at the disc edge. Directly observable at Amundsen-Scott Station, staffed year-round since 1957. See </w:t>
       </w:r>
-      <w:hyperlink w:history="1" r:id="rIdvof8rzzolijyqpg0ntzbq">
+      <w:hyperlink w:history="1" r:id="rIdhbepi0qzjjeg5wxh2i0a_">
         <w:r>
           <w:rPr>
             <w:rStyle w:val="Hyperlink"/>
@@ -13798,7 +13798,7 @@
       <w:r>
         <w:t xml:space="preserve">GPS provides 1–3 meter accuracy worldwide using 24+ satellites in Keplerian orbits calculated from spherical-Earth gravitational mechanics. The system requires precise relativistic corrections (both special and general) that depend on the satellites' orbital velocity and altitude above a spherical gravitational well. If Earth were a flat disc with different geometry, the signal propagation times, relativistic corrections, and satellite visibility geometry would all be wrong, and the system would not achieve meter-level accuracy. The same applies to every other satellite navigation system (GLONASS, Galileo, BeiDou). The ISS at 408 km is visible on predictable schedules computed from Keplerian orbits. Geostationary satellites at 35,786 km — far above the dome's maximum height — provide continuous coverage. See </w:t>
       </w:r>
-      <w:hyperlink w:history="1" r:id="rIdlb8ujcesemcqiuqj9e58y">
+      <w:hyperlink w:history="1" r:id="rId2lipdjxn6dgmpaxpi3wtz">
         <w:r>
           <w:rPr>
             <w:rStyle w:val="Hyperlink"/>
@@ -13809,7 +13809,7 @@
       <w:r>
         <w:t xml:space="preserve">; </w:t>
       </w:r>
-      <w:hyperlink w:history="1" r:id="rIdqz-amo3-aotrlhb7zl-bk">
+      <w:hyperlink w:history="1" r:id="rIdksy1m02qou7orc9wgxojr">
         <w:r>
           <w:rPr>
             <w:rStyle w:val="Hyperlink"/>
@@ -13858,7 +13858,7 @@
       <w:r>
         <w:t xml:space="preserve">Modern solar calculators (</w:t>
       </w:r>
-      <w:hyperlink w:history="1" r:id="rIdckm-blvruskcfc8ca-ix1">
+      <w:hyperlink w:history="1" r:id="rId5rlnujnxbtrxu836v2x-d">
         <w:r>
           <w:rPr>
             <w:rStyle w:val="Hyperlink"/>
@@ -13907,7 +13907,7 @@
       <w:r>
         <w:t xml:space="preserve">The </w:t>
       </w:r>
-      <w:hyperlink w:history="1" r:id="rIdxstfn3snue_g-pgc3_tm0">
+      <w:hyperlink w:history="1" r:id="rIdzerr9dqxfvy-lc3l_twlj">
         <w:r>
           <w:rPr>
             <w:rStyle w:val="Hyperlink"/>
@@ -13956,7 +13956,7 @@
       <w:r>
         <w:t xml:space="preserve">Earth's field is a dipole. South magnetic pole at 64.1°S, 135.9°E (</w:t>
       </w:r>
-      <w:hyperlink w:history="1" r:id="rIdhu4bxwblibhbzpv0ahl2c">
+      <w:hyperlink w:history="1" r:id="rIdbc5lz9nobla8btxjfsqto">
         <w:r>
           <w:rPr>
             <w:rStyle w:val="Hyperlink"/>
@@ -14005,7 +14005,7 @@
       <w:r>
         <w:t xml:space="preserve">g = 9.780 m/s² at equator, 9.832 m/s² at poles (0.53% variation). On a flat disc, centrifugal force points outward from center, producing the OPPOSITE pattern. See </w:t>
       </w:r>
-      <w:hyperlink w:history="1" r:id="rIdd1jytitr_vyixpyhi0chy">
+      <w:hyperlink w:history="1" r:id="rIdsm8ksgo7suedlurqowujt">
         <w:r>
           <w:rPr>
             <w:rStyle w:val="Hyperlink"/>
@@ -15002,7 +15002,7 @@
         </w:rPr>
         <w:t xml:space="preserve">NOAA World Magnetic Model 2025: </w:t>
       </w:r>
-      <w:hyperlink w:history="1" r:id="rIdtjdyvjbd2-coxfg34zrkp">
+      <w:hyperlink w:history="1" r:id="rId_ewo3scdghbkddijmgpod">
         <w:r>
           <w:rPr>
             <w:rStyle w:val="Hyperlink"/>
@@ -15022,7 +15022,7 @@
         </w:rPr>
         <w:t xml:space="preserve">NOAA Wandering Geomagnetic Poles: </w:t>
       </w:r>
-      <w:hyperlink w:history="1" r:id="rIdaxrzoa1viednacuokieh3">
+      <w:hyperlink w:history="1" r:id="rIda6jjgs6xrfnyalib0o5ut">
         <w:r>
           <w:rPr>
             <w:rStyle w:val="Hyperlink"/>
@@ -15042,7 +15042,7 @@
         </w:rPr>
         <w:t xml:space="preserve">CHAOS-7 Geomagnetic Field Model: </w:t>
       </w:r>
-      <w:hyperlink w:history="1" r:id="rIdodbwi7z9xwjptiq2bkm9x">
+      <w:hyperlink w:history="1" r:id="rIdhhkth6trl2eei_xey8ioy">
         <w:r>
           <w:rPr>
             <w:rStyle w:val="Hyperlink"/>
@@ -15062,7 +15062,7 @@
         </w:rPr>
         <w:t xml:space="preserve">ESA Swarm Satellite Mission: </w:t>
       </w:r>
-      <w:hyperlink w:history="1" r:id="rIdcnxrt2a4cgiijw9uqil8j">
+      <w:hyperlink w:history="1" r:id="rIdbyb4ezg7d7-gdpoulpcdv">
         <w:r>
           <w:rPr>
             <w:rStyle w:val="Hyperlink"/>
@@ -15082,7 +15082,7 @@
         </w:rPr>
         <w:t xml:space="preserve">INTERMAGNET Observatory Network: </w:t>
       </w:r>
-      <w:hyperlink w:history="1" r:id="rIdd2okrbfepsfamll0oofvl">
+      <w:hyperlink w:history="1" r:id="rId5pzchvwg-ee_joqvnog7z">
         <w:r>
           <w:rPr>
             <w:rStyle w:val="Hyperlink"/>
@@ -15102,7 +15102,7 @@
         </w:rPr>
         <w:t xml:space="preserve">IGRF-13: </w:t>
       </w:r>
-      <w:hyperlink w:history="1" r:id="rIdaepdqnzboytqt-kbnzjsh">
+      <w:hyperlink w:history="1" r:id="rIdltkmwrtnlzwe20zgyfrbp">
         <w:r>
           <w:rPr>
             <w:rStyle w:val="Hyperlink"/>
@@ -15122,7 +15122,7 @@
         </w:rPr>
         <w:t xml:space="preserve">ESA Gaia Data Release 3: </w:t>
       </w:r>
-      <w:hyperlink w:history="1" r:id="rIdphvxrdurow2hxdv-hqq1e">
+      <w:hyperlink w:history="1" r:id="rIdwc8ss3nzgd3qf6dsst_4g">
         <w:r>
           <w:rPr>
             <w:rStyle w:val="Hyperlink"/>
@@ -15142,7 +15142,7 @@
         </w:rPr>
         <w:t xml:space="preserve">Hipparcos Catalogue: </w:t>
       </w:r>
-      <w:hyperlink w:history="1" r:id="rIdzf2i-w5dqlowt334zxgek">
+      <w:hyperlink w:history="1" r:id="rIdni8gm1rfweyif_nhvbnej">
         <w:r>
           <w:rPr>
             <w:rStyle w:val="Hyperlink"/>
@@ -15162,7 +15162,7 @@
         </w:rPr>
         <w:t xml:space="preserve">US Patent 787412 (Tesla): </w:t>
       </w:r>
-      <w:hyperlink w:history="1" r:id="rId7kg0wi3mi3e36rvkrf_gz">
+      <w:hyperlink w:history="1" r:id="rIdbulhxzxravacvlwqkvq2f">
         <w:r>
           <w:rPr>
             <w:rStyle w:val="Hyperlink"/>
@@ -15182,7 +15182,7 @@
         </w:rPr>
         <w:t xml:space="preserve">NOAA Solar Position Algorithm: </w:t>
       </w:r>
-      <w:hyperlink w:history="1" r:id="rIdjz1zbgiqgrcaogtqye4-w">
+      <w:hyperlink w:history="1" r:id="rIdspr-fwl9qnrbfgnyz_d9i">
         <w:r>
           <w:rPr>
             <w:rStyle w:val="Hyperlink"/>
@@ -15202,7 +15202,7 @@
         </w:rPr>
         <w:t xml:space="preserve">National Geodetic Survey Gravity: </w:t>
       </w:r>
-      <w:hyperlink w:history="1" r:id="rIdnogv8h0hvwedas_gawmxl">
+      <w:hyperlink w:history="1" r:id="rIdxgqgze2xdasae3vfkx5nu">
         <w:r>
           <w:rPr>
             <w:rStyle w:val="Hyperlink"/>
@@ -15222,7 +15222,7 @@
         </w:rPr>
         <w:t xml:space="preserve">CHIME/FRB Project: </w:t>
       </w:r>
-      <w:hyperlink w:history="1" r:id="rIdqbepc8su9zjha7ipuqj2o">
+      <w:hyperlink w:history="1" r:id="rIdxav0njgz9kr5pxsezm1i0">
         <w:r>
           <w:rPr>
             <w:rStyle w:val="Hyperlink"/>
@@ -15242,7 +15242,7 @@
         </w:rPr>
         <w:t xml:space="preserve">GRACE-FO (gravity mapping): </w:t>
       </w:r>
-      <w:hyperlink w:history="1" r:id="rIdsvj8cxajsbyqt1n8hf3t4">
+      <w:hyperlink w:history="1" r:id="rIdo5aaazouik6ph0iyfex_c">
         <w:r>
           <w:rPr>
             <w:rStyle w:val="Hyperlink"/>
@@ -15262,7 +15262,7 @@
         </w:rPr>
         <w:t xml:space="preserve">GOCE (gravity field): </w:t>
       </w:r>
-      <w:hyperlink w:history="1" r:id="rIddxogwlbaytjc-prf6rebh">
+      <w:hyperlink w:history="1" r:id="rIdo0cmzc7tvnm08jmd7vmbo">
         <w:r>
           <w:rPr>
             <w:rStyle w:val="Hyperlink"/>
@@ -15282,7 +15282,7 @@
         </w:rPr>
         <w:t xml:space="preserve">GPS.gov: </w:t>
       </w:r>
-      <w:hyperlink w:history="1" r:id="rIdebxxx3dchwstedq36sbdq">
+      <w:hyperlink w:history="1" r:id="rIdky_s63lbh8pkrtgg9fa5j">
         <w:r>
           <w:rPr>
             <w:rStyle w:val="Hyperlink"/>
@@ -15302,7 +15302,7 @@
         </w:rPr>
         <w:t xml:space="preserve">CelesTrak TLE Data: </w:t>
       </w:r>
-      <w:hyperlink w:history="1" r:id="rId2btjcm03pxsxz70oxrqxw">
+      <w:hyperlink w:history="1" r:id="rIdetxvpdbs0wxoojvllr8pg">
         <w:r>
           <w:rPr>
             <w:rStyle w:val="Hyperlink"/>

</xml_diff>

<commit_message>
V4.9.6: Cryptographic observation on timestamping, model link, context updates
- Section 1.4: blockchain anchors reference data (observations), not predictions;
  git-only provenance for prediction parameters is weaker than blockchain
- Part 4.6 point 4: consistent rewrite matching Section 1.4 framing
- Model section: source URL now clickable link (HTML + DOCX)
- CLAUDE.md: full rewrite with monitoring pipeline, code_analysis schema,
  external reporting, computed counts, version history through V4.9.5
- SESSION-CONTEXT.md: updated with report-a-problem feature

Co-Authored-By: Claude Opus 4.6 <noreply@anthropic.com>
</commit_message>
<xml_diff>
--- a/downloads/critical-review-dome-model-v4.docx
+++ b/downloads/critical-review-dome-model-v4.docx
@@ -105,8 +105,19 @@
           <w:sz w:val="20"/>
           <w:szCs w:val="20"/>
         </w:rPr>
-        <w:t xml:space="preserve">Source: john09289.github.io/predictions</w:t>
-      </w:r>
+        <w:t xml:space="preserve">Source: </w:t>
+      </w:r>
+      <w:hyperlink w:history="1" r:id="rIdk5_pwy0pvnvglqn4nf60b">
+        <w:r>
+          <w:rPr>
+            <w:rStyle w:val="Hyperlink"/>
+            <w:rFonts w:ascii="Arial" w:cs="Arial" w:eastAsia="Arial" w:hAnsi="Arial"/>
+            <w:sz w:val="20"/>
+            <w:szCs w:val="20"/>
+          </w:rPr>
+          <w:t xml:space="preserve">john09289.github.io/predictions</w:t>
+        </w:r>
+      </w:hyperlink>
     </w:p>
     <w:p>
       <w:r>
@@ -325,7 +336,15 @@
         <w:spacing w:after="120"/>
       </w:pPr>
       <w:r>
-        <w:t xml:space="preserve">The model uses git commit timestamps and Bitcoin blockchain anchoring (OpenTimestamps) to prove predictions existed before confirming data arrived. This timestamping mechanism is cryptographically sound, and prospective prediction is the gold standard in science — credit is due for implementing it. However, the timestamped predictions themselves have low discriminating power: 'field will decay by ≥28 nT' when secular decay has been ongoing for centuries; 'Schumann resonance will remain at 7.83 Hz' when it has been stable for decades; 'SAA will continue westward drift' when NOAA has published the same trend for years. These are predictions of continuity, not novel phenomena. A prediction that 'tomorrow the sun will rise in the east' is prospective and timestamped, but it does not validate a new solar model. Scientific validation also requires: (a) comparison to a null hypothesis (would mainstream models predict the same outcome?), (b) accounting for all predictions including failures, and (c) independent replication. V51.0 introduces a 'Live Power' dashboard claiming 9.2-sigma convergence across 20 domains, but the domains are not statistically independent (many share the same scale constant and data sources), invalidating the aggregate p-value calculation.</w:t>
+        <w:t xml:space="preserve">The model uses git commit timestamps and Bitcoin blockchain anchoring (OpenTimestamps) to prove predictions existed before confirming data arrived. This timestamping mechanism is cryptographically sound, and prospective prediction is the gold standard in science — credit is due for implementing it. However, the blockchain timestamps the wrong side of the ledger. OpenTimestamps anchors status_history.json — the file containing observed values, pass/fail audit results, and statistical comparisons. This is the reference data side of the record. The prediction parameters — formulas, expected values, and tolerances — live in monitor.py source code and docs/model.html, which are only git-versioned, not blockchain-timestamped. Git history can be rewritten (git rebase, force push); blockchain anchoring cannot. By anchoring only the reference data and leaving the predictions in mutable git history, the system's strongest cryptographic proof applies to the part that needs it least.</w:t>
+      </w:r>
+    </w:p>
+    <w:p>
+      <w:pPr>
+        <w:spacing w:after="120"/>
+      </w:pPr>
+      <w:r>
+        <w:t xml:space="preserve">Beyond the timestamping structure, the timestamped predictions themselves have low discriminating power: 'field will decay by ≥28 nT' when secular decay has been ongoing for centuries; 'Schumann resonance will remain at 7.83 Hz' when it has been stable for decades; 'SAA will continue westward drift' when NOAA has published the same trend for years. These are predictions of continuity, not novel phenomena. A prediction that 'tomorrow the sun will rise in the east' is prospective and timestamped, but it does not validate a new solar model. Scientific validation also requires: (a) comparison to a null hypothesis (would mainstream models predict the same outcome?), (b) accounting for all predictions including failures, and (c) independent replication. V51.0 introduces a 'Live Power' dashboard claiming 9.2-sigma convergence across 20 domains, but the domains are not statistically independent (many share the same scale constant and data sources), invalidating the aggregate p-value calculation.</w:t>
       </w:r>
     </w:p>
     <w:p>
@@ -916,7 +935,7 @@
                 <w:sz w:val="18"/>
                 <w:szCs w:val="18"/>
               </w:rPr>
-              <w:t xml:space="preserve">Tesla measured a propagation time (0.08484 s) that converts to ~11.78 Hz, but never derived the disc-resonance formula f=c/(2D) attributed to him</w:t>
+              <w:t xml:space="preserve">Tesla estimated a propagation time (0.08484 s) that converts to ~11.78 Hz, but never derived the disc-resonance formula f=c/(2D) attributed to him. The formula requires D=12,717 km — Earth's diameter, not any dome parameter</w:t>
             </w:r>
           </w:p>
         </w:tc>
@@ -1035,7 +1054,7 @@
                 <w:sz w:val="18"/>
                 <w:szCs w:val="18"/>
               </w:rPr>
-              <w:t xml:space="preserve">Dome cavity with H(r)=8537·exp(−r/8619) gives ~22 Hz, not 7.83; uses simplified uniform-height formula</w:t>
+              <w:t xml:space="preserve">Dome cavity with H(r)=8537·exp(−r/8619) gives ~22 Hz, not 7.83 Hz. The 10.59 Hz 'raw theoretical' is Schumann's 1952 globe formula. WIN-029's Schumann-derived height (9,572 km) exceeds the dome's own ceiling (8,537 km) by 12%</w:t>
             </w:r>
           </w:p>
         </w:tc>
@@ -1154,7 +1173,7 @@
                 <w:sz w:val="18"/>
                 <w:szCs w:val="18"/>
               </w:rPr>
-              <w:t xml:space="preserve">117 Hz is acoustic resonance of granite chamber dimensions, not EM</w:t>
+              <w:t xml:space="preserve">117 Hz is acoustic resonance of a granite sarcophagus, not electromagnetic dome resonance. The '10th harmonic' claim is undefined: 10×7.83 Hz = 78.3 Hz (not 117). No mechanism connects stone acoustics to EM fields</w:t>
             </w:r>
           </w:p>
         </w:tc>
@@ -1630,7 +1649,7 @@
                 <w:sz w:val="18"/>
                 <w:szCs w:val="18"/>
               </w:rPr>
-              <w:t xml:space="preserve">Smooth acceleration from 1970s, not sharp 1990 phase transition</w:t>
+              <w:t xml:space="preserve">Standard geophysics explains the 1990s acceleration via flux lobe dynamics; dome provides only a label with no derivation or predictive content</w:t>
             </w:r>
           </w:p>
         </w:tc>
@@ -3415,7 +3434,7 @@
                 <w:sz w:val="18"/>
                 <w:szCs w:val="18"/>
               </w:rPr>
-              <w:t xml:space="preserve">Duplicate of WIN-007; same data counted twice</w:t>
+              <w:t xml:space="preserve">Duplicate of WIN-007 (same NOAA data, same parent prediction PROS-002); 'phase transition' is a category error applied to core flow dynamics</w:t>
             </w:r>
           </w:p>
         </w:tc>
@@ -3715,7 +3734,7 @@
                 <w:sz w:val="18"/>
                 <w:szCs w:val="18"/>
               </w:rPr>
-              <w:t xml:space="preserve">2024 eclipse 9-station (REMOVED)</w:t>
+              <w:t xml:space="preserve">2024 eclipse 9-station magnetic</w:t>
             </w:r>
           </w:p>
         </w:tc>
@@ -3728,7 +3747,7 @@
               <w:bottom w:val="single" w:color="CCCCCC" w:sz="1"/>
               <w:right w:val="single" w:color="CCCCCC" w:sz="1"/>
             </w:tcBorders>
-            <w:shd w:fill="FFE0B2" w:val="clear"/>
+            <w:shd w:fill="C8E6C9" w:val="clear"/>
             <w:tcMar>
               <w:top w:type="dxa" w:w="80"/>
               <w:left w:type="dxa" w:w="120"/>
@@ -3745,7 +3764,7 @@
                 <w:sz w:val="18"/>
                 <w:szCs w:val="18"/>
               </w:rPr>
-              <w:t xml:space="preserve">Misleading</w:t>
+              <w:t xml:space="preserve">Std Model Explains</w:t>
             </w:r>
           </w:p>
         </w:tc>
@@ -3772,7 +3791,7 @@
                 <w:sz w:val="18"/>
                 <w:szCs w:val="18"/>
               </w:rPr>
-              <w:t xml:space="preserve">Author removed in V51.0; disturbed-day baseline acknowledged</w:t>
+              <w:t xml:space="preserve">Eclipse-induced ±10 nT magnetic variations are predicted by standard ionospheric Sq current physics (Chapman 1933). The dome provides no derived magnitude or mechanism</w:t>
             </w:r>
           </w:p>
         </w:tc>
@@ -4724,7 +4743,7 @@
                 <w:sz w:val="18"/>
                 <w:szCs w:val="18"/>
               </w:rPr>
-              <w:t xml:space="preserve">Both stars ~130 ly away; brightness difference is intrinsic luminosity class</w:t>
+              <w:t xml:space="preserve">Intrinsic luminosity difference (supergiant vs. subgiant); Gaia photometry shows no systematic southern dimming</w:t>
             </w:r>
           </w:p>
         </w:tc>
@@ -4843,7 +4862,7 @@
                 <w:sz w:val="18"/>
                 <w:szCs w:val="18"/>
               </w:rPr>
-              <w:t xml:space="preserve">Biblical exegesis; a copper dome at any altitude would be radar-detectable</w:t>
+              <w:t xml:space="preserve">Biblical exegesis; copper dome would block all radio astronomy and contradict Schumann resonance</w:t>
             </w:r>
           </w:p>
         </w:tc>
@@ -8131,7 +8150,7 @@
               <w:bottom w:val="single" w:color="CCCCCC" w:sz="1"/>
               <w:right w:val="single" w:color="CCCCCC" w:sz="1"/>
             </w:tcBorders>
-            <w:shd w:fill="FFCCCC" w:val="clear"/>
+            <w:shd w:fill="FFE0B2" w:val="clear"/>
             <w:tcMar>
               <w:top w:type="dxa" w:w="80"/>
               <w:left w:type="dxa" w:w="120"/>
@@ -8148,7 +8167,7 @@
                 <w:sz w:val="18"/>
                 <w:szCs w:val="18"/>
               </w:rPr>
-              <w:t xml:space="preserve">Refuted by Data</w:t>
+              <w:t xml:space="preserve">Misleading</w:t>
             </w:r>
           </w:p>
         </w:tc>
@@ -8175,7 +8194,7 @@
                 <w:sz w:val="18"/>
                 <w:szCs w:val="18"/>
               </w:rPr>
-              <w:t xml:space="preserve">Superluminal group velocity is standard waveguide physics; implied disc diameter (40,030 km) contradicts model's own 28,210 km</w:t>
+              <w:t xml:space="preserve">Tesla's patent (with spherical Earth diagram) describes surface wave propagation at ~1.57c — a known waveguide effect on a globe. Dome relabels globe circumference as disc diameter</w:t>
             </w:r>
           </w:p>
         </w:tc>
@@ -8796,7 +8815,7 @@
         <w:t xml:space="preserve">V51.0 Tally (67 WINs): </w:t>
       </w:r>
       <w:r>
-        <w:t xml:space="preserve">Refuted by Data: 11  |  Self-Contradicted: 11  |  Misleading: 23  |  Std Model Explains: 15  |  Not Demonstrated: 3  |  Unfalsifiable: 4</w:t>
+        <w:t xml:space="preserve">Refuted by Data: 10  |  Self-Contradicted: 11  |  Misleading: 23  |  Std Model Explains: 16  |  Not Demonstrated: 3  |  Unfalsifiable: 4</w:t>
       </w:r>
     </w:p>
     <w:p>
@@ -8889,7 +8908,7 @@
       <w:r>
         <w:t xml:space="preserve">US Patent 787412 (1905), publicly available at </w:t>
       </w:r>
-      <w:hyperlink w:history="1" r:id="rId_yyvxgrpknhlmfnnyurds">
+      <w:hyperlink w:history="1" r:id="rId8n6iah226qlkduxctt5fk">
         <w:r>
           <w:rPr>
             <w:rStyle w:val="Hyperlink"/>
@@ -9029,7 +9048,7 @@
       <w:r>
         <w:t xml:space="preserve">James Bradley (1727) explicitly tested and rejected atmospheric refraction as an explanation: refraction is wavelength-dependent (chromatic), while stellar aberration is achromatic. Modern VLBI measurements achieve milliarcsecond precision and directly confirm aberration correlates with Earth's orbital velocity (~30 km/s). The </w:t>
       </w:r>
-      <w:hyperlink w:history="1" r:id="rId45gfymi2_sblf3_zijtlc">
+      <w:hyperlink w:history="1" r:id="rIdeu-h0utdcqfkac3h73sew">
         <w:r>
           <w:rPr>
             <w:rStyle w:val="Hyperlink"/>
@@ -9095,7 +9114,7 @@
       <w:r>
         <w:t xml:space="preserve">ESA </w:t>
       </w:r>
-      <w:hyperlink w:history="1" r:id="rIdzj-mkdymfhrk9iiibnanh">
+      <w:hyperlink w:history="1" r:id="rIdvwaiu6a342ljmp6-mpm1t">
         <w:r>
           <w:rPr>
             <w:rStyle w:val="Hyperlink"/>
@@ -9161,7 +9180,7 @@
       <w:r>
         <w:t xml:space="preserve">Crepuscular rays are parallel beams made visible by atmospheric scattering. The apparent divergence is a perspective effect. Crucially, anticrepuscular rays converge at the anti-solar point simultaneously. See </w:t>
       </w:r>
-      <w:hyperlink w:history="1" r:id="rIdy6_ppgs8bp8v3lrfadza-">
+      <w:hyperlink w:history="1" r:id="rIdovskgm72wumh56aeb0vw6">
         <w:r>
           <w:rPr>
             <w:rStyle w:val="Hyperlink"/>
@@ -9172,7 +9191,7 @@
       <w:r>
         <w:t xml:space="preserve"> and </w:t>
       </w:r>
-      <w:hyperlink w:history="1" r:id="rIdwfscq1gcvp8sdj_oogdjs">
+      <w:hyperlink w:history="1" r:id="rIda53amuyiydksj0hhzaxm4">
         <w:r>
           <w:rPr>
             <w:rStyle w:val="Hyperlink"/>
@@ -9238,7 +9257,7 @@
       <w:r>
         <w:t xml:space="preserve">NOAA officially states no evidence of anomalous disappearances. </w:t>
       </w:r>
-      <w:hyperlink w:history="1" r:id="rIdaynlilxsfkg4nrwv0qlun">
+      <w:hyperlink w:history="1" r:id="rIdckzf_bke-uyry7i0mne-j">
         <w:r>
           <w:rPr>
             <w:rStyle w:val="Hyperlink"/>
@@ -9304,7 +9323,7 @@
       <w:r>
         <w:t xml:space="preserve">Hipparcos </w:t>
       </w:r>
-      <w:hyperlink w:history="1" r:id="rId0l3kmzvmqw5jm-fqigdin">
+      <w:hyperlink w:history="1" r:id="rIdamcc0ufja-qf0znomicx1">
         <w:r>
           <w:rPr>
             <w:rStyle w:val="Hyperlink"/>
@@ -9720,7 +9739,7 @@
       <w:r>
         <w:t xml:space="preserve">Terra-Nova et al. (2017, PNAS) demonstrate reversed-flux patches reproduce SAA splitting in MHD simulations. The </w:t>
       </w:r>
-      <w:hyperlink w:history="1" r:id="rIduye2ckk7x3z19_wm_1de_">
+      <w:hyperlink w:history="1" r:id="rIdru253gt9jdxcitrjnylqa">
         <w:r>
           <w:rPr>
             <w:rStyle w:val="Hyperlink"/>
@@ -9731,7 +9750,7 @@
       <w:r>
         <w:t xml:space="preserve"> documents the evolution quantitatively. </w:t>
       </w:r>
-      <w:hyperlink w:history="1" r:id="rIdrbbnkdcrcbgc3gvkat2bp">
+      <w:hyperlink w:history="1" r:id="rIdow0zcxllu0ickd7chhdvj">
         <w:r>
           <w:rPr>
             <w:rStyle w:val="Hyperlink"/>
@@ -9782,7 +9801,7 @@
       <w:r>
         <w:t xml:space="preserve">Normal secular variation documented by </w:t>
       </w:r>
-      <w:hyperlink w:history="1" r:id="rIdt_zok1yvjcosi7mkfpwag">
+      <w:hyperlink w:history="1" r:id="rId7g6arioacxfsbchctbkgf">
         <w:r>
           <w:rPr>
             <w:rStyle w:val="Hyperlink"/>
@@ -9849,7 +9868,7 @@
       <w:r>
         <w:t xml:space="preserve">Eclipse-induced perturbations predicted by Chapman (1933) via ionospheric conductivity drops. Data from </w:t>
       </w:r>
-      <w:hyperlink w:history="1" r:id="rId8icbxdax4dmkcb_bfzcwt">
+      <w:hyperlink w:history="1" r:id="rIdwsuwn1gpup8_ui11cclf3">
         <w:r>
           <w:rPr>
             <w:rStyle w:val="Hyperlink"/>
@@ -9937,7 +9956,7 @@
       <w:r>
         <w:t xml:space="preserve">The formula used is for a quarter-wave linear waveguide, not a spherical cavity. Correct formula f = c/(2*pi*R) gives R = 6,098 km, within 4% of Earth's radius. The ionosphere IS conductive (</w:t>
       </w:r>
-      <w:hyperlink w:history="1" r:id="rIdmg4t2cgjzot6n8hgo6pza">
+      <w:hyperlink w:history="1" r:id="rIduexyqfbhekw0l1nfyodrr">
         <w:r>
           <w:rPr>
             <w:rStyle w:val="Hyperlink"/>
@@ -10004,7 +10023,7 @@
       <w:r>
         <w:t xml:space="preserve">All five observations already predicted by </w:t>
       </w:r>
-      <w:hyperlink w:history="1" r:id="rIdkcwqqkk19ot9v3qsil4gx">
+      <w:hyperlink w:history="1" r:id="rIdiywwlt9kw0mtwusd7e7da">
         <w:r>
           <w:rPr>
             <w:rStyle w:val="Hyperlink"/>
@@ -10015,7 +10034,7 @@
       <w:r>
         <w:t xml:space="preserve">, </w:t>
       </w:r>
-      <w:hyperlink w:history="1" r:id="rIdopi8t4yef6oyo4wahkwfs">
+      <w:hyperlink w:history="1" r:id="rIdkxagn6kl2qvtq-zktcwbr">
         <w:r>
           <w:rPr>
             <w:rStyle w:val="Hyperlink"/>
@@ -10342,7 +10361,7 @@
       <w:r>
         <w:t xml:space="preserve">Antarctic gravity anomalies are mapped from orbit by </w:t>
       </w:r>
-      <w:hyperlink w:history="1" r:id="rIdmmbfiggq27dpocnm_jsgu">
+      <w:hyperlink w:history="1" r:id="rIdf5c9y6nidvx89mkh47vjb">
         <w:r>
           <w:rPr>
             <w:rStyle w:val="Hyperlink"/>
@@ -10353,7 +10372,7 @@
       <w:r>
         <w:t xml:space="preserve"> and </w:t>
       </w:r>
-      <w:hyperlink w:history="1" r:id="rIdlco61s511zb-c2-ssms-l">
+      <w:hyperlink w:history="1" r:id="rIdaedwifhzau10qf2oj1qs7">
         <w:r>
           <w:rPr>
             <w:rStyle w:val="Hyperlink"/>
@@ -13329,7 +13348,7 @@
       <w:r>
         <w:t xml:space="preserve">A </w:t>
       </w:r>
-      <w:hyperlink w:history="1" r:id="rIdgbew7arlki3uvnn449o8w">
+      <w:hyperlink w:history="1" r:id="rId4hh7vli_ncihpuui6sqeh">
         <w:r>
           <w:rPr>
             <w:rStyle w:val="Hyperlink"/>
@@ -13340,7 +13359,7 @@
       <w:r>
         <w:t xml:space="preserve"> found detectable decreases in X, Z, and total field components during eclipses. An </w:t>
       </w:r>
-      <w:hyperlink w:history="1" r:id="rIdw8sp7bzakz0m6yoonhqdq">
+      <w:hyperlink w:history="1" r:id="rIdktdfs0cvmlbm1irrw175v">
         <w:r>
           <w:rPr>
             <w:rStyle w:val="Hyperlink"/>
@@ -13734,7 +13753,7 @@
       <w:r>
         <w:t xml:space="preserve">Continuous 24-hour sunlight. A local sun at 5,733 km circling above a flat disc cannot produce 24-hour sunlight at the disc edge. Directly observable at Amundsen-Scott Station, staffed year-round since 1957. See </w:t>
       </w:r>
-      <w:hyperlink w:history="1" r:id="rIdhbepi0qzjjeg5wxh2i0a_">
+      <w:hyperlink w:history="1" r:id="rIdhd8ipn6gcbtocqmrlqik0">
         <w:r>
           <w:rPr>
             <w:rStyle w:val="Hyperlink"/>
@@ -13798,7 +13817,7 @@
       <w:r>
         <w:t xml:space="preserve">GPS provides 1–3 meter accuracy worldwide using 24+ satellites in Keplerian orbits calculated from spherical-Earth gravitational mechanics. The system requires precise relativistic corrections (both special and general) that depend on the satellites' orbital velocity and altitude above a spherical gravitational well. If Earth were a flat disc with different geometry, the signal propagation times, relativistic corrections, and satellite visibility geometry would all be wrong, and the system would not achieve meter-level accuracy. The same applies to every other satellite navigation system (GLONASS, Galileo, BeiDou). The ISS at 408 km is visible on predictable schedules computed from Keplerian orbits. Geostationary satellites at 35,786 km — far above the dome's maximum height — provide continuous coverage. See </w:t>
       </w:r>
-      <w:hyperlink w:history="1" r:id="rId2lipdjxn6dgmpaxpi3wtz">
+      <w:hyperlink w:history="1" r:id="rIdm955m880fjexoaqnecvzm">
         <w:r>
           <w:rPr>
             <w:rStyle w:val="Hyperlink"/>
@@ -13809,7 +13828,7 @@
       <w:r>
         <w:t xml:space="preserve">; </w:t>
       </w:r>
-      <w:hyperlink w:history="1" r:id="rIdksy1m02qou7orc9wgxojr">
+      <w:hyperlink w:history="1" r:id="rIdwoaquvymngghc06v49tlc">
         <w:r>
           <w:rPr>
             <w:rStyle w:val="Hyperlink"/>
@@ -13858,7 +13877,7 @@
       <w:r>
         <w:t xml:space="preserve">Modern solar calculators (</w:t>
       </w:r>
-      <w:hyperlink w:history="1" r:id="rId5rlnujnxbtrxu836v2x-d">
+      <w:hyperlink w:history="1" r:id="rIdpfhqmkythibkug81qhrim">
         <w:r>
           <w:rPr>
             <w:rStyle w:val="Hyperlink"/>
@@ -13907,7 +13926,7 @@
       <w:r>
         <w:t xml:space="preserve">The </w:t>
       </w:r>
-      <w:hyperlink w:history="1" r:id="rIdzerr9dqxfvy-lc3l_twlj">
+      <w:hyperlink w:history="1" r:id="rIdnhufc9l6lg7mvfvqfas7e">
         <w:r>
           <w:rPr>
             <w:rStyle w:val="Hyperlink"/>
@@ -13956,7 +13975,7 @@
       <w:r>
         <w:t xml:space="preserve">Earth's field is a dipole. South magnetic pole at 64.1°S, 135.9°E (</w:t>
       </w:r>
-      <w:hyperlink w:history="1" r:id="rIdbc5lz9nobla8btxjfsqto">
+      <w:hyperlink w:history="1" r:id="rIdk95hhv5jxjveefka-nww9">
         <w:r>
           <w:rPr>
             <w:rStyle w:val="Hyperlink"/>
@@ -14005,7 +14024,7 @@
       <w:r>
         <w:t xml:space="preserve">g = 9.780 m/s² at equator, 9.832 m/s² at poles (0.53% variation). On a flat disc, centrifugal force points outward from center, producing the OPPOSITE pattern. See </w:t>
       </w:r>
-      <w:hyperlink w:history="1" r:id="rIdsm8ksgo7suedlurqowujt">
+      <w:hyperlink w:history="1" r:id="rIdiosl70wo6sclpt9y4x6qv">
         <w:r>
           <w:rPr>
             <w:rStyle w:val="Hyperlink"/>
@@ -14851,7 +14870,7 @@
           <w:b/>
           <w:bCs/>
         </w:rPr>
-        <w:t xml:space="preserve">Refuted by Data: 11 </w:t>
+        <w:t xml:space="preserve">Refuted by Data: 10 </w:t>
       </w:r>
       <w:r>
         <w:t xml:space="preserve">(direct measurements contradict the claim)</w:t>
@@ -14896,7 +14915,7 @@
           <w:b/>
           <w:bCs/>
         </w:rPr>
-        <w:t xml:space="preserve">Std Model Explains: 15 </w:t>
+        <w:t xml:space="preserve">Std Model Explains: 16 </w:t>
       </w:r>
       <w:r>
         <w:t xml:space="preserve">(observation is real but mainstream physics already accounts for it)</w:t>
@@ -15002,7 +15021,7 @@
         </w:rPr>
         <w:t xml:space="preserve">NOAA World Magnetic Model 2025: </w:t>
       </w:r>
-      <w:hyperlink w:history="1" r:id="rId_ewo3scdghbkddijmgpod">
+      <w:hyperlink w:history="1" r:id="rIdnaxauzowtkzwvmnu2-coa">
         <w:r>
           <w:rPr>
             <w:rStyle w:val="Hyperlink"/>
@@ -15022,7 +15041,7 @@
         </w:rPr>
         <w:t xml:space="preserve">NOAA Wandering Geomagnetic Poles: </w:t>
       </w:r>
-      <w:hyperlink w:history="1" r:id="rIda6jjgs6xrfnyalib0o5ut">
+      <w:hyperlink w:history="1" r:id="rIdjtcikr4bagbpolxsl7snm">
         <w:r>
           <w:rPr>
             <w:rStyle w:val="Hyperlink"/>
@@ -15042,7 +15061,7 @@
         </w:rPr>
         <w:t xml:space="preserve">CHAOS-7 Geomagnetic Field Model: </w:t>
       </w:r>
-      <w:hyperlink w:history="1" r:id="rIdhhkth6trl2eei_xey8ioy">
+      <w:hyperlink w:history="1" r:id="rIdo3f3vca5wf-suz_nq4lqg">
         <w:r>
           <w:rPr>
             <w:rStyle w:val="Hyperlink"/>
@@ -15062,7 +15081,7 @@
         </w:rPr>
         <w:t xml:space="preserve">ESA Swarm Satellite Mission: </w:t>
       </w:r>
-      <w:hyperlink w:history="1" r:id="rIdbyb4ezg7d7-gdpoulpcdv">
+      <w:hyperlink w:history="1" r:id="rIdm9evxz3ihjihjy3lbdyzi">
         <w:r>
           <w:rPr>
             <w:rStyle w:val="Hyperlink"/>
@@ -15082,7 +15101,7 @@
         </w:rPr>
         <w:t xml:space="preserve">INTERMAGNET Observatory Network: </w:t>
       </w:r>
-      <w:hyperlink w:history="1" r:id="rId5pzchvwg-ee_joqvnog7z">
+      <w:hyperlink w:history="1" r:id="rIdk123zghaopisyv-hyebwa">
         <w:r>
           <w:rPr>
             <w:rStyle w:val="Hyperlink"/>
@@ -15102,7 +15121,7 @@
         </w:rPr>
         <w:t xml:space="preserve">IGRF-13: </w:t>
       </w:r>
-      <w:hyperlink w:history="1" r:id="rIdltkmwrtnlzwe20zgyfrbp">
+      <w:hyperlink w:history="1" r:id="rIdwsvrx3bhpba1txxpszt6q">
         <w:r>
           <w:rPr>
             <w:rStyle w:val="Hyperlink"/>
@@ -15122,7 +15141,7 @@
         </w:rPr>
         <w:t xml:space="preserve">ESA Gaia Data Release 3: </w:t>
       </w:r>
-      <w:hyperlink w:history="1" r:id="rIdwc8ss3nzgd3qf6dsst_4g">
+      <w:hyperlink w:history="1" r:id="rIdpj1y_gfpgkhh-7dsv4xsh">
         <w:r>
           <w:rPr>
             <w:rStyle w:val="Hyperlink"/>
@@ -15142,7 +15161,7 @@
         </w:rPr>
         <w:t xml:space="preserve">Hipparcos Catalogue: </w:t>
       </w:r>
-      <w:hyperlink w:history="1" r:id="rIdni8gm1rfweyif_nhvbnej">
+      <w:hyperlink w:history="1" r:id="rIdorgbgxdsucdpvaegsc-kp">
         <w:r>
           <w:rPr>
             <w:rStyle w:val="Hyperlink"/>
@@ -15162,7 +15181,7 @@
         </w:rPr>
         <w:t xml:space="preserve">US Patent 787412 (Tesla): </w:t>
       </w:r>
-      <w:hyperlink w:history="1" r:id="rIdbulhxzxravacvlwqkvq2f">
+      <w:hyperlink w:history="1" r:id="rId_akjlftmz1g6zyyptmuov">
         <w:r>
           <w:rPr>
             <w:rStyle w:val="Hyperlink"/>
@@ -15182,7 +15201,7 @@
         </w:rPr>
         <w:t xml:space="preserve">NOAA Solar Position Algorithm: </w:t>
       </w:r>
-      <w:hyperlink w:history="1" r:id="rIdspr-fwl9qnrbfgnyz_d9i">
+      <w:hyperlink w:history="1" r:id="rIdv7djl-s9ez1j4ieppkuig">
         <w:r>
           <w:rPr>
             <w:rStyle w:val="Hyperlink"/>
@@ -15202,7 +15221,7 @@
         </w:rPr>
         <w:t xml:space="preserve">National Geodetic Survey Gravity: </w:t>
       </w:r>
-      <w:hyperlink w:history="1" r:id="rIdxgqgze2xdasae3vfkx5nu">
+      <w:hyperlink w:history="1" r:id="rIdicqrt7ydxxjmsvxbbz8gv">
         <w:r>
           <w:rPr>
             <w:rStyle w:val="Hyperlink"/>
@@ -15222,7 +15241,7 @@
         </w:rPr>
         <w:t xml:space="preserve">CHIME/FRB Project: </w:t>
       </w:r>
-      <w:hyperlink w:history="1" r:id="rIdxav0njgz9kr5pxsezm1i0">
+      <w:hyperlink w:history="1" r:id="rIdmdv_849u56rkxuftektvk">
         <w:r>
           <w:rPr>
             <w:rStyle w:val="Hyperlink"/>
@@ -15242,7 +15261,7 @@
         </w:rPr>
         <w:t xml:space="preserve">GRACE-FO (gravity mapping): </w:t>
       </w:r>
-      <w:hyperlink w:history="1" r:id="rIdo5aaazouik6ph0iyfex_c">
+      <w:hyperlink w:history="1" r:id="rIdfiza7o0vtl44qscwpz3ps">
         <w:r>
           <w:rPr>
             <w:rStyle w:val="Hyperlink"/>
@@ -15262,7 +15281,7 @@
         </w:rPr>
         <w:t xml:space="preserve">GOCE (gravity field): </w:t>
       </w:r>
-      <w:hyperlink w:history="1" r:id="rIdo0cmzc7tvnm08jmd7vmbo">
+      <w:hyperlink w:history="1" r:id="rId5rllprw5uqebivydcmnrf">
         <w:r>
           <w:rPr>
             <w:rStyle w:val="Hyperlink"/>
@@ -15282,7 +15301,7 @@
         </w:rPr>
         <w:t xml:space="preserve">GPS.gov: </w:t>
       </w:r>
-      <w:hyperlink w:history="1" r:id="rIdky_s63lbh8pkrtgg9fa5j">
+      <w:hyperlink w:history="1" r:id="rIddjgvv1i1xdjhdxs0xltjd">
         <w:r>
           <w:rPr>
             <w:rStyle w:val="Hyperlink"/>
@@ -15302,7 +15321,7 @@
         </w:rPr>
         <w:t xml:space="preserve">CelesTrak TLE Data: </w:t>
       </w:r>
-      <w:hyperlink w:history="1" r:id="rIdetxvpdbs0wxoojvllr8pg">
+      <w:hyperlink w:history="1" r:id="rId3yolw7gaxijoskot-trq1">
         <w:r>
           <w:rPr>
             <w:rStyle w:val="Hyperlink"/>

</xml_diff>

<commit_message>
Update review (auto-build 2026-04-06)
Co-Authored-By: Claude Opus 4.6 <noreply@anthropic.com>
</commit_message>
<xml_diff>
--- a/downloads/critical-review-dome-model-v4.docx
+++ b/downloads/critical-review-dome-model-v4.docx
@@ -107,7 +107,7 @@
         </w:rPr>
         <w:t xml:space="preserve">Source: </w:t>
       </w:r>
-      <w:hyperlink w:history="1" r:id="rIdk5_pwy0pvnvglqn4nf60b">
+      <w:hyperlink w:history="1" r:id="rIdngljsj9nt53r5l0hrctik">
         <w:r>
           <w:rPr>
             <w:rStyle w:val="Hyperlink"/>
@@ -1768,7 +1768,7 @@
                 <w:sz w:val="18"/>
                 <w:szCs w:val="18"/>
               </w:rPr>
-              <w:t xml:space="preserve">MT surveys show attenuation valley at 11-12 Hz, not a peak</w:t>
+              <w:t xml:space="preserve">11-12 Hz is a Schumann inter-harmonic minimum, not a dome resonance peak; first harmonic at 14.3 Hz disproves any 'cutoff'</w:t>
             </w:r>
           </w:p>
         </w:tc>
@@ -1887,7 +1887,7 @@
                 <w:sz w:val="18"/>
                 <w:szCs w:val="18"/>
               </w:rPr>
-              <w:t xml:space="preserve">Working geophysicists deliberately avoid this noisy frequency band</w:t>
+              <w:t xml:space="preserve">The claimed ~12 Hz peak is the inter-harmonic spectral minimum between Schumann modes — a trough predicted by spherical-cavity physics, not a dome resonance peak</w:t>
             </w:r>
           </w:p>
         </w:tc>
@@ -2125,7 +2125,7 @@
                 <w:sz w:val="18"/>
                 <w:szCs w:val="18"/>
               </w:rPr>
-              <w:t xml:space="preserve">Membach SG (superior instrument) found 0.0 uGal; result unconfirmed</w:t>
+              <w:t xml:space="preserve">Van Camp et al. (2001) found no eclipse gravity signal with four superconducting gravimeters; marginal spring-gravimeter detection remains unconfirmed</w:t>
             </w:r>
           </w:p>
         </w:tc>
@@ -2200,7 +2200,7 @@
               <w:bottom w:val="single" w:color="CCCCCC" w:sz="1"/>
               <w:right w:val="single" w:color="CCCCCC" w:sz="1"/>
             </w:tcBorders>
-            <w:shd w:fill="D1C4E9" w:val="clear"/>
+            <w:shd w:fill="B3E5FC" w:val="clear"/>
             <w:tcMar>
               <w:top w:type="dxa" w:w="80"/>
               <w:left w:type="dxa" w:w="120"/>
@@ -2217,7 +2217,7 @@
                 <w:sz w:val="18"/>
                 <w:szCs w:val="18"/>
               </w:rPr>
-              <w:t xml:space="preserve">Not Demonstrated</w:t>
+              <w:t xml:space="preserve">Self-Contradicted</w:t>
             </w:r>
           </w:p>
         </w:tc>
@@ -2244,7 +2244,7 @@
                 <w:sz w:val="18"/>
                 <w:szCs w:val="18"/>
               </w:rPr>
-              <w:t xml:space="preserve">Circular derivation from unconfirmed Mohe data; fitted parameters (62,376/64,852 nT) hidden in 'zero-parameter' claim</w:t>
+              <w:t xml:space="preserve">WIN-012 claims 6.5 µGal eclipse gravity anomaly to derive κ = 1.67, but WIN-013/014 report 0.0 µGal — denominator vanishes, κ undefined. Coupling constant derived circularly from unconfirmed Mohe data; monitor.py validates via hardcoded identity check.</w:t>
             </w:r>
           </w:p>
         </w:tc>
@@ -2601,7 +2601,7 @@
                 <w:sz w:val="18"/>
                 <w:szCs w:val="18"/>
               </w:rPr>
-              <w:t xml:space="preserve">No peer-reviewed replication; CUORE Faraday cage shows 20 dB at 10 Hz</w:t>
+              <w:t xml:space="preserve">No peer-reviewed replication; near-field evanescent coupling explains apparent penetration; precision experiments worldwide show no anomalous EM shielding failure</w:t>
             </w:r>
           </w:p>
         </w:tc>
@@ -2958,7 +2958,7 @@
                 <w:sz w:val="18"/>
                 <w:szCs w:val="18"/>
               </w:rPr>
-              <w:t xml:space="preserve">Equation of time ranges +16.5 to -14.1 min; 6.9 is cherry-picked RMS</w:t>
+              <w:t xml:space="preserve">Equation of time ranges +16.4 to −14.3 min; 6.9 is obliquity sub-component RMS only (full equation-of-time RMS = 8.8 min)</w:t>
             </w:r>
           </w:p>
         </w:tc>
@@ -3196,7 +3196,7 @@
                 <w:sz w:val="18"/>
                 <w:szCs w:val="18"/>
               </w:rPr>
-              <w:t xml:space="preserve">Non-discriminating: period is an input (known for 250 years); dome's gears have no physical driver or amplitude prediction</w:t>
+              <w:t xml:space="preserve">Non-discriminating: period is an input (known for over 2,000 years, encoded in Antikythera mechanism ~100 BC); dome's gears have no physical driver or amplitude prediction</w:t>
             </w:r>
           </w:p>
         </w:tc>
@@ -3315,7 +3315,7 @@
                 <w:sz w:val="18"/>
                 <w:szCs w:val="18"/>
               </w:rPr>
-              <w:t xml:space="preserve">Derived from assumed dome parameters, not independent measurement</w:t>
+              <w:t xml:space="preserve">Units error: dome gives rad/s² (acceleration) not rad/s (velocity). Rate derived circularly from assumed dome parameters</w:t>
             </w:r>
           </w:p>
         </w:tc>
@@ -4386,7 +4386,7 @@
                 <w:sz w:val="18"/>
                 <w:szCs w:val="18"/>
               </w:rPr>
-              <w:t xml:space="preserve">Adding parameters always improves fit; no AIC/BIC comparison shown</w:t>
+              <w:t xml:space="preserve">Adding parameters always improves fit; no AIC/BIC comparison shown; 48.6% RMS figure unverifiable (no computation in repo)</w:t>
             </w:r>
           </w:p>
         </w:tc>
@@ -4505,7 +4505,7 @@
                 <w:sz w:val="18"/>
                 <w:szCs w:val="18"/>
               </w:rPr>
-              <w:t xml:space="preserve">Theological assertion, not testable physical claim</w:t>
+              <w:t xml:space="preserve">Six-text convergence is retrodiction (texts predate the model); no measurable physical consequence distinguishes this from any cosmology with a North Pole axis</w:t>
             </w:r>
           </w:p>
         </w:tc>
@@ -4743,7 +4743,7 @@
                 <w:sz w:val="18"/>
                 <w:szCs w:val="18"/>
               </w:rPr>
-              <w:t xml:space="preserve">Intrinsic luminosity difference (supergiant vs. subgiant); Gaia photometry shows no systematic southern dimming</w:t>
+              <w:t xml:space="preserve">Intrinsic luminosity difference: Polaris is an F7Ib supergiant (~1,260 L☉, 433 ly) vs. Sigma Octantis F0III/IV (~40 L☉, 294 ly); Gaia photometry shows no systematic southern dimming</w:t>
             </w:r>
           </w:p>
         </w:tc>
@@ -5219,7 +5219,7 @@
                 <w:sz w:val="18"/>
                 <w:szCs w:val="18"/>
               </w:rPr>
-              <w:t xml:space="preserve">Conflates regional SAA change with global dipole; rate is ~15 nT/yr globally</w:t>
+              <w:t xml:space="preserve">Prediction claims 'global' decay but confirmation uses SAA-only data (~30 nT/yr at Tsumeb); 28 nT/yr is a model input parameter, not a derived output; threshold set within established trend guarantees confirmation</w:t>
             </w:r>
           </w:p>
         </w:tc>
@@ -5695,7 +5695,7 @@
                 <w:sz w:val="18"/>
                 <w:szCs w:val="18"/>
               </w:rPr>
-              <w:t xml:space="preserve">Re-slices same INTERMAGNET data as WIN-004/005/035/037</w:t>
+              <w:t xml:space="preserve">Multi-station observation of a single regional anomaly (SAA) is one confirmation, not five independent ones; same INTERMAGNET data as WIN-004/005/035/037</w:t>
             </w:r>
           </w:p>
         </w:tc>
@@ -5814,7 +5814,7 @@
                 <w:sz w:val="18"/>
                 <w:szCs w:val="18"/>
               </w:rPr>
-              <w:t xml:space="preserve">Duplicate of WIN-037 with identical threshold and data</w:t>
+              <w:t xml:space="preserve">Mathematically equivalent to WIN-037 (≥28 nT cumulative per 12 months = ≥28 nT/yr rate); both WINs test SAA-core stations only, not the global dipole — see WIN-037 for full analysis</w:t>
             </w:r>
           </w:p>
         </w:tc>
@@ -5995,7 +5995,7 @@
                 <w:sz w:val="18"/>
                 <w:szCs w:val="18"/>
               </w:rPr>
-              <w:t xml:space="preserve">FSF formula from V12 geometry</w:t>
+              <w:t xml:space="preserve">The Firmament Scaling Function (FSF) formula is constructed from dome parameters as FSF(r) = H(r) / H(0) = exp(−r/λ_g), where H(0) = H₀ = 8,537 km and λ_g = 8,619 km. This makes WIN-044 unusual among the 67 WINs: it is one of only a handful genuinely derived from dome geometry rather than adopted post-hoc from observational data. The curmudgeon's code analysis confirms: derives_from_dome = true. However, 'derived from model geometry' is not the same as 'confirmed by independent data.' The eclipse predictions (E001–E009) that would test the FSF formula against INTERMAGNET eclipse measurements are all pending (August 12, 2026 eclipse). Claiming a formula as a confirmed WIN before the observational test amounts to claiming a derived identity as a prediction — the formula is confirmed because it was constructed, not because it was independently tested.Firmament Scaling Function from V12 geometry</w:t>
             </w:r>
           </w:p>
         </w:tc>
@@ -6052,7 +6052,7 @@
                 <w:sz w:val="18"/>
                 <w:szCs w:val="18"/>
               </w:rPr>
-              <w:t xml:space="preserve">Internal model derivation, not independent prediction</w:t>
+              <w:t xml:space="preserve">Internal model derivation claimed as confirmed WIN before observational test (eclipse August 2026); tests self-consistency, not truth</w:t>
             </w:r>
           </w:p>
         </w:tc>
@@ -6290,7 +6290,7 @@
                 <w:sz w:val="18"/>
                 <w:szCs w:val="18"/>
               </w:rPr>
-              <w:t xml:space="preserve">Period is trivial (half a solar day); dome's local moon at 2,534 km cannot produce the observed two-bulge pattern</w:t>
+              <w:t xml:space="preserve">Period is trivial (half a solar day); dome's local sun at 5,733 km produces sharp thermal spike, not the observed two-bulge pattern</w:t>
             </w:r>
           </w:p>
         </w:tc>
@@ -6409,7 +6409,7 @@
                 <w:sz w:val="18"/>
                 <w:szCs w:val="18"/>
               </w:rPr>
-              <w:t xml:space="preserve">H₀≈70 km/s/Mpc is the globe's own measured value; dome has no redshift mechanism or galaxy-scale physics</w:t>
+              <w:t xml:space="preserve">Dome claims low-z deviations support aetheric redshift, but provides no photon-aether interaction equation or redshift mechanism</w:t>
             </w:r>
           </w:p>
         </w:tc>
@@ -6528,7 +6528,7 @@
                 <w:sz w:val="18"/>
                 <w:szCs w:val="18"/>
               </w:rPr>
-              <w:t xml:space="preserve">Contested anomaly; no dome mechanism for CMB generation</w:t>
+              <w:t xml:space="preserve">False dilemma (ΛCDM problem ≠ dome evidence); anomaly significance eroded by Planck reanalysis; copper firmament (WIN-034) would block CMB microwaves</w:t>
             </w:r>
           </w:p>
         </w:tc>
@@ -6647,7 +6647,7 @@
                 <w:sz w:val="18"/>
                 <w:szCs w:val="18"/>
               </w:rPr>
-              <w:t xml:space="preserve">Period is trivial (luni-solar diurnal); dome's local moon cannot produce the observed two-bulge tidal pattern</w:t>
+              <w:t xml:space="preserve">Period is trivial (luni-solar diurnal); dome's local moon cannot produce K1's observed global diurnal inequality distribution</w:t>
             </w:r>
           </w:p>
         </w:tc>
@@ -6766,7 +6766,7 @@
                 <w:sz w:val="18"/>
                 <w:szCs w:val="18"/>
               </w:rPr>
-              <w:t xml:space="preserve">Period is trivial (lunar diurnal); dome's local moon cannot produce the observed two-bulge tidal pattern</w:t>
+              <w:t xml:space="preserve">Period is trivial (lunar diurnal); dome's local moon at 2,534 km concentrates force at one point, not the gentle global diurnal forcing required for O1</w:t>
             </w:r>
           </w:p>
         </w:tc>
@@ -7004,7 +7004,7 @@
                 <w:sz w:val="18"/>
                 <w:szCs w:val="18"/>
               </w:rPr>
-              <w:t xml:space="preserve">Cites Mistele 2024 but dome model has no lensing mechanism</w:t>
+              <w:t xml:space="preserve">Hijacks genuine ΛCDM challenge; dome has no galaxy-scale physics or RAR derivation</w:t>
             </w:r>
           </w:p>
         </w:tc>
@@ -7079,7 +7079,7 @@
               <w:bottom w:val="single" w:color="CCCCCC" w:sz="1"/>
               <w:right w:val="single" w:color="CCCCCC" w:sz="1"/>
             </w:tcBorders>
-            <w:shd w:fill="FFCCCC" w:val="clear"/>
+            <w:shd w:fill="B3E5FC" w:val="clear"/>
             <w:tcMar>
               <w:top w:type="dxa" w:w="80"/>
               <w:left w:type="dxa" w:w="120"/>
@@ -7096,7 +7096,7 @@
                 <w:sz w:val="18"/>
                 <w:szCs w:val="18"/>
               </w:rPr>
-              <w:t xml:space="preserve">Refuted by Data</w:t>
+              <w:t xml:space="preserve">Self-Contradicted</w:t>
             </w:r>
           </w:p>
         </w:tc>
@@ -7123,7 +7123,7 @@
                 <w:sz w:val="18"/>
                 <w:szCs w:val="18"/>
               </w:rPr>
-              <w:t xml:space="preserve">Contradicts V50.6 monopolar vortex; no actual mechanism change</w:t>
+              <w:t xml:space="preserve">Dome's ring magnet geometry predicts B_south ≈ 39 nT via flux conservation; fitted equation gives 64,852 nT — a 1,660:1 self-contradiction</w:t>
             </w:r>
           </w:p>
         </w:tc>
@@ -7242,7 +7242,7 @@
                 <w:sz w:val="18"/>
                 <w:szCs w:val="18"/>
               </w:rPr>
-              <w:t xml:space="preserve">Disputes LCDM but dome has no cosmological structure formation model</w:t>
+              <w:t xml:space="preserve">El Gordo is a genuine 6.2σ anomaly for ΛCDM, but citing an opponent's anomaly is not a WIN when the dome has no cosmological model, no structure formation equations, and no alternative prediction for cluster collision velocities</w:t>
             </w:r>
           </w:p>
         </w:tc>
@@ -7361,7 +7361,7 @@
                 <w:sz w:val="18"/>
                 <w:szCs w:val="18"/>
               </w:rPr>
-              <w:t xml:space="preserve">Standard cosmological observations; dome has no redshift mechanism</w:t>
+              <w:t xml:space="preserve">Cepheid/SBF distances via Magellanic parallax place galaxies at 10–100 Mpc with no cosmological assumption; dome has no aetheric pulsation or surface-brightness mechanism</w:t>
             </w:r>
           </w:p>
         </w:tc>
@@ -7542,7 +7542,7 @@
                 <w:sz w:val="18"/>
                 <w:szCs w:val="18"/>
               </w:rPr>
-              <w:t xml:space="preserve">Two-zone disc topology</w:t>
+              <w:t xml:space="preserve">Parameter accounting: Standard geodesy (WGS84 ellipsoid) uses two derived parameters — semi-major axis a = 6,378,137 m and flattening f = 1/298.257 — both determined independently from satellite orbits, gravimetry, VLBI, and SLR. The V13 dome coordinate system uses at least four fitted parameters: H₀ (firmament apex height), λ_g (firmament decay constant), EW angular scale 0.9941, and equatorial ring radius 14,105 km. More parameters, less accuracy (6.2% RMSE vs sub-0.01% for Vincenty geodesy) — the textbook signature of overfitting to a small training set. Evidence coverage: the 6.2% RMSE is computed from only six cherry-picked intercontinental routes. The dome does not report accuracy for short SH-internal routes, cross-equatorial routes under 1,000 km, or NH routes outside the training set. A sample of six is statistically insufficient to establish a reliable global performance figure. OPEN-015 scope: The dome's coordinates page concedes Singapore (1.35°N) and similar near-equatorial cities 'fall beyond the equatorial ring' — approximately 40% of the world's population lives in the tropics below ±12° latitude. A coordinate system that fails for 40% of inhabited locations and achieves only 6.2% RMSE for the other 60% is not a replacement for standard geodesy.Two-zone disc topology</w:t>
             </w:r>
           </w:p>
         </w:tc>
@@ -7599,7 +7599,7 @@
                 <w:sz w:val="18"/>
                 <w:szCs w:val="18"/>
               </w:rPr>
-              <w:t xml:space="preserve">V13 coordinates regressed NH accuracy from 5.2% to 7.3%</w:t>
+              <w:t xml:space="preserve">Cross-equatorial error fell from 25–78% to 6.2% RMSE by adding a fitted parameter (equatorial ring radius 14,105 km) to match six known WGS84 routes — curve-fitting, not prediction. Result is still 600× worse than standard geodesy (sub-0.01%) and excludes equatorial cities entirely (OPEN-015)</w:t>
             </w:r>
           </w:p>
         </w:tc>
@@ -7661,7 +7661,7 @@
                 <w:sz w:val="18"/>
                 <w:szCs w:val="18"/>
               </w:rPr>
-              <w:t xml:space="preserve">Unified angular coordinate</w:t>
+              <w:t xml:space="preserve">The 0.9941 EW scale factor can be compared to the globe's flattening f = 1/298.257 to illustrate the epistemological difference: the globe's flattening is derived from Earth's rotation rate and mass distribution, independently confirmed by four methods (satellite orbit perturbations, gravimetry, VLBI, SLR) each giving consistent results. The dome's 0.9941 is the output of a least-squares minimization on six WGS84-derived route distances — no physical derivation, no independent confirmation, no prior prediction. The dome's own AI context page lists 'EW scale 0.9941 physical interpretation' as an open question, conceding the parameter has no theoretical basis. A genuine dome-derived prediction would compute 0.9941 from disc radius (20,015 km), firmament height (9,086 km), or aetheric wave speed before comparing to city distances; instead, 0.9941 was reverse-engineered from WGS84 data and then claimed as a prediction.Unified angular coordinate</w:t>
             </w:r>
           </w:p>
         </w:tc>
@@ -7674,7 +7674,7 @@
               <w:bottom w:val="single" w:color="CCCCCC" w:sz="1"/>
               <w:right w:val="single" w:color="CCCCCC" w:sz="1"/>
             </w:tcBorders>
-            <w:shd w:fill="FFE0B2" w:val="clear"/>
+            <w:shd w:fill="D1C4E9" w:val="clear"/>
             <w:tcMar>
               <w:top w:type="dxa" w:w="80"/>
               <w:left w:type="dxa" w:w="120"/>
@@ -7691,7 +7691,7 @@
                 <w:sz w:val="18"/>
                 <w:szCs w:val="18"/>
               </w:rPr>
-              <w:t xml:space="preserve">Misleading</w:t>
+              <w:t xml:space="preserve">Not Demonstrated</w:t>
             </w:r>
           </w:p>
         </w:tc>
@@ -7837,7 +7837,7 @@
                 <w:sz w:val="18"/>
                 <w:szCs w:val="18"/>
               </w:rPr>
-              <w:t xml:space="preserve">Duplicate of WIN-007; dome has no mechanism to predict sector-specific deceleration</w:t>
+              <w:t xml:space="preserve">Dome's own Kill-Shot Test 6 failing at 39.9% error; axially symmetric geometry cannot predict sector-specific behavior</w:t>
             </w:r>
           </w:p>
         </w:tc>
@@ -8670,7 +8670,7 @@
                 <w:sz w:val="18"/>
                 <w:szCs w:val="18"/>
               </w:rPr>
-              <w:t xml:space="preserve">Caused by NH having 2× more land (lower heat capacity); dome has no heat-transport mechanism</w:t>
+              <w:t xml:space="preserve">Budget is remarkably symmetric (Stephens 2012); residual from NH land fraction; dome has no radiation budget model</w:t>
             </w:r>
           </w:p>
         </w:tc>
@@ -8815,7 +8815,7 @@
         <w:t xml:space="preserve">V51.0 Tally (67 WINs): </w:t>
       </w:r>
       <w:r>
-        <w:t xml:space="preserve">Refuted by Data: 10  |  Self-Contradicted: 11  |  Misleading: 23  |  Std Model Explains: 16  |  Not Demonstrated: 3  |  Unfalsifiable: 4</w:t>
+        <w:t xml:space="preserve">Refuted by Data: 9  |  Self-Contradicted: 13  |  Misleading: 22  |  Std Model Explains: 16  |  Not Demonstrated: 3  |  Unfalsifiable: 4</w:t>
       </w:r>
     </w:p>
     <w:p>
@@ -8908,7 +8908,7 @@
       <w:r>
         <w:t xml:space="preserve">US Patent 787412 (1905), publicly available at </w:t>
       </w:r>
-      <w:hyperlink w:history="1" r:id="rId8n6iah226qlkduxctt5fk">
+      <w:hyperlink w:history="1" r:id="rIdjc2uhn-y2p_4f1-id4t1u">
         <w:r>
           <w:rPr>
             <w:rStyle w:val="Hyperlink"/>
@@ -9048,7 +9048,7 @@
       <w:r>
         <w:t xml:space="preserve">James Bradley (1727) explicitly tested and rejected atmospheric refraction as an explanation: refraction is wavelength-dependent (chromatic), while stellar aberration is achromatic. Modern VLBI measurements achieve milliarcsecond precision and directly confirm aberration correlates with Earth's orbital velocity (~30 km/s). The </w:t>
       </w:r>
-      <w:hyperlink w:history="1" r:id="rIdeu-h0utdcqfkac3h73sew">
+      <w:hyperlink w:history="1" r:id="rIdgv45oxtjbh_zqah8iirf9">
         <w:r>
           <w:rPr>
             <w:rStyle w:val="Hyperlink"/>
@@ -9114,7 +9114,7 @@
       <w:r>
         <w:t xml:space="preserve">ESA </w:t>
       </w:r>
-      <w:hyperlink w:history="1" r:id="rIdvwaiu6a342ljmp6-mpm1t">
+      <w:hyperlink w:history="1" r:id="rId7gevuuldkhly7fidpebbu">
         <w:r>
           <w:rPr>
             <w:rStyle w:val="Hyperlink"/>
@@ -9180,7 +9180,7 @@
       <w:r>
         <w:t xml:space="preserve">Crepuscular rays are parallel beams made visible by atmospheric scattering. The apparent divergence is a perspective effect. Crucially, anticrepuscular rays converge at the anti-solar point simultaneously. See </w:t>
       </w:r>
-      <w:hyperlink w:history="1" r:id="rIdovskgm72wumh56aeb0vw6">
+      <w:hyperlink w:history="1" r:id="rIdyjbqyhttv9kuov97liyg3">
         <w:r>
           <w:rPr>
             <w:rStyle w:val="Hyperlink"/>
@@ -9191,7 +9191,7 @@
       <w:r>
         <w:t xml:space="preserve"> and </w:t>
       </w:r>
-      <w:hyperlink w:history="1" r:id="rIda53amuyiydksj0hhzaxm4">
+      <w:hyperlink w:history="1" r:id="rIdryd8xlkuqwo2lkzujdh_h">
         <w:r>
           <w:rPr>
             <w:rStyle w:val="Hyperlink"/>
@@ -9257,7 +9257,7 @@
       <w:r>
         <w:t xml:space="preserve">NOAA officially states no evidence of anomalous disappearances. </w:t>
       </w:r>
-      <w:hyperlink w:history="1" r:id="rIdckzf_bke-uyry7i0mne-j">
+      <w:hyperlink w:history="1" r:id="rIdycgtxfjv0r2evcekbbw1e">
         <w:r>
           <w:rPr>
             <w:rStyle w:val="Hyperlink"/>
@@ -9323,7 +9323,7 @@
       <w:r>
         <w:t xml:space="preserve">Hipparcos </w:t>
       </w:r>
-      <w:hyperlink w:history="1" r:id="rIdamcc0ufja-qf0znomicx1">
+      <w:hyperlink w:history="1" r:id="rIda9gfhbprrmz72f5lep3-n">
         <w:r>
           <w:rPr>
             <w:rStyle w:val="Hyperlink"/>
@@ -9739,7 +9739,7 @@
       <w:r>
         <w:t xml:space="preserve">Terra-Nova et al. (2017, PNAS) demonstrate reversed-flux patches reproduce SAA splitting in MHD simulations. The </w:t>
       </w:r>
-      <w:hyperlink w:history="1" r:id="rIdru253gt9jdxcitrjnylqa">
+      <w:hyperlink w:history="1" r:id="rIdeg7bwkw7jv21zjxbtvl18">
         <w:r>
           <w:rPr>
             <w:rStyle w:val="Hyperlink"/>
@@ -9750,7 +9750,7 @@
       <w:r>
         <w:t xml:space="preserve"> documents the evolution quantitatively. </w:t>
       </w:r>
-      <w:hyperlink w:history="1" r:id="rIdow0zcxllu0ickd7chhdvj">
+      <w:hyperlink w:history="1" r:id="rIdk1pktuo9aqsolti8dgvzp">
         <w:r>
           <w:rPr>
             <w:rStyle w:val="Hyperlink"/>
@@ -9801,7 +9801,7 @@
       <w:r>
         <w:t xml:space="preserve">Normal secular variation documented by </w:t>
       </w:r>
-      <w:hyperlink w:history="1" r:id="rId7g6arioacxfsbchctbkgf">
+      <w:hyperlink w:history="1" r:id="rIdah0e5fe9lvodpomwm7gal">
         <w:r>
           <w:rPr>
             <w:rStyle w:val="Hyperlink"/>
@@ -9868,7 +9868,7 @@
       <w:r>
         <w:t xml:space="preserve">Eclipse-induced perturbations predicted by Chapman (1933) via ionospheric conductivity drops. Data from </w:t>
       </w:r>
-      <w:hyperlink w:history="1" r:id="rIdwsuwn1gpup8_ui11cclf3">
+      <w:hyperlink w:history="1" r:id="rIdfg1gy4_zxvmggcs8foaa5">
         <w:r>
           <w:rPr>
             <w:rStyle w:val="Hyperlink"/>
@@ -9956,7 +9956,7 @@
       <w:r>
         <w:t xml:space="preserve">The formula used is for a quarter-wave linear waveguide, not a spherical cavity. Correct formula f = c/(2*pi*R) gives R = 6,098 km, within 4% of Earth's radius. The ionosphere IS conductive (</w:t>
       </w:r>
-      <w:hyperlink w:history="1" r:id="rIduexyqfbhekw0l1nfyodrr">
+      <w:hyperlink w:history="1" r:id="rId9kvti5nr1afo9aiq8ymws">
         <w:r>
           <w:rPr>
             <w:rStyle w:val="Hyperlink"/>
@@ -10023,7 +10023,7 @@
       <w:r>
         <w:t xml:space="preserve">All five observations already predicted by </w:t>
       </w:r>
-      <w:hyperlink w:history="1" r:id="rIdiywwlt9kw0mtwusd7e7da">
+      <w:hyperlink w:history="1" r:id="rIdywsk-rfr7uvvyugajsbee">
         <w:r>
           <w:rPr>
             <w:rStyle w:val="Hyperlink"/>
@@ -10034,7 +10034,7 @@
       <w:r>
         <w:t xml:space="preserve">, </w:t>
       </w:r>
-      <w:hyperlink w:history="1" r:id="rIdkxagn6kl2qvtq-zktcwbr">
+      <w:hyperlink w:history="1" r:id="rId1xrrcgqa-hdpr8ves_gvb">
         <w:r>
           <w:rPr>
             <w:rStyle w:val="Hyperlink"/>
@@ -10361,7 +10361,7 @@
       <w:r>
         <w:t xml:space="preserve">Antarctic gravity anomalies are mapped from orbit by </w:t>
       </w:r>
-      <w:hyperlink w:history="1" r:id="rIdf5c9y6nidvx89mkh47vjb">
+      <w:hyperlink w:history="1" r:id="rIdh5d9vp4cfauohfngqlctd">
         <w:r>
           <w:rPr>
             <w:rStyle w:val="Hyperlink"/>
@@ -10372,7 +10372,7 @@
       <w:r>
         <w:t xml:space="preserve"> and </w:t>
       </w:r>
-      <w:hyperlink w:history="1" r:id="rIdaedwifhzau10qf2oj1qs7">
+      <w:hyperlink w:history="1" r:id="rId3ht6cm2ozsfnegjn-1mcc">
         <w:r>
           <w:rPr>
             <w:rStyle w:val="Hyperlink"/>
@@ -13278,7 +13278,7 @@
         <w:t xml:space="preserve">Bottom line: </w:t>
       </w:r>
       <w:r>
-        <w:t xml:space="preserve">14 of 20 domains share the same fitted constant and are therefore one test, not fourteen. Of the remaining 6, the globe model predicts the same or better result in 5, and the dome prediction is directly contradicted by data in 1 (Polaris). Zero of 20 domains produce a result the globe model disagrees with that the dome model uniquely explains. The 9.2-sigma figure is the product of treating correlated tests as independent; the actual statistical significance is indeterminate.</w:t>
+        <w:t xml:space="preserve">14 of 20 domains share the same fitted constant and are therefore one test, not fourteen. Of the remaining 6, the globe model predicts the same or better result in 5, and the dome prediction is directly contradicted by data in 1 domain (Polaris excess, where the dome model's own refraction formula fails by two orders of magnitude). Zero of 20 domains produce a result the globe model disagrees with that the dome model uniquely explains. The 9.2-sigma figure is the product of treating correlated tests as independent; the actual statistical significance is indeterminate.</w:t>
       </w:r>
     </w:p>
     <w:p>
@@ -13348,7 +13348,7 @@
       <w:r>
         <w:t xml:space="preserve">A </w:t>
       </w:r>
-      <w:hyperlink w:history="1" r:id="rId4hh7vli_ncihpuui6sqeh">
+      <w:hyperlink w:history="1" r:id="rIdh4-gxwl2-haglekoyxmla">
         <w:r>
           <w:rPr>
             <w:rStyle w:val="Hyperlink"/>
@@ -13359,7 +13359,7 @@
       <w:r>
         <w:t xml:space="preserve"> found detectable decreases in X, Z, and total field components during eclipses. An </w:t>
       </w:r>
-      <w:hyperlink w:history="1" r:id="rIdktdfs0cvmlbm1irrw175v">
+      <w:hyperlink w:history="1" r:id="rIdaktphurhd9o6sxvaztcvr">
         <w:r>
           <w:rPr>
             <w:rStyle w:val="Hyperlink"/>
@@ -13753,7 +13753,7 @@
       <w:r>
         <w:t xml:space="preserve">Continuous 24-hour sunlight. A local sun at 5,733 km circling above a flat disc cannot produce 24-hour sunlight at the disc edge. Directly observable at Amundsen-Scott Station, staffed year-round since 1957. See </w:t>
       </w:r>
-      <w:hyperlink w:history="1" r:id="rIdhd8ipn6gcbtocqmrlqik0">
+      <w:hyperlink w:history="1" r:id="rIdskvjtdssheb2lq5masymj">
         <w:r>
           <w:rPr>
             <w:rStyle w:val="Hyperlink"/>
@@ -13817,7 +13817,7 @@
       <w:r>
         <w:t xml:space="preserve">GPS provides 1–3 meter accuracy worldwide using 24+ satellites in Keplerian orbits calculated from spherical-Earth gravitational mechanics. The system requires precise relativistic corrections (both special and general) that depend on the satellites' orbital velocity and altitude above a spherical gravitational well. If Earth were a flat disc with different geometry, the signal propagation times, relativistic corrections, and satellite visibility geometry would all be wrong, and the system would not achieve meter-level accuracy. The same applies to every other satellite navigation system (GLONASS, Galileo, BeiDou). The ISS at 408 km is visible on predictable schedules computed from Keplerian orbits. Geostationary satellites at 35,786 km — far above the dome's maximum height — provide continuous coverage. See </w:t>
       </w:r>
-      <w:hyperlink w:history="1" r:id="rIdm955m880fjexoaqnecvzm">
+      <w:hyperlink w:history="1" r:id="rIdimchqiaoiphqq_9wkyvve">
         <w:r>
           <w:rPr>
             <w:rStyle w:val="Hyperlink"/>
@@ -13828,7 +13828,7 @@
       <w:r>
         <w:t xml:space="preserve">; </w:t>
       </w:r>
-      <w:hyperlink w:history="1" r:id="rIdwoaquvymngghc06v49tlc">
+      <w:hyperlink w:history="1" r:id="rIdx7jc_p29eijv5xkaol2cq">
         <w:r>
           <w:rPr>
             <w:rStyle w:val="Hyperlink"/>
@@ -13877,7 +13877,7 @@
       <w:r>
         <w:t xml:space="preserve">Modern solar calculators (</w:t>
       </w:r>
-      <w:hyperlink w:history="1" r:id="rIdpfhqmkythibkug81qhrim">
+      <w:hyperlink w:history="1" r:id="rId858nurjhfbmymubbu2ksd">
         <w:r>
           <w:rPr>
             <w:rStyle w:val="Hyperlink"/>
@@ -13926,7 +13926,7 @@
       <w:r>
         <w:t xml:space="preserve">The </w:t>
       </w:r>
-      <w:hyperlink w:history="1" r:id="rIdnhufc9l6lg7mvfvqfas7e">
+      <w:hyperlink w:history="1" r:id="rIdtjyanfkjoufhqi54m-rk5">
         <w:r>
           <w:rPr>
             <w:rStyle w:val="Hyperlink"/>
@@ -13975,7 +13975,7 @@
       <w:r>
         <w:t xml:space="preserve">Earth's field is a dipole. South magnetic pole at 64.1°S, 135.9°E (</w:t>
       </w:r>
-      <w:hyperlink w:history="1" r:id="rIdk95hhv5jxjveefka-nww9">
+      <w:hyperlink w:history="1" r:id="rIdb4uiygddjpsv0pfwvsfmm">
         <w:r>
           <w:rPr>
             <w:rStyle w:val="Hyperlink"/>
@@ -14024,7 +14024,7 @@
       <w:r>
         <w:t xml:space="preserve">g = 9.780 m/s² at equator, 9.832 m/s² at poles (0.53% variation). On a flat disc, centrifugal force points outward from center, producing the OPPOSITE pattern. See </w:t>
       </w:r>
-      <w:hyperlink w:history="1" r:id="rIdiosl70wo6sclpt9y4x6qv">
+      <w:hyperlink w:history="1" r:id="rIdlxcjn3mckjakuhvqvmxoe">
         <w:r>
           <w:rPr>
             <w:rStyle w:val="Hyperlink"/>
@@ -14870,7 +14870,7 @@
           <w:b/>
           <w:bCs/>
         </w:rPr>
-        <w:t xml:space="preserve">Refuted by Data: 10 </w:t>
+        <w:t xml:space="preserve">Refuted by Data: 9 </w:t>
       </w:r>
       <w:r>
         <w:t xml:space="preserve">(direct measurements contradict the claim)</w:t>
@@ -14885,7 +14885,7 @@
           <w:b/>
           <w:bCs/>
         </w:rPr>
-        <w:t xml:space="preserve">Self-Contradicted: 11 </w:t>
+        <w:t xml:space="preserve">Self-Contradicted: 13 </w:t>
       </w:r>
       <w:r>
         <w:t xml:space="preserve">(the dome's own geometry, if worked through honestly, predicts radically different values)</w:t>
@@ -14900,7 +14900,7 @@
           <w:b/>
           <w:bCs/>
         </w:rPr>
-        <w:t xml:space="preserve">Misleading: 23 </w:t>
+        <w:t xml:space="preserve">Misleading: 22 </w:t>
       </w:r>
       <w:r>
         <w:t xml:space="preserve">(data misrepresented, duplicated, cherry-picked, or logically contradictory)</w:t>
@@ -15021,7 +15021,7 @@
         </w:rPr>
         <w:t xml:space="preserve">NOAA World Magnetic Model 2025: </w:t>
       </w:r>
-      <w:hyperlink w:history="1" r:id="rIdnaxauzowtkzwvmnu2-coa">
+      <w:hyperlink w:history="1" r:id="rIdltksh4gshjdhcg4afqxai">
         <w:r>
           <w:rPr>
             <w:rStyle w:val="Hyperlink"/>
@@ -15041,7 +15041,7 @@
         </w:rPr>
         <w:t xml:space="preserve">NOAA Wandering Geomagnetic Poles: </w:t>
       </w:r>
-      <w:hyperlink w:history="1" r:id="rIdjtcikr4bagbpolxsl7snm">
+      <w:hyperlink w:history="1" r:id="rIdyt-kjwawwchyam5sjfqzc">
         <w:r>
           <w:rPr>
             <w:rStyle w:val="Hyperlink"/>
@@ -15061,7 +15061,7 @@
         </w:rPr>
         <w:t xml:space="preserve">CHAOS-7 Geomagnetic Field Model: </w:t>
       </w:r>
-      <w:hyperlink w:history="1" r:id="rIdo3f3vca5wf-suz_nq4lqg">
+      <w:hyperlink w:history="1" r:id="rIdt0k49epuoecc6vh6tbaht">
         <w:r>
           <w:rPr>
             <w:rStyle w:val="Hyperlink"/>
@@ -15081,7 +15081,7 @@
         </w:rPr>
         <w:t xml:space="preserve">ESA Swarm Satellite Mission: </w:t>
       </w:r>
-      <w:hyperlink w:history="1" r:id="rIdm9evxz3ihjihjy3lbdyzi">
+      <w:hyperlink w:history="1" r:id="rIdf99ihebuvj4tzwqxxk0bd">
         <w:r>
           <w:rPr>
             <w:rStyle w:val="Hyperlink"/>
@@ -15101,7 +15101,7 @@
         </w:rPr>
         <w:t xml:space="preserve">INTERMAGNET Observatory Network: </w:t>
       </w:r>
-      <w:hyperlink w:history="1" r:id="rIdk123zghaopisyv-hyebwa">
+      <w:hyperlink w:history="1" r:id="rIdpzvd-fagdflza_7l-d91b">
         <w:r>
           <w:rPr>
             <w:rStyle w:val="Hyperlink"/>
@@ -15121,7 +15121,7 @@
         </w:rPr>
         <w:t xml:space="preserve">IGRF-13: </w:t>
       </w:r>
-      <w:hyperlink w:history="1" r:id="rIdwsvrx3bhpba1txxpszt6q">
+      <w:hyperlink w:history="1" r:id="rIdf8pyaqi6qgaicqmoi6ono">
         <w:r>
           <w:rPr>
             <w:rStyle w:val="Hyperlink"/>
@@ -15141,7 +15141,7 @@
         </w:rPr>
         <w:t xml:space="preserve">ESA Gaia Data Release 3: </w:t>
       </w:r>
-      <w:hyperlink w:history="1" r:id="rIdpj1y_gfpgkhh-7dsv4xsh">
+      <w:hyperlink w:history="1" r:id="rIdlriz-yrlwmtukvtr4mywq">
         <w:r>
           <w:rPr>
             <w:rStyle w:val="Hyperlink"/>
@@ -15161,7 +15161,7 @@
         </w:rPr>
         <w:t xml:space="preserve">Hipparcos Catalogue: </w:t>
       </w:r>
-      <w:hyperlink w:history="1" r:id="rIdorgbgxdsucdpvaegsc-kp">
+      <w:hyperlink w:history="1" r:id="rIdfvqftjgbnbbyi8yjxu-da">
         <w:r>
           <w:rPr>
             <w:rStyle w:val="Hyperlink"/>
@@ -15181,7 +15181,7 @@
         </w:rPr>
         <w:t xml:space="preserve">US Patent 787412 (Tesla): </w:t>
       </w:r>
-      <w:hyperlink w:history="1" r:id="rId_akjlftmz1g6zyyptmuov">
+      <w:hyperlink w:history="1" r:id="rIde4riy5gm4h8efl49gc_hi">
         <w:r>
           <w:rPr>
             <w:rStyle w:val="Hyperlink"/>
@@ -15201,7 +15201,7 @@
         </w:rPr>
         <w:t xml:space="preserve">NOAA Solar Position Algorithm: </w:t>
       </w:r>
-      <w:hyperlink w:history="1" r:id="rIdv7djl-s9ez1j4ieppkuig">
+      <w:hyperlink w:history="1" r:id="rIdgzmtmy-bcqwlbgjouj1ad">
         <w:r>
           <w:rPr>
             <w:rStyle w:val="Hyperlink"/>
@@ -15221,7 +15221,7 @@
         </w:rPr>
         <w:t xml:space="preserve">National Geodetic Survey Gravity: </w:t>
       </w:r>
-      <w:hyperlink w:history="1" r:id="rIdicqrt7ydxxjmsvxbbz8gv">
+      <w:hyperlink w:history="1" r:id="rId7tvkoyheuhyo3nx9uvucy">
         <w:r>
           <w:rPr>
             <w:rStyle w:val="Hyperlink"/>
@@ -15241,7 +15241,7 @@
         </w:rPr>
         <w:t xml:space="preserve">CHIME/FRB Project: </w:t>
       </w:r>
-      <w:hyperlink w:history="1" r:id="rIdmdv_849u56rkxuftektvk">
+      <w:hyperlink w:history="1" r:id="rIdg7-bbyvzcjpxqnk_sryxn">
         <w:r>
           <w:rPr>
             <w:rStyle w:val="Hyperlink"/>
@@ -15261,7 +15261,7 @@
         </w:rPr>
         <w:t xml:space="preserve">GRACE-FO (gravity mapping): </w:t>
       </w:r>
-      <w:hyperlink w:history="1" r:id="rIdfiza7o0vtl44qscwpz3ps">
+      <w:hyperlink w:history="1" r:id="rIdldjug-jvzmabuc86rqv4e">
         <w:r>
           <w:rPr>
             <w:rStyle w:val="Hyperlink"/>
@@ -15281,7 +15281,7 @@
         </w:rPr>
         <w:t xml:space="preserve">GOCE (gravity field): </w:t>
       </w:r>
-      <w:hyperlink w:history="1" r:id="rId5rllprw5uqebivydcmnrf">
+      <w:hyperlink w:history="1" r:id="rIdchulkwhmu1b1xiypjeoi2">
         <w:r>
           <w:rPr>
             <w:rStyle w:val="Hyperlink"/>
@@ -15301,7 +15301,7 @@
         </w:rPr>
         <w:t xml:space="preserve">GPS.gov: </w:t>
       </w:r>
-      <w:hyperlink w:history="1" r:id="rIddjgvv1i1xdjhdxs0xltjd">
+      <w:hyperlink w:history="1" r:id="rIdsn3pu0pwyl9g1wdvgipml">
         <w:r>
           <w:rPr>
             <w:rStyle w:val="Hyperlink"/>
@@ -15321,7 +15321,7 @@
         </w:rPr>
         <w:t xml:space="preserve">CelesTrak TLE Data: </w:t>
       </w:r>
-      <w:hyperlink w:history="1" r:id="rId3yolw7gaxijoskot-trq1">
+      <w:hyperlink w:history="1" r:id="rIdkcxloyptp1vldl_fg_2tk">
         <w:r>
           <w:rPr>
             <w:rStyle w:val="Hyperlink"/>

</xml_diff>